<commit_message>
Developer Guide: chapter 6, creating the first Admin account
Co-Authored-By: Claude Opus 5.5 <noreply@anthropic.com>
</commit_message>
<xml_diff>
--- a/docs/Developer Guide.docx
+++ b/docs/Developer Guide.docx
@@ -40,7 +40,7 @@
       <w:pPr>
         <w:pStyle w:val="NormalWeb"/>
         <w:shd w:val="clear" w:color="auto" w:fill="EEF2F8"/>
-        <w:divId w:val="1556045214"/>
+        <w:divId w:val="1098523763"/>
         <w:rPr>
           <w:rFonts w:ascii="Calibri" w:hAnsi="Calibri" w:cs="Calibri"/>
           <w:color w:val="404040"/>
@@ -8446,7 +8446,102 @@
         <w:rPr>
           <w:rFonts w:ascii="Calibri" w:eastAsia="Times New Roman" w:hAnsi="Calibri" w:cs="Calibri"/>
         </w:rPr>
-        <w:t>Coming next</w:t>
+        <w:t>Chapter 6: The first Admin account</w:t>
+      </w:r>
+    </w:p>
+    <w:p>
+      <w:pPr>
+        <w:pStyle w:val="NormalWeb"/>
+        <w:rPr>
+          <w:rFonts w:ascii="Calibri" w:hAnsi="Calibri" w:cs="Calibri"/>
+          <w:color w:val="1A1A1A"/>
+          <w:sz w:val="22"/>
+          <w:szCs w:val="22"/>
+        </w:rPr>
+      </w:pPr>
+      <w:r>
+        <w:rPr>
+          <w:rFonts w:ascii="Calibri" w:hAnsi="Calibri" w:cs="Calibri"/>
+          <w:color w:val="1A1A1A"/>
+          <w:sz w:val="22"/>
+          <w:szCs w:val="22"/>
+        </w:rPr>
+        <w:t xml:space="preserve">The app has no sign-up screen (only Admins create accounts), so the very first Admin is added directly in the database, once. Open pgAdmin, click </w:t>
+      </w:r>
+      <w:r>
+        <w:rPr>
+          <w:rStyle w:val="HTMLCode"/>
+          <w:color w:val="1A1A1A"/>
+        </w:rPr>
+        <w:t>construction_db</w:t>
+      </w:r>
+      <w:r>
+        <w:rPr>
+          <w:rFonts w:ascii="Calibri" w:hAnsi="Calibri" w:cs="Calibri"/>
+          <w:color w:val="1A1A1A"/>
+          <w:sz w:val="22"/>
+          <w:szCs w:val="22"/>
+        </w:rPr>
+        <w:t xml:space="preserve">, then </w:t>
+      </w:r>
+      <w:r>
+        <w:rPr>
+          <w:rStyle w:val="Strong"/>
+          <w:rFonts w:ascii="Calibri" w:hAnsi="Calibri" w:cs="Calibri"/>
+          <w:color w:val="1A1A1A"/>
+          <w:sz w:val="22"/>
+          <w:szCs w:val="22"/>
+        </w:rPr>
+        <w:t>Tools &gt; Query Tool</w:t>
+      </w:r>
+      <w:r>
+        <w:rPr>
+          <w:rFonts w:ascii="Calibri" w:hAnsi="Calibri" w:cs="Calibri"/>
+          <w:color w:val="1A1A1A"/>
+          <w:sz w:val="22"/>
+          <w:szCs w:val="22"/>
+        </w:rPr>
+        <w:t>, and run (with your own username, name and password):</w:t>
+      </w:r>
+    </w:p>
+    <w:p>
+      <w:pPr>
+        <w:pStyle w:val="HTMLPreformatted"/>
+        <w:rPr>
+          <w:color w:val="1A1A1A"/>
+          <w:sz w:val="19"/>
+          <w:szCs w:val="19"/>
+          <w:shd w:val="clear" w:color="auto" w:fill="F2F2F2"/>
+        </w:rPr>
+      </w:pPr>
+      <w:r>
+        <w:rPr>
+          <w:color w:val="1A1A1A"/>
+          <w:sz w:val="19"/>
+          <w:szCs w:val="19"/>
+          <w:shd w:val="clear" w:color="auto" w:fill="F2F2F2"/>
+        </w:rPr>
+        <w:t>INSERT INTO users (username, password_hash, full_name, level)</w:t>
+      </w:r>
+    </w:p>
+    <w:p>
+      <w:pPr>
+        <w:pStyle w:val="HTMLPreformatted"/>
+        <w:rPr>
+          <w:color w:val="1A1A1A"/>
+          <w:sz w:val="19"/>
+          <w:szCs w:val="19"/>
+          <w:shd w:val="clear" w:color="auto" w:fill="F2F2F2"/>
+        </w:rPr>
+      </w:pPr>
+      <w:r>
+        <w:rPr>
+          <w:color w:val="1A1A1A"/>
+          <w:sz w:val="19"/>
+          <w:szCs w:val="19"/>
+          <w:shd w:val="clear" w:color="auto" w:fill="F2F2F2"/>
+        </w:rPr>
+        <w:t>VALUES ('YourUsername', crypt('YourPassword', gen_salt('bf', 11)), 'Your Full Name', 'Admin');</w:t>
       </w:r>
     </w:p>
     <w:p>
@@ -8465,12 +8560,35 @@
       </w:pPr>
       <w:r>
         <w:rPr>
+          <w:rStyle w:val="HTMLCode"/>
+          <w:color w:val="1A1A1A"/>
+        </w:rPr>
+        <w:t>crypt(..., gen_salt('bf', 11))</w:t>
+      </w:r>
+      <w:r>
+        <w:rPr>
           <w:rFonts w:ascii="Calibri" w:eastAsia="Times New Roman" w:hAnsi="Calibri" w:cs="Calibri"/>
           <w:color w:val="1A1A1A"/>
           <w:sz w:val="22"/>
           <w:szCs w:val="22"/>
         </w:rPr>
-        <w:t>Chapter 6: First Admin account</w:t>
+        <w:t xml:space="preserve"> stores a bcrypt hash (cost 11), never the password itself. The hash starts with </w:t>
+      </w:r>
+      <w:r>
+        <w:rPr>
+          <w:rStyle w:val="HTMLCode"/>
+          <w:color w:val="1A1A1A"/>
+        </w:rPr>
+        <w:t>$2a$11$</w:t>
+      </w:r>
+      <w:r>
+        <w:rPr>
+          <w:rFonts w:ascii="Calibri" w:eastAsia="Times New Roman" w:hAnsi="Calibri" w:cs="Calibri"/>
+          <w:color w:val="1A1A1A"/>
+          <w:sz w:val="22"/>
+          <w:szCs w:val="22"/>
+        </w:rPr>
+        <w:t>.</w:t>
       </w:r>
     </w:p>
     <w:p>
@@ -8489,21 +8607,19 @@
       </w:pPr>
       <w:r>
         <w:rPr>
+          <w:rStyle w:val="HTMLCode"/>
+          <w:color w:val="1A1A1A"/>
+        </w:rPr>
+        <w:t>department</w:t>
+      </w:r>
+      <w:r>
+        <w:rPr>
           <w:rFonts w:ascii="Calibri" w:eastAsia="Times New Roman" w:hAnsi="Calibri" w:cs="Calibri"/>
           <w:color w:val="1A1A1A"/>
           <w:sz w:val="22"/>
           <w:szCs w:val="22"/>
         </w:rPr>
-        <w:t>Chapter 7: Connecting the desktop app to the database (connection settings, "</w:t>
-      </w:r>
-      <w:r>
-        <w:rPr>
-          <w:rFonts w:ascii="Calibri" w:eastAsia="Times New Roman" w:hAnsi="Calibri" w:cs="Calibri"/>
-          <w:color w:val="1A1A1A"/>
-          <w:sz w:val="22"/>
-          <w:szCs w:val="22"/>
-        </w:rPr>
-        <w:t>Database Settings" screen)</w:t>
+        <w:t xml:space="preserve"> is left empty because Admins don't belong to one.</w:t>
       </w:r>
     </w:p>
     <w:p>
@@ -8527,14 +8643,200 @@
           <w:sz w:val="22"/>
           <w:szCs w:val="22"/>
         </w:rPr>
-        <w:t>Chapter 8: The Login window and Main Window</w:t>
+        <w:t xml:space="preserve">The real password is </w:t>
+      </w:r>
+      <w:r>
+        <w:rPr>
+          <w:rStyle w:val="Strong"/>
+          <w:rFonts w:ascii="Calibri" w:eastAsia="Times New Roman" w:hAnsi="Calibri" w:cs="Calibri"/>
+          <w:color w:val="1A1A1A"/>
+          <w:sz w:val="22"/>
+          <w:szCs w:val="22"/>
+        </w:rPr>
+        <w:t>never</w:t>
+      </w:r>
+      <w:r>
+        <w:rPr>
+          <w:rFonts w:ascii="Calibri" w:eastAsia="Times New Roman" w:hAnsi="Calibri" w:cs="Calibri"/>
+          <w:color w:val="1A1A1A"/>
+          <w:sz w:val="22"/>
+          <w:szCs w:val="22"/>
+        </w:rPr>
+        <w:t xml:space="preserve"> written in a script file or saved in Git.</w:t>
+      </w:r>
+    </w:p>
+    <w:p>
+      <w:pPr>
+        <w:pStyle w:val="NormalWeb"/>
+        <w:rPr>
+          <w:rFonts w:ascii="Calibri" w:hAnsi="Calibri" w:cs="Calibri"/>
+          <w:color w:val="1A1A1A"/>
+          <w:sz w:val="22"/>
+          <w:szCs w:val="22"/>
+        </w:rPr>
+      </w:pPr>
+      <w:r>
+        <w:rPr>
+          <w:rFonts w:ascii="Calibri" w:hAnsi="Calibri" w:cs="Calibri"/>
+          <w:color w:val="1A1A1A"/>
+          <w:sz w:val="22"/>
+          <w:szCs w:val="22"/>
+        </w:rPr>
+        <w:t xml:space="preserve">Check it worked (the last column must be </w:t>
+      </w:r>
+      <w:r>
+        <w:rPr>
+          <w:rStyle w:val="HTMLCode"/>
+          <w:color w:val="1A1A1A"/>
+        </w:rPr>
+        <w:t>t</w:t>
+      </w:r>
+      <w:r>
+        <w:rPr>
+          <w:rFonts w:ascii="Calibri" w:hAnsi="Calibri" w:cs="Calibri"/>
+          <w:color w:val="1A1A1A"/>
+          <w:sz w:val="22"/>
+          <w:szCs w:val="22"/>
+        </w:rPr>
+        <w:t xml:space="preserve"> for true):</w:t>
+      </w:r>
+    </w:p>
+    <w:p>
+      <w:pPr>
+        <w:pStyle w:val="HTMLPreformatted"/>
+        <w:rPr>
+          <w:color w:val="1A1A1A"/>
+          <w:sz w:val="19"/>
+          <w:szCs w:val="19"/>
+          <w:shd w:val="clear" w:color="auto" w:fill="F2F2F2"/>
+        </w:rPr>
+      </w:pPr>
+      <w:r>
+        <w:rPr>
+          <w:color w:val="1A1A1A"/>
+          <w:sz w:val="19"/>
+          <w:szCs w:val="19"/>
+          <w:shd w:val="clear" w:color="auto" w:fill="F2F2F2"/>
+        </w:rPr>
+        <w:t>SELECT username, level, status, password_hash = crypt('YourPassword', password_hash) AS password_works</w:t>
+      </w:r>
+    </w:p>
+    <w:p>
+      <w:pPr>
+        <w:pStyle w:val="HTMLPreformatted"/>
+        <w:rPr>
+          <w:color w:val="1A1A1A"/>
+          <w:sz w:val="19"/>
+          <w:szCs w:val="19"/>
+          <w:shd w:val="clear" w:color="auto" w:fill="F2F2F2"/>
+        </w:rPr>
+      </w:pPr>
+      <w:r>
+        <w:rPr>
+          <w:color w:val="1A1A1A"/>
+          <w:sz w:val="19"/>
+          <w:szCs w:val="19"/>
+          <w:shd w:val="clear" w:color="auto" w:fill="F2F2F2"/>
+        </w:rPr>
+        <w:t>FROM users;</w:t>
+      </w:r>
+    </w:p>
+    <w:p>
+      <w:pPr>
+        <w:pStyle w:val="NormalWeb"/>
+        <w:rPr>
+          <w:rFonts w:ascii="Calibri" w:hAnsi="Calibri" w:cs="Calibri"/>
+          <w:color w:val="1A1A1A"/>
+          <w:sz w:val="22"/>
+          <w:szCs w:val="22"/>
+        </w:rPr>
+      </w:pPr>
+      <w:r>
+        <w:rPr>
+          <w:rFonts w:ascii="Calibri" w:hAnsi="Calibri" w:cs="Calibri"/>
+          <w:color w:val="1A1A1A"/>
+          <w:sz w:val="22"/>
+          <w:szCs w:val="22"/>
+        </w:rPr>
+        <w:t>After this, every other account is created by an Admin inside the app (User Accounts page).</w:t>
+      </w:r>
+    </w:p>
+    <w:p>
+      <w:pPr>
+        <w:pStyle w:val="Heading1"/>
+        <w:rPr>
+          <w:rFonts w:ascii="Calibri" w:eastAsia="Times New Roman" w:hAnsi="Calibri" w:cs="Calibri"/>
+        </w:rPr>
+      </w:pPr>
+      <w:r>
+        <w:rPr>
+          <w:rFonts w:ascii="Calibri" w:eastAsia="Times New Roman" w:hAnsi="Calibri" w:cs="Calibri"/>
+        </w:rPr>
+        <w:t>Coming next</w:t>
       </w:r>
     </w:p>
     <w:p>
       <w:pPr>
         <w:numPr>
           <w:ilvl w:val="0"/>
-          <w:numId w:val="4"/>
+          <w:numId w:val="5"/>
+        </w:numPr>
+        <w:spacing w:before="100" w:beforeAutospacing="1" w:after="100" w:afterAutospacing="1"/>
+        <w:rPr>
+          <w:rFonts w:ascii="Calibri" w:eastAsia="Times New Roman" w:hAnsi="Calibri" w:cs="Calibri"/>
+          <w:color w:val="1A1A1A"/>
+          <w:sz w:val="22"/>
+          <w:szCs w:val="22"/>
+        </w:rPr>
+      </w:pPr>
+      <w:r>
+        <w:rPr>
+          <w:rFonts w:ascii="Calibri" w:eastAsia="Times New Roman" w:hAnsi="Calibri" w:cs="Calibri"/>
+          <w:color w:val="1A1A1A"/>
+          <w:sz w:val="22"/>
+          <w:szCs w:val="22"/>
+        </w:rPr>
+        <w:t xml:space="preserve">Chapter 7: Connecting the desktop app to the database (connection settings, "Database Settings" </w:t>
+      </w:r>
+      <w:r>
+        <w:rPr>
+          <w:rFonts w:ascii="Calibri" w:eastAsia="Times New Roman" w:hAnsi="Calibri" w:cs="Calibri"/>
+          <w:color w:val="1A1A1A"/>
+          <w:sz w:val="22"/>
+          <w:szCs w:val="22"/>
+        </w:rPr>
+        <w:t>screen)</w:t>
+      </w:r>
+    </w:p>
+    <w:p>
+      <w:pPr>
+        <w:numPr>
+          <w:ilvl w:val="0"/>
+          <w:numId w:val="5"/>
+        </w:numPr>
+        <w:spacing w:before="100" w:beforeAutospacing="1" w:after="100" w:afterAutospacing="1"/>
+        <w:rPr>
+          <w:rFonts w:ascii="Calibri" w:eastAsia="Times New Roman" w:hAnsi="Calibri" w:cs="Calibri"/>
+          <w:color w:val="1A1A1A"/>
+          <w:sz w:val="22"/>
+          <w:szCs w:val="22"/>
+        </w:rPr>
+      </w:pPr>
+      <w:r>
+        <w:rPr>
+          <w:rFonts w:ascii="Calibri" w:eastAsia="Times New Roman" w:hAnsi="Calibri" w:cs="Calibri"/>
+          <w:color w:val="1A1A1A"/>
+          <w:sz w:val="22"/>
+          <w:szCs w:val="22"/>
+        </w:rPr>
+        <w:t>Chapter 8: The Login window and Main Window</w:t>
+      </w:r>
+    </w:p>
+    <w:p>
+      <w:pPr>
+        <w:numPr>
+          <w:ilvl w:val="0"/>
+          <w:numId w:val="5"/>
         </w:numPr>
         <w:spacing w:before="100" w:beforeAutospacing="1" w:after="100" w:afterAutospacing="1"/>
         <w:rPr>
@@ -8567,9 +8869,9 @@
 <file path=word/numbering.xml><?xml version="1.0" encoding="utf-8"?>
 <w:numbering xmlns:wpc="http://schemas.microsoft.com/office/word/2010/wordprocessingCanvas" xmlns:cx="http://schemas.microsoft.com/office/drawing/2014/chartex" xmlns:cx1="http://schemas.microsoft.com/office/drawing/2015/9/8/chartex" xmlns:cx2="http://schemas.microsoft.com/office/drawing/2015/10/21/chartex" xmlns:cx3="http://schemas.microsoft.com/office/drawing/2016/5/9/chartex" xmlns:cx4="http://schemas.microsoft.com/office/drawing/2016/5/10/chartex" xmlns:cx5="http://schemas.microsoft.com/office/drawing/2016/5/11/chartex" xmlns:cx6="http://schemas.microsoft.com/office/drawing/2016/5/12/chartex" xmlns:cx7="http://schemas.microsoft.com/office/drawing/2016/5/13/chartex" xmlns:cx8="http://schemas.microsoft.com/office/drawing/2016/5/14/chartex" xmlns:mc="http://schemas.openxmlformats.org/markup-compatibility/2006" xmlns:aink="http://schemas.microsoft.com/office/drawing/2016/ink" xmlns:am3d="http://schemas.microsoft.com/office/drawing/2017/model3d" xmlns:o="urn:schemas-microsoft-com:office:office" xmlns:oel="http://schemas.microsoft.com/office/2019/extlst" xmlns:r="http://schemas.openxmlformats.org/officeDocument/2006/relationships" xmlns:m="http://schemas.openxmlformats.org/officeDocument/2006/math" xmlns:v="urn:schemas-microsoft-com:vml" xmlns:wp14="http://schemas.microsoft.com/office/word/2010/wordprocessingDrawing" xmlns:wp="http://schemas.openxmlformats.org/drawingml/2006/wordprocessingDrawing" xmlns:w10="urn:schemas-microsoft-com:office:word" xmlns:w="http://schemas.openxmlformats.org/wordprocessingml/2006/main" xmlns:w14="http://schemas.microsoft.com/office/word/2010/wordml" xmlns:w15="http://schemas.microsoft.com/office/word/2012/wordml" xmlns:w16cex="http://schemas.microsoft.com/office/word/2018/wordml/cex" xmlns:w16cid="http://schemas.microsoft.com/office/word/2016/wordml/cid" xmlns:w16="http://schemas.microsoft.com/office/word/2018/wordml" xmlns:w16du="http://schemas.microsoft.com/office/word/2023/wordml/word16du" xmlns:w16sdtdh="http://schemas.microsoft.com/office/word/2020/wordml/sdtdatahash" xmlns:w16sdtfl="http://schemas.microsoft.com/office/word/2024/wordml/sdtformatlock" xmlns:w16se="http://schemas.microsoft.com/office/word/2015/wordml/symex" xmlns:wpg="http://schemas.microsoft.com/office/word/2010/wordprocessingGroup" xmlns:wpi="http://schemas.microsoft.com/office/word/2010/wordprocessingInk" xmlns:wne="http://schemas.microsoft.com/office/word/2006/wordml" xmlns:wps="http://schemas.microsoft.com/office/word/2010/wordprocessingShape" mc:Ignorable="w14 w15 w16se w16cid w16 w16cex w16sdtdh w16sdtfl w16du wp14">
   <w:abstractNum w:abstractNumId="0" w15:restartNumberingAfterBreak="0">
-    <w:nsid w:val="12CF3636"/>
+    <w:nsid w:val="181D33B6"/>
     <w:multiLevelType w:val="multilevel"/>
-    <w:tmpl w:val="C4707934"/>
+    <w:tmpl w:val="F710BA5C"/>
     <w:lvl w:ilvl="0">
       <w:start w:val="1"/>
       <w:numFmt w:val="bullet"/>
@@ -8716,9 +9018,9 @@
     </w:lvl>
   </w:abstractNum>
   <w:abstractNum w:abstractNumId="1" w15:restartNumberingAfterBreak="0">
-    <w:nsid w:val="1D520FBF"/>
+    <w:nsid w:val="564029C7"/>
     <w:multiLevelType w:val="multilevel"/>
-    <w:tmpl w:val="9AFEADD4"/>
+    <w:tmpl w:val="F342C4D2"/>
     <w:lvl w:ilvl="0">
       <w:start w:val="1"/>
       <w:numFmt w:val="bullet"/>
@@ -8865,9 +9167,9 @@
     </w:lvl>
   </w:abstractNum>
   <w:abstractNum w:abstractNumId="2" w15:restartNumberingAfterBreak="0">
-    <w:nsid w:val="4F8C701A"/>
+    <w:nsid w:val="5771636A"/>
     <w:multiLevelType w:val="multilevel"/>
-    <w:tmpl w:val="A55416F4"/>
+    <w:tmpl w:val="67BE6B98"/>
     <w:lvl w:ilvl="0">
       <w:start w:val="1"/>
       <w:numFmt w:val="bullet"/>
@@ -9014,9 +9316,9 @@
     </w:lvl>
   </w:abstractNum>
   <w:abstractNum w:abstractNumId="3" w15:restartNumberingAfterBreak="0">
-    <w:nsid w:val="790B69DF"/>
+    <w:nsid w:val="5D140D2D"/>
     <w:multiLevelType w:val="multilevel"/>
-    <w:tmpl w:val="A4721E88"/>
+    <w:tmpl w:val="4E08E8C4"/>
     <w:lvl w:ilvl="0">
       <w:start w:val="1"/>
       <w:numFmt w:val="bullet"/>
@@ -9162,17 +9464,169 @@
       </w:rPr>
     </w:lvl>
   </w:abstractNum>
-  <w:num w:numId="1" w16cid:durableId="314990647">
+  <w:abstractNum w:abstractNumId="4" w15:restartNumberingAfterBreak="0">
+    <w:nsid w:val="7EBB2785"/>
+    <w:multiLevelType w:val="multilevel"/>
+    <w:tmpl w:val="B1FA3C7E"/>
+    <w:lvl w:ilvl="0">
+      <w:start w:val="1"/>
+      <w:numFmt w:val="bullet"/>
+      <w:lvlText w:val=""/>
+      <w:lvlJc w:val="left"/>
+      <w:pPr>
+        <w:tabs>
+          <w:tab w:val="num" w:pos="720"/>
+        </w:tabs>
+        <w:ind w:left="720" w:hanging="360"/>
+      </w:pPr>
+      <w:rPr>
+        <w:rFonts w:ascii="Symbol" w:hAnsi="Symbol" w:hint="default"/>
+        <w:sz w:val="20"/>
+      </w:rPr>
+    </w:lvl>
+    <w:lvl w:ilvl="1" w:tentative="1">
+      <w:start w:val="1"/>
+      <w:numFmt w:val="bullet"/>
+      <w:lvlText w:val="o"/>
+      <w:lvlJc w:val="left"/>
+      <w:pPr>
+        <w:tabs>
+          <w:tab w:val="num" w:pos="1440"/>
+        </w:tabs>
+        <w:ind w:left="1440" w:hanging="360"/>
+      </w:pPr>
+      <w:rPr>
+        <w:rFonts w:ascii="Courier New" w:hAnsi="Courier New" w:hint="default"/>
+        <w:sz w:val="20"/>
+      </w:rPr>
+    </w:lvl>
+    <w:lvl w:ilvl="2" w:tentative="1">
+      <w:start w:val="1"/>
+      <w:numFmt w:val="bullet"/>
+      <w:lvlText w:val=""/>
+      <w:lvlJc w:val="left"/>
+      <w:pPr>
+        <w:tabs>
+          <w:tab w:val="num" w:pos="2160"/>
+        </w:tabs>
+        <w:ind w:left="2160" w:hanging="360"/>
+      </w:pPr>
+      <w:rPr>
+        <w:rFonts w:ascii="Wingdings" w:hAnsi="Wingdings" w:hint="default"/>
+        <w:sz w:val="20"/>
+      </w:rPr>
+    </w:lvl>
+    <w:lvl w:ilvl="3" w:tentative="1">
+      <w:start w:val="1"/>
+      <w:numFmt w:val="bullet"/>
+      <w:lvlText w:val=""/>
+      <w:lvlJc w:val="left"/>
+      <w:pPr>
+        <w:tabs>
+          <w:tab w:val="num" w:pos="2880"/>
+        </w:tabs>
+        <w:ind w:left="2880" w:hanging="360"/>
+      </w:pPr>
+      <w:rPr>
+        <w:rFonts w:ascii="Wingdings" w:hAnsi="Wingdings" w:hint="default"/>
+        <w:sz w:val="20"/>
+      </w:rPr>
+    </w:lvl>
+    <w:lvl w:ilvl="4" w:tentative="1">
+      <w:start w:val="1"/>
+      <w:numFmt w:val="bullet"/>
+      <w:lvlText w:val=""/>
+      <w:lvlJc w:val="left"/>
+      <w:pPr>
+        <w:tabs>
+          <w:tab w:val="num" w:pos="3600"/>
+        </w:tabs>
+        <w:ind w:left="3600" w:hanging="360"/>
+      </w:pPr>
+      <w:rPr>
+        <w:rFonts w:ascii="Wingdings" w:hAnsi="Wingdings" w:hint="default"/>
+        <w:sz w:val="20"/>
+      </w:rPr>
+    </w:lvl>
+    <w:lvl w:ilvl="5" w:tentative="1">
+      <w:start w:val="1"/>
+      <w:numFmt w:val="bullet"/>
+      <w:lvlText w:val=""/>
+      <w:lvlJc w:val="left"/>
+      <w:pPr>
+        <w:tabs>
+          <w:tab w:val="num" w:pos="4320"/>
+        </w:tabs>
+        <w:ind w:left="4320" w:hanging="360"/>
+      </w:pPr>
+      <w:rPr>
+        <w:rFonts w:ascii="Wingdings" w:hAnsi="Wingdings" w:hint="default"/>
+        <w:sz w:val="20"/>
+      </w:rPr>
+    </w:lvl>
+    <w:lvl w:ilvl="6" w:tentative="1">
+      <w:start w:val="1"/>
+      <w:numFmt w:val="bullet"/>
+      <w:lvlText w:val=""/>
+      <w:lvlJc w:val="left"/>
+      <w:pPr>
+        <w:tabs>
+          <w:tab w:val="num" w:pos="5040"/>
+        </w:tabs>
+        <w:ind w:left="5040" w:hanging="360"/>
+      </w:pPr>
+      <w:rPr>
+        <w:rFonts w:ascii="Wingdings" w:hAnsi="Wingdings" w:hint="default"/>
+        <w:sz w:val="20"/>
+      </w:rPr>
+    </w:lvl>
+    <w:lvl w:ilvl="7" w:tentative="1">
+      <w:start w:val="1"/>
+      <w:numFmt w:val="bullet"/>
+      <w:lvlText w:val=""/>
+      <w:lvlJc w:val="left"/>
+      <w:pPr>
+        <w:tabs>
+          <w:tab w:val="num" w:pos="5760"/>
+        </w:tabs>
+        <w:ind w:left="5760" w:hanging="360"/>
+      </w:pPr>
+      <w:rPr>
+        <w:rFonts w:ascii="Wingdings" w:hAnsi="Wingdings" w:hint="default"/>
+        <w:sz w:val="20"/>
+      </w:rPr>
+    </w:lvl>
+    <w:lvl w:ilvl="8" w:tentative="1">
+      <w:start w:val="1"/>
+      <w:numFmt w:val="bullet"/>
+      <w:lvlText w:val=""/>
+      <w:lvlJc w:val="left"/>
+      <w:pPr>
+        <w:tabs>
+          <w:tab w:val="num" w:pos="6480"/>
+        </w:tabs>
+        <w:ind w:left="6480" w:hanging="360"/>
+      </w:pPr>
+      <w:rPr>
+        <w:rFonts w:ascii="Wingdings" w:hAnsi="Wingdings" w:hint="default"/>
+        <w:sz w:val="20"/>
+      </w:rPr>
+    </w:lvl>
+  </w:abstractNum>
+  <w:num w:numId="1" w16cid:durableId="274597745">
+    <w:abstractNumId w:val="4"/>
+  </w:num>
+  <w:num w:numId="2" w16cid:durableId="2100368097">
     <w:abstractNumId w:val="0"/>
   </w:num>
-  <w:num w:numId="2" w16cid:durableId="1273051361">
+  <w:num w:numId="3" w16cid:durableId="751584719">
     <w:abstractNumId w:val="3"/>
   </w:num>
-  <w:num w:numId="3" w16cid:durableId="112795113">
+  <w:num w:numId="4" w16cid:durableId="658463084">
+    <w:abstractNumId w:val="1"/>
+  </w:num>
+  <w:num w:numId="5" w16cid:durableId="568228041">
     <w:abstractNumId w:val="2"/>
-  </w:num>
-  <w:num w:numId="4" w16cid:durableId="502010301">
-    <w:abstractNumId w:val="1"/>
   </w:num>
 </w:numbering>
 </file>

</xml_diff>

<commit_message>
Developer Guide: SelectRow, the dropdown-clearing rule, the two-PC testing log
Co-Authored-By: Claude Opus 5.5 <noreply@anthropic.com>
</commit_message>
<xml_diff>
--- a/docs/Developer Guide.docx
+++ b/docs/Developer Guide.docx
@@ -72,7 +72,7 @@
       <w:pPr>
         <w:pStyle w:val="NormalWeb"/>
         <w:shd w:val="clear" w:color="auto" w:fill="EEF2F8"/>
-        <w:divId w:val="1317999931"/>
+        <w:divId w:val="76832569"/>
         <w:rPr>
           <w:rFonts w:ascii="Calibri" w:hAnsi="Calibri" w:cs="Calibri"/>
           <w:color w:val="404040"/>
@@ -3558,7 +3558,6 @@
           <w:szCs w:val="19"/>
           <w:shd w:val="clear" w:color="auto" w:fill="F2F2F2"/>
         </w:rPr>
-        <w:lastRenderedPageBreak/>
         <w:t>INSERT INTO users (username, password_hash, full_name, level)</w:t>
       </w:r>
     </w:p>
@@ -4457,7 +4456,6 @@
         <w:rPr>
           <w:rFonts w:ascii="Calibri" w:eastAsia="Times New Roman" w:hAnsi="Calibri" w:cs="Calibri"/>
         </w:rPr>
-        <w:lastRenderedPageBreak/>
         <w:t>3.3 Main window</w:t>
       </w:r>
     </w:p>
@@ -5898,7 +5896,6 @@
                 <w:rStyle w:val="HTMLCode"/>
                 <w:color w:val="1A1A1A"/>
               </w:rPr>
-              <w:lastRenderedPageBreak/>
               <w:t>ExcelExport</w:t>
             </w:r>
           </w:p>
@@ -6137,7 +6134,23 @@
                 <w:sz w:val="22"/>
                 <w:szCs w:val="22"/>
               </w:rPr>
-              <w:t xml:space="preserve"> shows the wait cursor.</w:t>
+              <w:t xml:space="preserve"> shows the wait cursor; </w:t>
+            </w:r>
+            <w:r>
+              <w:rPr>
+                <w:rStyle w:val="HTMLCode"/>
+                <w:color w:val="1A1A1A"/>
+              </w:rPr>
+              <w:t>SelectRow</w:t>
+            </w:r>
+            <w:r>
+              <w:rPr>
+                <w:rFonts w:ascii="Calibri" w:eastAsia="Times New Roman" w:hAnsi="Calibri" w:cs="Calibri"/>
+                <w:color w:val="1A1A1A"/>
+                <w:sz w:val="22"/>
+                <w:szCs w:val="22"/>
+              </w:rPr>
+              <w:t xml:space="preserve"> highlights the record just saved after the table reloads.</w:t>
             </w:r>
           </w:p>
         </w:tc>
@@ -6201,6 +6214,46 @@
           <w:shd w:val="clear" w:color="auto" w:fill="F2F2F2"/>
         </w:rPr>
         <w:t>Responsive.OnTypingPause(txtProjectSearch, () =&gt; LoadProjectsAsync());</w:t>
+      </w:r>
+    </w:p>
+    <w:p>
+      <w:pPr>
+        <w:pStyle w:val="NormalWeb"/>
+        <w:rPr>
+          <w:rFonts w:ascii="Calibri" w:hAnsi="Calibri" w:cs="Calibri"/>
+          <w:color w:val="1A1A1A"/>
+          <w:sz w:val="22"/>
+          <w:szCs w:val="22"/>
+        </w:rPr>
+      </w:pPr>
+      <w:r>
+        <w:rPr>
+          <w:rFonts w:ascii="Calibri" w:hAnsi="Calibri" w:cs="Calibri"/>
+          <w:color w:val="1A1A1A"/>
+          <w:sz w:val="22"/>
+          <w:szCs w:val="22"/>
+        </w:rPr>
+        <w:t>and after a save, the reload highlights the saved record again:</w:t>
+      </w:r>
+    </w:p>
+    <w:p>
+      <w:pPr>
+        <w:pStyle w:val="HTMLPreformatted"/>
+        <w:rPr>
+          <w:color w:val="1A1A1A"/>
+          <w:sz w:val="19"/>
+          <w:szCs w:val="19"/>
+          <w:shd w:val="clear" w:color="auto" w:fill="F2F2F2"/>
+        </w:rPr>
+      </w:pPr>
+      <w:r>
+        <w:rPr>
+          <w:color w:val="1A1A1A"/>
+          <w:sz w:val="19"/>
+          <w:szCs w:val="19"/>
+          <w:shd w:val="clear" w:color="auto" w:fill="F2F2F2"/>
+        </w:rPr>
+        <w:t>Responsive.SelectRow(dgvProjects, (ProjectRow row) =&gt; row.ProjectId == id);</w:t>
       </w:r>
     </w:p>
     <w:p>
@@ -6294,71 +6347,39 @@
           <w:sz w:val="22"/>
           <w:szCs w:val="22"/>
         </w:rPr>
-        <w:t>Control names follow the UI Elements Guide (</w:t>
+        <w:t xml:space="preserve">To clear a dropdown, set </w:t>
       </w:r>
       <w:r>
         <w:rPr>
           <w:rStyle w:val="HTMLCode"/>
           <w:color w:val="1A1A1A"/>
         </w:rPr>
-        <w:t>btn</w:t>
-      </w:r>
-      <w:r>
-        <w:rPr>
-          <w:rFonts w:ascii="Calibri" w:eastAsia="Times New Roman" w:hAnsi="Calibri" w:cs="Calibri"/>
-          <w:color w:val="1A1A1A"/>
-          <w:sz w:val="22"/>
-          <w:szCs w:val="22"/>
-        </w:rPr>
-        <w:t xml:space="preserve">, </w:t>
+        <w:t>SelectedIndex = -1</w:t>
+      </w:r>
+      <w:r>
+        <w:rPr>
+          <w:rFonts w:ascii="Calibri" w:eastAsia="Times New Roman" w:hAnsi="Calibri" w:cs="Calibri"/>
+          <w:color w:val="1A1A1A"/>
+          <w:sz w:val="22"/>
+          <w:szCs w:val="22"/>
+        </w:rPr>
+        <w:t xml:space="preserve">, not </w:t>
       </w:r>
       <w:r>
         <w:rPr>
           <w:rStyle w:val="HTMLCode"/>
           <w:color w:val="1A1A1A"/>
         </w:rPr>
-        <w:t>txt</w:t>
-      </w:r>
-      <w:r>
-        <w:rPr>
-          <w:rFonts w:ascii="Calibri" w:eastAsia="Times New Roman" w:hAnsi="Calibri" w:cs="Calibri"/>
-          <w:color w:val="1A1A1A"/>
-          <w:sz w:val="22"/>
-          <w:szCs w:val="22"/>
-        </w:rPr>
-        <w:t xml:space="preserve">, </w:t>
-      </w:r>
-      <w:r>
-        <w:rPr>
-          <w:rStyle w:val="HTMLCode"/>
-          <w:color w:val="1A1A1A"/>
-        </w:rPr>
-        <w:t>cbo</w:t>
-      </w:r>
-      <w:r>
-        <w:rPr>
-          <w:rFonts w:ascii="Calibri" w:eastAsia="Times New Roman" w:hAnsi="Calibri" w:cs="Calibri"/>
-          <w:color w:val="1A1A1A"/>
-          <w:sz w:val="22"/>
-          <w:szCs w:val="22"/>
-        </w:rPr>
-        <w:t xml:space="preserve">, </w:t>
-      </w:r>
-      <w:r>
-        <w:rPr>
-          <w:rStyle w:val="HTMLCode"/>
-          <w:color w:val="1A1A1A"/>
-        </w:rPr>
-        <w:t>dgv</w:t>
-      </w:r>
-      <w:r>
-        <w:rPr>
-          <w:rFonts w:ascii="Calibri" w:eastAsia="Times New Roman" w:hAnsi="Calibri" w:cs="Calibri"/>
-          <w:color w:val="1A1A1A"/>
-          <w:sz w:val="22"/>
-          <w:szCs w:val="22"/>
-        </w:rPr>
-        <w:t>...).</w:t>
+        <w:t>Text = ""</w:t>
+      </w:r>
+      <w:r>
+        <w:rPr>
+          <w:rFonts w:ascii="Calibri" w:eastAsia="Times New Roman" w:hAnsi="Calibri" w:cs="Calibri"/>
+          <w:color w:val="1A1A1A"/>
+          <w:sz w:val="22"/>
+          <w:szCs w:val="22"/>
+        </w:rPr>
+        <w:t>. Clearing only the text keeps the old choice selected underneath, and picking it again doesn't register (bug fixed on the Materials form).</w:t>
       </w:r>
     </w:p>
     <w:p>
@@ -6382,7 +6403,71 @@
           <w:sz w:val="22"/>
           <w:szCs w:val="22"/>
         </w:rPr>
-        <w:t>Screens stay plain, default WinForms until they are styled from the Figma design.</w:t>
+        <w:t>Control names follow the UI Elements Guide (</w:t>
+      </w:r>
+      <w:r>
+        <w:rPr>
+          <w:rStyle w:val="HTMLCode"/>
+          <w:color w:val="1A1A1A"/>
+        </w:rPr>
+        <w:t>btn</w:t>
+      </w:r>
+      <w:r>
+        <w:rPr>
+          <w:rFonts w:ascii="Calibri" w:eastAsia="Times New Roman" w:hAnsi="Calibri" w:cs="Calibri"/>
+          <w:color w:val="1A1A1A"/>
+          <w:sz w:val="22"/>
+          <w:szCs w:val="22"/>
+        </w:rPr>
+        <w:t xml:space="preserve">, </w:t>
+      </w:r>
+      <w:r>
+        <w:rPr>
+          <w:rStyle w:val="HTMLCode"/>
+          <w:color w:val="1A1A1A"/>
+        </w:rPr>
+        <w:t>txt</w:t>
+      </w:r>
+      <w:r>
+        <w:rPr>
+          <w:rFonts w:ascii="Calibri" w:eastAsia="Times New Roman" w:hAnsi="Calibri" w:cs="Calibri"/>
+          <w:color w:val="1A1A1A"/>
+          <w:sz w:val="22"/>
+          <w:szCs w:val="22"/>
+        </w:rPr>
+        <w:t xml:space="preserve">, </w:t>
+      </w:r>
+      <w:r>
+        <w:rPr>
+          <w:rStyle w:val="HTMLCode"/>
+          <w:color w:val="1A1A1A"/>
+        </w:rPr>
+        <w:t>cbo</w:t>
+      </w:r>
+      <w:r>
+        <w:rPr>
+          <w:rFonts w:ascii="Calibri" w:eastAsia="Times New Roman" w:hAnsi="Calibri" w:cs="Calibri"/>
+          <w:color w:val="1A1A1A"/>
+          <w:sz w:val="22"/>
+          <w:szCs w:val="22"/>
+        </w:rPr>
+        <w:t xml:space="preserve">, </w:t>
+      </w:r>
+      <w:r>
+        <w:rPr>
+          <w:rStyle w:val="HTMLCode"/>
+          <w:color w:val="1A1A1A"/>
+        </w:rPr>
+        <w:t>dgv</w:t>
+      </w:r>
+      <w:r>
+        <w:rPr>
+          <w:rFonts w:ascii="Calibri" w:eastAsia="Times New Roman" w:hAnsi="Calibri" w:cs="Calibri"/>
+          <w:color w:val="1A1A1A"/>
+          <w:sz w:val="22"/>
+          <w:szCs w:val="22"/>
+        </w:rPr>
+        <w:t>...).</w:t>
       </w:r>
     </w:p>
     <w:p>
@@ -6406,124 +6491,77 @@
           <w:sz w:val="22"/>
           <w:szCs w:val="22"/>
         </w:rPr>
-        <w:t xml:space="preserve">Big </w:t>
-      </w:r>
-      <w:r>
-        <w:rPr>
-          <w:rStyle w:val="HTMLCode"/>
-          <w:color w:val="1A1A1A"/>
-        </w:rPr>
-        <w:t>.Designer.cs</w:t>
-      </w:r>
-      <w:r>
-        <w:rPr>
-          <w:rFonts w:ascii="Calibri" w:eastAsia="Times New Roman" w:hAnsi="Calibri" w:cs="Calibri"/>
-          <w:color w:val="1A1A1A"/>
-          <w:sz w:val="22"/>
-          <w:szCs w:val="22"/>
-        </w:rPr>
-        <w:t xml:space="preserve"> files can be generated once with </w:t>
-      </w:r>
-      <w:r>
-        <w:rPr>
-          <w:rStyle w:val="HTMLCode"/>
-          <w:color w:val="1A1A1A"/>
-        </w:rPr>
-        <w:t>docs/_tools/designer-gen</w:t>
-      </w:r>
-      <w:r>
-        <w:rPr>
-          <w:rFonts w:ascii="Calibri" w:eastAsia="Times New Roman" w:hAnsi="Calibri" w:cs="Calibri"/>
-          <w:color w:val="1A1A1A"/>
-          <w:sz w:val="22"/>
-          <w:szCs w:val="22"/>
-        </w:rPr>
-        <w:t>. Never regenerate a form after it has been edited in Visual Studio's designer.</w:t>
+        <w:t>Screens stay plain, default WinForms until they are styled from the Figma design.</w:t>
       </w:r>
     </w:p>
     <w:p>
       <w:pPr>
-        <w:pStyle w:val="Heading1"/>
-        <w:rPr>
-          <w:rFonts w:ascii="Calibri" w:eastAsia="Times New Roman" w:hAnsi="Calibri" w:cs="Calibri"/>
-        </w:rPr>
-      </w:pPr>
-      <w:r>
-        <w:rPr>
-          <w:rFonts w:ascii="Calibri" w:eastAsia="Times New Roman" w:hAnsi="Calibri" w:cs="Calibri"/>
-        </w:rPr>
-        <w:t>Chapter 4: Login &amp; Security (Part 0)</w:t>
+        <w:numPr>
+          <w:ilvl w:val="0"/>
+          <w:numId w:val="3"/>
+        </w:numPr>
+        <w:spacing w:before="100" w:beforeAutospacing="1" w:after="100" w:afterAutospacing="1"/>
+        <w:rPr>
+          <w:rFonts w:ascii="Calibri" w:eastAsia="Times New Roman" w:hAnsi="Calibri" w:cs="Calibri"/>
+          <w:color w:val="1A1A1A"/>
+          <w:sz w:val="22"/>
+          <w:szCs w:val="22"/>
+        </w:rPr>
+      </w:pPr>
+      <w:r>
+        <w:rPr>
+          <w:rFonts w:ascii="Calibri" w:eastAsia="Times New Roman" w:hAnsi="Calibri" w:cs="Calibri"/>
+          <w:color w:val="1A1A1A"/>
+          <w:sz w:val="22"/>
+          <w:szCs w:val="22"/>
+        </w:rPr>
+        <w:t xml:space="preserve">Big </w:t>
+      </w:r>
+      <w:r>
+        <w:rPr>
+          <w:rStyle w:val="HTMLCode"/>
+          <w:color w:val="1A1A1A"/>
+        </w:rPr>
+        <w:t>.Designer.cs</w:t>
+      </w:r>
+      <w:r>
+        <w:rPr>
+          <w:rFonts w:ascii="Calibri" w:eastAsia="Times New Roman" w:hAnsi="Calibri" w:cs="Calibri"/>
+          <w:color w:val="1A1A1A"/>
+          <w:sz w:val="22"/>
+          <w:szCs w:val="22"/>
+        </w:rPr>
+        <w:t xml:space="preserve"> files can be generated once with </w:t>
+      </w:r>
+      <w:r>
+        <w:rPr>
+          <w:rStyle w:val="HTMLCode"/>
+          <w:color w:val="1A1A1A"/>
+        </w:rPr>
+        <w:t>docs/_tools/designer-gen</w:t>
+      </w:r>
+      <w:r>
+        <w:rPr>
+          <w:rFonts w:ascii="Calibri" w:eastAsia="Times New Roman" w:hAnsi="Calibri" w:cs="Calibri"/>
+          <w:color w:val="1A1A1A"/>
+          <w:sz w:val="22"/>
+          <w:szCs w:val="22"/>
+        </w:rPr>
+        <w:t>. Never regenerate a form after it has been edited in Visual Studio's designer.</w:t>
       </w:r>
     </w:p>
     <w:p>
       <w:pPr>
-        <w:pStyle w:val="NormalWeb"/>
-        <w:rPr>
-          <w:rFonts w:ascii="Calibri" w:hAnsi="Calibri" w:cs="Calibri"/>
-          <w:color w:val="1A1A1A"/>
-          <w:sz w:val="22"/>
-          <w:szCs w:val="22"/>
-        </w:rPr>
-      </w:pPr>
-      <w:r>
-        <w:rPr>
-          <w:rStyle w:val="Strong"/>
-          <w:rFonts w:ascii="Calibri" w:hAnsi="Calibri" w:cs="Calibri"/>
-          <w:color w:val="1A1A1A"/>
-          <w:sz w:val="22"/>
-          <w:szCs w:val="22"/>
-        </w:rPr>
-        <w:t>Sign-in.</w:t>
-      </w:r>
-      <w:r>
-        <w:rPr>
-          <w:rFonts w:ascii="Calibri" w:hAnsi="Calibri" w:cs="Calibri"/>
-          <w:color w:val="1A1A1A"/>
-          <w:sz w:val="22"/>
-          <w:szCs w:val="22"/>
-        </w:rPr>
-        <w:t xml:space="preserve"> Usernames ignore capital letters. 5 wrong passwords lock the account until an Admin unlocks it. Every sign-in, sign-out, failure, lock and password change goes to </w:t>
-      </w:r>
-      <w:r>
-        <w:rPr>
-          <w:rStyle w:val="HTMLCode"/>
-          <w:color w:val="1A1A1A"/>
-        </w:rPr>
-        <w:t>login_logs</w:t>
-      </w:r>
-      <w:r>
-        <w:rPr>
-          <w:rFonts w:ascii="Calibri" w:hAnsi="Calibri" w:cs="Calibri"/>
-          <w:color w:val="1A1A1A"/>
-          <w:sz w:val="22"/>
-          <w:szCs w:val="22"/>
-        </w:rPr>
-        <w:t xml:space="preserve"> with the PC name. After 5 minutes without activity a "</w:t>
-      </w:r>
-      <w:r>
-        <w:rPr>
-          <w:rFonts w:ascii="Calibri" w:hAnsi="Calibri" w:cs="Calibri"/>
-          <w:color w:val="1A1A1A"/>
-          <w:sz w:val="22"/>
-          <w:szCs w:val="22"/>
-        </w:rPr>
-        <w:t xml:space="preserve">Still there?" popup appears, and the app signs out by itself after 60 more seconds. In Debug builds, the </w:t>
-      </w:r>
-      <w:r>
-        <w:rPr>
-          <w:rStyle w:val="HTMLCode"/>
-          <w:color w:val="1A1A1A"/>
-        </w:rPr>
-        <w:t>TRISTONE_IDLE_SECONDS</w:t>
-      </w:r>
-      <w:r>
-        <w:rPr>
-          <w:rFonts w:ascii="Calibri" w:hAnsi="Calibri" w:cs="Calibri"/>
-          <w:color w:val="1A1A1A"/>
-          <w:sz w:val="22"/>
-          <w:szCs w:val="22"/>
-        </w:rPr>
-        <w:t xml:space="preserve"> environment variable shortens the wait for testing.</w:t>
+        <w:pStyle w:val="Heading1"/>
+        <w:rPr>
+          <w:rFonts w:ascii="Calibri" w:eastAsia="Times New Roman" w:hAnsi="Calibri" w:cs="Calibri"/>
+        </w:rPr>
+      </w:pPr>
+      <w:r>
+        <w:rPr>
+          <w:rFonts w:ascii="Calibri" w:eastAsia="Times New Roman" w:hAnsi="Calibri" w:cs="Calibri"/>
+        </w:rPr>
+        <w:t>Chapter 4: Login &amp; Security (Part 0)</w:t>
       </w:r>
     </w:p>
     <w:p>
@@ -6544,54 +6582,57 @@
           <w:sz w:val="22"/>
           <w:szCs w:val="22"/>
         </w:rPr>
-        <w:t>Passwords.</w:t>
-      </w:r>
-      <w:r>
-        <w:rPr>
-          <w:rFonts w:ascii="Calibri" w:hAnsi="Calibri" w:cs="Calibri"/>
-          <w:color w:val="1A1A1A"/>
-          <w:sz w:val="22"/>
-          <w:szCs w:val="22"/>
-        </w:rPr>
-        <w:t xml:space="preserve"> Only Admins create accounts and set passwords. Rules: 8+ characters with a letter and a number. </w:t>
-      </w:r>
-      <w:r>
-        <w:rPr>
-          <w:rStyle w:val="Strong"/>
-          <w:rFonts w:ascii="Calibri" w:hAnsi="Calibri" w:cs="Calibri"/>
-          <w:color w:val="1A1A1A"/>
-          <w:sz w:val="22"/>
-          <w:szCs w:val="22"/>
-        </w:rPr>
-        <w:t>Forgot Password</w:t>
-      </w:r>
-      <w:r>
-        <w:rPr>
-          <w:rFonts w:ascii="Calibri" w:hAnsi="Calibri" w:cs="Calibri"/>
-          <w:color w:val="1A1A1A"/>
-          <w:sz w:val="22"/>
-          <w:szCs w:val="22"/>
-        </w:rPr>
-        <w:t xml:space="preserve"> sends a request to the Admins, who set a new password and give it in person. An Admin who forgets answers their own security question (set in </w:t>
-      </w:r>
-      <w:r>
-        <w:rPr>
-          <w:rStyle w:val="Strong"/>
-          <w:rFonts w:ascii="Calibri" w:hAnsi="Calibri" w:cs="Calibri"/>
-          <w:color w:val="1A1A1A"/>
-          <w:sz w:val="22"/>
-          <w:szCs w:val="22"/>
-        </w:rPr>
-        <w:t>My Account</w:t>
-      </w:r>
-      <w:r>
-        <w:rPr>
-          <w:rFonts w:ascii="Calibri" w:hAnsi="Calibri" w:cs="Calibri"/>
-          <w:color w:val="1A1A1A"/>
-          <w:sz w:val="22"/>
-          <w:szCs w:val="22"/>
-        </w:rPr>
-        <w:t>).</w:t>
+        <w:t>Sign-in.</w:t>
+      </w:r>
+      <w:r>
+        <w:rPr>
+          <w:rFonts w:ascii="Calibri" w:hAnsi="Calibri" w:cs="Calibri"/>
+          <w:color w:val="1A1A1A"/>
+          <w:sz w:val="22"/>
+          <w:szCs w:val="22"/>
+        </w:rPr>
+        <w:t xml:space="preserve"> Usernames ignore capital letters. 5 wrong passwords lock the account until an Admin unlocks it. Every sign-in, sign-out, failure, lock and password change goes to </w:t>
+      </w:r>
+      <w:r>
+        <w:rPr>
+          <w:rStyle w:val="HTMLCode"/>
+          <w:color w:val="1A1A1A"/>
+        </w:rPr>
+        <w:t>login_logs</w:t>
+      </w:r>
+      <w:r>
+        <w:rPr>
+          <w:rFonts w:ascii="Calibri" w:hAnsi="Calibri" w:cs="Calibri"/>
+          <w:color w:val="1A1A1A"/>
+          <w:sz w:val="22"/>
+          <w:szCs w:val="22"/>
+        </w:rPr>
+        <w:t xml:space="preserve"> with the PC name. After 5 minutes without activity a "Still there?" popup appears, and the app signs out by itself after 60 more seconds. In Debug builds, the </w:t>
+      </w:r>
+      <w:r>
+        <w:rPr>
+          <w:rStyle w:val="HTMLCode"/>
+          <w:color w:val="1A1A1A"/>
+        </w:rPr>
+        <w:t>TRISTONE_IDLE_SECONDS</w:t>
+      </w:r>
+      <w:r>
+        <w:rPr>
+          <w:rFonts w:ascii="Calibri" w:hAnsi="Calibri" w:cs="Calibri"/>
+          <w:color w:val="1A1A1A"/>
+          <w:sz w:val="22"/>
+          <w:szCs w:val="22"/>
+        </w:rPr>
+        <w:t xml:space="preserve"> </w:t>
+      </w:r>
+      <w:r>
+        <w:rPr>
+          <w:rFonts w:ascii="Calibri" w:hAnsi="Calibri" w:cs="Calibri"/>
+          <w:color w:val="1A1A1A"/>
+          <w:sz w:val="22"/>
+          <w:szCs w:val="22"/>
+        </w:rPr>
+        <w:t>environment variable shortens the wait for testing.</w:t>
       </w:r>
     </w:p>
     <w:p>
@@ -6612,6 +6653,74 @@
           <w:sz w:val="22"/>
           <w:szCs w:val="22"/>
         </w:rPr>
+        <w:t>Passwords.</w:t>
+      </w:r>
+      <w:r>
+        <w:rPr>
+          <w:rFonts w:ascii="Calibri" w:hAnsi="Calibri" w:cs="Calibri"/>
+          <w:color w:val="1A1A1A"/>
+          <w:sz w:val="22"/>
+          <w:szCs w:val="22"/>
+        </w:rPr>
+        <w:t xml:space="preserve"> Only Admins create accounts and set passwords. Rules: 8+ characters with a letter and a number. </w:t>
+      </w:r>
+      <w:r>
+        <w:rPr>
+          <w:rStyle w:val="Strong"/>
+          <w:rFonts w:ascii="Calibri" w:hAnsi="Calibri" w:cs="Calibri"/>
+          <w:color w:val="1A1A1A"/>
+          <w:sz w:val="22"/>
+          <w:szCs w:val="22"/>
+        </w:rPr>
+        <w:t>Forgot Password</w:t>
+      </w:r>
+      <w:r>
+        <w:rPr>
+          <w:rFonts w:ascii="Calibri" w:hAnsi="Calibri" w:cs="Calibri"/>
+          <w:color w:val="1A1A1A"/>
+          <w:sz w:val="22"/>
+          <w:szCs w:val="22"/>
+        </w:rPr>
+        <w:t xml:space="preserve"> sends a request to the Admins, who set a new password and give it in person. An Admin who forgets answers their own security question (set in </w:t>
+      </w:r>
+      <w:r>
+        <w:rPr>
+          <w:rStyle w:val="Strong"/>
+          <w:rFonts w:ascii="Calibri" w:hAnsi="Calibri" w:cs="Calibri"/>
+          <w:color w:val="1A1A1A"/>
+          <w:sz w:val="22"/>
+          <w:szCs w:val="22"/>
+        </w:rPr>
+        <w:t>My Account</w:t>
+      </w:r>
+      <w:r>
+        <w:rPr>
+          <w:rFonts w:ascii="Calibri" w:hAnsi="Calibri" w:cs="Calibri"/>
+          <w:color w:val="1A1A1A"/>
+          <w:sz w:val="22"/>
+          <w:szCs w:val="22"/>
+        </w:rPr>
+        <w:t>).</w:t>
+      </w:r>
+    </w:p>
+    <w:p>
+      <w:pPr>
+        <w:pStyle w:val="NormalWeb"/>
+        <w:rPr>
+          <w:rFonts w:ascii="Calibri" w:hAnsi="Calibri" w:cs="Calibri"/>
+          <w:color w:val="1A1A1A"/>
+          <w:sz w:val="22"/>
+          <w:szCs w:val="22"/>
+        </w:rPr>
+      </w:pPr>
+      <w:r>
+        <w:rPr>
+          <w:rStyle w:val="Strong"/>
+          <w:rFonts w:ascii="Calibri" w:hAnsi="Calibri" w:cs="Calibri"/>
+          <w:color w:val="1A1A1A"/>
+          <w:sz w:val="22"/>
+          <w:szCs w:val="22"/>
+        </w:rPr>
         <w:t>User Accounts</w:t>
       </w:r>
       <w:r>
@@ -6621,16 +6730,16 @@
           <w:sz w:val="22"/>
           <w:szCs w:val="22"/>
         </w:rPr>
-        <w:t xml:space="preserve"> </w:t>
-      </w:r>
-      <w:r>
-        <w:rPr>
-          <w:rFonts w:ascii="Calibri" w:hAnsi="Calibri" w:cs="Calibri"/>
-          <w:color w:val="1A1A1A"/>
-          <w:sz w:val="22"/>
-          <w:szCs w:val="22"/>
-        </w:rPr>
-        <w:t>(Admin only). Every login belongs to one Active office employee and takes its name and department from them. Administration staff only get Admin logins. You can't disable yourself or remove your own Admin level, and the last active Admin is protected.</w:t>
+        <w:t xml:space="preserve"> (Admin only). Every login belongs to one Active office employee and takes its name and department from them. Administration staff only get Admin logins. You can'</w:t>
+      </w:r>
+      <w:r>
+        <w:rPr>
+          <w:rFonts w:ascii="Calibri" w:hAnsi="Calibri" w:cs="Calibri"/>
+          <w:color w:val="1A1A1A"/>
+          <w:sz w:val="22"/>
+          <w:szCs w:val="22"/>
+        </w:rPr>
+        <w:t>t disable yourself or remove your own Admin level, and the last active Admin is protected.</w:t>
       </w:r>
     </w:p>
     <w:p>
@@ -6857,16 +6966,7 @@
           <w:sz w:val="22"/>
           <w:szCs w:val="22"/>
         </w:rPr>
-        <w:t>, and overhead counts by its own date. Supervisors only see their own department'</w:t>
-      </w:r>
-      <w:r>
-        <w:rPr>
-          <w:rFonts w:ascii="Calibri" w:hAnsi="Calibri" w:cs="Calibri"/>
-          <w:color w:val="1A1A1A"/>
-          <w:sz w:val="22"/>
-          <w:szCs w:val="22"/>
-        </w:rPr>
-        <w:t xml:space="preserve">s expenses; revenue and net are hidden from them. The chart is ScottPlot (NuGet </w:t>
+        <w:t xml:space="preserve">, and overhead counts by its own date. Supervisors only see their own department's expenses; revenue and net are hidden from them. The chart is ScottPlot (NuGet </w:t>
       </w:r>
       <w:r>
         <w:rPr>
@@ -6912,7 +7012,13 @@
         <w:rPr>
           <w:rFonts w:ascii="Calibri" w:eastAsia="Times New Roman" w:hAnsi="Calibri" w:cs="Calibri"/>
         </w:rPr>
-        <w:t>Chapter 6: HR &amp; Payroll (Part 2)</w:t>
+        <w:t xml:space="preserve">Chapter 6: HR </w:t>
+      </w:r>
+      <w:r>
+        <w:rPr>
+          <w:rFonts w:ascii="Calibri" w:eastAsia="Times New Roman" w:hAnsi="Calibri" w:cs="Calibri"/>
+        </w:rPr>
+        <w:t>&amp; Payroll (Part 2)</w:t>
       </w:r>
     </w:p>
     <w:p>
@@ -6988,7 +7094,16 @@
           <w:sz w:val="22"/>
           <w:szCs w:val="22"/>
         </w:rPr>
-        <w:t xml:space="preserve"> Attendance (waiting for the fingerprint scanner's sample export file), Payroll, Cash Advances, Payslips.</w:t>
+        <w:t xml:space="preserve"> Attendance (waiting for the fingerprint scanner'</w:t>
+      </w:r>
+      <w:r>
+        <w:rPr>
+          <w:rFonts w:ascii="Calibri" w:hAnsi="Calibri" w:cs="Calibri"/>
+          <w:color w:val="1A1A1A"/>
+          <w:sz w:val="22"/>
+          <w:szCs w:val="22"/>
+        </w:rPr>
+        <w:t>s sample export file), Payroll, Cash Advances, Payslips.</w:t>
       </w:r>
     </w:p>
     <w:p>
@@ -7070,16 +7185,7 @@
           <w:sz w:val="22"/>
           <w:szCs w:val="22"/>
         </w:rPr>
-        <w:t xml:space="preserve"> </w:t>
-      </w:r>
-      <w:r>
-        <w:rPr>
-          <w:rFonts w:ascii="Calibri" w:eastAsia="Times New Roman" w:hAnsi="Calibri" w:cs="Calibri"/>
-          <w:color w:val="1A1A1A"/>
-          <w:sz w:val="22"/>
-          <w:szCs w:val="22"/>
-        </w:rPr>
-        <w:t>the Employee records, the Supervisor approves. Then the stock drops and the cost goes to the project.</w:t>
+        <w:t xml:space="preserve"> the Employee records, the Supervisor approves. Then the stock drops and the cost goes to the project.</w:t>
       </w:r>
     </w:p>
     <w:p>
@@ -7147,7 +7253,16 @@
           <w:sz w:val="22"/>
           <w:szCs w:val="22"/>
         </w:rPr>
-        <w:t xml:space="preserve"> no approval needed. Each needs a scan, or "physical copy only" with where the paper is filed. Receipts shows them as "Stock purchase" without copying them, so they are never counted twice.</w:t>
+        <w:t xml:space="preserve"> no approval needed. Each needs a scan, or "physical copy only" </w:t>
+      </w:r>
+      <w:r>
+        <w:rPr>
+          <w:rFonts w:ascii="Calibri" w:eastAsia="Times New Roman" w:hAnsi="Calibri" w:cs="Calibri"/>
+          <w:color w:val="1A1A1A"/>
+          <w:sz w:val="22"/>
+          <w:szCs w:val="22"/>
+        </w:rPr>
+        <w:t>with where the paper is filed. Receipts shows them as "Stock purchase" without copying them, so they are never counted twice.</w:t>
       </w:r>
     </w:p>
     <w:p>
@@ -7306,7 +7421,16 @@
           <w:sz w:val="22"/>
           <w:szCs w:val="22"/>
         </w:rPr>
-        <w:t xml:space="preserve"> the Employee marks a stage reached and prepares the voucher (SV-0001...), the Supervisor approves, then the payout is recorded. Once billing starts, the amount and stages are locked.</w:t>
+        <w:t xml:space="preserve"> </w:t>
+      </w:r>
+      <w:r>
+        <w:rPr>
+          <w:rFonts w:ascii="Calibri" w:eastAsia="Times New Roman" w:hAnsi="Calibri" w:cs="Calibri"/>
+          <w:color w:val="1A1A1A"/>
+          <w:sz w:val="22"/>
+          <w:szCs w:val="22"/>
+        </w:rPr>
+        <w:t>the Employee marks a stage reached and prepares the voucher (SV-0001...), the Supervisor approves, then the payout is recorded. Once billing starts, the amount and stages are locked.</w:t>
       </w:r>
     </w:p>
     <w:p>
@@ -7340,16 +7464,7 @@
           <w:sz w:val="22"/>
           <w:szCs w:val="22"/>
         </w:rPr>
-        <w:t xml:space="preserve"> is released only when the job is 100% done an</w:t>
-      </w:r>
-      <w:r>
-        <w:rPr>
-          <w:rFonts w:ascii="Calibri" w:eastAsia="Times New Roman" w:hAnsi="Calibri" w:cs="Calibri"/>
-          <w:color w:val="1A1A1A"/>
-          <w:sz w:val="22"/>
-          <w:szCs w:val="22"/>
-        </w:rPr>
-        <w:t>d every stage is paid.</w:t>
+        <w:t xml:space="preserve"> is released only when the job is 100% done and every stage is paid.</w:t>
       </w:r>
     </w:p>
     <w:p>
@@ -7555,16 +7670,7 @@
           <w:sz w:val="22"/>
           <w:szCs w:val="22"/>
         </w:rPr>
-        <w:t>. On approval the cost change is added to the project'</w:t>
-      </w:r>
-      <w:r>
-        <w:rPr>
-          <w:rFonts w:ascii="Calibri" w:eastAsia="Times New Roman" w:hAnsi="Calibri" w:cs="Calibri"/>
-          <w:color w:val="1A1A1A"/>
-          <w:sz w:val="22"/>
-          <w:szCs w:val="22"/>
-        </w:rPr>
-        <w:t>s revenue and the days move its target end date.</w:t>
+        <w:t>. On approval the cost change is added to the project's revenue and the days move its target end date.</w:t>
       </w:r>
     </w:p>
     <w:p>
@@ -7619,6 +7725,61 @@
           <w:rFonts w:ascii="Calibri" w:eastAsia="Times New Roman" w:hAnsi="Calibri" w:cs="Calibri"/>
         </w:rPr>
         <w:t>Chapter 10: Testing</w:t>
+      </w:r>
+    </w:p>
+    <w:p>
+      <w:pPr>
+        <w:pStyle w:val="NormalWeb"/>
+        <w:rPr>
+          <w:rFonts w:ascii="Calibri" w:hAnsi="Calibri" w:cs="Calibri"/>
+          <w:color w:val="1A1A1A"/>
+          <w:sz w:val="22"/>
+          <w:szCs w:val="22"/>
+        </w:rPr>
+      </w:pPr>
+      <w:r>
+        <w:rPr>
+          <w:rStyle w:val="Strong"/>
+          <w:rFonts w:ascii="Calibri" w:hAnsi="Calibri" w:cs="Calibri"/>
+          <w:color w:val="1A1A1A"/>
+          <w:sz w:val="22"/>
+          <w:szCs w:val="22"/>
+        </w:rPr>
+        <w:t>Two PCs.</w:t>
+      </w:r>
+      <w:r>
+        <w:rPr>
+          <w:rFonts w:ascii="Calibri" w:hAnsi="Calibri" w:cs="Calibri"/>
+          <w:color w:val="1A1A1A"/>
+          <w:sz w:val="22"/>
+          <w:szCs w:val="22"/>
+        </w:rPr>
+        <w:t xml:space="preserve"> </w:t>
+      </w:r>
+      <w:r>
+        <w:rPr>
+          <w:rFonts w:ascii="Calibri" w:hAnsi="Calibri" w:cs="Calibri"/>
+          <w:color w:val="1A1A1A"/>
+          <w:sz w:val="22"/>
+          <w:szCs w:val="22"/>
+        </w:rPr>
+        <w:t xml:space="preserve">The home PC has the real database. The work PC has its own fresh database with test data only. Every test run on the work PC is written in </w:t>
+      </w:r>
+      <w:r>
+        <w:rPr>
+          <w:rStyle w:val="HTMLCode"/>
+          <w:color w:val="1A1A1A"/>
+        </w:rPr>
+        <w:t>docs\Testing Log.md</w:t>
+      </w:r>
+      <w:r>
+        <w:rPr>
+          <w:rFonts w:ascii="Calibri" w:hAnsi="Calibri" w:cs="Calibri"/>
+          <w:color w:val="1A1A1A"/>
+          <w:sz w:val="22"/>
+          <w:szCs w:val="22"/>
+        </w:rPr>
+        <w:t>, and anything that still needs the real data is listed there under "Check at home".</w:t>
       </w:r>
     </w:p>
     <w:p>
@@ -7685,7 +7846,7 @@
         <w:tblLook w:val="04A0" w:firstRow="1" w:lastRow="0" w:firstColumn="1" w:lastColumn="0" w:noHBand="0" w:noVBand="1"/>
       </w:tblPr>
       <w:tblGrid>
-        <w:gridCol w:w="5438"/>
+        <w:gridCol w:w="5480"/>
         <w:gridCol w:w="1552"/>
       </w:tblGrid>
       <w:tr>
@@ -8401,6 +8562,84 @@
                 <w:szCs w:val="22"/>
               </w:rPr>
               <w:t>24</w:t>
+            </w:r>
+          </w:p>
+        </w:tc>
+      </w:tr>
+      <w:tr>
+        <w:tc>
+          <w:tcPr>
+            <w:tcW w:w="0" w:type="auto"/>
+            <w:tcBorders>
+              <w:top w:val="single" w:sz="6" w:space="0" w:color="BFBFBF"/>
+              <w:left w:val="single" w:sz="6" w:space="0" w:color="BFBFBF"/>
+              <w:bottom w:val="single" w:sz="6" w:space="0" w:color="BFBFBF"/>
+              <w:right w:val="single" w:sz="6" w:space="0" w:color="BFBFBF"/>
+            </w:tcBorders>
+            <w:tcMar>
+              <w:top w:w="60" w:type="dxa"/>
+              <w:left w:w="120" w:type="dxa"/>
+              <w:bottom w:w="60" w:type="dxa"/>
+              <w:right w:w="120" w:type="dxa"/>
+            </w:tcMar>
+            <w:hideMark/>
+          </w:tcPr>
+          <w:p>
+            <w:pPr>
+              <w:spacing w:before="120" w:after="120"/>
+              <w:rPr>
+                <w:rFonts w:ascii="Calibri" w:eastAsia="Times New Roman" w:hAnsi="Calibri" w:cs="Calibri"/>
+                <w:color w:val="1A1A1A"/>
+                <w:sz w:val="22"/>
+                <w:szCs w:val="22"/>
+              </w:rPr>
+            </w:pPr>
+            <w:r>
+              <w:rPr>
+                <w:rFonts w:ascii="Calibri" w:eastAsia="Times New Roman" w:hAnsi="Calibri" w:cs="Calibri"/>
+                <w:color w:val="1A1A1A"/>
+                <w:sz w:val="22"/>
+                <w:szCs w:val="22"/>
+              </w:rPr>
+              <w:t>Row re-select after saving (Projects, Materials, Employees)</w:t>
+            </w:r>
+          </w:p>
+        </w:tc>
+        <w:tc>
+          <w:tcPr>
+            <w:tcW w:w="0" w:type="auto"/>
+            <w:tcBorders>
+              <w:top w:val="single" w:sz="6" w:space="0" w:color="BFBFBF"/>
+              <w:left w:val="single" w:sz="6" w:space="0" w:color="BFBFBF"/>
+              <w:bottom w:val="single" w:sz="6" w:space="0" w:color="BFBFBF"/>
+              <w:right w:val="single" w:sz="6" w:space="0" w:color="BFBFBF"/>
+            </w:tcBorders>
+            <w:tcMar>
+              <w:top w:w="60" w:type="dxa"/>
+              <w:left w:w="120" w:type="dxa"/>
+              <w:bottom w:w="60" w:type="dxa"/>
+              <w:right w:w="120" w:type="dxa"/>
+            </w:tcMar>
+            <w:hideMark/>
+          </w:tcPr>
+          <w:p>
+            <w:pPr>
+              <w:spacing w:before="120" w:after="120"/>
+              <w:rPr>
+                <w:rFonts w:ascii="Calibri" w:eastAsia="Times New Roman" w:hAnsi="Calibri" w:cs="Calibri"/>
+                <w:color w:val="1A1A1A"/>
+                <w:sz w:val="22"/>
+                <w:szCs w:val="22"/>
+              </w:rPr>
+            </w:pPr>
+            <w:r>
+              <w:rPr>
+                <w:rFonts w:ascii="Calibri" w:eastAsia="Times New Roman" w:hAnsi="Calibri" w:cs="Calibri"/>
+                <w:color w:val="1A1A1A"/>
+                <w:sz w:val="22"/>
+                <w:szCs w:val="22"/>
+              </w:rPr>
+              <w:t>11</w:t>
             </w:r>
           </w:p>
         </w:tc>
@@ -8535,9 +8774,9 @@
 <file path=word/numbering.xml><?xml version="1.0" encoding="utf-8"?>
 <w:numbering xmlns:wpc="http://schemas.microsoft.com/office/word/2010/wordprocessingCanvas" xmlns:cx="http://schemas.microsoft.com/office/drawing/2014/chartex" xmlns:cx1="http://schemas.microsoft.com/office/drawing/2015/9/8/chartex" xmlns:cx2="http://schemas.microsoft.com/office/drawing/2015/10/21/chartex" xmlns:cx3="http://schemas.microsoft.com/office/drawing/2016/5/9/chartex" xmlns:cx4="http://schemas.microsoft.com/office/drawing/2016/5/10/chartex" xmlns:cx5="http://schemas.microsoft.com/office/drawing/2016/5/11/chartex" xmlns:cx6="http://schemas.microsoft.com/office/drawing/2016/5/12/chartex" xmlns:cx7="http://schemas.microsoft.com/office/drawing/2016/5/13/chartex" xmlns:cx8="http://schemas.microsoft.com/office/drawing/2016/5/14/chartex" xmlns:mc="http://schemas.openxmlformats.org/markup-compatibility/2006" xmlns:aink="http://schemas.microsoft.com/office/drawing/2016/ink" xmlns:am3d="http://schemas.microsoft.com/office/drawing/2017/model3d" xmlns:o="urn:schemas-microsoft-com:office:office" xmlns:oel="http://schemas.microsoft.com/office/2019/extlst" xmlns:r="http://schemas.openxmlformats.org/officeDocument/2006/relationships" xmlns:m="http://schemas.openxmlformats.org/officeDocument/2006/math" xmlns:v="urn:schemas-microsoft-com:vml" xmlns:wp14="http://schemas.microsoft.com/office/word/2010/wordprocessingDrawing" xmlns:wp="http://schemas.openxmlformats.org/drawingml/2006/wordprocessingDrawing" xmlns:w10="urn:schemas-microsoft-com:office:word" xmlns:w="http://schemas.openxmlformats.org/wordprocessingml/2006/main" xmlns:w14="http://schemas.microsoft.com/office/word/2010/wordml" xmlns:w15="http://schemas.microsoft.com/office/word/2012/wordml" xmlns:w16cex="http://schemas.microsoft.com/office/word/2018/wordml/cex" xmlns:w16cid="http://schemas.microsoft.com/office/word/2016/wordml/cid" xmlns:w16="http://schemas.microsoft.com/office/word/2018/wordml" xmlns:w16du="http://schemas.microsoft.com/office/word/2023/wordml/word16du" xmlns:w16sdtdh="http://schemas.microsoft.com/office/word/2020/wordml/sdtdatahash" xmlns:w16sdtfl="http://schemas.microsoft.com/office/word/2024/wordml/sdtformatlock" xmlns:w16se="http://schemas.microsoft.com/office/word/2015/wordml/symex" xmlns:wpg="http://schemas.microsoft.com/office/word/2010/wordprocessingGroup" xmlns:wpi="http://schemas.microsoft.com/office/word/2010/wordprocessingInk" xmlns:wne="http://schemas.microsoft.com/office/word/2006/wordml" xmlns:wps="http://schemas.microsoft.com/office/word/2010/wordprocessingShape" mc:Ignorable="w14 w15 w16se w16cid w16 w16cex w16sdtdh w16sdtfl w16du wp14">
   <w:abstractNum w:abstractNumId="0" w15:restartNumberingAfterBreak="0">
-    <w:nsid w:val="08543151"/>
+    <w:nsid w:val="09471A96"/>
     <w:multiLevelType w:val="multilevel"/>
-    <w:tmpl w:val="44249F54"/>
+    <w:tmpl w:val="26CE195E"/>
     <w:lvl w:ilvl="0">
       <w:start w:val="1"/>
       <w:numFmt w:val="bullet"/>
@@ -8684,122 +8923,9 @@
     </w:lvl>
   </w:abstractNum>
   <w:abstractNum w:abstractNumId="1" w15:restartNumberingAfterBreak="0">
-    <w:nsid w:val="1A0D26E0"/>
+    <w:nsid w:val="0B0E3B12"/>
     <w:multiLevelType w:val="multilevel"/>
-    <w:tmpl w:val="AA2CD9D4"/>
-    <w:lvl w:ilvl="0">
-      <w:start w:val="1"/>
-      <w:numFmt w:val="decimal"/>
-      <w:lvlText w:val="%1."/>
-      <w:lvlJc w:val="left"/>
-      <w:pPr>
-        <w:tabs>
-          <w:tab w:val="num" w:pos="720"/>
-        </w:tabs>
-        <w:ind w:left="720" w:hanging="360"/>
-      </w:pPr>
-    </w:lvl>
-    <w:lvl w:ilvl="1" w:tentative="1">
-      <w:start w:val="1"/>
-      <w:numFmt w:val="decimal"/>
-      <w:lvlText w:val="%2."/>
-      <w:lvlJc w:val="left"/>
-      <w:pPr>
-        <w:tabs>
-          <w:tab w:val="num" w:pos="1440"/>
-        </w:tabs>
-        <w:ind w:left="1440" w:hanging="360"/>
-      </w:pPr>
-    </w:lvl>
-    <w:lvl w:ilvl="2" w:tentative="1">
-      <w:start w:val="1"/>
-      <w:numFmt w:val="decimal"/>
-      <w:lvlText w:val="%3."/>
-      <w:lvlJc w:val="left"/>
-      <w:pPr>
-        <w:tabs>
-          <w:tab w:val="num" w:pos="2160"/>
-        </w:tabs>
-        <w:ind w:left="2160" w:hanging="360"/>
-      </w:pPr>
-    </w:lvl>
-    <w:lvl w:ilvl="3" w:tentative="1">
-      <w:start w:val="1"/>
-      <w:numFmt w:val="decimal"/>
-      <w:lvlText w:val="%4."/>
-      <w:lvlJc w:val="left"/>
-      <w:pPr>
-        <w:tabs>
-          <w:tab w:val="num" w:pos="2880"/>
-        </w:tabs>
-        <w:ind w:left="2880" w:hanging="360"/>
-      </w:pPr>
-    </w:lvl>
-    <w:lvl w:ilvl="4" w:tentative="1">
-      <w:start w:val="1"/>
-      <w:numFmt w:val="decimal"/>
-      <w:lvlText w:val="%5."/>
-      <w:lvlJc w:val="left"/>
-      <w:pPr>
-        <w:tabs>
-          <w:tab w:val="num" w:pos="3600"/>
-        </w:tabs>
-        <w:ind w:left="3600" w:hanging="360"/>
-      </w:pPr>
-    </w:lvl>
-    <w:lvl w:ilvl="5" w:tentative="1">
-      <w:start w:val="1"/>
-      <w:numFmt w:val="decimal"/>
-      <w:lvlText w:val="%6."/>
-      <w:lvlJc w:val="left"/>
-      <w:pPr>
-        <w:tabs>
-          <w:tab w:val="num" w:pos="4320"/>
-        </w:tabs>
-        <w:ind w:left="4320" w:hanging="360"/>
-      </w:pPr>
-    </w:lvl>
-    <w:lvl w:ilvl="6" w:tentative="1">
-      <w:start w:val="1"/>
-      <w:numFmt w:val="decimal"/>
-      <w:lvlText w:val="%7."/>
-      <w:lvlJc w:val="left"/>
-      <w:pPr>
-        <w:tabs>
-          <w:tab w:val="num" w:pos="5040"/>
-        </w:tabs>
-        <w:ind w:left="5040" w:hanging="360"/>
-      </w:pPr>
-    </w:lvl>
-    <w:lvl w:ilvl="7" w:tentative="1">
-      <w:start w:val="1"/>
-      <w:numFmt w:val="decimal"/>
-      <w:lvlText w:val="%8."/>
-      <w:lvlJc w:val="left"/>
-      <w:pPr>
-        <w:tabs>
-          <w:tab w:val="num" w:pos="5760"/>
-        </w:tabs>
-        <w:ind w:left="5760" w:hanging="360"/>
-      </w:pPr>
-    </w:lvl>
-    <w:lvl w:ilvl="8" w:tentative="1">
-      <w:start w:val="1"/>
-      <w:numFmt w:val="decimal"/>
-      <w:lvlText w:val="%9."/>
-      <w:lvlJc w:val="left"/>
-      <w:pPr>
-        <w:tabs>
-          <w:tab w:val="num" w:pos="6480"/>
-        </w:tabs>
-        <w:ind w:left="6480" w:hanging="360"/>
-      </w:pPr>
-    </w:lvl>
-  </w:abstractNum>
-  <w:abstractNum w:abstractNumId="2" w15:restartNumberingAfterBreak="0">
-    <w:nsid w:val="209D6D64"/>
-    <w:multiLevelType w:val="multilevel"/>
-    <w:tmpl w:val="EC74E11A"/>
+    <w:tmpl w:val="BBECCEC6"/>
     <w:lvl w:ilvl="0">
       <w:start w:val="1"/>
       <w:numFmt w:val="bullet"/>
@@ -8945,10 +9071,10 @@
       </w:rPr>
     </w:lvl>
   </w:abstractNum>
-  <w:abstractNum w:abstractNumId="3" w15:restartNumberingAfterBreak="0">
-    <w:nsid w:val="2A914AD5"/>
+  <w:abstractNum w:abstractNumId="2" w15:restartNumberingAfterBreak="0">
+    <w:nsid w:val="17821C57"/>
     <w:multiLevelType w:val="multilevel"/>
-    <w:tmpl w:val="2610A366"/>
+    <w:tmpl w:val="FCBC52CE"/>
     <w:lvl w:ilvl="0">
       <w:start w:val="1"/>
       <w:numFmt w:val="bullet"/>
@@ -9094,10 +9220,10 @@
       </w:rPr>
     </w:lvl>
   </w:abstractNum>
-  <w:abstractNum w:abstractNumId="4" w15:restartNumberingAfterBreak="0">
-    <w:nsid w:val="3F107EFE"/>
+  <w:abstractNum w:abstractNumId="3" w15:restartNumberingAfterBreak="0">
+    <w:nsid w:val="24796556"/>
     <w:multiLevelType w:val="multilevel"/>
-    <w:tmpl w:val="35E034D4"/>
+    <w:tmpl w:val="C01ED224"/>
     <w:lvl w:ilvl="0">
       <w:start w:val="1"/>
       <w:numFmt w:val="bullet"/>
@@ -9243,10 +9369,10 @@
       </w:rPr>
     </w:lvl>
   </w:abstractNum>
-  <w:abstractNum w:abstractNumId="5" w15:restartNumberingAfterBreak="0">
-    <w:nsid w:val="4E66644F"/>
+  <w:abstractNum w:abstractNumId="4" w15:restartNumberingAfterBreak="0">
+    <w:nsid w:val="25491003"/>
     <w:multiLevelType w:val="multilevel"/>
-    <w:tmpl w:val="0B4A65AA"/>
+    <w:tmpl w:val="E0886C02"/>
     <w:lvl w:ilvl="0">
       <w:start w:val="1"/>
       <w:numFmt w:val="bullet"/>
@@ -9392,10 +9518,123 @@
       </w:rPr>
     </w:lvl>
   </w:abstractNum>
+  <w:abstractNum w:abstractNumId="5" w15:restartNumberingAfterBreak="0">
+    <w:nsid w:val="2C3813EB"/>
+    <w:multiLevelType w:val="multilevel"/>
+    <w:tmpl w:val="9DC06838"/>
+    <w:lvl w:ilvl="0">
+      <w:start w:val="1"/>
+      <w:numFmt w:val="decimal"/>
+      <w:lvlText w:val="%1."/>
+      <w:lvlJc w:val="left"/>
+      <w:pPr>
+        <w:tabs>
+          <w:tab w:val="num" w:pos="720"/>
+        </w:tabs>
+        <w:ind w:left="720" w:hanging="360"/>
+      </w:pPr>
+    </w:lvl>
+    <w:lvl w:ilvl="1" w:tentative="1">
+      <w:start w:val="1"/>
+      <w:numFmt w:val="decimal"/>
+      <w:lvlText w:val="%2."/>
+      <w:lvlJc w:val="left"/>
+      <w:pPr>
+        <w:tabs>
+          <w:tab w:val="num" w:pos="1440"/>
+        </w:tabs>
+        <w:ind w:left="1440" w:hanging="360"/>
+      </w:pPr>
+    </w:lvl>
+    <w:lvl w:ilvl="2" w:tentative="1">
+      <w:start w:val="1"/>
+      <w:numFmt w:val="decimal"/>
+      <w:lvlText w:val="%3."/>
+      <w:lvlJc w:val="left"/>
+      <w:pPr>
+        <w:tabs>
+          <w:tab w:val="num" w:pos="2160"/>
+        </w:tabs>
+        <w:ind w:left="2160" w:hanging="360"/>
+      </w:pPr>
+    </w:lvl>
+    <w:lvl w:ilvl="3" w:tentative="1">
+      <w:start w:val="1"/>
+      <w:numFmt w:val="decimal"/>
+      <w:lvlText w:val="%4."/>
+      <w:lvlJc w:val="left"/>
+      <w:pPr>
+        <w:tabs>
+          <w:tab w:val="num" w:pos="2880"/>
+        </w:tabs>
+        <w:ind w:left="2880" w:hanging="360"/>
+      </w:pPr>
+    </w:lvl>
+    <w:lvl w:ilvl="4" w:tentative="1">
+      <w:start w:val="1"/>
+      <w:numFmt w:val="decimal"/>
+      <w:lvlText w:val="%5."/>
+      <w:lvlJc w:val="left"/>
+      <w:pPr>
+        <w:tabs>
+          <w:tab w:val="num" w:pos="3600"/>
+        </w:tabs>
+        <w:ind w:left="3600" w:hanging="360"/>
+      </w:pPr>
+    </w:lvl>
+    <w:lvl w:ilvl="5" w:tentative="1">
+      <w:start w:val="1"/>
+      <w:numFmt w:val="decimal"/>
+      <w:lvlText w:val="%6."/>
+      <w:lvlJc w:val="left"/>
+      <w:pPr>
+        <w:tabs>
+          <w:tab w:val="num" w:pos="4320"/>
+        </w:tabs>
+        <w:ind w:left="4320" w:hanging="360"/>
+      </w:pPr>
+    </w:lvl>
+    <w:lvl w:ilvl="6" w:tentative="1">
+      <w:start w:val="1"/>
+      <w:numFmt w:val="decimal"/>
+      <w:lvlText w:val="%7."/>
+      <w:lvlJc w:val="left"/>
+      <w:pPr>
+        <w:tabs>
+          <w:tab w:val="num" w:pos="5040"/>
+        </w:tabs>
+        <w:ind w:left="5040" w:hanging="360"/>
+      </w:pPr>
+    </w:lvl>
+    <w:lvl w:ilvl="7" w:tentative="1">
+      <w:start w:val="1"/>
+      <w:numFmt w:val="decimal"/>
+      <w:lvlText w:val="%8."/>
+      <w:lvlJc w:val="left"/>
+      <w:pPr>
+        <w:tabs>
+          <w:tab w:val="num" w:pos="5760"/>
+        </w:tabs>
+        <w:ind w:left="5760" w:hanging="360"/>
+      </w:pPr>
+    </w:lvl>
+    <w:lvl w:ilvl="8" w:tentative="1">
+      <w:start w:val="1"/>
+      <w:numFmt w:val="decimal"/>
+      <w:lvlText w:val="%9."/>
+      <w:lvlJc w:val="left"/>
+      <w:pPr>
+        <w:tabs>
+          <w:tab w:val="num" w:pos="6480"/>
+        </w:tabs>
+        <w:ind w:left="6480" w:hanging="360"/>
+      </w:pPr>
+    </w:lvl>
+  </w:abstractNum>
   <w:abstractNum w:abstractNumId="6" w15:restartNumberingAfterBreak="0">
-    <w:nsid w:val="5635747C"/>
+    <w:nsid w:val="326757AE"/>
     <w:multiLevelType w:val="multilevel"/>
-    <w:tmpl w:val="28887052"/>
+    <w:tmpl w:val="E7007E5C"/>
     <w:lvl w:ilvl="0">
       <w:start w:val="1"/>
       <w:numFmt w:val="bullet"/>
@@ -9542,9 +9781,9 @@
     </w:lvl>
   </w:abstractNum>
   <w:abstractNum w:abstractNumId="7" w15:restartNumberingAfterBreak="0">
-    <w:nsid w:val="73ED2848"/>
+    <w:nsid w:val="7A7F1D50"/>
     <w:multiLevelType w:val="multilevel"/>
-    <w:tmpl w:val="19D8E9AA"/>
+    <w:tmpl w:val="6C0ECE32"/>
     <w:lvl w:ilvl="0">
       <w:start w:val="1"/>
       <w:numFmt w:val="bullet"/>
@@ -9690,29 +9929,29 @@
       </w:rPr>
     </w:lvl>
   </w:abstractNum>
-  <w:num w:numId="1" w16cid:durableId="302277168">
+  <w:num w:numId="1" w16cid:durableId="1478841660">
+    <w:abstractNumId w:val="5"/>
+  </w:num>
+  <w:num w:numId="2" w16cid:durableId="96100999">
+    <w:abstractNumId w:val="4"/>
+  </w:num>
+  <w:num w:numId="3" w16cid:durableId="202912548">
+    <w:abstractNumId w:val="6"/>
+  </w:num>
+  <w:num w:numId="4" w16cid:durableId="542136646">
+    <w:abstractNumId w:val="3"/>
+  </w:num>
+  <w:num w:numId="5" w16cid:durableId="370686893">
+    <w:abstractNumId w:val="2"/>
+  </w:num>
+  <w:num w:numId="6" w16cid:durableId="185607213">
     <w:abstractNumId w:val="1"/>
   </w:num>
-  <w:num w:numId="2" w16cid:durableId="339308598">
-    <w:abstractNumId w:val="3"/>
-  </w:num>
-  <w:num w:numId="3" w16cid:durableId="800808465">
-    <w:abstractNumId w:val="6"/>
-  </w:num>
-  <w:num w:numId="4" w16cid:durableId="1397170846">
+  <w:num w:numId="7" w16cid:durableId="59132256">
     <w:abstractNumId w:val="7"/>
   </w:num>
-  <w:num w:numId="5" w16cid:durableId="1330402129">
-    <w:abstractNumId w:val="5"/>
-  </w:num>
-  <w:num w:numId="6" w16cid:durableId="1705328858">
+  <w:num w:numId="8" w16cid:durableId="1309094786">
     <w:abstractNumId w:val="0"/>
-  </w:num>
-  <w:num w:numId="7" w16cid:durableId="503596992">
-    <w:abstractNumId w:val="2"/>
-  </w:num>
-  <w:num w:numId="8" w16cid:durableId="102116601">
-    <w:abstractNumId w:val="4"/>
   </w:num>
 </w:numbering>
 </file>

</xml_diff>

<commit_message>
Employees: stop overwriting the first employee; Add pop-up, confirm edits; full-screen main window
Owner report: HR "Save" removed an employee. The list selected the first
employee by itself, so the form was silently in edit mode and typing a new
person overwrote them. Now:
- the list never auto-selects (ClearSelection + filling guard on reload);
- Add Employee opens EmployeeEntryForm, which always creates a new person;
- the page form only edits the clicked employee, is locked otherwise, and
  Save shows a Yes/No list of the changes (government IDs as "changed");
- MainForm is borderless and maximized to the working area: no resizing,
  no minimize/maximize/close buttons.
20/20 checks on the work PC database; guides and testing log updated.

Co-Authored-By: Claude Opus 5.5 <noreply@anthropic.com>
</commit_message>
<xml_diff>
--- a/docs/Developer Guide.docx
+++ b/docs/Developer Guide.docx
@@ -72,7 +72,7 @@
       <w:pPr>
         <w:pStyle w:val="NormalWeb"/>
         <w:shd w:val="clear" w:color="auto" w:fill="EEF2F8"/>
-        <w:divId w:val="76832569"/>
+        <w:divId w:val="2129077838"/>
         <w:rPr>
           <w:rFonts w:ascii="Calibri" w:hAnsi="Calibri" w:cs="Calibri"/>
           <w:color w:val="404040"/>
@@ -6342,44 +6342,86 @@
       </w:pPr>
       <w:r>
         <w:rPr>
-          <w:rFonts w:ascii="Calibri" w:eastAsia="Times New Roman" w:hAnsi="Calibri" w:cs="Calibri"/>
-          <w:color w:val="1A1A1A"/>
-          <w:sz w:val="22"/>
-          <w:szCs w:val="22"/>
-        </w:rPr>
-        <w:t xml:space="preserve">To clear a dropdown, set </w:t>
+          <w:rStyle w:val="Strong"/>
+          <w:rFonts w:ascii="Calibri" w:eastAsia="Times New Roman" w:hAnsi="Calibri" w:cs="Calibri"/>
+          <w:color w:val="1A1A1A"/>
+          <w:sz w:val="22"/>
+          <w:szCs w:val="22"/>
+        </w:rPr>
+        <w:t>Never let a grid select a row by itself.</w:t>
+      </w:r>
+      <w:r>
+        <w:rPr>
+          <w:rFonts w:ascii="Calibri" w:eastAsia="Times New Roman" w:hAnsi="Calibri" w:cs="Calibri"/>
+          <w:color w:val="1A1A1A"/>
+          <w:sz w:val="22"/>
+          <w:szCs w:val="22"/>
+        </w:rPr>
+        <w:t xml:space="preserve"> After setting </w:t>
       </w:r>
       <w:r>
         <w:rPr>
           <w:rStyle w:val="HTMLCode"/>
           <w:color w:val="1A1A1A"/>
         </w:rPr>
-        <w:t>SelectedIndex = -1</w:t>
-      </w:r>
-      <w:r>
-        <w:rPr>
-          <w:rFonts w:ascii="Calibri" w:eastAsia="Times New Roman" w:hAnsi="Calibri" w:cs="Calibri"/>
-          <w:color w:val="1A1A1A"/>
-          <w:sz w:val="22"/>
-          <w:szCs w:val="22"/>
-        </w:rPr>
-        <w:t xml:space="preserve">, not </w:t>
+        <w:t>DataSource</w:t>
+      </w:r>
+      <w:r>
+        <w:rPr>
+          <w:rFonts w:ascii="Calibri" w:eastAsia="Times New Roman" w:hAnsi="Calibri" w:cs="Calibri"/>
+          <w:color w:val="1A1A1A"/>
+          <w:sz w:val="22"/>
+          <w:szCs w:val="22"/>
+        </w:rPr>
+        <w:t xml:space="preserve">, call </w:t>
       </w:r>
       <w:r>
         <w:rPr>
           <w:rStyle w:val="HTMLCode"/>
           <w:color w:val="1A1A1A"/>
         </w:rPr>
-        <w:t>Text = ""</w:t>
-      </w:r>
-      <w:r>
-        <w:rPr>
-          <w:rFonts w:ascii="Calibri" w:eastAsia="Times New Roman" w:hAnsi="Calibri" w:cs="Calibri"/>
-          <w:color w:val="1A1A1A"/>
-          <w:sz w:val="22"/>
-          <w:szCs w:val="22"/>
-        </w:rPr>
-        <w:t>. Clearing only the text keeps the old choice selected underneath, and picking it again doesn't register (bug fixed on the Materials form).</w:t>
+        <w:t>ClearSelection()</w:t>
+      </w:r>
+      <w:r>
+        <w:rPr>
+          <w:rFonts w:ascii="Calibri" w:eastAsia="Times New Roman" w:hAnsi="Calibri" w:cs="Calibri"/>
+          <w:color w:val="1A1A1A"/>
+          <w:sz w:val="22"/>
+          <w:szCs w:val="22"/>
+        </w:rPr>
+        <w:t xml:space="preserve"> (with a </w:t>
+      </w:r>
+      <w:r>
+        <w:rPr>
+          <w:rStyle w:val="HTMLCode"/>
+          <w:color w:val="1A1A1A"/>
+        </w:rPr>
+        <w:t>filling</w:t>
+      </w:r>
+      <w:r>
+        <w:rPr>
+          <w:rFonts w:ascii="Calibri" w:eastAsia="Times New Roman" w:hAnsi="Calibri" w:cs="Calibri"/>
+          <w:color w:val="1A1A1A"/>
+          <w:sz w:val="22"/>
+          <w:szCs w:val="22"/>
+        </w:rPr>
+        <w:t xml:space="preserve"> flag so </w:t>
+      </w:r>
+      <w:r>
+        <w:rPr>
+          <w:rStyle w:val="HTMLCode"/>
+          <w:color w:val="1A1A1A"/>
+        </w:rPr>
+        <w:t>SelectionChanged</w:t>
+      </w:r>
+      <w:r>
+        <w:rPr>
+          <w:rFonts w:ascii="Calibri" w:eastAsia="Times New Roman" w:hAnsi="Calibri" w:cs="Calibri"/>
+          <w:color w:val="1A1A1A"/>
+          <w:sz w:val="22"/>
+          <w:szCs w:val="22"/>
+        </w:rPr>
+        <w:t xml:space="preserve"> ignores the reload), then re-select only the record you mean. Otherwise the form silently edits the first row, and typing a "new" record overwrites it (bug found on Employees, 2026-10-30).</w:t>
       </w:r>
     </w:p>
     <w:p>
@@ -6398,76 +6440,38 @@
       </w:pPr>
       <w:r>
         <w:rPr>
-          <w:rFonts w:ascii="Calibri" w:eastAsia="Times New Roman" w:hAnsi="Calibri" w:cs="Calibri"/>
-          <w:color w:val="1A1A1A"/>
-          <w:sz w:val="22"/>
-          <w:szCs w:val="22"/>
-        </w:rPr>
-        <w:t>Control names follow the UI Elements Guide (</w:t>
+          <w:rStyle w:val="Strong"/>
+          <w:rFonts w:ascii="Calibri" w:eastAsia="Times New Roman" w:hAnsi="Calibri" w:cs="Calibri"/>
+          <w:color w:val="1A1A1A"/>
+          <w:sz w:val="22"/>
+          <w:szCs w:val="22"/>
+        </w:rPr>
+        <w:t>Adding and editing are separate (Employees, the pattern for other pages):</w:t>
+      </w:r>
+      <w:r>
+        <w:rPr>
+          <w:rFonts w:ascii="Calibri" w:eastAsia="Times New Roman" w:hAnsi="Calibri" w:cs="Calibri"/>
+          <w:color w:val="1A1A1A"/>
+          <w:sz w:val="22"/>
+          <w:szCs w:val="22"/>
+        </w:rPr>
+        <w:t xml:space="preserve"> Add opens a pop-up (</w:t>
       </w:r>
       <w:r>
         <w:rPr>
           <w:rStyle w:val="HTMLCode"/>
           <w:color w:val="1A1A1A"/>
         </w:rPr>
-        <w:t>btn</w:t>
-      </w:r>
-      <w:r>
-        <w:rPr>
-          <w:rFonts w:ascii="Calibri" w:eastAsia="Times New Roman" w:hAnsi="Calibri" w:cs="Calibri"/>
-          <w:color w:val="1A1A1A"/>
-          <w:sz w:val="22"/>
-          <w:szCs w:val="22"/>
-        </w:rPr>
-        <w:t xml:space="preserve">, </w:t>
-      </w:r>
-      <w:r>
-        <w:rPr>
-          <w:rStyle w:val="HTMLCode"/>
-          <w:color w:val="1A1A1A"/>
-        </w:rPr>
-        <w:t>txt</w:t>
-      </w:r>
-      <w:r>
-        <w:rPr>
-          <w:rFonts w:ascii="Calibri" w:eastAsia="Times New Roman" w:hAnsi="Calibri" w:cs="Calibri"/>
-          <w:color w:val="1A1A1A"/>
-          <w:sz w:val="22"/>
-          <w:szCs w:val="22"/>
-        </w:rPr>
-        <w:t xml:space="preserve">, </w:t>
-      </w:r>
-      <w:r>
-        <w:rPr>
-          <w:rStyle w:val="HTMLCode"/>
-          <w:color w:val="1A1A1A"/>
-        </w:rPr>
-        <w:t>cbo</w:t>
-      </w:r>
-      <w:r>
-        <w:rPr>
-          <w:rFonts w:ascii="Calibri" w:eastAsia="Times New Roman" w:hAnsi="Calibri" w:cs="Calibri"/>
-          <w:color w:val="1A1A1A"/>
-          <w:sz w:val="22"/>
-          <w:szCs w:val="22"/>
-        </w:rPr>
-        <w:t xml:space="preserve">, </w:t>
-      </w:r>
-      <w:r>
-        <w:rPr>
-          <w:rStyle w:val="HTMLCode"/>
-          <w:color w:val="1A1A1A"/>
-        </w:rPr>
-        <w:t>dgv</w:t>
-      </w:r>
-      <w:r>
-        <w:rPr>
-          <w:rFonts w:ascii="Calibri" w:eastAsia="Times New Roman" w:hAnsi="Calibri" w:cs="Calibri"/>
-          <w:color w:val="1A1A1A"/>
-          <w:sz w:val="22"/>
-          <w:szCs w:val="22"/>
-        </w:rPr>
-        <w:t>...).</w:t>
+        <w:t>EmployeeEntryForm</w:t>
+      </w:r>
+      <w:r>
+        <w:rPr>
+          <w:rFonts w:ascii="Calibri" w:eastAsia="Times New Roman" w:hAnsi="Calibri" w:cs="Calibri"/>
+          <w:color w:val="1A1A1A"/>
+          <w:sz w:val="22"/>
+          <w:szCs w:val="22"/>
+        </w:rPr>
+        <w:t>); the page form only edits the clicked record, is locked when nothing is selected, and Save shows a Yes/No list of the changes first.</w:t>
       </w:r>
     </w:p>
     <w:p>
@@ -6491,7 +6495,55 @@
           <w:sz w:val="22"/>
           <w:szCs w:val="22"/>
         </w:rPr>
-        <w:t>Screens stay plain, default WinForms until they are styled from the Figma design.</w:t>
+        <w:t>The main window is borderless and maximized to the screen's working area (</w:t>
+      </w:r>
+      <w:r>
+        <w:rPr>
+          <w:rStyle w:val="HTMLCode"/>
+          <w:color w:val="1A1A1A"/>
+        </w:rPr>
+        <w:t>FormBorderStyle = None</w:t>
+      </w:r>
+      <w:r>
+        <w:rPr>
+          <w:rFonts w:ascii="Calibri" w:eastAsia="Times New Roman" w:hAnsi="Calibri" w:cs="Calibri"/>
+          <w:color w:val="1A1A1A"/>
+          <w:sz w:val="22"/>
+          <w:szCs w:val="22"/>
+        </w:rPr>
+        <w:t xml:space="preserve">, </w:t>
+      </w:r>
+      <w:r>
+        <w:rPr>
+          <w:rStyle w:val="HTMLCode"/>
+          <w:color w:val="1A1A1A"/>
+        </w:rPr>
+        <w:t>ControlBox = false</w:t>
+      </w:r>
+      <w:r>
+        <w:rPr>
+          <w:rFonts w:ascii="Calibri" w:eastAsia="Times New Roman" w:hAnsi="Calibri" w:cs="Calibri"/>
+          <w:color w:val="1A1A1A"/>
+          <w:sz w:val="22"/>
+          <w:szCs w:val="22"/>
+        </w:rPr>
+        <w:t xml:space="preserve">, </w:t>
+      </w:r>
+      <w:r>
+        <w:rPr>
+          <w:rStyle w:val="HTMLCode"/>
+          <w:color w:val="1A1A1A"/>
+        </w:rPr>
+        <w:t>MaximizedBounds</w:t>
+      </w:r>
+      <w:r>
+        <w:rPr>
+          <w:rFonts w:ascii="Calibri" w:eastAsia="Times New Roman" w:hAnsi="Calibri" w:cs="Calibri"/>
+          <w:color w:val="1A1A1A"/>
+          <w:sz w:val="22"/>
+          <w:szCs w:val="22"/>
+        </w:rPr>
+        <w:t xml:space="preserve"> set in the constructor), so it can't be resized, moved or closed by accident.</w:t>
       </w:r>
     </w:p>
     <w:p>
@@ -6515,128 +6567,234 @@
           <w:sz w:val="22"/>
           <w:szCs w:val="22"/>
         </w:rPr>
-        <w:t xml:space="preserve">Big </w:t>
+        <w:t xml:space="preserve">To clear a dropdown, set </w:t>
       </w:r>
       <w:r>
         <w:rPr>
           <w:rStyle w:val="HTMLCode"/>
           <w:color w:val="1A1A1A"/>
         </w:rPr>
-        <w:t>.Designer.cs</w:t>
-      </w:r>
-      <w:r>
-        <w:rPr>
-          <w:rFonts w:ascii="Calibri" w:eastAsia="Times New Roman" w:hAnsi="Calibri" w:cs="Calibri"/>
-          <w:color w:val="1A1A1A"/>
-          <w:sz w:val="22"/>
-          <w:szCs w:val="22"/>
-        </w:rPr>
-        <w:t xml:space="preserve"> files can be generated once with </w:t>
+        <w:t>SelectedIndex = -1</w:t>
+      </w:r>
+      <w:r>
+        <w:rPr>
+          <w:rFonts w:ascii="Calibri" w:eastAsia="Times New Roman" w:hAnsi="Calibri" w:cs="Calibri"/>
+          <w:color w:val="1A1A1A"/>
+          <w:sz w:val="22"/>
+          <w:szCs w:val="22"/>
+        </w:rPr>
+        <w:t xml:space="preserve">, not </w:t>
       </w:r>
       <w:r>
         <w:rPr>
           <w:rStyle w:val="HTMLCode"/>
           <w:color w:val="1A1A1A"/>
         </w:rPr>
-        <w:t>docs/_tools/designer-gen</w:t>
-      </w:r>
-      <w:r>
-        <w:rPr>
-          <w:rFonts w:ascii="Calibri" w:eastAsia="Times New Roman" w:hAnsi="Calibri" w:cs="Calibri"/>
-          <w:color w:val="1A1A1A"/>
-          <w:sz w:val="22"/>
-          <w:szCs w:val="22"/>
-        </w:rPr>
-        <w:t>. Never regenerate a form after it has been edited in Visual Studio's designer.</w:t>
+        <w:t>Text = ""</w:t>
+      </w:r>
+      <w:r>
+        <w:rPr>
+          <w:rFonts w:ascii="Calibri" w:eastAsia="Times New Roman" w:hAnsi="Calibri" w:cs="Calibri"/>
+          <w:color w:val="1A1A1A"/>
+          <w:sz w:val="22"/>
+          <w:szCs w:val="22"/>
+        </w:rPr>
+        <w:t>. Clearing only the text keeps the old choice selected underneath, and picking it again doesn'</w:t>
+      </w:r>
+      <w:r>
+        <w:rPr>
+          <w:rFonts w:ascii="Calibri" w:eastAsia="Times New Roman" w:hAnsi="Calibri" w:cs="Calibri"/>
+          <w:color w:val="1A1A1A"/>
+          <w:sz w:val="22"/>
+          <w:szCs w:val="22"/>
+        </w:rPr>
+        <w:t>t register (bug fixed on the Materials form).</w:t>
       </w:r>
     </w:p>
     <w:p>
       <w:pPr>
-        <w:pStyle w:val="Heading1"/>
-        <w:rPr>
-          <w:rFonts w:ascii="Calibri" w:eastAsia="Times New Roman" w:hAnsi="Calibri" w:cs="Calibri"/>
-        </w:rPr>
-      </w:pPr>
-      <w:r>
-        <w:rPr>
-          <w:rFonts w:ascii="Calibri" w:eastAsia="Times New Roman" w:hAnsi="Calibri" w:cs="Calibri"/>
-        </w:rPr>
-        <w:t>Chapter 4: Login &amp; Security (Part 0)</w:t>
+        <w:numPr>
+          <w:ilvl w:val="0"/>
+          <w:numId w:val="3"/>
+        </w:numPr>
+        <w:spacing w:before="100" w:beforeAutospacing="1" w:after="100" w:afterAutospacing="1"/>
+        <w:rPr>
+          <w:rFonts w:ascii="Calibri" w:eastAsia="Times New Roman" w:hAnsi="Calibri" w:cs="Calibri"/>
+          <w:color w:val="1A1A1A"/>
+          <w:sz w:val="22"/>
+          <w:szCs w:val="22"/>
+        </w:rPr>
+      </w:pPr>
+      <w:r>
+        <w:rPr>
+          <w:rFonts w:ascii="Calibri" w:eastAsia="Times New Roman" w:hAnsi="Calibri" w:cs="Calibri"/>
+          <w:color w:val="1A1A1A"/>
+          <w:sz w:val="22"/>
+          <w:szCs w:val="22"/>
+        </w:rPr>
+        <w:t>Control names follow the UI Elements Guide (</w:t>
+      </w:r>
+      <w:r>
+        <w:rPr>
+          <w:rStyle w:val="HTMLCode"/>
+          <w:color w:val="1A1A1A"/>
+        </w:rPr>
+        <w:t>btn</w:t>
+      </w:r>
+      <w:r>
+        <w:rPr>
+          <w:rFonts w:ascii="Calibri" w:eastAsia="Times New Roman" w:hAnsi="Calibri" w:cs="Calibri"/>
+          <w:color w:val="1A1A1A"/>
+          <w:sz w:val="22"/>
+          <w:szCs w:val="22"/>
+        </w:rPr>
+        <w:t xml:space="preserve">, </w:t>
+      </w:r>
+      <w:r>
+        <w:rPr>
+          <w:rStyle w:val="HTMLCode"/>
+          <w:color w:val="1A1A1A"/>
+        </w:rPr>
+        <w:t>txt</w:t>
+      </w:r>
+      <w:r>
+        <w:rPr>
+          <w:rFonts w:ascii="Calibri" w:eastAsia="Times New Roman" w:hAnsi="Calibri" w:cs="Calibri"/>
+          <w:color w:val="1A1A1A"/>
+          <w:sz w:val="22"/>
+          <w:szCs w:val="22"/>
+        </w:rPr>
+        <w:t xml:space="preserve">, </w:t>
+      </w:r>
+      <w:r>
+        <w:rPr>
+          <w:rStyle w:val="HTMLCode"/>
+          <w:color w:val="1A1A1A"/>
+        </w:rPr>
+        <w:t>cbo</w:t>
+      </w:r>
+      <w:r>
+        <w:rPr>
+          <w:rFonts w:ascii="Calibri" w:eastAsia="Times New Roman" w:hAnsi="Calibri" w:cs="Calibri"/>
+          <w:color w:val="1A1A1A"/>
+          <w:sz w:val="22"/>
+          <w:szCs w:val="22"/>
+        </w:rPr>
+        <w:t xml:space="preserve">, </w:t>
+      </w:r>
+      <w:r>
+        <w:rPr>
+          <w:rStyle w:val="HTMLCode"/>
+          <w:color w:val="1A1A1A"/>
+        </w:rPr>
+        <w:t>dgv</w:t>
+      </w:r>
+      <w:r>
+        <w:rPr>
+          <w:rFonts w:ascii="Calibri" w:eastAsia="Times New Roman" w:hAnsi="Calibri" w:cs="Calibri"/>
+          <w:color w:val="1A1A1A"/>
+          <w:sz w:val="22"/>
+          <w:szCs w:val="22"/>
+        </w:rPr>
+        <w:t>...).</w:t>
       </w:r>
     </w:p>
     <w:p>
       <w:pPr>
-        <w:pStyle w:val="NormalWeb"/>
-        <w:rPr>
-          <w:rFonts w:ascii="Calibri" w:hAnsi="Calibri" w:cs="Calibri"/>
-          <w:color w:val="1A1A1A"/>
-          <w:sz w:val="22"/>
-          <w:szCs w:val="22"/>
-        </w:rPr>
-      </w:pPr>
-      <w:r>
-        <w:rPr>
-          <w:rStyle w:val="Strong"/>
-          <w:rFonts w:ascii="Calibri" w:hAnsi="Calibri" w:cs="Calibri"/>
-          <w:color w:val="1A1A1A"/>
-          <w:sz w:val="22"/>
-          <w:szCs w:val="22"/>
-        </w:rPr>
-        <w:t>Sign-in.</w:t>
-      </w:r>
-      <w:r>
-        <w:rPr>
-          <w:rFonts w:ascii="Calibri" w:hAnsi="Calibri" w:cs="Calibri"/>
-          <w:color w:val="1A1A1A"/>
-          <w:sz w:val="22"/>
-          <w:szCs w:val="22"/>
-        </w:rPr>
-        <w:t xml:space="preserve"> Usernames ignore capital letters. 5 wrong passwords lock the account until an Admin unlocks it. Every sign-in, sign-out, failure, lock and password change goes to </w:t>
-      </w:r>
-      <w:r>
-        <w:rPr>
-          <w:rStyle w:val="HTMLCode"/>
-          <w:color w:val="1A1A1A"/>
-        </w:rPr>
-        <w:t>login_logs</w:t>
-      </w:r>
-      <w:r>
-        <w:rPr>
-          <w:rFonts w:ascii="Calibri" w:hAnsi="Calibri" w:cs="Calibri"/>
-          <w:color w:val="1A1A1A"/>
-          <w:sz w:val="22"/>
-          <w:szCs w:val="22"/>
-        </w:rPr>
-        <w:t xml:space="preserve"> with the PC name. After 5 minutes without activity a "Still there?" popup appears, and the app signs out by itself after 60 more seconds. In Debug builds, the </w:t>
-      </w:r>
-      <w:r>
-        <w:rPr>
-          <w:rStyle w:val="HTMLCode"/>
-          <w:color w:val="1A1A1A"/>
-        </w:rPr>
-        <w:t>TRISTONE_IDLE_SECONDS</w:t>
-      </w:r>
-      <w:r>
-        <w:rPr>
-          <w:rFonts w:ascii="Calibri" w:hAnsi="Calibri" w:cs="Calibri"/>
-          <w:color w:val="1A1A1A"/>
-          <w:sz w:val="22"/>
-          <w:szCs w:val="22"/>
-        </w:rPr>
-        <w:t xml:space="preserve"> </w:t>
-      </w:r>
-      <w:r>
-        <w:rPr>
-          <w:rFonts w:ascii="Calibri" w:hAnsi="Calibri" w:cs="Calibri"/>
-          <w:color w:val="1A1A1A"/>
-          <w:sz w:val="22"/>
-          <w:szCs w:val="22"/>
-        </w:rPr>
-        <w:t>environment variable shortens the wait for testing.</w:t>
+        <w:numPr>
+          <w:ilvl w:val="0"/>
+          <w:numId w:val="3"/>
+        </w:numPr>
+        <w:spacing w:before="100" w:beforeAutospacing="1" w:after="100" w:afterAutospacing="1"/>
+        <w:rPr>
+          <w:rFonts w:ascii="Calibri" w:eastAsia="Times New Roman" w:hAnsi="Calibri" w:cs="Calibri"/>
+          <w:color w:val="1A1A1A"/>
+          <w:sz w:val="22"/>
+          <w:szCs w:val="22"/>
+        </w:rPr>
+      </w:pPr>
+      <w:r>
+        <w:rPr>
+          <w:rFonts w:ascii="Calibri" w:eastAsia="Times New Roman" w:hAnsi="Calibri" w:cs="Calibri"/>
+          <w:color w:val="1A1A1A"/>
+          <w:sz w:val="22"/>
+          <w:szCs w:val="22"/>
+        </w:rPr>
+        <w:t>Screens stay plain, default WinForms until they are styled from the Figma design.</w:t>
       </w:r>
     </w:p>
     <w:p>
       <w:pPr>
+        <w:numPr>
+          <w:ilvl w:val="0"/>
+          <w:numId w:val="3"/>
+        </w:numPr>
+        <w:spacing w:before="100" w:beforeAutospacing="1" w:after="100" w:afterAutospacing="1"/>
+        <w:rPr>
+          <w:rFonts w:ascii="Calibri" w:eastAsia="Times New Roman" w:hAnsi="Calibri" w:cs="Calibri"/>
+          <w:color w:val="1A1A1A"/>
+          <w:sz w:val="22"/>
+          <w:szCs w:val="22"/>
+        </w:rPr>
+      </w:pPr>
+      <w:r>
+        <w:rPr>
+          <w:rFonts w:ascii="Calibri" w:eastAsia="Times New Roman" w:hAnsi="Calibri" w:cs="Calibri"/>
+          <w:color w:val="1A1A1A"/>
+          <w:sz w:val="22"/>
+          <w:szCs w:val="22"/>
+        </w:rPr>
+        <w:t xml:space="preserve">Big </w:t>
+      </w:r>
+      <w:r>
+        <w:rPr>
+          <w:rStyle w:val="HTMLCode"/>
+          <w:color w:val="1A1A1A"/>
+        </w:rPr>
+        <w:t>.Designer.cs</w:t>
+      </w:r>
+      <w:r>
+        <w:rPr>
+          <w:rFonts w:ascii="Calibri" w:eastAsia="Times New Roman" w:hAnsi="Calibri" w:cs="Calibri"/>
+          <w:color w:val="1A1A1A"/>
+          <w:sz w:val="22"/>
+          <w:szCs w:val="22"/>
+        </w:rPr>
+        <w:t xml:space="preserve"> files can be generated once with </w:t>
+      </w:r>
+      <w:r>
+        <w:rPr>
+          <w:rStyle w:val="HTMLCode"/>
+          <w:color w:val="1A1A1A"/>
+        </w:rPr>
+        <w:t>docs/_tools/designer-gen</w:t>
+      </w:r>
+      <w:r>
+        <w:rPr>
+          <w:rFonts w:ascii="Calibri" w:eastAsia="Times New Roman" w:hAnsi="Calibri" w:cs="Calibri"/>
+          <w:color w:val="1A1A1A"/>
+          <w:sz w:val="22"/>
+          <w:szCs w:val="22"/>
+        </w:rPr>
+        <w:t>. Never regenerate a form after it has been edited in Visual Studio's designer.</w:t>
+      </w:r>
+    </w:p>
+    <w:p>
+      <w:pPr>
+        <w:pStyle w:val="Heading1"/>
+        <w:rPr>
+          <w:rFonts w:ascii="Calibri" w:eastAsia="Times New Roman" w:hAnsi="Calibri" w:cs="Calibri"/>
+        </w:rPr>
+      </w:pPr>
+      <w:r>
+        <w:rPr>
+          <w:rFonts w:ascii="Calibri" w:eastAsia="Times New Roman" w:hAnsi="Calibri" w:cs="Calibri"/>
+        </w:rPr>
+        <w:t>Chapter 4: Login &amp; Security (Part 0)</w:t>
+      </w:r>
+    </w:p>
+    <w:p>
+      <w:pPr>
         <w:pStyle w:val="NormalWeb"/>
         <w:rPr>
           <w:rFonts w:ascii="Calibri" w:hAnsi="Calibri" w:cs="Calibri"/>
@@ -6653,6 +6811,77 @@
           <w:sz w:val="22"/>
           <w:szCs w:val="22"/>
         </w:rPr>
+        <w:t>Sign-in.</w:t>
+      </w:r>
+      <w:r>
+        <w:rPr>
+          <w:rFonts w:ascii="Calibri" w:hAnsi="Calibri" w:cs="Calibri"/>
+          <w:color w:val="1A1A1A"/>
+          <w:sz w:val="22"/>
+          <w:szCs w:val="22"/>
+        </w:rPr>
+        <w:t xml:space="preserve"> </w:t>
+      </w:r>
+      <w:r>
+        <w:rPr>
+          <w:rFonts w:ascii="Calibri" w:hAnsi="Calibri" w:cs="Calibri"/>
+          <w:color w:val="1A1A1A"/>
+          <w:sz w:val="22"/>
+          <w:szCs w:val="22"/>
+        </w:rPr>
+        <w:t xml:space="preserve">Usernames ignore capital letters. 5 wrong passwords lock the account until an Admin unlocks it. Every sign-in, sign-out, failure, lock and password change goes to </w:t>
+      </w:r>
+      <w:r>
+        <w:rPr>
+          <w:rStyle w:val="HTMLCode"/>
+          <w:color w:val="1A1A1A"/>
+        </w:rPr>
+        <w:t>login_logs</w:t>
+      </w:r>
+      <w:r>
+        <w:rPr>
+          <w:rFonts w:ascii="Calibri" w:hAnsi="Calibri" w:cs="Calibri"/>
+          <w:color w:val="1A1A1A"/>
+          <w:sz w:val="22"/>
+          <w:szCs w:val="22"/>
+        </w:rPr>
+        <w:t xml:space="preserve"> with the PC name. After 5 minutes without activity a "Still there?" popup appears, and the app signs out by itself after 60 more seconds. In Debug builds, the </w:t>
+      </w:r>
+      <w:r>
+        <w:rPr>
+          <w:rStyle w:val="HTMLCode"/>
+          <w:color w:val="1A1A1A"/>
+        </w:rPr>
+        <w:t>TRISTONE_IDLE_SECONDS</w:t>
+      </w:r>
+      <w:r>
+        <w:rPr>
+          <w:rFonts w:ascii="Calibri" w:hAnsi="Calibri" w:cs="Calibri"/>
+          <w:color w:val="1A1A1A"/>
+          <w:sz w:val="22"/>
+          <w:szCs w:val="22"/>
+        </w:rPr>
+        <w:t xml:space="preserve"> environment variable shortens the wait for testing.</w:t>
+      </w:r>
+    </w:p>
+    <w:p>
+      <w:pPr>
+        <w:pStyle w:val="NormalWeb"/>
+        <w:rPr>
+          <w:rFonts w:ascii="Calibri" w:hAnsi="Calibri" w:cs="Calibri"/>
+          <w:color w:val="1A1A1A"/>
+          <w:sz w:val="22"/>
+          <w:szCs w:val="22"/>
+        </w:rPr>
+      </w:pPr>
+      <w:r>
+        <w:rPr>
+          <w:rStyle w:val="Strong"/>
+          <w:rFonts w:ascii="Calibri" w:hAnsi="Calibri" w:cs="Calibri"/>
+          <w:color w:val="1A1A1A"/>
+          <w:sz w:val="22"/>
+          <w:szCs w:val="22"/>
+        </w:rPr>
         <w:t>Passwords.</w:t>
       </w:r>
       <w:r>
@@ -6662,7 +6891,16 @@
           <w:sz w:val="22"/>
           <w:szCs w:val="22"/>
         </w:rPr>
-        <w:t xml:space="preserve"> Only Admins create accounts and set passwords. Rules: 8+ characters with a letter and a number. </w:t>
+        <w:t xml:space="preserve"> </w:t>
+      </w:r>
+      <w:r>
+        <w:rPr>
+          <w:rFonts w:ascii="Calibri" w:hAnsi="Calibri" w:cs="Calibri"/>
+          <w:color w:val="1A1A1A"/>
+          <w:sz w:val="22"/>
+          <w:szCs w:val="22"/>
+        </w:rPr>
+        <w:t xml:space="preserve">Only Admins create accounts and set passwords. Rules: 8+ characters with a letter and a number. </w:t>
       </w:r>
       <w:r>
         <w:rPr>
@@ -7094,16 +7332,16 @@
           <w:sz w:val="22"/>
           <w:szCs w:val="22"/>
         </w:rPr>
-        <w:t xml:space="preserve"> Attendance (waiting for the fingerprint scanner'</w:t>
-      </w:r>
-      <w:r>
-        <w:rPr>
-          <w:rFonts w:ascii="Calibri" w:hAnsi="Calibri" w:cs="Calibri"/>
-          <w:color w:val="1A1A1A"/>
-          <w:sz w:val="22"/>
-          <w:szCs w:val="22"/>
-        </w:rPr>
-        <w:t>s sample export file), Payroll, Cash Advances, Payslips.</w:t>
+        <w:t xml:space="preserve"> Attendance (waiting for the fingerprint scanner's sample export file), Payroll, Cash Advances, </w:t>
+      </w:r>
+      <w:r>
+        <w:rPr>
+          <w:rFonts w:ascii="Calibri" w:hAnsi="Calibri" w:cs="Calibri"/>
+          <w:color w:val="1A1A1A"/>
+          <w:sz w:val="22"/>
+          <w:szCs w:val="22"/>
+        </w:rPr>
+        <w:t>Payslips.</w:t>
       </w:r>
     </w:p>
     <w:p>
@@ -7253,16 +7491,16 @@
           <w:sz w:val="22"/>
           <w:szCs w:val="22"/>
         </w:rPr>
-        <w:t xml:space="preserve"> no approval needed. Each needs a scan, or "physical copy only" </w:t>
-      </w:r>
-      <w:r>
-        <w:rPr>
-          <w:rFonts w:ascii="Calibri" w:eastAsia="Times New Roman" w:hAnsi="Calibri" w:cs="Calibri"/>
-          <w:color w:val="1A1A1A"/>
-          <w:sz w:val="22"/>
-          <w:szCs w:val="22"/>
-        </w:rPr>
-        <w:t>with where the paper is filed. Receipts shows them as "Stock purchase" without copying them, so they are never counted twice.</w:t>
+        <w:t xml:space="preserve"> no approval needed. Each needs a scan, or "physical copy only" with where the paper is filed. Receipts shows them as "</w:t>
+      </w:r>
+      <w:r>
+        <w:rPr>
+          <w:rFonts w:ascii="Calibri" w:eastAsia="Times New Roman" w:hAnsi="Calibri" w:cs="Calibri"/>
+          <w:color w:val="1A1A1A"/>
+          <w:sz w:val="22"/>
+          <w:szCs w:val="22"/>
+        </w:rPr>
+        <w:t>Stock purchase" without copying them, so they are never counted twice.</w:t>
       </w:r>
     </w:p>
     <w:p>
@@ -8774,9 +9012,9 @@
 <file path=word/numbering.xml><?xml version="1.0" encoding="utf-8"?>
 <w:numbering xmlns:wpc="http://schemas.microsoft.com/office/word/2010/wordprocessingCanvas" xmlns:cx="http://schemas.microsoft.com/office/drawing/2014/chartex" xmlns:cx1="http://schemas.microsoft.com/office/drawing/2015/9/8/chartex" xmlns:cx2="http://schemas.microsoft.com/office/drawing/2015/10/21/chartex" xmlns:cx3="http://schemas.microsoft.com/office/drawing/2016/5/9/chartex" xmlns:cx4="http://schemas.microsoft.com/office/drawing/2016/5/10/chartex" xmlns:cx5="http://schemas.microsoft.com/office/drawing/2016/5/11/chartex" xmlns:cx6="http://schemas.microsoft.com/office/drawing/2016/5/12/chartex" xmlns:cx7="http://schemas.microsoft.com/office/drawing/2016/5/13/chartex" xmlns:cx8="http://schemas.microsoft.com/office/drawing/2016/5/14/chartex" xmlns:mc="http://schemas.openxmlformats.org/markup-compatibility/2006" xmlns:aink="http://schemas.microsoft.com/office/drawing/2016/ink" xmlns:am3d="http://schemas.microsoft.com/office/drawing/2017/model3d" xmlns:o="urn:schemas-microsoft-com:office:office" xmlns:oel="http://schemas.microsoft.com/office/2019/extlst" xmlns:r="http://schemas.openxmlformats.org/officeDocument/2006/relationships" xmlns:m="http://schemas.openxmlformats.org/officeDocument/2006/math" xmlns:v="urn:schemas-microsoft-com:vml" xmlns:wp14="http://schemas.microsoft.com/office/word/2010/wordprocessingDrawing" xmlns:wp="http://schemas.openxmlformats.org/drawingml/2006/wordprocessingDrawing" xmlns:w10="urn:schemas-microsoft-com:office:word" xmlns:w="http://schemas.openxmlformats.org/wordprocessingml/2006/main" xmlns:w14="http://schemas.microsoft.com/office/word/2010/wordml" xmlns:w15="http://schemas.microsoft.com/office/word/2012/wordml" xmlns:w16cex="http://schemas.microsoft.com/office/word/2018/wordml/cex" xmlns:w16cid="http://schemas.microsoft.com/office/word/2016/wordml/cid" xmlns:w16="http://schemas.microsoft.com/office/word/2018/wordml" xmlns:w16du="http://schemas.microsoft.com/office/word/2023/wordml/word16du" xmlns:w16sdtdh="http://schemas.microsoft.com/office/word/2020/wordml/sdtdatahash" xmlns:w16sdtfl="http://schemas.microsoft.com/office/word/2024/wordml/sdtformatlock" xmlns:w16se="http://schemas.microsoft.com/office/word/2015/wordml/symex" xmlns:wpg="http://schemas.microsoft.com/office/word/2010/wordprocessingGroup" xmlns:wpi="http://schemas.microsoft.com/office/word/2010/wordprocessingInk" xmlns:wne="http://schemas.microsoft.com/office/word/2006/wordml" xmlns:wps="http://schemas.microsoft.com/office/word/2010/wordprocessingShape" mc:Ignorable="w14 w15 w16se w16cid w16 w16cex w16sdtdh w16sdtfl w16du wp14">
   <w:abstractNum w:abstractNumId="0" w15:restartNumberingAfterBreak="0">
-    <w:nsid w:val="09471A96"/>
+    <w:nsid w:val="26CC08D9"/>
     <w:multiLevelType w:val="multilevel"/>
-    <w:tmpl w:val="26CE195E"/>
+    <w:tmpl w:val="53045390"/>
     <w:lvl w:ilvl="0">
       <w:start w:val="1"/>
       <w:numFmt w:val="bullet"/>
@@ -8923,9 +9161,9 @@
     </w:lvl>
   </w:abstractNum>
   <w:abstractNum w:abstractNumId="1" w15:restartNumberingAfterBreak="0">
-    <w:nsid w:val="0B0E3B12"/>
+    <w:nsid w:val="303514B4"/>
     <w:multiLevelType w:val="multilevel"/>
-    <w:tmpl w:val="BBECCEC6"/>
+    <w:tmpl w:val="C3764276"/>
     <w:lvl w:ilvl="0">
       <w:start w:val="1"/>
       <w:numFmt w:val="bullet"/>
@@ -9072,9 +9310,9 @@
     </w:lvl>
   </w:abstractNum>
   <w:abstractNum w:abstractNumId="2" w15:restartNumberingAfterBreak="0">
-    <w:nsid w:val="17821C57"/>
+    <w:nsid w:val="3D9C392C"/>
     <w:multiLevelType w:val="multilevel"/>
-    <w:tmpl w:val="FCBC52CE"/>
+    <w:tmpl w:val="107E0AA4"/>
     <w:lvl w:ilvl="0">
       <w:start w:val="1"/>
       <w:numFmt w:val="bullet"/>
@@ -9221,9 +9459,122 @@
     </w:lvl>
   </w:abstractNum>
   <w:abstractNum w:abstractNumId="3" w15:restartNumberingAfterBreak="0">
-    <w:nsid w:val="24796556"/>
+    <w:nsid w:val="4855231A"/>
     <w:multiLevelType w:val="multilevel"/>
-    <w:tmpl w:val="C01ED224"/>
+    <w:tmpl w:val="B614B9C8"/>
+    <w:lvl w:ilvl="0">
+      <w:start w:val="1"/>
+      <w:numFmt w:val="decimal"/>
+      <w:lvlText w:val="%1."/>
+      <w:lvlJc w:val="left"/>
+      <w:pPr>
+        <w:tabs>
+          <w:tab w:val="num" w:pos="720"/>
+        </w:tabs>
+        <w:ind w:left="720" w:hanging="360"/>
+      </w:pPr>
+    </w:lvl>
+    <w:lvl w:ilvl="1" w:tentative="1">
+      <w:start w:val="1"/>
+      <w:numFmt w:val="decimal"/>
+      <w:lvlText w:val="%2."/>
+      <w:lvlJc w:val="left"/>
+      <w:pPr>
+        <w:tabs>
+          <w:tab w:val="num" w:pos="1440"/>
+        </w:tabs>
+        <w:ind w:left="1440" w:hanging="360"/>
+      </w:pPr>
+    </w:lvl>
+    <w:lvl w:ilvl="2" w:tentative="1">
+      <w:start w:val="1"/>
+      <w:numFmt w:val="decimal"/>
+      <w:lvlText w:val="%3."/>
+      <w:lvlJc w:val="left"/>
+      <w:pPr>
+        <w:tabs>
+          <w:tab w:val="num" w:pos="2160"/>
+        </w:tabs>
+        <w:ind w:left="2160" w:hanging="360"/>
+      </w:pPr>
+    </w:lvl>
+    <w:lvl w:ilvl="3" w:tentative="1">
+      <w:start w:val="1"/>
+      <w:numFmt w:val="decimal"/>
+      <w:lvlText w:val="%4."/>
+      <w:lvlJc w:val="left"/>
+      <w:pPr>
+        <w:tabs>
+          <w:tab w:val="num" w:pos="2880"/>
+        </w:tabs>
+        <w:ind w:left="2880" w:hanging="360"/>
+      </w:pPr>
+    </w:lvl>
+    <w:lvl w:ilvl="4" w:tentative="1">
+      <w:start w:val="1"/>
+      <w:numFmt w:val="decimal"/>
+      <w:lvlText w:val="%5."/>
+      <w:lvlJc w:val="left"/>
+      <w:pPr>
+        <w:tabs>
+          <w:tab w:val="num" w:pos="3600"/>
+        </w:tabs>
+        <w:ind w:left="3600" w:hanging="360"/>
+      </w:pPr>
+    </w:lvl>
+    <w:lvl w:ilvl="5" w:tentative="1">
+      <w:start w:val="1"/>
+      <w:numFmt w:val="decimal"/>
+      <w:lvlText w:val="%6."/>
+      <w:lvlJc w:val="left"/>
+      <w:pPr>
+        <w:tabs>
+          <w:tab w:val="num" w:pos="4320"/>
+        </w:tabs>
+        <w:ind w:left="4320" w:hanging="360"/>
+      </w:pPr>
+    </w:lvl>
+    <w:lvl w:ilvl="6" w:tentative="1">
+      <w:start w:val="1"/>
+      <w:numFmt w:val="decimal"/>
+      <w:lvlText w:val="%7."/>
+      <w:lvlJc w:val="left"/>
+      <w:pPr>
+        <w:tabs>
+          <w:tab w:val="num" w:pos="5040"/>
+        </w:tabs>
+        <w:ind w:left="5040" w:hanging="360"/>
+      </w:pPr>
+    </w:lvl>
+    <w:lvl w:ilvl="7" w:tentative="1">
+      <w:start w:val="1"/>
+      <w:numFmt w:val="decimal"/>
+      <w:lvlText w:val="%8."/>
+      <w:lvlJc w:val="left"/>
+      <w:pPr>
+        <w:tabs>
+          <w:tab w:val="num" w:pos="5760"/>
+        </w:tabs>
+        <w:ind w:left="5760" w:hanging="360"/>
+      </w:pPr>
+    </w:lvl>
+    <w:lvl w:ilvl="8" w:tentative="1">
+      <w:start w:val="1"/>
+      <w:numFmt w:val="decimal"/>
+      <w:lvlText w:val="%9."/>
+      <w:lvlJc w:val="left"/>
+      <w:pPr>
+        <w:tabs>
+          <w:tab w:val="num" w:pos="6480"/>
+        </w:tabs>
+        <w:ind w:left="6480" w:hanging="360"/>
+      </w:pPr>
+    </w:lvl>
+  </w:abstractNum>
+  <w:abstractNum w:abstractNumId="4" w15:restartNumberingAfterBreak="0">
+    <w:nsid w:val="506914A9"/>
+    <w:multiLevelType w:val="multilevel"/>
+    <w:tmpl w:val="780CC65E"/>
     <w:lvl w:ilvl="0">
       <w:start w:val="1"/>
       <w:numFmt w:val="bullet"/>
@@ -9369,10 +9720,10 @@
       </w:rPr>
     </w:lvl>
   </w:abstractNum>
-  <w:abstractNum w:abstractNumId="4" w15:restartNumberingAfterBreak="0">
-    <w:nsid w:val="25491003"/>
+  <w:abstractNum w:abstractNumId="5" w15:restartNumberingAfterBreak="0">
+    <w:nsid w:val="516558F1"/>
     <w:multiLevelType w:val="multilevel"/>
-    <w:tmpl w:val="E0886C02"/>
+    <w:tmpl w:val="D0861ED4"/>
     <w:lvl w:ilvl="0">
       <w:start w:val="1"/>
       <w:numFmt w:val="bullet"/>
@@ -9518,123 +9869,10 @@
       </w:rPr>
     </w:lvl>
   </w:abstractNum>
-  <w:abstractNum w:abstractNumId="5" w15:restartNumberingAfterBreak="0">
-    <w:nsid w:val="2C3813EB"/>
+  <w:abstractNum w:abstractNumId="6" w15:restartNumberingAfterBreak="0">
+    <w:nsid w:val="5817228F"/>
     <w:multiLevelType w:val="multilevel"/>
-    <w:tmpl w:val="9DC06838"/>
-    <w:lvl w:ilvl="0">
-      <w:start w:val="1"/>
-      <w:numFmt w:val="decimal"/>
-      <w:lvlText w:val="%1."/>
-      <w:lvlJc w:val="left"/>
-      <w:pPr>
-        <w:tabs>
-          <w:tab w:val="num" w:pos="720"/>
-        </w:tabs>
-        <w:ind w:left="720" w:hanging="360"/>
-      </w:pPr>
-    </w:lvl>
-    <w:lvl w:ilvl="1" w:tentative="1">
-      <w:start w:val="1"/>
-      <w:numFmt w:val="decimal"/>
-      <w:lvlText w:val="%2."/>
-      <w:lvlJc w:val="left"/>
-      <w:pPr>
-        <w:tabs>
-          <w:tab w:val="num" w:pos="1440"/>
-        </w:tabs>
-        <w:ind w:left="1440" w:hanging="360"/>
-      </w:pPr>
-    </w:lvl>
-    <w:lvl w:ilvl="2" w:tentative="1">
-      <w:start w:val="1"/>
-      <w:numFmt w:val="decimal"/>
-      <w:lvlText w:val="%3."/>
-      <w:lvlJc w:val="left"/>
-      <w:pPr>
-        <w:tabs>
-          <w:tab w:val="num" w:pos="2160"/>
-        </w:tabs>
-        <w:ind w:left="2160" w:hanging="360"/>
-      </w:pPr>
-    </w:lvl>
-    <w:lvl w:ilvl="3" w:tentative="1">
-      <w:start w:val="1"/>
-      <w:numFmt w:val="decimal"/>
-      <w:lvlText w:val="%4."/>
-      <w:lvlJc w:val="left"/>
-      <w:pPr>
-        <w:tabs>
-          <w:tab w:val="num" w:pos="2880"/>
-        </w:tabs>
-        <w:ind w:left="2880" w:hanging="360"/>
-      </w:pPr>
-    </w:lvl>
-    <w:lvl w:ilvl="4" w:tentative="1">
-      <w:start w:val="1"/>
-      <w:numFmt w:val="decimal"/>
-      <w:lvlText w:val="%5."/>
-      <w:lvlJc w:val="left"/>
-      <w:pPr>
-        <w:tabs>
-          <w:tab w:val="num" w:pos="3600"/>
-        </w:tabs>
-        <w:ind w:left="3600" w:hanging="360"/>
-      </w:pPr>
-    </w:lvl>
-    <w:lvl w:ilvl="5" w:tentative="1">
-      <w:start w:val="1"/>
-      <w:numFmt w:val="decimal"/>
-      <w:lvlText w:val="%6."/>
-      <w:lvlJc w:val="left"/>
-      <w:pPr>
-        <w:tabs>
-          <w:tab w:val="num" w:pos="4320"/>
-        </w:tabs>
-        <w:ind w:left="4320" w:hanging="360"/>
-      </w:pPr>
-    </w:lvl>
-    <w:lvl w:ilvl="6" w:tentative="1">
-      <w:start w:val="1"/>
-      <w:numFmt w:val="decimal"/>
-      <w:lvlText w:val="%7."/>
-      <w:lvlJc w:val="left"/>
-      <w:pPr>
-        <w:tabs>
-          <w:tab w:val="num" w:pos="5040"/>
-        </w:tabs>
-        <w:ind w:left="5040" w:hanging="360"/>
-      </w:pPr>
-    </w:lvl>
-    <w:lvl w:ilvl="7" w:tentative="1">
-      <w:start w:val="1"/>
-      <w:numFmt w:val="decimal"/>
-      <w:lvlText w:val="%8."/>
-      <w:lvlJc w:val="left"/>
-      <w:pPr>
-        <w:tabs>
-          <w:tab w:val="num" w:pos="5760"/>
-        </w:tabs>
-        <w:ind w:left="5760" w:hanging="360"/>
-      </w:pPr>
-    </w:lvl>
-    <w:lvl w:ilvl="8" w:tentative="1">
-      <w:start w:val="1"/>
-      <w:numFmt w:val="decimal"/>
-      <w:lvlText w:val="%9."/>
-      <w:lvlJc w:val="left"/>
-      <w:pPr>
-        <w:tabs>
-          <w:tab w:val="num" w:pos="6480"/>
-        </w:tabs>
-        <w:ind w:left="6480" w:hanging="360"/>
-      </w:pPr>
-    </w:lvl>
-  </w:abstractNum>
-  <w:abstractNum w:abstractNumId="6" w15:restartNumberingAfterBreak="0">
-    <w:nsid w:val="326757AE"/>
-    <w:multiLevelType w:val="multilevel"/>
-    <w:tmpl w:val="E7007E5C"/>
+    <w:tmpl w:val="ECC25BDE"/>
     <w:lvl w:ilvl="0">
       <w:start w:val="1"/>
       <w:numFmt w:val="bullet"/>
@@ -9781,9 +10019,9 @@
     </w:lvl>
   </w:abstractNum>
   <w:abstractNum w:abstractNumId="7" w15:restartNumberingAfterBreak="0">
-    <w:nsid w:val="7A7F1D50"/>
+    <w:nsid w:val="6DC314F8"/>
     <w:multiLevelType w:val="multilevel"/>
-    <w:tmpl w:val="6C0ECE32"/>
+    <w:tmpl w:val="5A4ED45C"/>
     <w:lvl w:ilvl="0">
       <w:start w:val="1"/>
       <w:numFmt w:val="bullet"/>
@@ -9929,29 +10167,29 @@
       </w:rPr>
     </w:lvl>
   </w:abstractNum>
-  <w:num w:numId="1" w16cid:durableId="1478841660">
+  <w:num w:numId="1" w16cid:durableId="1386444383">
+    <w:abstractNumId w:val="3"/>
+  </w:num>
+  <w:num w:numId="2" w16cid:durableId="1079211237">
+    <w:abstractNumId w:val="2"/>
+  </w:num>
+  <w:num w:numId="3" w16cid:durableId="1870755992">
+    <w:abstractNumId w:val="6"/>
+  </w:num>
+  <w:num w:numId="4" w16cid:durableId="378213805">
+    <w:abstractNumId w:val="0"/>
+  </w:num>
+  <w:num w:numId="5" w16cid:durableId="1363554936">
+    <w:abstractNumId w:val="4"/>
+  </w:num>
+  <w:num w:numId="6" w16cid:durableId="698822487">
+    <w:abstractNumId w:val="7"/>
+  </w:num>
+  <w:num w:numId="7" w16cid:durableId="143015352">
     <w:abstractNumId w:val="5"/>
   </w:num>
-  <w:num w:numId="2" w16cid:durableId="96100999">
-    <w:abstractNumId w:val="4"/>
-  </w:num>
-  <w:num w:numId="3" w16cid:durableId="202912548">
-    <w:abstractNumId w:val="6"/>
-  </w:num>
-  <w:num w:numId="4" w16cid:durableId="542136646">
-    <w:abstractNumId w:val="3"/>
-  </w:num>
-  <w:num w:numId="5" w16cid:durableId="370686893">
-    <w:abstractNumId w:val="2"/>
-  </w:num>
-  <w:num w:numId="6" w16cid:durableId="185607213">
+  <w:num w:numId="8" w16cid:durableId="2140955125">
     <w:abstractNumId w:val="1"/>
-  </w:num>
-  <w:num w:numId="7" w16cid:durableId="59132256">
-    <w:abstractNumId w:val="7"/>
-  </w:num>
-  <w:num w:numId="8" w16cid:durableId="1309094786">
-    <w:abstractNumId w:val="0"/>
   </w:num>
 </w:numbering>
 </file>

</xml_diff>

<commit_message>
All list pages: no auto-select, Add opens a pop-up, Save asks with a list of changes
The Employees fix, applied to Projects, User Accounts, Materials, Vendors,
Equipment, Subcontractor Directory, Jobs and Change Orders through a shared
helper, UI/RecordForm:
- the Add pop-up is a second copy of the same page made with addOnly: true
  (ShowFormOnly hides the list and record-only parts, AddDialog shows it
  until the page raises Added(id)), so each form exists once;
- lists never select a row by themselves; the form is locked until a click;
- Save on an edit lists every change in a Yes/No message (TIN and bank
  account numbers only as "changed").
66/66 checks on the work PC database; guides and testing log updated.

Co-Authored-By: Claude Opus 5.5 <noreply@anthropic.com>
</commit_message>
<xml_diff>
--- a/docs/Developer Guide.docx
+++ b/docs/Developer Guide.docx
@@ -72,7 +72,7 @@
       <w:pPr>
         <w:pStyle w:val="NormalWeb"/>
         <w:shd w:val="clear" w:color="auto" w:fill="EEF2F8"/>
-        <w:divId w:val="2129077838"/>
+        <w:divId w:val="113981673"/>
         <w:rPr>
           <w:rFonts w:ascii="Calibri" w:hAnsi="Calibri" w:cs="Calibri"/>
           <w:color w:val="404040"/>
@@ -6446,20 +6446,247 @@
           <w:sz w:val="22"/>
           <w:szCs w:val="22"/>
         </w:rPr>
-        <w:t>Adding and editing are separate (Employees, the pattern for other pages):</w:t>
-      </w:r>
-      <w:r>
-        <w:rPr>
-          <w:rFonts w:ascii="Calibri" w:eastAsia="Times New Roman" w:hAnsi="Calibri" w:cs="Calibri"/>
-          <w:color w:val="1A1A1A"/>
-          <w:sz w:val="22"/>
-          <w:szCs w:val="22"/>
-        </w:rPr>
-        <w:t xml:space="preserve"> Add opens a pop-up (</w:t>
+        <w:t>Adding and editing are separate on every list page (</w:t>
       </w:r>
       <w:r>
         <w:rPr>
           <w:rStyle w:val="HTMLCode"/>
+          <w:b/>
+          <w:bCs/>
+          <w:color w:val="1A1A1A"/>
+        </w:rPr>
+        <w:t>UI/RecordForm</w:t>
+      </w:r>
+      <w:r>
+        <w:rPr>
+          <w:rStyle w:val="Strong"/>
+          <w:rFonts w:ascii="Calibri" w:eastAsia="Times New Roman" w:hAnsi="Calibri" w:cs="Calibri"/>
+          <w:color w:val="1A1A1A"/>
+          <w:sz w:val="22"/>
+          <w:szCs w:val="22"/>
+        </w:rPr>
+        <w:t>):</w:t>
+      </w:r>
+    </w:p>
+    <w:p>
+      <w:pPr>
+        <w:numPr>
+          <w:ilvl w:val="1"/>
+          <w:numId w:val="3"/>
+        </w:numPr>
+        <w:spacing w:before="100" w:beforeAutospacing="1" w:after="100" w:afterAutospacing="1"/>
+        <w:rPr>
+          <w:rFonts w:ascii="Calibri" w:eastAsia="Times New Roman" w:hAnsi="Calibri" w:cs="Calibri"/>
+          <w:color w:val="1A1A1A"/>
+          <w:sz w:val="22"/>
+          <w:szCs w:val="22"/>
+        </w:rPr>
+      </w:pPr>
+      <w:r>
+        <w:rPr>
+          <w:rFonts w:ascii="Calibri" w:eastAsia="Times New Roman" w:hAnsi="Calibri" w:cs="Calibri"/>
+          <w:color w:val="1A1A1A"/>
+          <w:sz w:val="22"/>
+          <w:szCs w:val="22"/>
+        </w:rPr>
+        <w:t xml:space="preserve">Add opens a pop-up that is a second copy of the same page made with </w:t>
+      </w:r>
+      <w:r>
+        <w:rPr>
+          <w:rStyle w:val="HTMLCode"/>
+          <w:color w:val="1A1A1A"/>
+        </w:rPr>
+        <w:t>new XPage(addOnly: true)</w:t>
+      </w:r>
+      <w:r>
+        <w:rPr>
+          <w:rFonts w:ascii="Calibri" w:eastAsia="Times New Roman" w:hAnsi="Calibri" w:cs="Calibri"/>
+          <w:color w:val="1A1A1A"/>
+          <w:sz w:val="22"/>
+          <w:szCs w:val="22"/>
+        </w:rPr>
+        <w:t xml:space="preserve">: </w:t>
+      </w:r>
+      <w:r>
+        <w:rPr>
+          <w:rStyle w:val="HTMLCode"/>
+          <w:color w:val="1A1A1A"/>
+        </w:rPr>
+        <w:t>RecordForm.ShowFormOnly</w:t>
+      </w:r>
+      <w:r>
+        <w:rPr>
+          <w:rFonts w:ascii="Calibri" w:eastAsia="Times New Roman" w:hAnsi="Calibri" w:cs="Calibri"/>
+          <w:color w:val="1A1A1A"/>
+          <w:sz w:val="22"/>
+          <w:szCs w:val="22"/>
+        </w:rPr>
+        <w:t xml:space="preserve"> hides the list (everything above the form's title label) and record-only parts, and </w:t>
+      </w:r>
+      <w:r>
+        <w:rPr>
+          <w:rStyle w:val="HTMLCode"/>
+          <w:color w:val="1A1A1A"/>
+        </w:rPr>
+        <w:t>RecordForm.AddDialog</w:t>
+      </w:r>
+      <w:r>
+        <w:rPr>
+          <w:rFonts w:ascii="Calibri" w:eastAsia="Times New Roman" w:hAnsi="Calibri" w:cs="Calibri"/>
+          <w:color w:val="1A1A1A"/>
+          <w:sz w:val="22"/>
+          <w:szCs w:val="22"/>
+        </w:rPr>
+        <w:t xml:space="preserve"> shows it until the page raises </w:t>
+      </w:r>
+      <w:r>
+        <w:rPr>
+          <w:rStyle w:val="HTMLCode"/>
+          <w:color w:val="1A1A1A"/>
+        </w:rPr>
+        <w:t>Added(id)</w:t>
+      </w:r>
+      <w:r>
+        <w:rPr>
+          <w:rFonts w:ascii="Calibri" w:eastAsia="Times New Roman" w:hAnsi="Calibri" w:cs="Calibri"/>
+          <w:color w:val="1A1A1A"/>
+          <w:sz w:val="22"/>
+          <w:szCs w:val="22"/>
+        </w:rPr>
+        <w:t>. Each form exists once. The add-only copy never loads the list (its hidden filters fire on start-up).</w:t>
+      </w:r>
+    </w:p>
+    <w:p>
+      <w:pPr>
+        <w:numPr>
+          <w:ilvl w:val="1"/>
+          <w:numId w:val="3"/>
+        </w:numPr>
+        <w:spacing w:before="100" w:beforeAutospacing="1" w:after="100" w:afterAutospacing="1"/>
+        <w:rPr>
+          <w:rFonts w:ascii="Calibri" w:eastAsia="Times New Roman" w:hAnsi="Calibri" w:cs="Calibri"/>
+          <w:color w:val="1A1A1A"/>
+          <w:sz w:val="22"/>
+          <w:szCs w:val="22"/>
+        </w:rPr>
+      </w:pPr>
+      <w:r>
+        <w:rPr>
+          <w:rFonts w:ascii="Calibri" w:eastAsia="Times New Roman" w:hAnsi="Calibri" w:cs="Calibri"/>
+          <w:color w:val="1A1A1A"/>
+          <w:sz w:val="22"/>
+          <w:szCs w:val="22"/>
+        </w:rPr>
+        <w:t xml:space="preserve">The page form only edits the clicked record; </w:t>
+      </w:r>
+      <w:r>
+        <w:rPr>
+          <w:rStyle w:val="HTMLCode"/>
+          <w:color w:val="1A1A1A"/>
+        </w:rPr>
+        <w:t>RecordForm.SetEnabled</w:t>
+      </w:r>
+      <w:r>
+        <w:rPr>
+          <w:rFonts w:ascii="Calibri" w:eastAsia="Times New Roman" w:hAnsi="Calibri" w:cs="Calibri"/>
+          <w:color w:val="1A1A1A"/>
+          <w:sz w:val="22"/>
+          <w:szCs w:val="22"/>
+        </w:rPr>
+        <w:t xml:space="preserve"> locks it when nothing is selected.</w:t>
+      </w:r>
+    </w:p>
+    <w:p>
+      <w:pPr>
+        <w:numPr>
+          <w:ilvl w:val="1"/>
+          <w:numId w:val="3"/>
+        </w:numPr>
+        <w:spacing w:before="100" w:beforeAutospacing="1" w:after="100" w:afterAutospacing="1"/>
+        <w:rPr>
+          <w:rFonts w:ascii="Calibri" w:eastAsia="Times New Roman" w:hAnsi="Calibri" w:cs="Calibri"/>
+          <w:color w:val="1A1A1A"/>
+          <w:sz w:val="22"/>
+          <w:szCs w:val="22"/>
+        </w:rPr>
+      </w:pPr>
+      <w:r>
+        <w:rPr>
+          <w:rFonts w:ascii="Calibri" w:eastAsia="Times New Roman" w:hAnsi="Calibri" w:cs="Calibri"/>
+          <w:color w:val="1A1A1A"/>
+          <w:sz w:val="22"/>
+          <w:szCs w:val="22"/>
+        </w:rPr>
+        <w:t xml:space="preserve">Save snapshots </w:t>
+      </w:r>
+      <w:r>
+        <w:rPr>
+          <w:rStyle w:val="HTMLCode"/>
+          <w:color w:val="1A1A1A"/>
+        </w:rPr>
+        <w:t>ReadForm()</w:t>
+      </w:r>
+      <w:r>
+        <w:rPr>
+          <w:rFonts w:ascii="Calibri" w:eastAsia="Times New Roman" w:hAnsi="Calibri" w:cs="Calibri"/>
+          <w:color w:val="1A1A1A"/>
+          <w:sz w:val="22"/>
+          <w:szCs w:val="22"/>
+        </w:rPr>
+        <w:t xml:space="preserve"> </w:t>
+      </w:r>
+      <w:r>
+        <w:rPr>
+          <w:rFonts w:ascii="Calibri" w:eastAsia="Times New Roman" w:hAnsi="Calibri" w:cs="Calibri"/>
+          <w:color w:val="1A1A1A"/>
+          <w:sz w:val="22"/>
+          <w:szCs w:val="22"/>
+        </w:rPr>
+        <w:t xml:space="preserve">when the record loads and calls </w:t>
+      </w:r>
+      <w:r>
+        <w:rPr>
+          <w:rStyle w:val="HTMLCode"/>
+          <w:color w:val="1A1A1A"/>
+        </w:rPr>
+        <w:t>RecordForm.ConfirmSave(original, input, labels, privateFields)</w:t>
+      </w:r>
+      <w:r>
+        <w:rPr>
+          <w:rFonts w:ascii="Calibri" w:eastAsia="Times New Roman" w:hAnsi="Calibri" w:cs="Calibri"/>
+          <w:color w:val="1A1A1A"/>
+          <w:sz w:val="22"/>
+          <w:szCs w:val="22"/>
+        </w:rPr>
+        <w:t>, which lists the changes in a Yes/No message.</w:t>
+      </w:r>
+    </w:p>
+    <w:p>
+      <w:pPr>
+        <w:numPr>
+          <w:ilvl w:val="1"/>
+          <w:numId w:val="3"/>
+        </w:numPr>
+        <w:spacing w:before="100" w:beforeAutospacing="1" w:after="100" w:afterAutospacing="1"/>
+        <w:rPr>
+          <w:rFonts w:ascii="Calibri" w:eastAsia="Times New Roman" w:hAnsi="Calibri" w:cs="Calibri"/>
+          <w:color w:val="1A1A1A"/>
+          <w:sz w:val="22"/>
+          <w:szCs w:val="22"/>
+        </w:rPr>
+      </w:pPr>
+      <w:r>
+        <w:rPr>
+          <w:rFonts w:ascii="Calibri" w:eastAsia="Times New Roman" w:hAnsi="Calibri" w:cs="Calibri"/>
+          <w:color w:val="1A1A1A"/>
+          <w:sz w:val="22"/>
+          <w:szCs w:val="22"/>
+        </w:rPr>
+        <w:t xml:space="preserve">Employees uses its own </w:t>
+      </w:r>
+      <w:r>
+        <w:rPr>
+          <w:rStyle w:val="HTMLCode"/>
           <w:color w:val="1A1A1A"/>
         </w:rPr>
         <w:t>EmployeeEntryForm</w:t>
@@ -6471,7 +6698,7 @@
           <w:sz w:val="22"/>
           <w:szCs w:val="22"/>
         </w:rPr>
-        <w:t>); the page form only edits the clicked record, is locked when nothing is selected, and Save shows a Yes/No list of the changes first.</w:t>
+        <w:t xml:space="preserve"> pop-up (built first, same behaviour).</w:t>
       </w:r>
     </w:p>
     <w:p>
@@ -6599,16 +6826,7 @@
           <w:sz w:val="22"/>
           <w:szCs w:val="22"/>
         </w:rPr>
-        <w:t>. Clearing only the text keeps the old choice selected underneath, and picking it again doesn'</w:t>
-      </w:r>
-      <w:r>
-        <w:rPr>
-          <w:rFonts w:ascii="Calibri" w:eastAsia="Times New Roman" w:hAnsi="Calibri" w:cs="Calibri"/>
-          <w:color w:val="1A1A1A"/>
-          <w:sz w:val="22"/>
-          <w:szCs w:val="22"/>
-        </w:rPr>
-        <w:t>t register (bug fixed on the Materials form).</w:t>
+        <w:t>. Clearing only the text keeps the old choice selected underneath, and picking it again doesn't register (bug fixed on the Materials form).</w:t>
       </w:r>
     </w:p>
     <w:p>
@@ -7332,16 +7550,16 @@
           <w:sz w:val="22"/>
           <w:szCs w:val="22"/>
         </w:rPr>
-        <w:t xml:space="preserve"> Attendance (waiting for the fingerprint scanner's sample export file), Payroll, Cash Advances, </w:t>
-      </w:r>
-      <w:r>
-        <w:rPr>
-          <w:rFonts w:ascii="Calibri" w:hAnsi="Calibri" w:cs="Calibri"/>
-          <w:color w:val="1A1A1A"/>
-          <w:sz w:val="22"/>
-          <w:szCs w:val="22"/>
-        </w:rPr>
-        <w:t>Payslips.</w:t>
+        <w:t xml:space="preserve"> Attendance (waiting for the fingerprint scanner'</w:t>
+      </w:r>
+      <w:r>
+        <w:rPr>
+          <w:rFonts w:ascii="Calibri" w:hAnsi="Calibri" w:cs="Calibri"/>
+          <w:color w:val="1A1A1A"/>
+          <w:sz w:val="22"/>
+          <w:szCs w:val="22"/>
+        </w:rPr>
+        <w:t>s sample export file), Payroll, Cash Advances, Payslips.</w:t>
       </w:r>
     </w:p>
     <w:p>
@@ -7491,16 +7709,16 @@
           <w:sz w:val="22"/>
           <w:szCs w:val="22"/>
         </w:rPr>
-        <w:t xml:space="preserve"> no approval needed. Each needs a scan, or "physical copy only" with where the paper is filed. Receipts shows them as "</w:t>
-      </w:r>
-      <w:r>
-        <w:rPr>
-          <w:rFonts w:ascii="Calibri" w:eastAsia="Times New Roman" w:hAnsi="Calibri" w:cs="Calibri"/>
-          <w:color w:val="1A1A1A"/>
-          <w:sz w:val="22"/>
-          <w:szCs w:val="22"/>
-        </w:rPr>
-        <w:t>Stock purchase" without copying them, so they are never counted twice.</w:t>
+        <w:t xml:space="preserve"> no approval needed. Each needs a scan, or "physical copy only" </w:t>
+      </w:r>
+      <w:r>
+        <w:rPr>
+          <w:rFonts w:ascii="Calibri" w:eastAsia="Times New Roman" w:hAnsi="Calibri" w:cs="Calibri"/>
+          <w:color w:val="1A1A1A"/>
+          <w:sz w:val="22"/>
+          <w:szCs w:val="22"/>
+        </w:rPr>
+        <w:t>with where the paper is filed. Receipts shows them as "Stock purchase" without copying them, so they are never counted twice.</w:t>
       </w:r>
     </w:p>
     <w:p>
@@ -9012,9 +9230,122 @@
 <file path=word/numbering.xml><?xml version="1.0" encoding="utf-8"?>
 <w:numbering xmlns:wpc="http://schemas.microsoft.com/office/word/2010/wordprocessingCanvas" xmlns:cx="http://schemas.microsoft.com/office/drawing/2014/chartex" xmlns:cx1="http://schemas.microsoft.com/office/drawing/2015/9/8/chartex" xmlns:cx2="http://schemas.microsoft.com/office/drawing/2015/10/21/chartex" xmlns:cx3="http://schemas.microsoft.com/office/drawing/2016/5/9/chartex" xmlns:cx4="http://schemas.microsoft.com/office/drawing/2016/5/10/chartex" xmlns:cx5="http://schemas.microsoft.com/office/drawing/2016/5/11/chartex" xmlns:cx6="http://schemas.microsoft.com/office/drawing/2016/5/12/chartex" xmlns:cx7="http://schemas.microsoft.com/office/drawing/2016/5/13/chartex" xmlns:cx8="http://schemas.microsoft.com/office/drawing/2016/5/14/chartex" xmlns:mc="http://schemas.openxmlformats.org/markup-compatibility/2006" xmlns:aink="http://schemas.microsoft.com/office/drawing/2016/ink" xmlns:am3d="http://schemas.microsoft.com/office/drawing/2017/model3d" xmlns:o="urn:schemas-microsoft-com:office:office" xmlns:oel="http://schemas.microsoft.com/office/2019/extlst" xmlns:r="http://schemas.openxmlformats.org/officeDocument/2006/relationships" xmlns:m="http://schemas.openxmlformats.org/officeDocument/2006/math" xmlns:v="urn:schemas-microsoft-com:vml" xmlns:wp14="http://schemas.microsoft.com/office/word/2010/wordprocessingDrawing" xmlns:wp="http://schemas.openxmlformats.org/drawingml/2006/wordprocessingDrawing" xmlns:w10="urn:schemas-microsoft-com:office:word" xmlns:w="http://schemas.openxmlformats.org/wordprocessingml/2006/main" xmlns:w14="http://schemas.microsoft.com/office/word/2010/wordml" xmlns:w15="http://schemas.microsoft.com/office/word/2012/wordml" xmlns:w16cex="http://schemas.microsoft.com/office/word/2018/wordml/cex" xmlns:w16cid="http://schemas.microsoft.com/office/word/2016/wordml/cid" xmlns:w16="http://schemas.microsoft.com/office/word/2018/wordml" xmlns:w16du="http://schemas.microsoft.com/office/word/2023/wordml/word16du" xmlns:w16sdtdh="http://schemas.microsoft.com/office/word/2020/wordml/sdtdatahash" xmlns:w16sdtfl="http://schemas.microsoft.com/office/word/2024/wordml/sdtformatlock" xmlns:w16se="http://schemas.microsoft.com/office/word/2015/wordml/symex" xmlns:wpg="http://schemas.microsoft.com/office/word/2010/wordprocessingGroup" xmlns:wpi="http://schemas.microsoft.com/office/word/2010/wordprocessingInk" xmlns:wne="http://schemas.microsoft.com/office/word/2006/wordml" xmlns:wps="http://schemas.microsoft.com/office/word/2010/wordprocessingShape" mc:Ignorable="w14 w15 w16se w16cid w16 w16cex w16sdtdh w16sdtfl w16du wp14">
   <w:abstractNum w:abstractNumId="0" w15:restartNumberingAfterBreak="0">
-    <w:nsid w:val="26CC08D9"/>
+    <w:nsid w:val="0DAE79B6"/>
     <w:multiLevelType w:val="multilevel"/>
-    <w:tmpl w:val="53045390"/>
+    <w:tmpl w:val="D37A923C"/>
+    <w:lvl w:ilvl="0">
+      <w:start w:val="1"/>
+      <w:numFmt w:val="decimal"/>
+      <w:lvlText w:val="%1."/>
+      <w:lvlJc w:val="left"/>
+      <w:pPr>
+        <w:tabs>
+          <w:tab w:val="num" w:pos="720"/>
+        </w:tabs>
+        <w:ind w:left="720" w:hanging="360"/>
+      </w:pPr>
+    </w:lvl>
+    <w:lvl w:ilvl="1" w:tentative="1">
+      <w:start w:val="1"/>
+      <w:numFmt w:val="decimal"/>
+      <w:lvlText w:val="%2."/>
+      <w:lvlJc w:val="left"/>
+      <w:pPr>
+        <w:tabs>
+          <w:tab w:val="num" w:pos="1440"/>
+        </w:tabs>
+        <w:ind w:left="1440" w:hanging="360"/>
+      </w:pPr>
+    </w:lvl>
+    <w:lvl w:ilvl="2" w:tentative="1">
+      <w:start w:val="1"/>
+      <w:numFmt w:val="decimal"/>
+      <w:lvlText w:val="%3."/>
+      <w:lvlJc w:val="left"/>
+      <w:pPr>
+        <w:tabs>
+          <w:tab w:val="num" w:pos="2160"/>
+        </w:tabs>
+        <w:ind w:left="2160" w:hanging="360"/>
+      </w:pPr>
+    </w:lvl>
+    <w:lvl w:ilvl="3" w:tentative="1">
+      <w:start w:val="1"/>
+      <w:numFmt w:val="decimal"/>
+      <w:lvlText w:val="%4."/>
+      <w:lvlJc w:val="left"/>
+      <w:pPr>
+        <w:tabs>
+          <w:tab w:val="num" w:pos="2880"/>
+        </w:tabs>
+        <w:ind w:left="2880" w:hanging="360"/>
+      </w:pPr>
+    </w:lvl>
+    <w:lvl w:ilvl="4" w:tentative="1">
+      <w:start w:val="1"/>
+      <w:numFmt w:val="decimal"/>
+      <w:lvlText w:val="%5."/>
+      <w:lvlJc w:val="left"/>
+      <w:pPr>
+        <w:tabs>
+          <w:tab w:val="num" w:pos="3600"/>
+        </w:tabs>
+        <w:ind w:left="3600" w:hanging="360"/>
+      </w:pPr>
+    </w:lvl>
+    <w:lvl w:ilvl="5" w:tentative="1">
+      <w:start w:val="1"/>
+      <w:numFmt w:val="decimal"/>
+      <w:lvlText w:val="%6."/>
+      <w:lvlJc w:val="left"/>
+      <w:pPr>
+        <w:tabs>
+          <w:tab w:val="num" w:pos="4320"/>
+        </w:tabs>
+        <w:ind w:left="4320" w:hanging="360"/>
+      </w:pPr>
+    </w:lvl>
+    <w:lvl w:ilvl="6" w:tentative="1">
+      <w:start w:val="1"/>
+      <w:numFmt w:val="decimal"/>
+      <w:lvlText w:val="%7."/>
+      <w:lvlJc w:val="left"/>
+      <w:pPr>
+        <w:tabs>
+          <w:tab w:val="num" w:pos="5040"/>
+        </w:tabs>
+        <w:ind w:left="5040" w:hanging="360"/>
+      </w:pPr>
+    </w:lvl>
+    <w:lvl w:ilvl="7" w:tentative="1">
+      <w:start w:val="1"/>
+      <w:numFmt w:val="decimal"/>
+      <w:lvlText w:val="%8."/>
+      <w:lvlJc w:val="left"/>
+      <w:pPr>
+        <w:tabs>
+          <w:tab w:val="num" w:pos="5760"/>
+        </w:tabs>
+        <w:ind w:left="5760" w:hanging="360"/>
+      </w:pPr>
+    </w:lvl>
+    <w:lvl w:ilvl="8" w:tentative="1">
+      <w:start w:val="1"/>
+      <w:numFmt w:val="decimal"/>
+      <w:lvlText w:val="%9."/>
+      <w:lvlJc w:val="left"/>
+      <w:pPr>
+        <w:tabs>
+          <w:tab w:val="num" w:pos="6480"/>
+        </w:tabs>
+        <w:ind w:left="6480" w:hanging="360"/>
+      </w:pPr>
+    </w:lvl>
+  </w:abstractNum>
+  <w:abstractNum w:abstractNumId="1" w15:restartNumberingAfterBreak="0">
+    <w:nsid w:val="13A13840"/>
+    <w:multiLevelType w:val="multilevel"/>
+    <w:tmpl w:val="38E2B634"/>
     <w:lvl w:ilvl="0">
       <w:start w:val="1"/>
       <w:numFmt w:val="bullet"/>
@@ -9160,10 +9491,10 @@
       </w:rPr>
     </w:lvl>
   </w:abstractNum>
-  <w:abstractNum w:abstractNumId="1" w15:restartNumberingAfterBreak="0">
-    <w:nsid w:val="303514B4"/>
+  <w:abstractNum w:abstractNumId="2" w15:restartNumberingAfterBreak="0">
+    <w:nsid w:val="148614FC"/>
     <w:multiLevelType w:val="multilevel"/>
-    <w:tmpl w:val="C3764276"/>
+    <w:tmpl w:val="84729906"/>
     <w:lvl w:ilvl="0">
       <w:start w:val="1"/>
       <w:numFmt w:val="bullet"/>
@@ -9309,10 +9640,10 @@
       </w:rPr>
     </w:lvl>
   </w:abstractNum>
-  <w:abstractNum w:abstractNumId="2" w15:restartNumberingAfterBreak="0">
-    <w:nsid w:val="3D9C392C"/>
+  <w:abstractNum w:abstractNumId="3" w15:restartNumberingAfterBreak="0">
+    <w:nsid w:val="148B4AA4"/>
     <w:multiLevelType w:val="multilevel"/>
-    <w:tmpl w:val="107E0AA4"/>
+    <w:tmpl w:val="936E6C4E"/>
     <w:lvl w:ilvl="0">
       <w:start w:val="1"/>
       <w:numFmt w:val="bullet"/>
@@ -9458,123 +9789,10 @@
       </w:rPr>
     </w:lvl>
   </w:abstractNum>
-  <w:abstractNum w:abstractNumId="3" w15:restartNumberingAfterBreak="0">
-    <w:nsid w:val="4855231A"/>
+  <w:abstractNum w:abstractNumId="4" w15:restartNumberingAfterBreak="0">
+    <w:nsid w:val="2DD16059"/>
     <w:multiLevelType w:val="multilevel"/>
-    <w:tmpl w:val="B614B9C8"/>
-    <w:lvl w:ilvl="0">
-      <w:start w:val="1"/>
-      <w:numFmt w:val="decimal"/>
-      <w:lvlText w:val="%1."/>
-      <w:lvlJc w:val="left"/>
-      <w:pPr>
-        <w:tabs>
-          <w:tab w:val="num" w:pos="720"/>
-        </w:tabs>
-        <w:ind w:left="720" w:hanging="360"/>
-      </w:pPr>
-    </w:lvl>
-    <w:lvl w:ilvl="1" w:tentative="1">
-      <w:start w:val="1"/>
-      <w:numFmt w:val="decimal"/>
-      <w:lvlText w:val="%2."/>
-      <w:lvlJc w:val="left"/>
-      <w:pPr>
-        <w:tabs>
-          <w:tab w:val="num" w:pos="1440"/>
-        </w:tabs>
-        <w:ind w:left="1440" w:hanging="360"/>
-      </w:pPr>
-    </w:lvl>
-    <w:lvl w:ilvl="2" w:tentative="1">
-      <w:start w:val="1"/>
-      <w:numFmt w:val="decimal"/>
-      <w:lvlText w:val="%3."/>
-      <w:lvlJc w:val="left"/>
-      <w:pPr>
-        <w:tabs>
-          <w:tab w:val="num" w:pos="2160"/>
-        </w:tabs>
-        <w:ind w:left="2160" w:hanging="360"/>
-      </w:pPr>
-    </w:lvl>
-    <w:lvl w:ilvl="3" w:tentative="1">
-      <w:start w:val="1"/>
-      <w:numFmt w:val="decimal"/>
-      <w:lvlText w:val="%4."/>
-      <w:lvlJc w:val="left"/>
-      <w:pPr>
-        <w:tabs>
-          <w:tab w:val="num" w:pos="2880"/>
-        </w:tabs>
-        <w:ind w:left="2880" w:hanging="360"/>
-      </w:pPr>
-    </w:lvl>
-    <w:lvl w:ilvl="4" w:tentative="1">
-      <w:start w:val="1"/>
-      <w:numFmt w:val="decimal"/>
-      <w:lvlText w:val="%5."/>
-      <w:lvlJc w:val="left"/>
-      <w:pPr>
-        <w:tabs>
-          <w:tab w:val="num" w:pos="3600"/>
-        </w:tabs>
-        <w:ind w:left="3600" w:hanging="360"/>
-      </w:pPr>
-    </w:lvl>
-    <w:lvl w:ilvl="5" w:tentative="1">
-      <w:start w:val="1"/>
-      <w:numFmt w:val="decimal"/>
-      <w:lvlText w:val="%6."/>
-      <w:lvlJc w:val="left"/>
-      <w:pPr>
-        <w:tabs>
-          <w:tab w:val="num" w:pos="4320"/>
-        </w:tabs>
-        <w:ind w:left="4320" w:hanging="360"/>
-      </w:pPr>
-    </w:lvl>
-    <w:lvl w:ilvl="6" w:tentative="1">
-      <w:start w:val="1"/>
-      <w:numFmt w:val="decimal"/>
-      <w:lvlText w:val="%7."/>
-      <w:lvlJc w:val="left"/>
-      <w:pPr>
-        <w:tabs>
-          <w:tab w:val="num" w:pos="5040"/>
-        </w:tabs>
-        <w:ind w:left="5040" w:hanging="360"/>
-      </w:pPr>
-    </w:lvl>
-    <w:lvl w:ilvl="7" w:tentative="1">
-      <w:start w:val="1"/>
-      <w:numFmt w:val="decimal"/>
-      <w:lvlText w:val="%8."/>
-      <w:lvlJc w:val="left"/>
-      <w:pPr>
-        <w:tabs>
-          <w:tab w:val="num" w:pos="5760"/>
-        </w:tabs>
-        <w:ind w:left="5760" w:hanging="360"/>
-      </w:pPr>
-    </w:lvl>
-    <w:lvl w:ilvl="8" w:tentative="1">
-      <w:start w:val="1"/>
-      <w:numFmt w:val="decimal"/>
-      <w:lvlText w:val="%9."/>
-      <w:lvlJc w:val="left"/>
-      <w:pPr>
-        <w:tabs>
-          <w:tab w:val="num" w:pos="6480"/>
-        </w:tabs>
-        <w:ind w:left="6480" w:hanging="360"/>
-      </w:pPr>
-    </w:lvl>
-  </w:abstractNum>
-  <w:abstractNum w:abstractNumId="4" w15:restartNumberingAfterBreak="0">
-    <w:nsid w:val="506914A9"/>
-    <w:multiLevelType w:val="multilevel"/>
-    <w:tmpl w:val="780CC65E"/>
+    <w:tmpl w:val="1F36C034"/>
     <w:lvl w:ilvl="0">
       <w:start w:val="1"/>
       <w:numFmt w:val="bullet"/>
@@ -9721,9 +9939,9 @@
     </w:lvl>
   </w:abstractNum>
   <w:abstractNum w:abstractNumId="5" w15:restartNumberingAfterBreak="0">
-    <w:nsid w:val="516558F1"/>
+    <w:nsid w:val="397F0026"/>
     <w:multiLevelType w:val="multilevel"/>
-    <w:tmpl w:val="D0861ED4"/>
+    <w:tmpl w:val="9B86F13A"/>
     <w:lvl w:ilvl="0">
       <w:start w:val="1"/>
       <w:numFmt w:val="bullet"/>
@@ -9870,9 +10088,9 @@
     </w:lvl>
   </w:abstractNum>
   <w:abstractNum w:abstractNumId="6" w15:restartNumberingAfterBreak="0">
-    <w:nsid w:val="5817228F"/>
+    <w:nsid w:val="40635B0F"/>
     <w:multiLevelType w:val="multilevel"/>
-    <w:tmpl w:val="ECC25BDE"/>
+    <w:tmpl w:val="4E78A074"/>
     <w:lvl w:ilvl="0">
       <w:start w:val="1"/>
       <w:numFmt w:val="bullet"/>
@@ -10019,9 +10237,9 @@
     </w:lvl>
   </w:abstractNum>
   <w:abstractNum w:abstractNumId="7" w15:restartNumberingAfterBreak="0">
-    <w:nsid w:val="6DC314F8"/>
+    <w:nsid w:val="52525C3C"/>
     <w:multiLevelType w:val="multilevel"/>
-    <w:tmpl w:val="5A4ED45C"/>
+    <w:tmpl w:val="573C04C0"/>
     <w:lvl w:ilvl="0">
       <w:start w:val="1"/>
       <w:numFmt w:val="bullet"/>
@@ -10038,7 +10256,7 @@
         <w:sz w:val="20"/>
       </w:rPr>
     </w:lvl>
-    <w:lvl w:ilvl="1" w:tentative="1">
+    <w:lvl w:ilvl="1">
       <w:start w:val="1"/>
       <w:numFmt w:val="bullet"/>
       <w:lvlText w:val="o"/>
@@ -10167,29 +10385,29 @@
       </w:rPr>
     </w:lvl>
   </w:abstractNum>
-  <w:num w:numId="1" w16cid:durableId="1386444383">
+  <w:num w:numId="1" w16cid:durableId="1318463298">
+    <w:abstractNumId w:val="0"/>
+  </w:num>
+  <w:num w:numId="2" w16cid:durableId="1097168674">
+    <w:abstractNumId w:val="1"/>
+  </w:num>
+  <w:num w:numId="3" w16cid:durableId="1355158463">
+    <w:abstractNumId w:val="7"/>
+  </w:num>
+  <w:num w:numId="4" w16cid:durableId="2127459730">
+    <w:abstractNumId w:val="4"/>
+  </w:num>
+  <w:num w:numId="5" w16cid:durableId="1836650787">
+    <w:abstractNumId w:val="5"/>
+  </w:num>
+  <w:num w:numId="6" w16cid:durableId="1122069108">
     <w:abstractNumId w:val="3"/>
   </w:num>
-  <w:num w:numId="2" w16cid:durableId="1079211237">
-    <w:abstractNumId w:val="2"/>
-  </w:num>
-  <w:num w:numId="3" w16cid:durableId="1870755992">
+  <w:num w:numId="7" w16cid:durableId="2141338864">
     <w:abstractNumId w:val="6"/>
   </w:num>
-  <w:num w:numId="4" w16cid:durableId="378213805">
-    <w:abstractNumId w:val="0"/>
-  </w:num>
-  <w:num w:numId="5" w16cid:durableId="1363554936">
-    <w:abstractNumId w:val="4"/>
-  </w:num>
-  <w:num w:numId="6" w16cid:durableId="698822487">
-    <w:abstractNumId w:val="7"/>
-  </w:num>
-  <w:num w:numId="7" w16cid:durableId="143015352">
-    <w:abstractNumId w:val="5"/>
-  </w:num>
-  <w:num w:numId="8" w16cid:durableId="2140955125">
-    <w:abstractNumId w:val="1"/>
+  <w:num w:numId="8" w16cid:durableId="267157457">
+    <w:abstractNumId w:val="2"/>
   </w:num>
 </w:numbering>
 </file>

</xml_diff>

<commit_message>
Website Admin becomes a separate app: remove it from the office app
Owner decision: Website Admin is its own desktop app (planned
src/Company.WebsiteAdmin, same database) with its own accounts, not a page
of the office app. Removed the sidebar button and AppPage.WebsiteAdmin;
notes, guides and testing log updated.

Co-Authored-By: Claude Opus 5.5 <noreply@anthropic.com>
</commit_message>
<xml_diff>
--- a/docs/Developer Guide.docx
+++ b/docs/Developer Guide.docx
@@ -72,7 +72,7 @@
       <w:pPr>
         <w:pStyle w:val="NormalWeb"/>
         <w:shd w:val="clear" w:color="auto" w:fill="EEF2F8"/>
-        <w:divId w:val="113981673"/>
+        <w:divId w:val="1220553399"/>
         <w:rPr>
           <w:rFonts w:ascii="Calibri" w:hAnsi="Calibri" w:cs="Calibri"/>
           <w:color w:val="404040"/>
@@ -153,9 +153,9 @@
         <w:tblLook w:val="04A0" w:firstRow="1" w:lastRow="0" w:firstColumn="1" w:lastColumn="0" w:noHBand="0" w:noVBand="1"/>
       </w:tblPr>
       <w:tblGrid>
-        <w:gridCol w:w="764"/>
-        <w:gridCol w:w="3212"/>
-        <w:gridCol w:w="4305"/>
+        <w:gridCol w:w="733"/>
+        <w:gridCol w:w="4958"/>
+        <w:gridCol w:w="3653"/>
       </w:tblGrid>
       <w:tr>
         <w:trPr>
@@ -1063,7 +1063,7 @@
                 <w:sz w:val="22"/>
                 <w:szCs w:val="22"/>
               </w:rPr>
-              <w:t>Website Admin</w:t>
+              <w:t>Website Admin (a separate desktop app with its own accounts)</w:t>
             </w:r>
           </w:p>
         </w:tc>
@@ -1195,6 +1195,7 @@
                 <w:sz w:val="22"/>
                 <w:szCs w:val="22"/>
               </w:rPr>
+              <w:lastRenderedPageBreak/>
               <w:t>Tool</w:t>
             </w:r>
           </w:p>
@@ -1439,7 +1440,6 @@
                 <w:sz w:val="22"/>
                 <w:szCs w:val="22"/>
               </w:rPr>
-              <w:lastRenderedPageBreak/>
               <w:t>.NET SDK</w:t>
             </w:r>
           </w:p>
@@ -4120,16 +4120,16 @@
                 <w:sz w:val="22"/>
                 <w:szCs w:val="22"/>
               </w:rPr>
-              <w:t xml:space="preserve"> Static, async methods that return an e</w:t>
-            </w:r>
-            <w:r>
-              <w:rPr>
-                <w:rFonts w:ascii="Calibri" w:eastAsia="Times New Roman" w:hAnsi="Calibri" w:cs="Calibri"/>
-                <w:color w:val="1A1A1A"/>
-                <w:sz w:val="22"/>
-                <w:szCs w:val="22"/>
-              </w:rPr>
-              <w:t xml:space="preserve">rror message or </w:t>
+              <w:t xml:space="preserve"> </w:t>
+            </w:r>
+            <w:r>
+              <w:rPr>
+                <w:rFonts w:ascii="Calibri" w:eastAsia="Times New Roman" w:hAnsi="Calibri" w:cs="Calibri"/>
+                <w:color w:val="1A1A1A"/>
+                <w:sz w:val="22"/>
+                <w:szCs w:val="22"/>
+              </w:rPr>
+              <w:t xml:space="preserve">Static, async methods that return an error message or </w:t>
             </w:r>
             <w:r>
               <w:rPr>
@@ -4934,7 +4934,7 @@
                 <w:sz w:val="22"/>
                 <w:szCs w:val="22"/>
               </w:rPr>
-              <w:t>Projects, Website Admin, User Accounts</w:t>
+              <w:t>Projects, User Accounts</w:t>
             </w:r>
           </w:p>
         </w:tc>
@@ -9190,7 +9190,7 @@
           <w:sz w:val="22"/>
           <w:szCs w:val="22"/>
         </w:rPr>
-        <w:t>Website Admin, the API and the website Contact form</w:t>
+        <w:t>The Website Admin app (separate from the office app), the API and the website Contact form</w:t>
       </w:r>
     </w:p>
     <w:p>
@@ -9230,9 +9230,9 @@
 <file path=word/numbering.xml><?xml version="1.0" encoding="utf-8"?>
 <w:numbering xmlns:wpc="http://schemas.microsoft.com/office/word/2010/wordprocessingCanvas" xmlns:cx="http://schemas.microsoft.com/office/drawing/2014/chartex" xmlns:cx1="http://schemas.microsoft.com/office/drawing/2015/9/8/chartex" xmlns:cx2="http://schemas.microsoft.com/office/drawing/2015/10/21/chartex" xmlns:cx3="http://schemas.microsoft.com/office/drawing/2016/5/9/chartex" xmlns:cx4="http://schemas.microsoft.com/office/drawing/2016/5/10/chartex" xmlns:cx5="http://schemas.microsoft.com/office/drawing/2016/5/11/chartex" xmlns:cx6="http://schemas.microsoft.com/office/drawing/2016/5/12/chartex" xmlns:cx7="http://schemas.microsoft.com/office/drawing/2016/5/13/chartex" xmlns:cx8="http://schemas.microsoft.com/office/drawing/2016/5/14/chartex" xmlns:mc="http://schemas.openxmlformats.org/markup-compatibility/2006" xmlns:aink="http://schemas.microsoft.com/office/drawing/2016/ink" xmlns:am3d="http://schemas.microsoft.com/office/drawing/2017/model3d" xmlns:o="urn:schemas-microsoft-com:office:office" xmlns:oel="http://schemas.microsoft.com/office/2019/extlst" xmlns:r="http://schemas.openxmlformats.org/officeDocument/2006/relationships" xmlns:m="http://schemas.openxmlformats.org/officeDocument/2006/math" xmlns:v="urn:schemas-microsoft-com:vml" xmlns:wp14="http://schemas.microsoft.com/office/word/2010/wordprocessingDrawing" xmlns:wp="http://schemas.openxmlformats.org/drawingml/2006/wordprocessingDrawing" xmlns:w10="urn:schemas-microsoft-com:office:word" xmlns:w="http://schemas.openxmlformats.org/wordprocessingml/2006/main" xmlns:w14="http://schemas.microsoft.com/office/word/2010/wordml" xmlns:w15="http://schemas.microsoft.com/office/word/2012/wordml" xmlns:w16cex="http://schemas.microsoft.com/office/word/2018/wordml/cex" xmlns:w16cid="http://schemas.microsoft.com/office/word/2016/wordml/cid" xmlns:w16="http://schemas.microsoft.com/office/word/2018/wordml" xmlns:w16du="http://schemas.microsoft.com/office/word/2023/wordml/word16du" xmlns:w16sdtdh="http://schemas.microsoft.com/office/word/2020/wordml/sdtdatahash" xmlns:w16sdtfl="http://schemas.microsoft.com/office/word/2024/wordml/sdtformatlock" xmlns:w16se="http://schemas.microsoft.com/office/word/2015/wordml/symex" xmlns:wpg="http://schemas.microsoft.com/office/word/2010/wordprocessingGroup" xmlns:wpi="http://schemas.microsoft.com/office/word/2010/wordprocessingInk" xmlns:wne="http://schemas.microsoft.com/office/word/2006/wordml" xmlns:wps="http://schemas.microsoft.com/office/word/2010/wordprocessingShape" mc:Ignorable="w14 w15 w16se w16cid w16 w16cex w16sdtdh w16sdtfl w16du wp14">
   <w:abstractNum w:abstractNumId="0" w15:restartNumberingAfterBreak="0">
-    <w:nsid w:val="0DAE79B6"/>
+    <w:nsid w:val="060B03B0"/>
     <w:multiLevelType w:val="multilevel"/>
-    <w:tmpl w:val="D37A923C"/>
+    <w:tmpl w:val="58F06746"/>
     <w:lvl w:ilvl="0">
       <w:start w:val="1"/>
       <w:numFmt w:val="decimal"/>
@@ -9343,9 +9343,9 @@
     </w:lvl>
   </w:abstractNum>
   <w:abstractNum w:abstractNumId="1" w15:restartNumberingAfterBreak="0">
-    <w:nsid w:val="13A13840"/>
+    <w:nsid w:val="146763A2"/>
     <w:multiLevelType w:val="multilevel"/>
-    <w:tmpl w:val="38E2B634"/>
+    <w:tmpl w:val="1F705170"/>
     <w:lvl w:ilvl="0">
       <w:start w:val="1"/>
       <w:numFmt w:val="bullet"/>
@@ -9492,9 +9492,9 @@
     </w:lvl>
   </w:abstractNum>
   <w:abstractNum w:abstractNumId="2" w15:restartNumberingAfterBreak="0">
-    <w:nsid w:val="148614FC"/>
+    <w:nsid w:val="148E3815"/>
     <w:multiLevelType w:val="multilevel"/>
-    <w:tmpl w:val="84729906"/>
+    <w:tmpl w:val="8846541C"/>
     <w:lvl w:ilvl="0">
       <w:start w:val="1"/>
       <w:numFmt w:val="bullet"/>
@@ -9641,9 +9641,9 @@
     </w:lvl>
   </w:abstractNum>
   <w:abstractNum w:abstractNumId="3" w15:restartNumberingAfterBreak="0">
-    <w:nsid w:val="148B4AA4"/>
+    <w:nsid w:val="338A68DA"/>
     <w:multiLevelType w:val="multilevel"/>
-    <w:tmpl w:val="936E6C4E"/>
+    <w:tmpl w:val="A74204D0"/>
     <w:lvl w:ilvl="0">
       <w:start w:val="1"/>
       <w:numFmt w:val="bullet"/>
@@ -9790,9 +9790,9 @@
     </w:lvl>
   </w:abstractNum>
   <w:abstractNum w:abstractNumId="4" w15:restartNumberingAfterBreak="0">
-    <w:nsid w:val="2DD16059"/>
+    <w:nsid w:val="35E01293"/>
     <w:multiLevelType w:val="multilevel"/>
-    <w:tmpl w:val="1F36C034"/>
+    <w:tmpl w:val="9E6AB248"/>
     <w:lvl w:ilvl="0">
       <w:start w:val="1"/>
       <w:numFmt w:val="bullet"/>
@@ -9939,9 +9939,158 @@
     </w:lvl>
   </w:abstractNum>
   <w:abstractNum w:abstractNumId="5" w15:restartNumberingAfterBreak="0">
-    <w:nsid w:val="397F0026"/>
+    <w:nsid w:val="470A1548"/>
     <w:multiLevelType w:val="multilevel"/>
-    <w:tmpl w:val="9B86F13A"/>
+    <w:tmpl w:val="1E5275C6"/>
+    <w:lvl w:ilvl="0">
+      <w:start w:val="1"/>
+      <w:numFmt w:val="bullet"/>
+      <w:lvlText w:val=""/>
+      <w:lvlJc w:val="left"/>
+      <w:pPr>
+        <w:tabs>
+          <w:tab w:val="num" w:pos="720"/>
+        </w:tabs>
+        <w:ind w:left="720" w:hanging="360"/>
+      </w:pPr>
+      <w:rPr>
+        <w:rFonts w:ascii="Symbol" w:hAnsi="Symbol" w:hint="default"/>
+        <w:sz w:val="20"/>
+      </w:rPr>
+    </w:lvl>
+    <w:lvl w:ilvl="1">
+      <w:start w:val="1"/>
+      <w:numFmt w:val="bullet"/>
+      <w:lvlText w:val="o"/>
+      <w:lvlJc w:val="left"/>
+      <w:pPr>
+        <w:tabs>
+          <w:tab w:val="num" w:pos="1440"/>
+        </w:tabs>
+        <w:ind w:left="1440" w:hanging="360"/>
+      </w:pPr>
+      <w:rPr>
+        <w:rFonts w:ascii="Courier New" w:hAnsi="Courier New" w:hint="default"/>
+        <w:sz w:val="20"/>
+      </w:rPr>
+    </w:lvl>
+    <w:lvl w:ilvl="2" w:tentative="1">
+      <w:start w:val="1"/>
+      <w:numFmt w:val="bullet"/>
+      <w:lvlText w:val=""/>
+      <w:lvlJc w:val="left"/>
+      <w:pPr>
+        <w:tabs>
+          <w:tab w:val="num" w:pos="2160"/>
+        </w:tabs>
+        <w:ind w:left="2160" w:hanging="360"/>
+      </w:pPr>
+      <w:rPr>
+        <w:rFonts w:ascii="Wingdings" w:hAnsi="Wingdings" w:hint="default"/>
+        <w:sz w:val="20"/>
+      </w:rPr>
+    </w:lvl>
+    <w:lvl w:ilvl="3" w:tentative="1">
+      <w:start w:val="1"/>
+      <w:numFmt w:val="bullet"/>
+      <w:lvlText w:val=""/>
+      <w:lvlJc w:val="left"/>
+      <w:pPr>
+        <w:tabs>
+          <w:tab w:val="num" w:pos="2880"/>
+        </w:tabs>
+        <w:ind w:left="2880" w:hanging="360"/>
+      </w:pPr>
+      <w:rPr>
+        <w:rFonts w:ascii="Wingdings" w:hAnsi="Wingdings" w:hint="default"/>
+        <w:sz w:val="20"/>
+      </w:rPr>
+    </w:lvl>
+    <w:lvl w:ilvl="4" w:tentative="1">
+      <w:start w:val="1"/>
+      <w:numFmt w:val="bullet"/>
+      <w:lvlText w:val=""/>
+      <w:lvlJc w:val="left"/>
+      <w:pPr>
+        <w:tabs>
+          <w:tab w:val="num" w:pos="3600"/>
+        </w:tabs>
+        <w:ind w:left="3600" w:hanging="360"/>
+      </w:pPr>
+      <w:rPr>
+        <w:rFonts w:ascii="Wingdings" w:hAnsi="Wingdings" w:hint="default"/>
+        <w:sz w:val="20"/>
+      </w:rPr>
+    </w:lvl>
+    <w:lvl w:ilvl="5" w:tentative="1">
+      <w:start w:val="1"/>
+      <w:numFmt w:val="bullet"/>
+      <w:lvlText w:val=""/>
+      <w:lvlJc w:val="left"/>
+      <w:pPr>
+        <w:tabs>
+          <w:tab w:val="num" w:pos="4320"/>
+        </w:tabs>
+        <w:ind w:left="4320" w:hanging="360"/>
+      </w:pPr>
+      <w:rPr>
+        <w:rFonts w:ascii="Wingdings" w:hAnsi="Wingdings" w:hint="default"/>
+        <w:sz w:val="20"/>
+      </w:rPr>
+    </w:lvl>
+    <w:lvl w:ilvl="6" w:tentative="1">
+      <w:start w:val="1"/>
+      <w:numFmt w:val="bullet"/>
+      <w:lvlText w:val=""/>
+      <w:lvlJc w:val="left"/>
+      <w:pPr>
+        <w:tabs>
+          <w:tab w:val="num" w:pos="5040"/>
+        </w:tabs>
+        <w:ind w:left="5040" w:hanging="360"/>
+      </w:pPr>
+      <w:rPr>
+        <w:rFonts w:ascii="Wingdings" w:hAnsi="Wingdings" w:hint="default"/>
+        <w:sz w:val="20"/>
+      </w:rPr>
+    </w:lvl>
+    <w:lvl w:ilvl="7" w:tentative="1">
+      <w:start w:val="1"/>
+      <w:numFmt w:val="bullet"/>
+      <w:lvlText w:val=""/>
+      <w:lvlJc w:val="left"/>
+      <w:pPr>
+        <w:tabs>
+          <w:tab w:val="num" w:pos="5760"/>
+        </w:tabs>
+        <w:ind w:left="5760" w:hanging="360"/>
+      </w:pPr>
+      <w:rPr>
+        <w:rFonts w:ascii="Wingdings" w:hAnsi="Wingdings" w:hint="default"/>
+        <w:sz w:val="20"/>
+      </w:rPr>
+    </w:lvl>
+    <w:lvl w:ilvl="8" w:tentative="1">
+      <w:start w:val="1"/>
+      <w:numFmt w:val="bullet"/>
+      <w:lvlText w:val=""/>
+      <w:lvlJc w:val="left"/>
+      <w:pPr>
+        <w:tabs>
+          <w:tab w:val="num" w:pos="6480"/>
+        </w:tabs>
+        <w:ind w:left="6480" w:hanging="360"/>
+      </w:pPr>
+      <w:rPr>
+        <w:rFonts w:ascii="Wingdings" w:hAnsi="Wingdings" w:hint="default"/>
+        <w:sz w:val="20"/>
+      </w:rPr>
+    </w:lvl>
+  </w:abstractNum>
+  <w:abstractNum w:abstractNumId="6" w15:restartNumberingAfterBreak="0">
+    <w:nsid w:val="6EFD24D1"/>
+    <w:multiLevelType w:val="multilevel"/>
+    <w:tmpl w:val="45067554"/>
     <w:lvl w:ilvl="0">
       <w:start w:val="1"/>
       <w:numFmt w:val="bullet"/>
@@ -10087,10 +10236,10 @@
       </w:rPr>
     </w:lvl>
   </w:abstractNum>
-  <w:abstractNum w:abstractNumId="6" w15:restartNumberingAfterBreak="0">
-    <w:nsid w:val="40635B0F"/>
+  <w:abstractNum w:abstractNumId="7" w15:restartNumberingAfterBreak="0">
+    <w:nsid w:val="7B7A47AF"/>
     <w:multiLevelType w:val="multilevel"/>
-    <w:tmpl w:val="4E78A074"/>
+    <w:tmpl w:val="6A62C842"/>
     <w:lvl w:ilvl="0">
       <w:start w:val="1"/>
       <w:numFmt w:val="bullet"/>
@@ -10236,177 +10385,28 @@
       </w:rPr>
     </w:lvl>
   </w:abstractNum>
-  <w:abstractNum w:abstractNumId="7" w15:restartNumberingAfterBreak="0">
-    <w:nsid w:val="52525C3C"/>
-    <w:multiLevelType w:val="multilevel"/>
-    <w:tmpl w:val="573C04C0"/>
-    <w:lvl w:ilvl="0">
-      <w:start w:val="1"/>
-      <w:numFmt w:val="bullet"/>
-      <w:lvlText w:val=""/>
-      <w:lvlJc w:val="left"/>
-      <w:pPr>
-        <w:tabs>
-          <w:tab w:val="num" w:pos="720"/>
-        </w:tabs>
-        <w:ind w:left="720" w:hanging="360"/>
-      </w:pPr>
-      <w:rPr>
-        <w:rFonts w:ascii="Symbol" w:hAnsi="Symbol" w:hint="default"/>
-        <w:sz w:val="20"/>
-      </w:rPr>
-    </w:lvl>
-    <w:lvl w:ilvl="1">
-      <w:start w:val="1"/>
-      <w:numFmt w:val="bullet"/>
-      <w:lvlText w:val="o"/>
-      <w:lvlJc w:val="left"/>
-      <w:pPr>
-        <w:tabs>
-          <w:tab w:val="num" w:pos="1440"/>
-        </w:tabs>
-        <w:ind w:left="1440" w:hanging="360"/>
-      </w:pPr>
-      <w:rPr>
-        <w:rFonts w:ascii="Courier New" w:hAnsi="Courier New" w:hint="default"/>
-        <w:sz w:val="20"/>
-      </w:rPr>
-    </w:lvl>
-    <w:lvl w:ilvl="2" w:tentative="1">
-      <w:start w:val="1"/>
-      <w:numFmt w:val="bullet"/>
-      <w:lvlText w:val=""/>
-      <w:lvlJc w:val="left"/>
-      <w:pPr>
-        <w:tabs>
-          <w:tab w:val="num" w:pos="2160"/>
-        </w:tabs>
-        <w:ind w:left="2160" w:hanging="360"/>
-      </w:pPr>
-      <w:rPr>
-        <w:rFonts w:ascii="Wingdings" w:hAnsi="Wingdings" w:hint="default"/>
-        <w:sz w:val="20"/>
-      </w:rPr>
-    </w:lvl>
-    <w:lvl w:ilvl="3" w:tentative="1">
-      <w:start w:val="1"/>
-      <w:numFmt w:val="bullet"/>
-      <w:lvlText w:val=""/>
-      <w:lvlJc w:val="left"/>
-      <w:pPr>
-        <w:tabs>
-          <w:tab w:val="num" w:pos="2880"/>
-        </w:tabs>
-        <w:ind w:left="2880" w:hanging="360"/>
-      </w:pPr>
-      <w:rPr>
-        <w:rFonts w:ascii="Wingdings" w:hAnsi="Wingdings" w:hint="default"/>
-        <w:sz w:val="20"/>
-      </w:rPr>
-    </w:lvl>
-    <w:lvl w:ilvl="4" w:tentative="1">
-      <w:start w:val="1"/>
-      <w:numFmt w:val="bullet"/>
-      <w:lvlText w:val=""/>
-      <w:lvlJc w:val="left"/>
-      <w:pPr>
-        <w:tabs>
-          <w:tab w:val="num" w:pos="3600"/>
-        </w:tabs>
-        <w:ind w:left="3600" w:hanging="360"/>
-      </w:pPr>
-      <w:rPr>
-        <w:rFonts w:ascii="Wingdings" w:hAnsi="Wingdings" w:hint="default"/>
-        <w:sz w:val="20"/>
-      </w:rPr>
-    </w:lvl>
-    <w:lvl w:ilvl="5" w:tentative="1">
-      <w:start w:val="1"/>
-      <w:numFmt w:val="bullet"/>
-      <w:lvlText w:val=""/>
-      <w:lvlJc w:val="left"/>
-      <w:pPr>
-        <w:tabs>
-          <w:tab w:val="num" w:pos="4320"/>
-        </w:tabs>
-        <w:ind w:left="4320" w:hanging="360"/>
-      </w:pPr>
-      <w:rPr>
-        <w:rFonts w:ascii="Wingdings" w:hAnsi="Wingdings" w:hint="default"/>
-        <w:sz w:val="20"/>
-      </w:rPr>
-    </w:lvl>
-    <w:lvl w:ilvl="6" w:tentative="1">
-      <w:start w:val="1"/>
-      <w:numFmt w:val="bullet"/>
-      <w:lvlText w:val=""/>
-      <w:lvlJc w:val="left"/>
-      <w:pPr>
-        <w:tabs>
-          <w:tab w:val="num" w:pos="5040"/>
-        </w:tabs>
-        <w:ind w:left="5040" w:hanging="360"/>
-      </w:pPr>
-      <w:rPr>
-        <w:rFonts w:ascii="Wingdings" w:hAnsi="Wingdings" w:hint="default"/>
-        <w:sz w:val="20"/>
-      </w:rPr>
-    </w:lvl>
-    <w:lvl w:ilvl="7" w:tentative="1">
-      <w:start w:val="1"/>
-      <w:numFmt w:val="bullet"/>
-      <w:lvlText w:val=""/>
-      <w:lvlJc w:val="left"/>
-      <w:pPr>
-        <w:tabs>
-          <w:tab w:val="num" w:pos="5760"/>
-        </w:tabs>
-        <w:ind w:left="5760" w:hanging="360"/>
-      </w:pPr>
-      <w:rPr>
-        <w:rFonts w:ascii="Wingdings" w:hAnsi="Wingdings" w:hint="default"/>
-        <w:sz w:val="20"/>
-      </w:rPr>
-    </w:lvl>
-    <w:lvl w:ilvl="8" w:tentative="1">
-      <w:start w:val="1"/>
-      <w:numFmt w:val="bullet"/>
-      <w:lvlText w:val=""/>
-      <w:lvlJc w:val="left"/>
-      <w:pPr>
-        <w:tabs>
-          <w:tab w:val="num" w:pos="6480"/>
-        </w:tabs>
-        <w:ind w:left="6480" w:hanging="360"/>
-      </w:pPr>
-      <w:rPr>
-        <w:rFonts w:ascii="Wingdings" w:hAnsi="Wingdings" w:hint="default"/>
-        <w:sz w:val="20"/>
-      </w:rPr>
-    </w:lvl>
-  </w:abstractNum>
-  <w:num w:numId="1" w16cid:durableId="1318463298">
+  <w:num w:numId="1" w16cid:durableId="744763881">
     <w:abstractNumId w:val="0"/>
   </w:num>
-  <w:num w:numId="2" w16cid:durableId="1097168674">
+  <w:num w:numId="2" w16cid:durableId="587815183">
+    <w:abstractNumId w:val="7"/>
+  </w:num>
+  <w:num w:numId="3" w16cid:durableId="1570270145">
+    <w:abstractNumId w:val="5"/>
+  </w:num>
+  <w:num w:numId="4" w16cid:durableId="1221788165">
     <w:abstractNumId w:val="1"/>
   </w:num>
-  <w:num w:numId="3" w16cid:durableId="1355158463">
-    <w:abstractNumId w:val="7"/>
-  </w:num>
-  <w:num w:numId="4" w16cid:durableId="2127459730">
+  <w:num w:numId="5" w16cid:durableId="98139362">
     <w:abstractNumId w:val="4"/>
   </w:num>
-  <w:num w:numId="5" w16cid:durableId="1836650787">
-    <w:abstractNumId w:val="5"/>
-  </w:num>
-  <w:num w:numId="6" w16cid:durableId="1122069108">
+  <w:num w:numId="6" w16cid:durableId="79450006">
     <w:abstractNumId w:val="3"/>
   </w:num>
-  <w:num w:numId="7" w16cid:durableId="2141338864">
+  <w:num w:numId="7" w16cid:durableId="1502038738">
     <w:abstractNumId w:val="6"/>
   </w:num>
-  <w:num w:numId="8" w16cid:durableId="267157457">
+  <w:num w:numId="8" w16cid:durableId="569509502">
     <w:abstractNumId w:val="2"/>
   </w:num>
 </w:numbering>

</xml_diff>

<commit_message>
Website Admin app: sidebar instead of tabs, like the office app
Owner request. Sidebar on the left (Page Content, Announcements, Website
Projects, Document Vault, Inquiries with its "(N new)" count, Website
Traffic, Accounts for main accounts, Sign Out), page title and signed-in
name at the top, the chosen page in the middle; open page in bold. Opens
on Inquiries. 9/9 checks; guides and testing log updated.

Co-Authored-By: Claude Opus 5.5 <noreply@anthropic.com>
</commit_message>
<xml_diff>
--- a/docs/Developer Guide.docx
+++ b/docs/Developer Guide.docx
@@ -72,7 +72,7 @@
       <w:pPr>
         <w:pStyle w:val="NormalWeb"/>
         <w:shd w:val="clear" w:color="auto" w:fill="EEF2F8"/>
-        <w:divId w:val="1893154769"/>
+        <w:divId w:val="1300191410"/>
         <w:rPr>
           <w:rFonts w:ascii="Calibri" w:hAnsi="Calibri" w:cs="Calibri"/>
           <w:color w:val="404040"/>
@@ -8845,26 +8845,7 @@
           <w:sz w:val="22"/>
           <w:szCs w:val="22"/>
         </w:rPr>
-        <w:t xml:space="preserve">The main window is full screen with no title bar. It shows who is signed in, a </w:t>
-      </w:r>
-      <w:r>
-        <w:rPr>
-          <w:rStyle w:val="Strong"/>
-          <w:rFonts w:ascii="Calibri" w:eastAsia="Times New Roman" w:hAnsi="Calibri" w:cs="Calibri"/>
-          <w:color w:val="1A1A1A"/>
-          <w:sz w:val="22"/>
-          <w:szCs w:val="22"/>
-        </w:rPr>
-        <w:t>Sign Out</w:t>
-      </w:r>
-      <w:r>
-        <w:rPr>
-          <w:rFonts w:ascii="Calibri" w:eastAsia="Times New Roman" w:hAnsi="Calibri" w:cs="Calibri"/>
-          <w:color w:val="1A1A1A"/>
-          <w:sz w:val="22"/>
-          <w:szCs w:val="22"/>
-        </w:rPr>
-        <w:t xml:space="preserve"> button and six tabs: Page Content, Announcements, Website Projects, Document Vault, Inquiries, Website Traffic. They're filled in one by one.</w:t>
+        <w:t>The main window is full screen with no title bar. It looks like the office app: a sidebar on the left (Page Content, Announcements, Website Projects, Document Vault, Inquiries, Website Traffic, Accounts for main accounts, Sign Out), the page title and who is signed in at the top, and the chosen page in the middle. Pages are filled in one by one.</w:t>
       </w:r>
     </w:p>
     <w:p>
@@ -9130,6 +9111,25 @@
           <w:sz w:val="22"/>
           <w:szCs w:val="22"/>
         </w:rPr>
+        <w:t xml:space="preserve"> accounts manage the others (owner decision, 30 Oct 2026), on the </w:t>
+      </w:r>
+      <w:r>
+        <w:rPr>
+          <w:rStyle w:val="Strong"/>
+          <w:rFonts w:ascii="Calibri" w:hAnsi="Calibri" w:cs="Calibri"/>
+          <w:color w:val="1A1A1A"/>
+          <w:sz w:val="22"/>
+          <w:szCs w:val="22"/>
+        </w:rPr>
+        <w:t>Accounts</w:t>
+      </w:r>
+      <w:r>
+        <w:rPr>
+          <w:rFonts w:ascii="Calibri" w:hAnsi="Calibri" w:cs="Calibri"/>
+          <w:color w:val="1A1A1A"/>
+          <w:sz w:val="22"/>
+          <w:szCs w:val="22"/>
+        </w:rPr>
         <w:t xml:space="preserve"> </w:t>
       </w:r>
       <w:r>
@@ -9139,26 +9139,7 @@
           <w:sz w:val="22"/>
           <w:szCs w:val="22"/>
         </w:rPr>
-        <w:t xml:space="preserve">accounts manage the others (owner decision, 30 Oct 2026), in the </w:t>
-      </w:r>
-      <w:r>
-        <w:rPr>
-          <w:rStyle w:val="Strong"/>
-          <w:rFonts w:ascii="Calibri" w:hAnsi="Calibri" w:cs="Calibri"/>
-          <w:color w:val="1A1A1A"/>
-          <w:sz w:val="22"/>
-          <w:szCs w:val="22"/>
-        </w:rPr>
-        <w:t>Accounts</w:t>
-      </w:r>
-      <w:r>
-        <w:rPr>
-          <w:rFonts w:ascii="Calibri" w:hAnsi="Calibri" w:cs="Calibri"/>
-          <w:color w:val="1A1A1A"/>
-          <w:sz w:val="22"/>
-          <w:szCs w:val="22"/>
-        </w:rPr>
-        <w:t xml:space="preserve"> tab, which only main accounts see. </w:t>
+        <w:t xml:space="preserve">page, whose sidebar button only main accounts see. </w:t>
       </w:r>
       <w:r>
         <w:rPr>
@@ -9352,6 +9333,22 @@
           <w:sz w:val="22"/>
           <w:szCs w:val="22"/>
         </w:rPr>
+        <w:t xml:space="preserve"> (script 010); the API will add them later. Any signed-in Website Admin account can follow them up: status New / Contacted / Closed and internal notes (never shown on the website). Inquiries are never deleted, so nothing a client sent is lost. The database refuses an inquiry with neither an email nor a phone number. </w:t>
+      </w:r>
+      <w:r>
+        <w:rPr>
+          <w:rStyle w:val="HTMLCode"/>
+          <w:color w:val="1A1A1A"/>
+        </w:rPr>
+        <w:t>Services/WebsiteInquiries</w:t>
+      </w:r>
+      <w:r>
+        <w:rPr>
+          <w:rFonts w:ascii="Calibri" w:hAnsi="Calibri" w:cs="Calibri"/>
+          <w:color w:val="1A1A1A"/>
+          <w:sz w:val="22"/>
+          <w:szCs w:val="22"/>
+        </w:rPr>
         <w:t xml:space="preserve"> </w:t>
       </w:r>
       <w:r>
@@ -9361,23 +9358,7 @@
           <w:sz w:val="22"/>
           <w:szCs w:val="22"/>
         </w:rPr>
-        <w:t xml:space="preserve">(script 010); the API will add them later. Any signed-in Website Admin account can follow them up: status New / Contacted / Closed and internal notes (never shown on the website). Inquiries are never deleted, so nothing a client sent is lost. The database refuses an inquiry with neither an email nor a phone number. </w:t>
-      </w:r>
-      <w:r>
-        <w:rPr>
-          <w:rStyle w:val="HTMLCode"/>
-          <w:color w:val="1A1A1A"/>
-        </w:rPr>
-        <w:t>Services/WebsiteInquiries</w:t>
-      </w:r>
-      <w:r>
-        <w:rPr>
-          <w:rFonts w:ascii="Calibri" w:hAnsi="Calibri" w:cs="Calibri"/>
-          <w:color w:val="1A1A1A"/>
-          <w:sz w:val="22"/>
-          <w:szCs w:val="22"/>
-        </w:rPr>
-        <w:t xml:space="preserve"> lists, counts and saves; the tab title shows "Inquiries (N new)".</w:t>
+        <w:t>lists, counts and saves; the sidebar button shows "Inquiries (N new)".</w:t>
       </w:r>
     </w:p>
     <w:p>
@@ -9421,16 +9402,7 @@
           <w:sz w:val="22"/>
           <w:szCs w:val="22"/>
         </w:rPr>
-        <w:t xml:space="preserve"> </w:t>
-      </w:r>
-      <w:r>
-        <w:rPr>
-          <w:rFonts w:ascii="Calibri" w:hAnsi="Calibri" w:cs="Calibri"/>
-          <w:color w:val="1A1A1A"/>
-          <w:sz w:val="22"/>
-          <w:szCs w:val="22"/>
-        </w:rPr>
-        <w:t xml:space="preserve">The home PC has the real database. The work PC has its own fresh database with test data only. Every test run on the work PC is written in </w:t>
+        <w:t xml:space="preserve"> The home PC has the real database. The work PC has its own fresh database with test data only. Every test run on the work PC is written in </w:t>
       </w:r>
       <w:r>
         <w:rPr>
@@ -9482,7 +9454,16 @@
           <w:sz w:val="22"/>
           <w:szCs w:val="22"/>
         </w:rPr>
-        <w:t xml:space="preserve"> (users) or </w:t>
+        <w:t xml:space="preserve"> </w:t>
+      </w:r>
+      <w:r>
+        <w:rPr>
+          <w:rFonts w:ascii="Calibri" w:hAnsi="Calibri" w:cs="Calibri"/>
+          <w:color w:val="1A1A1A"/>
+          <w:sz w:val="22"/>
+          <w:szCs w:val="22"/>
+        </w:rPr>
+        <w:t xml:space="preserve">(users) or </w:t>
       </w:r>
       <w:r>
         <w:rPr>
@@ -10791,7 +10772,7 @@
           <w:sz w:val="22"/>
           <w:szCs w:val="22"/>
         </w:rPr>
-        <w:t>Website Admin app: the six website tabs; then the API and the website Contact form</w:t>
+        <w:t>Website Admin app: the remaining website pages (Page Content, Announcements, Website Projects, Document Vault, Website Traffic); then the API and the website Contact form</w:t>
       </w:r>
     </w:p>
     <w:p>
@@ -10831,9 +10812,122 @@
 <file path=word/numbering.xml><?xml version="1.0" encoding="utf-8"?>
 <w:numbering xmlns:wpc="http://schemas.microsoft.com/office/word/2010/wordprocessingCanvas" xmlns:cx="http://schemas.microsoft.com/office/drawing/2014/chartex" xmlns:cx1="http://schemas.microsoft.com/office/drawing/2015/9/8/chartex" xmlns:cx2="http://schemas.microsoft.com/office/drawing/2015/10/21/chartex" xmlns:cx3="http://schemas.microsoft.com/office/drawing/2016/5/9/chartex" xmlns:cx4="http://schemas.microsoft.com/office/drawing/2016/5/10/chartex" xmlns:cx5="http://schemas.microsoft.com/office/drawing/2016/5/11/chartex" xmlns:cx6="http://schemas.microsoft.com/office/drawing/2016/5/12/chartex" xmlns:cx7="http://schemas.microsoft.com/office/drawing/2016/5/13/chartex" xmlns:cx8="http://schemas.microsoft.com/office/drawing/2016/5/14/chartex" xmlns:mc="http://schemas.openxmlformats.org/markup-compatibility/2006" xmlns:aink="http://schemas.microsoft.com/office/drawing/2016/ink" xmlns:am3d="http://schemas.microsoft.com/office/drawing/2017/model3d" xmlns:o="urn:schemas-microsoft-com:office:office" xmlns:oel="http://schemas.microsoft.com/office/2019/extlst" xmlns:r="http://schemas.openxmlformats.org/officeDocument/2006/relationships" xmlns:m="http://schemas.openxmlformats.org/officeDocument/2006/math" xmlns:v="urn:schemas-microsoft-com:vml" xmlns:wp14="http://schemas.microsoft.com/office/word/2010/wordprocessingDrawing" xmlns:wp="http://schemas.openxmlformats.org/drawingml/2006/wordprocessingDrawing" xmlns:w10="urn:schemas-microsoft-com:office:word" xmlns:w="http://schemas.openxmlformats.org/wordprocessingml/2006/main" xmlns:w14="http://schemas.microsoft.com/office/word/2010/wordml" xmlns:w15="http://schemas.microsoft.com/office/word/2012/wordml" xmlns:w16cex="http://schemas.microsoft.com/office/word/2018/wordml/cex" xmlns:w16cid="http://schemas.microsoft.com/office/word/2016/wordml/cid" xmlns:w16="http://schemas.microsoft.com/office/word/2018/wordml" xmlns:w16du="http://schemas.microsoft.com/office/word/2023/wordml/word16du" xmlns:w16sdtdh="http://schemas.microsoft.com/office/word/2020/wordml/sdtdatahash" xmlns:w16sdtfl="http://schemas.microsoft.com/office/word/2024/wordml/sdtformatlock" xmlns:w16se="http://schemas.microsoft.com/office/word/2015/wordml/symex" xmlns:wpg="http://schemas.microsoft.com/office/word/2010/wordprocessingGroup" xmlns:wpi="http://schemas.microsoft.com/office/word/2010/wordprocessingInk" xmlns:wne="http://schemas.microsoft.com/office/word/2006/wordml" xmlns:wps="http://schemas.microsoft.com/office/word/2010/wordprocessingShape" mc:Ignorable="w14 w15 w16se w16cid w16 w16cex w16sdtdh w16sdtfl w16du wp14">
   <w:abstractNum w:abstractNumId="0" w15:restartNumberingAfterBreak="0">
-    <w:nsid w:val="150E71CA"/>
+    <w:nsid w:val="08537D24"/>
     <w:multiLevelType w:val="multilevel"/>
-    <w:tmpl w:val="445E351A"/>
+    <w:tmpl w:val="683C6390"/>
+    <w:lvl w:ilvl="0">
+      <w:start w:val="1"/>
+      <w:numFmt w:val="decimal"/>
+      <w:lvlText w:val="%1."/>
+      <w:lvlJc w:val="left"/>
+      <w:pPr>
+        <w:tabs>
+          <w:tab w:val="num" w:pos="720"/>
+        </w:tabs>
+        <w:ind w:left="720" w:hanging="360"/>
+      </w:pPr>
+    </w:lvl>
+    <w:lvl w:ilvl="1" w:tentative="1">
+      <w:start w:val="1"/>
+      <w:numFmt w:val="decimal"/>
+      <w:lvlText w:val="%2."/>
+      <w:lvlJc w:val="left"/>
+      <w:pPr>
+        <w:tabs>
+          <w:tab w:val="num" w:pos="1440"/>
+        </w:tabs>
+        <w:ind w:left="1440" w:hanging="360"/>
+      </w:pPr>
+    </w:lvl>
+    <w:lvl w:ilvl="2" w:tentative="1">
+      <w:start w:val="1"/>
+      <w:numFmt w:val="decimal"/>
+      <w:lvlText w:val="%3."/>
+      <w:lvlJc w:val="left"/>
+      <w:pPr>
+        <w:tabs>
+          <w:tab w:val="num" w:pos="2160"/>
+        </w:tabs>
+        <w:ind w:left="2160" w:hanging="360"/>
+      </w:pPr>
+    </w:lvl>
+    <w:lvl w:ilvl="3" w:tentative="1">
+      <w:start w:val="1"/>
+      <w:numFmt w:val="decimal"/>
+      <w:lvlText w:val="%4."/>
+      <w:lvlJc w:val="left"/>
+      <w:pPr>
+        <w:tabs>
+          <w:tab w:val="num" w:pos="2880"/>
+        </w:tabs>
+        <w:ind w:left="2880" w:hanging="360"/>
+      </w:pPr>
+    </w:lvl>
+    <w:lvl w:ilvl="4" w:tentative="1">
+      <w:start w:val="1"/>
+      <w:numFmt w:val="decimal"/>
+      <w:lvlText w:val="%5."/>
+      <w:lvlJc w:val="left"/>
+      <w:pPr>
+        <w:tabs>
+          <w:tab w:val="num" w:pos="3600"/>
+        </w:tabs>
+        <w:ind w:left="3600" w:hanging="360"/>
+      </w:pPr>
+    </w:lvl>
+    <w:lvl w:ilvl="5" w:tentative="1">
+      <w:start w:val="1"/>
+      <w:numFmt w:val="decimal"/>
+      <w:lvlText w:val="%6."/>
+      <w:lvlJc w:val="left"/>
+      <w:pPr>
+        <w:tabs>
+          <w:tab w:val="num" w:pos="4320"/>
+        </w:tabs>
+        <w:ind w:left="4320" w:hanging="360"/>
+      </w:pPr>
+    </w:lvl>
+    <w:lvl w:ilvl="6" w:tentative="1">
+      <w:start w:val="1"/>
+      <w:numFmt w:val="decimal"/>
+      <w:lvlText w:val="%7."/>
+      <w:lvlJc w:val="left"/>
+      <w:pPr>
+        <w:tabs>
+          <w:tab w:val="num" w:pos="5040"/>
+        </w:tabs>
+        <w:ind w:left="5040" w:hanging="360"/>
+      </w:pPr>
+    </w:lvl>
+    <w:lvl w:ilvl="7" w:tentative="1">
+      <w:start w:val="1"/>
+      <w:numFmt w:val="decimal"/>
+      <w:lvlText w:val="%8."/>
+      <w:lvlJc w:val="left"/>
+      <w:pPr>
+        <w:tabs>
+          <w:tab w:val="num" w:pos="5760"/>
+        </w:tabs>
+        <w:ind w:left="5760" w:hanging="360"/>
+      </w:pPr>
+    </w:lvl>
+    <w:lvl w:ilvl="8" w:tentative="1">
+      <w:start w:val="1"/>
+      <w:numFmt w:val="decimal"/>
+      <w:lvlText w:val="%9."/>
+      <w:lvlJc w:val="left"/>
+      <w:pPr>
+        <w:tabs>
+          <w:tab w:val="num" w:pos="6480"/>
+        </w:tabs>
+        <w:ind w:left="6480" w:hanging="360"/>
+      </w:pPr>
+    </w:lvl>
+  </w:abstractNum>
+  <w:abstractNum w:abstractNumId="1" w15:restartNumberingAfterBreak="0">
+    <w:nsid w:val="20E24835"/>
+    <w:multiLevelType w:val="multilevel"/>
+    <w:tmpl w:val="D39A6D0C"/>
     <w:lvl w:ilvl="0">
       <w:start w:val="1"/>
       <w:numFmt w:val="bullet"/>
@@ -10979,10 +11073,159 @@
       </w:rPr>
     </w:lvl>
   </w:abstractNum>
-  <w:abstractNum w:abstractNumId="1" w15:restartNumberingAfterBreak="0">
-    <w:nsid w:val="1ECB7A9E"/>
+  <w:abstractNum w:abstractNumId="2" w15:restartNumberingAfterBreak="0">
+    <w:nsid w:val="2CBC69DC"/>
     <w:multiLevelType w:val="multilevel"/>
-    <w:tmpl w:val="B950A682"/>
+    <w:tmpl w:val="D73CAB10"/>
+    <w:lvl w:ilvl="0">
+      <w:start w:val="1"/>
+      <w:numFmt w:val="bullet"/>
+      <w:lvlText w:val=""/>
+      <w:lvlJc w:val="left"/>
+      <w:pPr>
+        <w:tabs>
+          <w:tab w:val="num" w:pos="720"/>
+        </w:tabs>
+        <w:ind w:left="720" w:hanging="360"/>
+      </w:pPr>
+      <w:rPr>
+        <w:rFonts w:ascii="Symbol" w:hAnsi="Symbol" w:hint="default"/>
+        <w:sz w:val="20"/>
+      </w:rPr>
+    </w:lvl>
+    <w:lvl w:ilvl="1">
+      <w:start w:val="1"/>
+      <w:numFmt w:val="bullet"/>
+      <w:lvlText w:val="o"/>
+      <w:lvlJc w:val="left"/>
+      <w:pPr>
+        <w:tabs>
+          <w:tab w:val="num" w:pos="1440"/>
+        </w:tabs>
+        <w:ind w:left="1440" w:hanging="360"/>
+      </w:pPr>
+      <w:rPr>
+        <w:rFonts w:ascii="Courier New" w:hAnsi="Courier New" w:hint="default"/>
+        <w:sz w:val="20"/>
+      </w:rPr>
+    </w:lvl>
+    <w:lvl w:ilvl="2" w:tentative="1">
+      <w:start w:val="1"/>
+      <w:numFmt w:val="bullet"/>
+      <w:lvlText w:val=""/>
+      <w:lvlJc w:val="left"/>
+      <w:pPr>
+        <w:tabs>
+          <w:tab w:val="num" w:pos="2160"/>
+        </w:tabs>
+        <w:ind w:left="2160" w:hanging="360"/>
+      </w:pPr>
+      <w:rPr>
+        <w:rFonts w:ascii="Wingdings" w:hAnsi="Wingdings" w:hint="default"/>
+        <w:sz w:val="20"/>
+      </w:rPr>
+    </w:lvl>
+    <w:lvl w:ilvl="3" w:tentative="1">
+      <w:start w:val="1"/>
+      <w:numFmt w:val="bullet"/>
+      <w:lvlText w:val=""/>
+      <w:lvlJc w:val="left"/>
+      <w:pPr>
+        <w:tabs>
+          <w:tab w:val="num" w:pos="2880"/>
+        </w:tabs>
+        <w:ind w:left="2880" w:hanging="360"/>
+      </w:pPr>
+      <w:rPr>
+        <w:rFonts w:ascii="Wingdings" w:hAnsi="Wingdings" w:hint="default"/>
+        <w:sz w:val="20"/>
+      </w:rPr>
+    </w:lvl>
+    <w:lvl w:ilvl="4" w:tentative="1">
+      <w:start w:val="1"/>
+      <w:numFmt w:val="bullet"/>
+      <w:lvlText w:val=""/>
+      <w:lvlJc w:val="left"/>
+      <w:pPr>
+        <w:tabs>
+          <w:tab w:val="num" w:pos="3600"/>
+        </w:tabs>
+        <w:ind w:left="3600" w:hanging="360"/>
+      </w:pPr>
+      <w:rPr>
+        <w:rFonts w:ascii="Wingdings" w:hAnsi="Wingdings" w:hint="default"/>
+        <w:sz w:val="20"/>
+      </w:rPr>
+    </w:lvl>
+    <w:lvl w:ilvl="5" w:tentative="1">
+      <w:start w:val="1"/>
+      <w:numFmt w:val="bullet"/>
+      <w:lvlText w:val=""/>
+      <w:lvlJc w:val="left"/>
+      <w:pPr>
+        <w:tabs>
+          <w:tab w:val="num" w:pos="4320"/>
+        </w:tabs>
+        <w:ind w:left="4320" w:hanging="360"/>
+      </w:pPr>
+      <w:rPr>
+        <w:rFonts w:ascii="Wingdings" w:hAnsi="Wingdings" w:hint="default"/>
+        <w:sz w:val="20"/>
+      </w:rPr>
+    </w:lvl>
+    <w:lvl w:ilvl="6" w:tentative="1">
+      <w:start w:val="1"/>
+      <w:numFmt w:val="bullet"/>
+      <w:lvlText w:val=""/>
+      <w:lvlJc w:val="left"/>
+      <w:pPr>
+        <w:tabs>
+          <w:tab w:val="num" w:pos="5040"/>
+        </w:tabs>
+        <w:ind w:left="5040" w:hanging="360"/>
+      </w:pPr>
+      <w:rPr>
+        <w:rFonts w:ascii="Wingdings" w:hAnsi="Wingdings" w:hint="default"/>
+        <w:sz w:val="20"/>
+      </w:rPr>
+    </w:lvl>
+    <w:lvl w:ilvl="7" w:tentative="1">
+      <w:start w:val="1"/>
+      <w:numFmt w:val="bullet"/>
+      <w:lvlText w:val=""/>
+      <w:lvlJc w:val="left"/>
+      <w:pPr>
+        <w:tabs>
+          <w:tab w:val="num" w:pos="5760"/>
+        </w:tabs>
+        <w:ind w:left="5760" w:hanging="360"/>
+      </w:pPr>
+      <w:rPr>
+        <w:rFonts w:ascii="Wingdings" w:hAnsi="Wingdings" w:hint="default"/>
+        <w:sz w:val="20"/>
+      </w:rPr>
+    </w:lvl>
+    <w:lvl w:ilvl="8" w:tentative="1">
+      <w:start w:val="1"/>
+      <w:numFmt w:val="bullet"/>
+      <w:lvlText w:val=""/>
+      <w:lvlJc w:val="left"/>
+      <w:pPr>
+        <w:tabs>
+          <w:tab w:val="num" w:pos="6480"/>
+        </w:tabs>
+        <w:ind w:left="6480" w:hanging="360"/>
+      </w:pPr>
+      <w:rPr>
+        <w:rFonts w:ascii="Wingdings" w:hAnsi="Wingdings" w:hint="default"/>
+        <w:sz w:val="20"/>
+      </w:rPr>
+    </w:lvl>
+  </w:abstractNum>
+  <w:abstractNum w:abstractNumId="3" w15:restartNumberingAfterBreak="0">
+    <w:nsid w:val="36366C53"/>
+    <w:multiLevelType w:val="multilevel"/>
+    <w:tmpl w:val="DE7CBEFA"/>
     <w:lvl w:ilvl="0">
       <w:start w:val="1"/>
       <w:numFmt w:val="bullet"/>
@@ -11128,10 +11371,10 @@
       </w:rPr>
     </w:lvl>
   </w:abstractNum>
-  <w:abstractNum w:abstractNumId="2" w15:restartNumberingAfterBreak="0">
-    <w:nsid w:val="20E47FE3"/>
+  <w:abstractNum w:abstractNumId="4" w15:restartNumberingAfterBreak="0">
+    <w:nsid w:val="4B037168"/>
     <w:multiLevelType w:val="multilevel"/>
-    <w:tmpl w:val="F1F295C6"/>
+    <w:tmpl w:val="FFCA9B26"/>
     <w:lvl w:ilvl="0">
       <w:start w:val="1"/>
       <w:numFmt w:val="bullet"/>
@@ -11277,10 +11520,10 @@
       </w:rPr>
     </w:lvl>
   </w:abstractNum>
-  <w:abstractNum w:abstractNumId="3" w15:restartNumberingAfterBreak="0">
-    <w:nsid w:val="2B8D6E68"/>
+  <w:abstractNum w:abstractNumId="5" w15:restartNumberingAfterBreak="0">
+    <w:nsid w:val="521C3418"/>
     <w:multiLevelType w:val="multilevel"/>
-    <w:tmpl w:val="AD1A4464"/>
+    <w:tmpl w:val="5FB07E8E"/>
     <w:lvl w:ilvl="0">
       <w:start w:val="1"/>
       <w:numFmt w:val="bullet"/>
@@ -11426,123 +11669,10 @@
       </w:rPr>
     </w:lvl>
   </w:abstractNum>
-  <w:abstractNum w:abstractNumId="4" w15:restartNumberingAfterBreak="0">
-    <w:nsid w:val="31566B48"/>
+  <w:abstractNum w:abstractNumId="6" w15:restartNumberingAfterBreak="0">
+    <w:nsid w:val="53DA198D"/>
     <w:multiLevelType w:val="multilevel"/>
-    <w:tmpl w:val="0980E5B0"/>
-    <w:lvl w:ilvl="0">
-      <w:start w:val="1"/>
-      <w:numFmt w:val="decimal"/>
-      <w:lvlText w:val="%1."/>
-      <w:lvlJc w:val="left"/>
-      <w:pPr>
-        <w:tabs>
-          <w:tab w:val="num" w:pos="720"/>
-        </w:tabs>
-        <w:ind w:left="720" w:hanging="360"/>
-      </w:pPr>
-    </w:lvl>
-    <w:lvl w:ilvl="1" w:tentative="1">
-      <w:start w:val="1"/>
-      <w:numFmt w:val="decimal"/>
-      <w:lvlText w:val="%2."/>
-      <w:lvlJc w:val="left"/>
-      <w:pPr>
-        <w:tabs>
-          <w:tab w:val="num" w:pos="1440"/>
-        </w:tabs>
-        <w:ind w:left="1440" w:hanging="360"/>
-      </w:pPr>
-    </w:lvl>
-    <w:lvl w:ilvl="2" w:tentative="1">
-      <w:start w:val="1"/>
-      <w:numFmt w:val="decimal"/>
-      <w:lvlText w:val="%3."/>
-      <w:lvlJc w:val="left"/>
-      <w:pPr>
-        <w:tabs>
-          <w:tab w:val="num" w:pos="2160"/>
-        </w:tabs>
-        <w:ind w:left="2160" w:hanging="360"/>
-      </w:pPr>
-    </w:lvl>
-    <w:lvl w:ilvl="3" w:tentative="1">
-      <w:start w:val="1"/>
-      <w:numFmt w:val="decimal"/>
-      <w:lvlText w:val="%4."/>
-      <w:lvlJc w:val="left"/>
-      <w:pPr>
-        <w:tabs>
-          <w:tab w:val="num" w:pos="2880"/>
-        </w:tabs>
-        <w:ind w:left="2880" w:hanging="360"/>
-      </w:pPr>
-    </w:lvl>
-    <w:lvl w:ilvl="4" w:tentative="1">
-      <w:start w:val="1"/>
-      <w:numFmt w:val="decimal"/>
-      <w:lvlText w:val="%5."/>
-      <w:lvlJc w:val="left"/>
-      <w:pPr>
-        <w:tabs>
-          <w:tab w:val="num" w:pos="3600"/>
-        </w:tabs>
-        <w:ind w:left="3600" w:hanging="360"/>
-      </w:pPr>
-    </w:lvl>
-    <w:lvl w:ilvl="5" w:tentative="1">
-      <w:start w:val="1"/>
-      <w:numFmt w:val="decimal"/>
-      <w:lvlText w:val="%6."/>
-      <w:lvlJc w:val="left"/>
-      <w:pPr>
-        <w:tabs>
-          <w:tab w:val="num" w:pos="4320"/>
-        </w:tabs>
-        <w:ind w:left="4320" w:hanging="360"/>
-      </w:pPr>
-    </w:lvl>
-    <w:lvl w:ilvl="6" w:tentative="1">
-      <w:start w:val="1"/>
-      <w:numFmt w:val="decimal"/>
-      <w:lvlText w:val="%7."/>
-      <w:lvlJc w:val="left"/>
-      <w:pPr>
-        <w:tabs>
-          <w:tab w:val="num" w:pos="5040"/>
-        </w:tabs>
-        <w:ind w:left="5040" w:hanging="360"/>
-      </w:pPr>
-    </w:lvl>
-    <w:lvl w:ilvl="7" w:tentative="1">
-      <w:start w:val="1"/>
-      <w:numFmt w:val="decimal"/>
-      <w:lvlText w:val="%8."/>
-      <w:lvlJc w:val="left"/>
-      <w:pPr>
-        <w:tabs>
-          <w:tab w:val="num" w:pos="5760"/>
-        </w:tabs>
-        <w:ind w:left="5760" w:hanging="360"/>
-      </w:pPr>
-    </w:lvl>
-    <w:lvl w:ilvl="8" w:tentative="1">
-      <w:start w:val="1"/>
-      <w:numFmt w:val="decimal"/>
-      <w:lvlText w:val="%9."/>
-      <w:lvlJc w:val="left"/>
-      <w:pPr>
-        <w:tabs>
-          <w:tab w:val="num" w:pos="6480"/>
-        </w:tabs>
-        <w:ind w:left="6480" w:hanging="360"/>
-      </w:pPr>
-    </w:lvl>
-  </w:abstractNum>
-  <w:abstractNum w:abstractNumId="5" w15:restartNumberingAfterBreak="0">
-    <w:nsid w:val="48F51FD3"/>
-    <w:multiLevelType w:val="multilevel"/>
-    <w:tmpl w:val="3AD6A5F6"/>
+    <w:tmpl w:val="C156A424"/>
     <w:lvl w:ilvl="0">
       <w:start w:val="1"/>
       <w:numFmt w:val="bullet"/>
@@ -11688,10 +11818,10 @@
       </w:rPr>
     </w:lvl>
   </w:abstractNum>
-  <w:abstractNum w:abstractNumId="6" w15:restartNumberingAfterBreak="0">
-    <w:nsid w:val="49910BD0"/>
+  <w:abstractNum w:abstractNumId="7" w15:restartNumberingAfterBreak="0">
+    <w:nsid w:val="5A1F2DBA"/>
     <w:multiLevelType w:val="multilevel"/>
-    <w:tmpl w:val="9E469286"/>
+    <w:tmpl w:val="09BE24B4"/>
     <w:lvl w:ilvl="0">
       <w:start w:val="1"/>
       <w:numFmt w:val="bullet"/>
@@ -11708,7 +11838,7 @@
         <w:sz w:val="20"/>
       </w:rPr>
     </w:lvl>
-    <w:lvl w:ilvl="1">
+    <w:lvl w:ilvl="1" w:tentative="1">
       <w:start w:val="1"/>
       <w:numFmt w:val="bullet"/>
       <w:lvlText w:val="o"/>
@@ -11837,10 +11967,10 @@
       </w:rPr>
     </w:lvl>
   </w:abstractNum>
-  <w:abstractNum w:abstractNumId="7" w15:restartNumberingAfterBreak="0">
-    <w:nsid w:val="523A4EB6"/>
+  <w:abstractNum w:abstractNumId="8" w15:restartNumberingAfterBreak="0">
+    <w:nsid w:val="6C123755"/>
     <w:multiLevelType w:val="multilevel"/>
-    <w:tmpl w:val="E82A3314"/>
+    <w:tmpl w:val="F87074C4"/>
     <w:lvl w:ilvl="0">
       <w:start w:val="1"/>
       <w:numFmt w:val="bullet"/>
@@ -11986,10 +12116,10 @@
       </w:rPr>
     </w:lvl>
   </w:abstractNum>
-  <w:abstractNum w:abstractNumId="8" w15:restartNumberingAfterBreak="0">
-    <w:nsid w:val="55FB3312"/>
+  <w:abstractNum w:abstractNumId="9" w15:restartNumberingAfterBreak="0">
+    <w:nsid w:val="79353E37"/>
     <w:multiLevelType w:val="multilevel"/>
-    <w:tmpl w:val="D64E204E"/>
+    <w:tmpl w:val="EF82186E"/>
     <w:lvl w:ilvl="0">
       <w:start w:val="1"/>
       <w:numFmt w:val="bullet"/>
@@ -12135,184 +12265,35 @@
       </w:rPr>
     </w:lvl>
   </w:abstractNum>
-  <w:abstractNum w:abstractNumId="9" w15:restartNumberingAfterBreak="0">
-    <w:nsid w:val="56F5329E"/>
-    <w:multiLevelType w:val="multilevel"/>
-    <w:tmpl w:val="147AE3DC"/>
-    <w:lvl w:ilvl="0">
-      <w:start w:val="1"/>
-      <w:numFmt w:val="bullet"/>
-      <w:lvlText w:val=""/>
-      <w:lvlJc w:val="left"/>
-      <w:pPr>
-        <w:tabs>
-          <w:tab w:val="num" w:pos="720"/>
-        </w:tabs>
-        <w:ind w:left="720" w:hanging="360"/>
-      </w:pPr>
-      <w:rPr>
-        <w:rFonts w:ascii="Symbol" w:hAnsi="Symbol" w:hint="default"/>
-        <w:sz w:val="20"/>
-      </w:rPr>
-    </w:lvl>
-    <w:lvl w:ilvl="1" w:tentative="1">
-      <w:start w:val="1"/>
-      <w:numFmt w:val="bullet"/>
-      <w:lvlText w:val="o"/>
-      <w:lvlJc w:val="left"/>
-      <w:pPr>
-        <w:tabs>
-          <w:tab w:val="num" w:pos="1440"/>
-        </w:tabs>
-        <w:ind w:left="1440" w:hanging="360"/>
-      </w:pPr>
-      <w:rPr>
-        <w:rFonts w:ascii="Courier New" w:hAnsi="Courier New" w:hint="default"/>
-        <w:sz w:val="20"/>
-      </w:rPr>
-    </w:lvl>
-    <w:lvl w:ilvl="2" w:tentative="1">
-      <w:start w:val="1"/>
-      <w:numFmt w:val="bullet"/>
-      <w:lvlText w:val=""/>
-      <w:lvlJc w:val="left"/>
-      <w:pPr>
-        <w:tabs>
-          <w:tab w:val="num" w:pos="2160"/>
-        </w:tabs>
-        <w:ind w:left="2160" w:hanging="360"/>
-      </w:pPr>
-      <w:rPr>
-        <w:rFonts w:ascii="Wingdings" w:hAnsi="Wingdings" w:hint="default"/>
-        <w:sz w:val="20"/>
-      </w:rPr>
-    </w:lvl>
-    <w:lvl w:ilvl="3" w:tentative="1">
-      <w:start w:val="1"/>
-      <w:numFmt w:val="bullet"/>
-      <w:lvlText w:val=""/>
-      <w:lvlJc w:val="left"/>
-      <w:pPr>
-        <w:tabs>
-          <w:tab w:val="num" w:pos="2880"/>
-        </w:tabs>
-        <w:ind w:left="2880" w:hanging="360"/>
-      </w:pPr>
-      <w:rPr>
-        <w:rFonts w:ascii="Wingdings" w:hAnsi="Wingdings" w:hint="default"/>
-        <w:sz w:val="20"/>
-      </w:rPr>
-    </w:lvl>
-    <w:lvl w:ilvl="4" w:tentative="1">
-      <w:start w:val="1"/>
-      <w:numFmt w:val="bullet"/>
-      <w:lvlText w:val=""/>
-      <w:lvlJc w:val="left"/>
-      <w:pPr>
-        <w:tabs>
-          <w:tab w:val="num" w:pos="3600"/>
-        </w:tabs>
-        <w:ind w:left="3600" w:hanging="360"/>
-      </w:pPr>
-      <w:rPr>
-        <w:rFonts w:ascii="Wingdings" w:hAnsi="Wingdings" w:hint="default"/>
-        <w:sz w:val="20"/>
-      </w:rPr>
-    </w:lvl>
-    <w:lvl w:ilvl="5" w:tentative="1">
-      <w:start w:val="1"/>
-      <w:numFmt w:val="bullet"/>
-      <w:lvlText w:val=""/>
-      <w:lvlJc w:val="left"/>
-      <w:pPr>
-        <w:tabs>
-          <w:tab w:val="num" w:pos="4320"/>
-        </w:tabs>
-        <w:ind w:left="4320" w:hanging="360"/>
-      </w:pPr>
-      <w:rPr>
-        <w:rFonts w:ascii="Wingdings" w:hAnsi="Wingdings" w:hint="default"/>
-        <w:sz w:val="20"/>
-      </w:rPr>
-    </w:lvl>
-    <w:lvl w:ilvl="6" w:tentative="1">
-      <w:start w:val="1"/>
-      <w:numFmt w:val="bullet"/>
-      <w:lvlText w:val=""/>
-      <w:lvlJc w:val="left"/>
-      <w:pPr>
-        <w:tabs>
-          <w:tab w:val="num" w:pos="5040"/>
-        </w:tabs>
-        <w:ind w:left="5040" w:hanging="360"/>
-      </w:pPr>
-      <w:rPr>
-        <w:rFonts w:ascii="Wingdings" w:hAnsi="Wingdings" w:hint="default"/>
-        <w:sz w:val="20"/>
-      </w:rPr>
-    </w:lvl>
-    <w:lvl w:ilvl="7" w:tentative="1">
-      <w:start w:val="1"/>
-      <w:numFmt w:val="bullet"/>
-      <w:lvlText w:val=""/>
-      <w:lvlJc w:val="left"/>
-      <w:pPr>
-        <w:tabs>
-          <w:tab w:val="num" w:pos="5760"/>
-        </w:tabs>
-        <w:ind w:left="5760" w:hanging="360"/>
-      </w:pPr>
-      <w:rPr>
-        <w:rFonts w:ascii="Wingdings" w:hAnsi="Wingdings" w:hint="default"/>
-        <w:sz w:val="20"/>
-      </w:rPr>
-    </w:lvl>
-    <w:lvl w:ilvl="8" w:tentative="1">
-      <w:start w:val="1"/>
-      <w:numFmt w:val="bullet"/>
-      <w:lvlText w:val=""/>
-      <w:lvlJc w:val="left"/>
-      <w:pPr>
-        <w:tabs>
-          <w:tab w:val="num" w:pos="6480"/>
-        </w:tabs>
-        <w:ind w:left="6480" w:hanging="360"/>
-      </w:pPr>
-      <w:rPr>
-        <w:rFonts w:ascii="Wingdings" w:hAnsi="Wingdings" w:hint="default"/>
-        <w:sz w:val="20"/>
-      </w:rPr>
-    </w:lvl>
-  </w:abstractNum>
-  <w:num w:numId="1" w16cid:durableId="497498319">
+  <w:num w:numId="1" w16cid:durableId="331105483">
+    <w:abstractNumId w:val="0"/>
+  </w:num>
+  <w:num w:numId="2" w16cid:durableId="180365905">
+    <w:abstractNumId w:val="3"/>
+  </w:num>
+  <w:num w:numId="3" w16cid:durableId="244464582">
+    <w:abstractNumId w:val="2"/>
+  </w:num>
+  <w:num w:numId="4" w16cid:durableId="1120802265">
     <w:abstractNumId w:val="4"/>
   </w:num>
-  <w:num w:numId="2" w16cid:durableId="314187776">
+  <w:num w:numId="5" w16cid:durableId="1158885741">
+    <w:abstractNumId w:val="7"/>
+  </w:num>
+  <w:num w:numId="6" w16cid:durableId="2023117641">
+    <w:abstractNumId w:val="8"/>
+  </w:num>
+  <w:num w:numId="7" w16cid:durableId="1063334030">
+    <w:abstractNumId w:val="5"/>
+  </w:num>
+  <w:num w:numId="8" w16cid:durableId="1183739306">
     <w:abstractNumId w:val="9"/>
   </w:num>
-  <w:num w:numId="3" w16cid:durableId="1219241657">
+  <w:num w:numId="9" w16cid:durableId="1277634204">
     <w:abstractNumId w:val="6"/>
   </w:num>
-  <w:num w:numId="4" w16cid:durableId="561796785">
-    <w:abstractNumId w:val="5"/>
-  </w:num>
-  <w:num w:numId="5" w16cid:durableId="438912072">
+  <w:num w:numId="10" w16cid:durableId="1749762966">
     <w:abstractNumId w:val="1"/>
-  </w:num>
-  <w:num w:numId="6" w16cid:durableId="2023311161">
-    <w:abstractNumId w:val="7"/>
-  </w:num>
-  <w:num w:numId="7" w16cid:durableId="990909312">
-    <w:abstractNumId w:val="0"/>
-  </w:num>
-  <w:num w:numId="8" w16cid:durableId="1676298468">
-    <w:abstractNumId w:val="8"/>
-  </w:num>
-  <w:num w:numId="9" w16cid:durableId="540871197">
-    <w:abstractNumId w:val="2"/>
-  </w:num>
-  <w:num w:numId="10" w16cid:durableId="547110446">
-    <w:abstractNumId w:val="3"/>
   </w:num>
 </w:numbering>
 </file>

</xml_diff>

<commit_message>
Build both apps into an easy Apps folder
Owner request: the programs were buried in src\...\bin\Debug\net10.0-windows.
Each .csproj now sets OutputPath, so every build puts them in
Apps\Office App\Company.OfficeApp.exe and
Apps\Website Admin\Company.WebsiteAdmin.exe (Apps/ is git-ignored).
Both start from there; notes, Developer Guide and testing log updated
(also fixes two paths in the notes and log that had lost their backslashes).

Co-Authored-By: Claude Opus 5.5 <noreply@anthropic.com>
</commit_message>
<xml_diff>
--- a/docs/Developer Guide.docx
+++ b/docs/Developer Guide.docx
@@ -72,7 +72,7 @@
       <w:pPr>
         <w:pStyle w:val="NormalWeb"/>
         <w:shd w:val="clear" w:color="auto" w:fill="EEF2F8"/>
-        <w:divId w:val="1300191410"/>
+        <w:divId w:val="1788892160"/>
         <w:rPr>
           <w:rFonts w:ascii="Calibri" w:hAnsi="Calibri" w:cs="Calibri"/>
           <w:color w:val="404040"/>
@@ -2363,135 +2363,187 @@
       </w:pPr>
       <w:r>
         <w:rPr>
-          <w:rStyle w:val="Strong"/>
-          <w:rFonts w:ascii="Calibri" w:hAnsi="Calibri" w:cs="Calibri"/>
-          <w:color w:val="1A1A1A"/>
-          <w:sz w:val="22"/>
-          <w:szCs w:val="22"/>
-        </w:rPr>
-        <w:t>Forgotten PostgreSQL password:</w:t>
-      </w:r>
-      <w:r>
-        <w:rPr>
-          <w:rFonts w:ascii="Calibri" w:hAnsi="Calibri" w:cs="Calibri"/>
-          <w:color w:val="1A1A1A"/>
-          <w:sz w:val="22"/>
-          <w:szCs w:val="22"/>
-        </w:rPr>
-        <w:t xml:space="preserve"> in </w:t>
+          <w:rFonts w:ascii="Calibri" w:hAnsi="Calibri" w:cs="Calibri"/>
+          <w:color w:val="1A1A1A"/>
+          <w:sz w:val="22"/>
+          <w:szCs w:val="22"/>
+        </w:rPr>
+        <w:t xml:space="preserve">Every build puts the finished programs in one easy folder at the top of the project: </w:t>
       </w:r>
       <w:r>
         <w:rPr>
           <w:rStyle w:val="HTMLCode"/>
           <w:color w:val="1A1A1A"/>
         </w:rPr>
-        <w:t>C:\Program Files\PostgreSQL\18\data\pg_hba.conf</w:t>
-      </w:r>
-      <w:r>
-        <w:rPr>
-          <w:rFonts w:ascii="Calibri" w:hAnsi="Calibri" w:cs="Calibri"/>
-          <w:color w:val="1A1A1A"/>
-          <w:sz w:val="22"/>
-          <w:szCs w:val="22"/>
-        </w:rPr>
-        <w:t xml:space="preserve"> change </w:t>
+        <w:t>Apps\Office App\Company.OfficeApp.exe</w:t>
+      </w:r>
+      <w:r>
+        <w:rPr>
+          <w:rFonts w:ascii="Calibri" w:hAnsi="Calibri" w:cs="Calibri"/>
+          <w:color w:val="1A1A1A"/>
+          <w:sz w:val="22"/>
+          <w:szCs w:val="22"/>
+        </w:rPr>
+        <w:t xml:space="preserve"> and </w:t>
       </w:r>
       <w:r>
         <w:rPr>
           <w:rStyle w:val="HTMLCode"/>
           <w:color w:val="1A1A1A"/>
         </w:rPr>
-        <w:t>scram-sha-256</w:t>
-      </w:r>
-      <w:r>
-        <w:rPr>
-          <w:rFonts w:ascii="Calibri" w:hAnsi="Calibri" w:cs="Calibri"/>
-          <w:color w:val="1A1A1A"/>
-          <w:sz w:val="22"/>
-          <w:szCs w:val="22"/>
-        </w:rPr>
-        <w:t xml:space="preserve"> to </w:t>
-      </w:r>
-      <w:r>
-        <w:rPr>
-          <w:rStyle w:val="HTMLCode"/>
-          <w:color w:val="1A1A1A"/>
-        </w:rPr>
-        <w:t>trust</w:t>
-      </w:r>
-      <w:r>
-        <w:rPr>
-          <w:rFonts w:ascii="Calibri" w:hAnsi="Calibri" w:cs="Calibri"/>
-          <w:color w:val="1A1A1A"/>
-          <w:sz w:val="22"/>
-          <w:szCs w:val="22"/>
-        </w:rPr>
-        <w:t xml:space="preserve">, restart the </w:t>
-      </w:r>
-      <w:r>
-        <w:rPr>
-          <w:rStyle w:val="HTMLCode"/>
-          <w:color w:val="1A1A1A"/>
-        </w:rPr>
-        <w:t>postgresql-x64-18</w:t>
-      </w:r>
-      <w:r>
-        <w:rPr>
-          <w:rFonts w:ascii="Calibri" w:hAnsi="Calibri" w:cs="Calibri"/>
-          <w:color w:val="1A1A1A"/>
-          <w:sz w:val="22"/>
-          <w:szCs w:val="22"/>
-        </w:rPr>
-        <w:t xml:space="preserve"> service, run </w:t>
-      </w:r>
-      <w:r>
-        <w:rPr>
-          <w:rStyle w:val="HTMLCode"/>
-          <w:color w:val="1A1A1A"/>
-        </w:rPr>
-        <w:t>ALTER USER postgres WITH PASSWORD '...';</w:t>
-      </w:r>
-      <w:r>
-        <w:rPr>
-          <w:rFonts w:ascii="Calibri" w:hAnsi="Calibri" w:cs="Calibri"/>
-          <w:color w:val="1A1A1A"/>
-          <w:sz w:val="22"/>
-          <w:szCs w:val="22"/>
-        </w:rPr>
-        <w:t xml:space="preserve"> in pgAdmin, then change it back and restart again.</w:t>
+        <w:t>Apps\Website Admin\Company.WebsiteAdmin.exe</w:t>
+      </w:r>
+      <w:r>
+        <w:rPr>
+          <w:rFonts w:ascii="Calibri" w:hAnsi="Calibri" w:cs="Calibri"/>
+          <w:color w:val="1A1A1A"/>
+          <w:sz w:val="22"/>
+          <w:szCs w:val="22"/>
+        </w:rPr>
+        <w:t>. Double-click them there (or make desktop shortcuts to them). The folder is rebuilt every time and isn't saved in Git.</w:t>
       </w:r>
     </w:p>
     <w:p>
       <w:pPr>
-        <w:pStyle w:val="Heading1"/>
-        <w:rPr>
-          <w:rFonts w:ascii="Calibri" w:eastAsia="Times New Roman" w:hAnsi="Calibri" w:cs="Calibri"/>
-        </w:rPr>
-      </w:pPr>
-      <w:r>
-        <w:rPr>
-          <w:rFonts w:ascii="Calibri" w:eastAsia="Times New Roman" w:hAnsi="Calibri" w:cs="Calibri"/>
+        <w:pStyle w:val="NormalWeb"/>
+        <w:rPr>
+          <w:rFonts w:ascii="Calibri" w:hAnsi="Calibri" w:cs="Calibri"/>
+          <w:color w:val="1A1A1A"/>
+          <w:sz w:val="22"/>
+          <w:szCs w:val="22"/>
+        </w:rPr>
+      </w:pPr>
+      <w:r>
+        <w:rPr>
+          <w:rStyle w:val="Strong"/>
+          <w:rFonts w:ascii="Calibri" w:hAnsi="Calibri" w:cs="Calibri"/>
+          <w:color w:val="1A1A1A"/>
+          <w:sz w:val="22"/>
+          <w:szCs w:val="22"/>
         </w:rPr>
         <w:lastRenderedPageBreak/>
-        <w:t>Chapter 2: The database</w:t>
+        <w:t>Forgotten PostgreSQL password:</w:t>
+      </w:r>
+      <w:r>
+        <w:rPr>
+          <w:rFonts w:ascii="Calibri" w:hAnsi="Calibri" w:cs="Calibri"/>
+          <w:color w:val="1A1A1A"/>
+          <w:sz w:val="22"/>
+          <w:szCs w:val="22"/>
+        </w:rPr>
+        <w:t xml:space="preserve"> in </w:t>
+      </w:r>
+      <w:r>
+        <w:rPr>
+          <w:rStyle w:val="HTMLCode"/>
+          <w:color w:val="1A1A1A"/>
+        </w:rPr>
+        <w:t>C:\Program Files\PostgreSQL\18\data\pg_hba.conf</w:t>
+      </w:r>
+      <w:r>
+        <w:rPr>
+          <w:rFonts w:ascii="Calibri" w:hAnsi="Calibri" w:cs="Calibri"/>
+          <w:color w:val="1A1A1A"/>
+          <w:sz w:val="22"/>
+          <w:szCs w:val="22"/>
+        </w:rPr>
+        <w:t xml:space="preserve"> change </w:t>
+      </w:r>
+      <w:r>
+        <w:rPr>
+          <w:rStyle w:val="HTMLCode"/>
+          <w:color w:val="1A1A1A"/>
+        </w:rPr>
+        <w:t>scram-sha-256</w:t>
+      </w:r>
+      <w:r>
+        <w:rPr>
+          <w:rFonts w:ascii="Calibri" w:hAnsi="Calibri" w:cs="Calibri"/>
+          <w:color w:val="1A1A1A"/>
+          <w:sz w:val="22"/>
+          <w:szCs w:val="22"/>
+        </w:rPr>
+        <w:t xml:space="preserve"> to </w:t>
+      </w:r>
+      <w:r>
+        <w:rPr>
+          <w:rStyle w:val="HTMLCode"/>
+          <w:color w:val="1A1A1A"/>
+        </w:rPr>
+        <w:t>trust</w:t>
+      </w:r>
+      <w:r>
+        <w:rPr>
+          <w:rFonts w:ascii="Calibri" w:hAnsi="Calibri" w:cs="Calibri"/>
+          <w:color w:val="1A1A1A"/>
+          <w:sz w:val="22"/>
+          <w:szCs w:val="22"/>
+        </w:rPr>
+        <w:t xml:space="preserve">, restart the </w:t>
+      </w:r>
+      <w:r>
+        <w:rPr>
+          <w:rStyle w:val="HTMLCode"/>
+          <w:color w:val="1A1A1A"/>
+        </w:rPr>
+        <w:t>postgresql-x64-18</w:t>
+      </w:r>
+      <w:r>
+        <w:rPr>
+          <w:rFonts w:ascii="Calibri" w:hAnsi="Calibri" w:cs="Calibri"/>
+          <w:color w:val="1A1A1A"/>
+          <w:sz w:val="22"/>
+          <w:szCs w:val="22"/>
+        </w:rPr>
+        <w:t xml:space="preserve"> service, run </w:t>
+      </w:r>
+      <w:r>
+        <w:rPr>
+          <w:rStyle w:val="HTMLCode"/>
+          <w:color w:val="1A1A1A"/>
+        </w:rPr>
+        <w:t>ALTER USER postgres WITH PASSWORD '...';</w:t>
+      </w:r>
+      <w:r>
+        <w:rPr>
+          <w:rFonts w:ascii="Calibri" w:hAnsi="Calibri" w:cs="Calibri"/>
+          <w:color w:val="1A1A1A"/>
+          <w:sz w:val="22"/>
+          <w:szCs w:val="22"/>
+        </w:rPr>
+        <w:t xml:space="preserve"> in pgAdmin, then change it back and restart again.</w:t>
       </w:r>
     </w:p>
     <w:p>
       <w:pPr>
-        <w:pStyle w:val="Heading2"/>
-        <w:rPr>
-          <w:rFonts w:ascii="Calibri" w:eastAsia="Times New Roman" w:hAnsi="Calibri" w:cs="Calibri"/>
-        </w:rPr>
-      </w:pPr>
-      <w:r>
-        <w:rPr>
-          <w:rFonts w:ascii="Calibri" w:eastAsia="Times New Roman" w:hAnsi="Calibri" w:cs="Calibri"/>
-        </w:rPr>
-        <w:t>2.1 Numbered scripts</w:t>
+        <w:pStyle w:val="Heading1"/>
+        <w:rPr>
+          <w:rFonts w:ascii="Calibri" w:eastAsia="Times New Roman" w:hAnsi="Calibri" w:cs="Calibri"/>
+        </w:rPr>
+      </w:pPr>
+      <w:r>
+        <w:rPr>
+          <w:rFonts w:ascii="Calibri" w:eastAsia="Times New Roman" w:hAnsi="Calibri" w:cs="Calibri"/>
+        </w:rPr>
+        <w:t>Chapter 2: The database</w:t>
       </w:r>
     </w:p>
     <w:p>
       <w:pPr>
+        <w:pStyle w:val="Heading2"/>
+        <w:rPr>
+          <w:rFonts w:ascii="Calibri" w:eastAsia="Times New Roman" w:hAnsi="Calibri" w:cs="Calibri"/>
+        </w:rPr>
+      </w:pPr>
+      <w:r>
+        <w:rPr>
+          <w:rFonts w:ascii="Calibri" w:eastAsia="Times New Roman" w:hAnsi="Calibri" w:cs="Calibri"/>
+        </w:rPr>
+        <w:t>2.1 Numbered scripts</w:t>
+      </w:r>
+    </w:p>
+    <w:p>
+      <w:pPr>
         <w:pStyle w:val="NormalWeb"/>
         <w:rPr>
           <w:rFonts w:ascii="Calibri" w:hAnsi="Calibri" w:cs="Calibri"/>
@@ -2555,7 +2607,16 @@
           <w:sz w:val="22"/>
           <w:szCs w:val="22"/>
         </w:rPr>
-        <w:t xml:space="preserve"> remembers which have run. Any PC, and later the server, gets exactly the same database.</w:t>
+        <w:t xml:space="preserve"> </w:t>
+      </w:r>
+      <w:r>
+        <w:rPr>
+          <w:rFonts w:ascii="Calibri" w:hAnsi="Calibri" w:cs="Calibri"/>
+          <w:color w:val="1A1A1A"/>
+          <w:sz w:val="22"/>
+          <w:szCs w:val="22"/>
+        </w:rPr>
+        <w:t>remembers which have run. Any PC, and later the server, gets exactly the same database.</w:t>
       </w:r>
     </w:p>
     <w:p>
@@ -8903,7 +8964,32 @@
           <w:sz w:val="22"/>
           <w:szCs w:val="22"/>
         </w:rPr>
-        <w:t>.</w:t>
+        <w:t xml:space="preserve">. Or double-click </w:t>
+      </w:r>
+      <w:r>
+        <w:rPr>
+          <w:rStyle w:val="HTMLCode"/>
+          <w:color w:val="1A1A1A"/>
+        </w:rPr>
+        <w:t>Apps\Website Admin\Company.WebsiteAdmin.exe</w:t>
+      </w:r>
+      <w:r>
+        <w:rPr>
+          <w:rFonts w:ascii="Calibri" w:hAnsi="Calibri" w:cs="Calibri"/>
+          <w:color w:val="1A1A1A"/>
+          <w:sz w:val="22"/>
+          <w:szCs w:val="22"/>
+        </w:rPr>
+        <w:t xml:space="preserve"> </w:t>
+      </w:r>
+      <w:r>
+        <w:rPr>
+          <w:rFonts w:ascii="Calibri" w:hAnsi="Calibri" w:cs="Calibri"/>
+          <w:color w:val="1A1A1A"/>
+          <w:sz w:val="22"/>
+          <w:szCs w:val="22"/>
+        </w:rPr>
+        <w:t>after a build.</w:t>
       </w:r>
     </w:p>
     <w:p>
@@ -9111,7 +9197,16 @@
           <w:sz w:val="22"/>
           <w:szCs w:val="22"/>
         </w:rPr>
-        <w:t xml:space="preserve"> accounts manage the others (owner decision, 30 Oct 2026), on the </w:t>
+        <w:t xml:space="preserve"> </w:t>
+      </w:r>
+      <w:r>
+        <w:rPr>
+          <w:rFonts w:ascii="Calibri" w:hAnsi="Calibri" w:cs="Calibri"/>
+          <w:color w:val="1A1A1A"/>
+          <w:sz w:val="22"/>
+          <w:szCs w:val="22"/>
+        </w:rPr>
+        <w:t xml:space="preserve">accounts manage the others (owner decision, 30 Oct 2026), on the </w:t>
       </w:r>
       <w:r>
         <w:rPr>
@@ -9130,16 +9225,7 @@
           <w:sz w:val="22"/>
           <w:szCs w:val="22"/>
         </w:rPr>
-        <w:t xml:space="preserve"> </w:t>
-      </w:r>
-      <w:r>
-        <w:rPr>
-          <w:rFonts w:ascii="Calibri" w:hAnsi="Calibri" w:cs="Calibri"/>
-          <w:color w:val="1A1A1A"/>
-          <w:sz w:val="22"/>
-          <w:szCs w:val="22"/>
-        </w:rPr>
-        <w:t xml:space="preserve">page, whose sidebar button only main accounts see. </w:t>
+        <w:t xml:space="preserve"> page, whose sidebar button only main accounts see. </w:t>
       </w:r>
       <w:r>
         <w:rPr>
@@ -9333,7 +9419,16 @@
           <w:sz w:val="22"/>
           <w:szCs w:val="22"/>
         </w:rPr>
-        <w:t xml:space="preserve"> (script 010); the API will add them later. Any signed-in Website Admin account can follow them up: status New / Contacted / Closed and internal notes (never shown on the website). Inquiries are never deleted, so nothing a client sent is lost. The database refuses an inquiry with neither an email nor a phone number. </w:t>
+        <w:t xml:space="preserve"> </w:t>
+      </w:r>
+      <w:r>
+        <w:rPr>
+          <w:rFonts w:ascii="Calibri" w:hAnsi="Calibri" w:cs="Calibri"/>
+          <w:color w:val="1A1A1A"/>
+          <w:sz w:val="22"/>
+          <w:szCs w:val="22"/>
+        </w:rPr>
+        <w:t xml:space="preserve">(script 010); the API will add them later. Any signed-in Website Admin account can follow them up: status New / Contacted / Closed and internal notes (never shown on the website). Inquiries are never deleted, so nothing a client sent is lost. The database refuses an inquiry with neither an email nor a phone number. </w:t>
       </w:r>
       <w:r>
         <w:rPr>
@@ -9349,16 +9444,7 @@
           <w:sz w:val="22"/>
           <w:szCs w:val="22"/>
         </w:rPr>
-        <w:t xml:space="preserve"> </w:t>
-      </w:r>
-      <w:r>
-        <w:rPr>
-          <w:rFonts w:ascii="Calibri" w:hAnsi="Calibri" w:cs="Calibri"/>
-          <w:color w:val="1A1A1A"/>
-          <w:sz w:val="22"/>
-          <w:szCs w:val="22"/>
-        </w:rPr>
-        <w:t>lists, counts and saves; the sidebar button shows "Inquiries (N new)".</w:t>
+        <w:t xml:space="preserve"> lists, counts and saves; the sidebar button shows "Inquiries (N new)".</w:t>
       </w:r>
     </w:p>
     <w:p>
@@ -9402,7 +9488,16 @@
           <w:sz w:val="22"/>
           <w:szCs w:val="22"/>
         </w:rPr>
-        <w:t xml:space="preserve"> The home PC has the real database. The work PC has its own fresh database with test data only. Every test run on the work PC is written in </w:t>
+        <w:t xml:space="preserve"> </w:t>
+      </w:r>
+      <w:r>
+        <w:rPr>
+          <w:rFonts w:ascii="Calibri" w:hAnsi="Calibri" w:cs="Calibri"/>
+          <w:color w:val="1A1A1A"/>
+          <w:sz w:val="22"/>
+          <w:szCs w:val="22"/>
+        </w:rPr>
+        <w:t xml:space="preserve">The home PC has the real database. The work PC has its own fresh database with test data only. Every test run on the work PC is written in </w:t>
       </w:r>
       <w:r>
         <w:rPr>
@@ -9454,16 +9549,7 @@
           <w:sz w:val="22"/>
           <w:szCs w:val="22"/>
         </w:rPr>
-        <w:t xml:space="preserve"> </w:t>
-      </w:r>
-      <w:r>
-        <w:rPr>
-          <w:rFonts w:ascii="Calibri" w:hAnsi="Calibri" w:cs="Calibri"/>
-          <w:color w:val="1A1A1A"/>
-          <w:sz w:val="22"/>
-          <w:szCs w:val="22"/>
-        </w:rPr>
-        <w:t xml:space="preserve">(users) or </w:t>
+        <w:t xml:space="preserve"> (users) or </w:t>
       </w:r>
       <w:r>
         <w:rPr>
@@ -10812,122 +10898,9 @@
 <file path=word/numbering.xml><?xml version="1.0" encoding="utf-8"?>
 <w:numbering xmlns:wpc="http://schemas.microsoft.com/office/word/2010/wordprocessingCanvas" xmlns:cx="http://schemas.microsoft.com/office/drawing/2014/chartex" xmlns:cx1="http://schemas.microsoft.com/office/drawing/2015/9/8/chartex" xmlns:cx2="http://schemas.microsoft.com/office/drawing/2015/10/21/chartex" xmlns:cx3="http://schemas.microsoft.com/office/drawing/2016/5/9/chartex" xmlns:cx4="http://schemas.microsoft.com/office/drawing/2016/5/10/chartex" xmlns:cx5="http://schemas.microsoft.com/office/drawing/2016/5/11/chartex" xmlns:cx6="http://schemas.microsoft.com/office/drawing/2016/5/12/chartex" xmlns:cx7="http://schemas.microsoft.com/office/drawing/2016/5/13/chartex" xmlns:cx8="http://schemas.microsoft.com/office/drawing/2016/5/14/chartex" xmlns:mc="http://schemas.openxmlformats.org/markup-compatibility/2006" xmlns:aink="http://schemas.microsoft.com/office/drawing/2016/ink" xmlns:am3d="http://schemas.microsoft.com/office/drawing/2017/model3d" xmlns:o="urn:schemas-microsoft-com:office:office" xmlns:oel="http://schemas.microsoft.com/office/2019/extlst" xmlns:r="http://schemas.openxmlformats.org/officeDocument/2006/relationships" xmlns:m="http://schemas.openxmlformats.org/officeDocument/2006/math" xmlns:v="urn:schemas-microsoft-com:vml" xmlns:wp14="http://schemas.microsoft.com/office/word/2010/wordprocessingDrawing" xmlns:wp="http://schemas.openxmlformats.org/drawingml/2006/wordprocessingDrawing" xmlns:w10="urn:schemas-microsoft-com:office:word" xmlns:w="http://schemas.openxmlformats.org/wordprocessingml/2006/main" xmlns:w14="http://schemas.microsoft.com/office/word/2010/wordml" xmlns:w15="http://schemas.microsoft.com/office/word/2012/wordml" xmlns:w16cex="http://schemas.microsoft.com/office/word/2018/wordml/cex" xmlns:w16cid="http://schemas.microsoft.com/office/word/2016/wordml/cid" xmlns:w16="http://schemas.microsoft.com/office/word/2018/wordml" xmlns:w16du="http://schemas.microsoft.com/office/word/2023/wordml/word16du" xmlns:w16sdtdh="http://schemas.microsoft.com/office/word/2020/wordml/sdtdatahash" xmlns:w16sdtfl="http://schemas.microsoft.com/office/word/2024/wordml/sdtformatlock" xmlns:w16se="http://schemas.microsoft.com/office/word/2015/wordml/symex" xmlns:wpg="http://schemas.microsoft.com/office/word/2010/wordprocessingGroup" xmlns:wpi="http://schemas.microsoft.com/office/word/2010/wordprocessingInk" xmlns:wne="http://schemas.microsoft.com/office/word/2006/wordml" xmlns:wps="http://schemas.microsoft.com/office/word/2010/wordprocessingShape" mc:Ignorable="w14 w15 w16se w16cid w16 w16cex w16sdtdh w16sdtfl w16du wp14">
   <w:abstractNum w:abstractNumId="0" w15:restartNumberingAfterBreak="0">
-    <w:nsid w:val="08537D24"/>
+    <w:nsid w:val="056D438C"/>
     <w:multiLevelType w:val="multilevel"/>
-    <w:tmpl w:val="683C6390"/>
-    <w:lvl w:ilvl="0">
-      <w:start w:val="1"/>
-      <w:numFmt w:val="decimal"/>
-      <w:lvlText w:val="%1."/>
-      <w:lvlJc w:val="left"/>
-      <w:pPr>
-        <w:tabs>
-          <w:tab w:val="num" w:pos="720"/>
-        </w:tabs>
-        <w:ind w:left="720" w:hanging="360"/>
-      </w:pPr>
-    </w:lvl>
-    <w:lvl w:ilvl="1" w:tentative="1">
-      <w:start w:val="1"/>
-      <w:numFmt w:val="decimal"/>
-      <w:lvlText w:val="%2."/>
-      <w:lvlJc w:val="left"/>
-      <w:pPr>
-        <w:tabs>
-          <w:tab w:val="num" w:pos="1440"/>
-        </w:tabs>
-        <w:ind w:left="1440" w:hanging="360"/>
-      </w:pPr>
-    </w:lvl>
-    <w:lvl w:ilvl="2" w:tentative="1">
-      <w:start w:val="1"/>
-      <w:numFmt w:val="decimal"/>
-      <w:lvlText w:val="%3."/>
-      <w:lvlJc w:val="left"/>
-      <w:pPr>
-        <w:tabs>
-          <w:tab w:val="num" w:pos="2160"/>
-        </w:tabs>
-        <w:ind w:left="2160" w:hanging="360"/>
-      </w:pPr>
-    </w:lvl>
-    <w:lvl w:ilvl="3" w:tentative="1">
-      <w:start w:val="1"/>
-      <w:numFmt w:val="decimal"/>
-      <w:lvlText w:val="%4."/>
-      <w:lvlJc w:val="left"/>
-      <w:pPr>
-        <w:tabs>
-          <w:tab w:val="num" w:pos="2880"/>
-        </w:tabs>
-        <w:ind w:left="2880" w:hanging="360"/>
-      </w:pPr>
-    </w:lvl>
-    <w:lvl w:ilvl="4" w:tentative="1">
-      <w:start w:val="1"/>
-      <w:numFmt w:val="decimal"/>
-      <w:lvlText w:val="%5."/>
-      <w:lvlJc w:val="left"/>
-      <w:pPr>
-        <w:tabs>
-          <w:tab w:val="num" w:pos="3600"/>
-        </w:tabs>
-        <w:ind w:left="3600" w:hanging="360"/>
-      </w:pPr>
-    </w:lvl>
-    <w:lvl w:ilvl="5" w:tentative="1">
-      <w:start w:val="1"/>
-      <w:numFmt w:val="decimal"/>
-      <w:lvlText w:val="%6."/>
-      <w:lvlJc w:val="left"/>
-      <w:pPr>
-        <w:tabs>
-          <w:tab w:val="num" w:pos="4320"/>
-        </w:tabs>
-        <w:ind w:left="4320" w:hanging="360"/>
-      </w:pPr>
-    </w:lvl>
-    <w:lvl w:ilvl="6" w:tentative="1">
-      <w:start w:val="1"/>
-      <w:numFmt w:val="decimal"/>
-      <w:lvlText w:val="%7."/>
-      <w:lvlJc w:val="left"/>
-      <w:pPr>
-        <w:tabs>
-          <w:tab w:val="num" w:pos="5040"/>
-        </w:tabs>
-        <w:ind w:left="5040" w:hanging="360"/>
-      </w:pPr>
-    </w:lvl>
-    <w:lvl w:ilvl="7" w:tentative="1">
-      <w:start w:val="1"/>
-      <w:numFmt w:val="decimal"/>
-      <w:lvlText w:val="%8."/>
-      <w:lvlJc w:val="left"/>
-      <w:pPr>
-        <w:tabs>
-          <w:tab w:val="num" w:pos="5760"/>
-        </w:tabs>
-        <w:ind w:left="5760" w:hanging="360"/>
-      </w:pPr>
-    </w:lvl>
-    <w:lvl w:ilvl="8" w:tentative="1">
-      <w:start w:val="1"/>
-      <w:numFmt w:val="decimal"/>
-      <w:lvlText w:val="%9."/>
-      <w:lvlJc w:val="left"/>
-      <w:pPr>
-        <w:tabs>
-          <w:tab w:val="num" w:pos="6480"/>
-        </w:tabs>
-        <w:ind w:left="6480" w:hanging="360"/>
-      </w:pPr>
-    </w:lvl>
-  </w:abstractNum>
-  <w:abstractNum w:abstractNumId="1" w15:restartNumberingAfterBreak="0">
-    <w:nsid w:val="20E24835"/>
-    <w:multiLevelType w:val="multilevel"/>
-    <w:tmpl w:val="D39A6D0C"/>
+    <w:tmpl w:val="19A2DC40"/>
     <w:lvl w:ilvl="0">
       <w:start w:val="1"/>
       <w:numFmt w:val="bullet"/>
@@ -11073,10 +11046,570 @@
       </w:rPr>
     </w:lvl>
   </w:abstractNum>
+  <w:abstractNum w:abstractNumId="1" w15:restartNumberingAfterBreak="0">
+    <w:nsid w:val="0ED6659C"/>
+    <w:multiLevelType w:val="multilevel"/>
+    <w:tmpl w:val="A8648A42"/>
+    <w:lvl w:ilvl="0">
+      <w:start w:val="1"/>
+      <w:numFmt w:val="bullet"/>
+      <w:lvlText w:val=""/>
+      <w:lvlJc w:val="left"/>
+      <w:pPr>
+        <w:tabs>
+          <w:tab w:val="num" w:pos="720"/>
+        </w:tabs>
+        <w:ind w:left="720" w:hanging="360"/>
+      </w:pPr>
+      <w:rPr>
+        <w:rFonts w:ascii="Symbol" w:hAnsi="Symbol" w:hint="default"/>
+        <w:sz w:val="20"/>
+      </w:rPr>
+    </w:lvl>
+    <w:lvl w:ilvl="1" w:tentative="1">
+      <w:start w:val="1"/>
+      <w:numFmt w:val="bullet"/>
+      <w:lvlText w:val="o"/>
+      <w:lvlJc w:val="left"/>
+      <w:pPr>
+        <w:tabs>
+          <w:tab w:val="num" w:pos="1440"/>
+        </w:tabs>
+        <w:ind w:left="1440" w:hanging="360"/>
+      </w:pPr>
+      <w:rPr>
+        <w:rFonts w:ascii="Courier New" w:hAnsi="Courier New" w:hint="default"/>
+        <w:sz w:val="20"/>
+      </w:rPr>
+    </w:lvl>
+    <w:lvl w:ilvl="2" w:tentative="1">
+      <w:start w:val="1"/>
+      <w:numFmt w:val="bullet"/>
+      <w:lvlText w:val=""/>
+      <w:lvlJc w:val="left"/>
+      <w:pPr>
+        <w:tabs>
+          <w:tab w:val="num" w:pos="2160"/>
+        </w:tabs>
+        <w:ind w:left="2160" w:hanging="360"/>
+      </w:pPr>
+      <w:rPr>
+        <w:rFonts w:ascii="Wingdings" w:hAnsi="Wingdings" w:hint="default"/>
+        <w:sz w:val="20"/>
+      </w:rPr>
+    </w:lvl>
+    <w:lvl w:ilvl="3" w:tentative="1">
+      <w:start w:val="1"/>
+      <w:numFmt w:val="bullet"/>
+      <w:lvlText w:val=""/>
+      <w:lvlJc w:val="left"/>
+      <w:pPr>
+        <w:tabs>
+          <w:tab w:val="num" w:pos="2880"/>
+        </w:tabs>
+        <w:ind w:left="2880" w:hanging="360"/>
+      </w:pPr>
+      <w:rPr>
+        <w:rFonts w:ascii="Wingdings" w:hAnsi="Wingdings" w:hint="default"/>
+        <w:sz w:val="20"/>
+      </w:rPr>
+    </w:lvl>
+    <w:lvl w:ilvl="4" w:tentative="1">
+      <w:start w:val="1"/>
+      <w:numFmt w:val="bullet"/>
+      <w:lvlText w:val=""/>
+      <w:lvlJc w:val="left"/>
+      <w:pPr>
+        <w:tabs>
+          <w:tab w:val="num" w:pos="3600"/>
+        </w:tabs>
+        <w:ind w:left="3600" w:hanging="360"/>
+      </w:pPr>
+      <w:rPr>
+        <w:rFonts w:ascii="Wingdings" w:hAnsi="Wingdings" w:hint="default"/>
+        <w:sz w:val="20"/>
+      </w:rPr>
+    </w:lvl>
+    <w:lvl w:ilvl="5" w:tentative="1">
+      <w:start w:val="1"/>
+      <w:numFmt w:val="bullet"/>
+      <w:lvlText w:val=""/>
+      <w:lvlJc w:val="left"/>
+      <w:pPr>
+        <w:tabs>
+          <w:tab w:val="num" w:pos="4320"/>
+        </w:tabs>
+        <w:ind w:left="4320" w:hanging="360"/>
+      </w:pPr>
+      <w:rPr>
+        <w:rFonts w:ascii="Wingdings" w:hAnsi="Wingdings" w:hint="default"/>
+        <w:sz w:val="20"/>
+      </w:rPr>
+    </w:lvl>
+    <w:lvl w:ilvl="6" w:tentative="1">
+      <w:start w:val="1"/>
+      <w:numFmt w:val="bullet"/>
+      <w:lvlText w:val=""/>
+      <w:lvlJc w:val="left"/>
+      <w:pPr>
+        <w:tabs>
+          <w:tab w:val="num" w:pos="5040"/>
+        </w:tabs>
+        <w:ind w:left="5040" w:hanging="360"/>
+      </w:pPr>
+      <w:rPr>
+        <w:rFonts w:ascii="Wingdings" w:hAnsi="Wingdings" w:hint="default"/>
+        <w:sz w:val="20"/>
+      </w:rPr>
+    </w:lvl>
+    <w:lvl w:ilvl="7" w:tentative="1">
+      <w:start w:val="1"/>
+      <w:numFmt w:val="bullet"/>
+      <w:lvlText w:val=""/>
+      <w:lvlJc w:val="left"/>
+      <w:pPr>
+        <w:tabs>
+          <w:tab w:val="num" w:pos="5760"/>
+        </w:tabs>
+        <w:ind w:left="5760" w:hanging="360"/>
+      </w:pPr>
+      <w:rPr>
+        <w:rFonts w:ascii="Wingdings" w:hAnsi="Wingdings" w:hint="default"/>
+        <w:sz w:val="20"/>
+      </w:rPr>
+    </w:lvl>
+    <w:lvl w:ilvl="8" w:tentative="1">
+      <w:start w:val="1"/>
+      <w:numFmt w:val="bullet"/>
+      <w:lvlText w:val=""/>
+      <w:lvlJc w:val="left"/>
+      <w:pPr>
+        <w:tabs>
+          <w:tab w:val="num" w:pos="6480"/>
+        </w:tabs>
+        <w:ind w:left="6480" w:hanging="360"/>
+      </w:pPr>
+      <w:rPr>
+        <w:rFonts w:ascii="Wingdings" w:hAnsi="Wingdings" w:hint="default"/>
+        <w:sz w:val="20"/>
+      </w:rPr>
+    </w:lvl>
+  </w:abstractNum>
   <w:abstractNum w:abstractNumId="2" w15:restartNumberingAfterBreak="0">
-    <w:nsid w:val="2CBC69DC"/>
+    <w:nsid w:val="1A0A3465"/>
     <w:multiLevelType w:val="multilevel"/>
-    <w:tmpl w:val="D73CAB10"/>
+    <w:tmpl w:val="6A689C0A"/>
+    <w:lvl w:ilvl="0">
+      <w:start w:val="1"/>
+      <w:numFmt w:val="bullet"/>
+      <w:lvlText w:val=""/>
+      <w:lvlJc w:val="left"/>
+      <w:pPr>
+        <w:tabs>
+          <w:tab w:val="num" w:pos="720"/>
+        </w:tabs>
+        <w:ind w:left="720" w:hanging="360"/>
+      </w:pPr>
+      <w:rPr>
+        <w:rFonts w:ascii="Symbol" w:hAnsi="Symbol" w:hint="default"/>
+        <w:sz w:val="20"/>
+      </w:rPr>
+    </w:lvl>
+    <w:lvl w:ilvl="1" w:tentative="1">
+      <w:start w:val="1"/>
+      <w:numFmt w:val="bullet"/>
+      <w:lvlText w:val="o"/>
+      <w:lvlJc w:val="left"/>
+      <w:pPr>
+        <w:tabs>
+          <w:tab w:val="num" w:pos="1440"/>
+        </w:tabs>
+        <w:ind w:left="1440" w:hanging="360"/>
+      </w:pPr>
+      <w:rPr>
+        <w:rFonts w:ascii="Courier New" w:hAnsi="Courier New" w:hint="default"/>
+        <w:sz w:val="20"/>
+      </w:rPr>
+    </w:lvl>
+    <w:lvl w:ilvl="2" w:tentative="1">
+      <w:start w:val="1"/>
+      <w:numFmt w:val="bullet"/>
+      <w:lvlText w:val=""/>
+      <w:lvlJc w:val="left"/>
+      <w:pPr>
+        <w:tabs>
+          <w:tab w:val="num" w:pos="2160"/>
+        </w:tabs>
+        <w:ind w:left="2160" w:hanging="360"/>
+      </w:pPr>
+      <w:rPr>
+        <w:rFonts w:ascii="Wingdings" w:hAnsi="Wingdings" w:hint="default"/>
+        <w:sz w:val="20"/>
+      </w:rPr>
+    </w:lvl>
+    <w:lvl w:ilvl="3" w:tentative="1">
+      <w:start w:val="1"/>
+      <w:numFmt w:val="bullet"/>
+      <w:lvlText w:val=""/>
+      <w:lvlJc w:val="left"/>
+      <w:pPr>
+        <w:tabs>
+          <w:tab w:val="num" w:pos="2880"/>
+        </w:tabs>
+        <w:ind w:left="2880" w:hanging="360"/>
+      </w:pPr>
+      <w:rPr>
+        <w:rFonts w:ascii="Wingdings" w:hAnsi="Wingdings" w:hint="default"/>
+        <w:sz w:val="20"/>
+      </w:rPr>
+    </w:lvl>
+    <w:lvl w:ilvl="4" w:tentative="1">
+      <w:start w:val="1"/>
+      <w:numFmt w:val="bullet"/>
+      <w:lvlText w:val=""/>
+      <w:lvlJc w:val="left"/>
+      <w:pPr>
+        <w:tabs>
+          <w:tab w:val="num" w:pos="3600"/>
+        </w:tabs>
+        <w:ind w:left="3600" w:hanging="360"/>
+      </w:pPr>
+      <w:rPr>
+        <w:rFonts w:ascii="Wingdings" w:hAnsi="Wingdings" w:hint="default"/>
+        <w:sz w:val="20"/>
+      </w:rPr>
+    </w:lvl>
+    <w:lvl w:ilvl="5" w:tentative="1">
+      <w:start w:val="1"/>
+      <w:numFmt w:val="bullet"/>
+      <w:lvlText w:val=""/>
+      <w:lvlJc w:val="left"/>
+      <w:pPr>
+        <w:tabs>
+          <w:tab w:val="num" w:pos="4320"/>
+        </w:tabs>
+        <w:ind w:left="4320" w:hanging="360"/>
+      </w:pPr>
+      <w:rPr>
+        <w:rFonts w:ascii="Wingdings" w:hAnsi="Wingdings" w:hint="default"/>
+        <w:sz w:val="20"/>
+      </w:rPr>
+    </w:lvl>
+    <w:lvl w:ilvl="6" w:tentative="1">
+      <w:start w:val="1"/>
+      <w:numFmt w:val="bullet"/>
+      <w:lvlText w:val=""/>
+      <w:lvlJc w:val="left"/>
+      <w:pPr>
+        <w:tabs>
+          <w:tab w:val="num" w:pos="5040"/>
+        </w:tabs>
+        <w:ind w:left="5040" w:hanging="360"/>
+      </w:pPr>
+      <w:rPr>
+        <w:rFonts w:ascii="Wingdings" w:hAnsi="Wingdings" w:hint="default"/>
+        <w:sz w:val="20"/>
+      </w:rPr>
+    </w:lvl>
+    <w:lvl w:ilvl="7" w:tentative="1">
+      <w:start w:val="1"/>
+      <w:numFmt w:val="bullet"/>
+      <w:lvlText w:val=""/>
+      <w:lvlJc w:val="left"/>
+      <w:pPr>
+        <w:tabs>
+          <w:tab w:val="num" w:pos="5760"/>
+        </w:tabs>
+        <w:ind w:left="5760" w:hanging="360"/>
+      </w:pPr>
+      <w:rPr>
+        <w:rFonts w:ascii="Wingdings" w:hAnsi="Wingdings" w:hint="default"/>
+        <w:sz w:val="20"/>
+      </w:rPr>
+    </w:lvl>
+    <w:lvl w:ilvl="8" w:tentative="1">
+      <w:start w:val="1"/>
+      <w:numFmt w:val="bullet"/>
+      <w:lvlText w:val=""/>
+      <w:lvlJc w:val="left"/>
+      <w:pPr>
+        <w:tabs>
+          <w:tab w:val="num" w:pos="6480"/>
+        </w:tabs>
+        <w:ind w:left="6480" w:hanging="360"/>
+      </w:pPr>
+      <w:rPr>
+        <w:rFonts w:ascii="Wingdings" w:hAnsi="Wingdings" w:hint="default"/>
+        <w:sz w:val="20"/>
+      </w:rPr>
+    </w:lvl>
+  </w:abstractNum>
+  <w:abstractNum w:abstractNumId="3" w15:restartNumberingAfterBreak="0">
+    <w:nsid w:val="2EB45DF4"/>
+    <w:multiLevelType w:val="multilevel"/>
+    <w:tmpl w:val="55A86006"/>
+    <w:lvl w:ilvl="0">
+      <w:start w:val="1"/>
+      <w:numFmt w:val="decimal"/>
+      <w:lvlText w:val="%1."/>
+      <w:lvlJc w:val="left"/>
+      <w:pPr>
+        <w:tabs>
+          <w:tab w:val="num" w:pos="720"/>
+        </w:tabs>
+        <w:ind w:left="720" w:hanging="360"/>
+      </w:pPr>
+    </w:lvl>
+    <w:lvl w:ilvl="1" w:tentative="1">
+      <w:start w:val="1"/>
+      <w:numFmt w:val="decimal"/>
+      <w:lvlText w:val="%2."/>
+      <w:lvlJc w:val="left"/>
+      <w:pPr>
+        <w:tabs>
+          <w:tab w:val="num" w:pos="1440"/>
+        </w:tabs>
+        <w:ind w:left="1440" w:hanging="360"/>
+      </w:pPr>
+    </w:lvl>
+    <w:lvl w:ilvl="2" w:tentative="1">
+      <w:start w:val="1"/>
+      <w:numFmt w:val="decimal"/>
+      <w:lvlText w:val="%3."/>
+      <w:lvlJc w:val="left"/>
+      <w:pPr>
+        <w:tabs>
+          <w:tab w:val="num" w:pos="2160"/>
+        </w:tabs>
+        <w:ind w:left="2160" w:hanging="360"/>
+      </w:pPr>
+    </w:lvl>
+    <w:lvl w:ilvl="3" w:tentative="1">
+      <w:start w:val="1"/>
+      <w:numFmt w:val="decimal"/>
+      <w:lvlText w:val="%4."/>
+      <w:lvlJc w:val="left"/>
+      <w:pPr>
+        <w:tabs>
+          <w:tab w:val="num" w:pos="2880"/>
+        </w:tabs>
+        <w:ind w:left="2880" w:hanging="360"/>
+      </w:pPr>
+    </w:lvl>
+    <w:lvl w:ilvl="4" w:tentative="1">
+      <w:start w:val="1"/>
+      <w:numFmt w:val="decimal"/>
+      <w:lvlText w:val="%5."/>
+      <w:lvlJc w:val="left"/>
+      <w:pPr>
+        <w:tabs>
+          <w:tab w:val="num" w:pos="3600"/>
+        </w:tabs>
+        <w:ind w:left="3600" w:hanging="360"/>
+      </w:pPr>
+    </w:lvl>
+    <w:lvl w:ilvl="5" w:tentative="1">
+      <w:start w:val="1"/>
+      <w:numFmt w:val="decimal"/>
+      <w:lvlText w:val="%6."/>
+      <w:lvlJc w:val="left"/>
+      <w:pPr>
+        <w:tabs>
+          <w:tab w:val="num" w:pos="4320"/>
+        </w:tabs>
+        <w:ind w:left="4320" w:hanging="360"/>
+      </w:pPr>
+    </w:lvl>
+    <w:lvl w:ilvl="6" w:tentative="1">
+      <w:start w:val="1"/>
+      <w:numFmt w:val="decimal"/>
+      <w:lvlText w:val="%7."/>
+      <w:lvlJc w:val="left"/>
+      <w:pPr>
+        <w:tabs>
+          <w:tab w:val="num" w:pos="5040"/>
+        </w:tabs>
+        <w:ind w:left="5040" w:hanging="360"/>
+      </w:pPr>
+    </w:lvl>
+    <w:lvl w:ilvl="7" w:tentative="1">
+      <w:start w:val="1"/>
+      <w:numFmt w:val="decimal"/>
+      <w:lvlText w:val="%8."/>
+      <w:lvlJc w:val="left"/>
+      <w:pPr>
+        <w:tabs>
+          <w:tab w:val="num" w:pos="5760"/>
+        </w:tabs>
+        <w:ind w:left="5760" w:hanging="360"/>
+      </w:pPr>
+    </w:lvl>
+    <w:lvl w:ilvl="8" w:tentative="1">
+      <w:start w:val="1"/>
+      <w:numFmt w:val="decimal"/>
+      <w:lvlText w:val="%9."/>
+      <w:lvlJc w:val="left"/>
+      <w:pPr>
+        <w:tabs>
+          <w:tab w:val="num" w:pos="6480"/>
+        </w:tabs>
+        <w:ind w:left="6480" w:hanging="360"/>
+      </w:pPr>
+    </w:lvl>
+  </w:abstractNum>
+  <w:abstractNum w:abstractNumId="4" w15:restartNumberingAfterBreak="0">
+    <w:nsid w:val="32AA6BE0"/>
+    <w:multiLevelType w:val="multilevel"/>
+    <w:tmpl w:val="A29A86B6"/>
+    <w:lvl w:ilvl="0">
+      <w:start w:val="1"/>
+      <w:numFmt w:val="bullet"/>
+      <w:lvlText w:val=""/>
+      <w:lvlJc w:val="left"/>
+      <w:pPr>
+        <w:tabs>
+          <w:tab w:val="num" w:pos="720"/>
+        </w:tabs>
+        <w:ind w:left="720" w:hanging="360"/>
+      </w:pPr>
+      <w:rPr>
+        <w:rFonts w:ascii="Symbol" w:hAnsi="Symbol" w:hint="default"/>
+        <w:sz w:val="20"/>
+      </w:rPr>
+    </w:lvl>
+    <w:lvl w:ilvl="1" w:tentative="1">
+      <w:start w:val="1"/>
+      <w:numFmt w:val="bullet"/>
+      <w:lvlText w:val="o"/>
+      <w:lvlJc w:val="left"/>
+      <w:pPr>
+        <w:tabs>
+          <w:tab w:val="num" w:pos="1440"/>
+        </w:tabs>
+        <w:ind w:left="1440" w:hanging="360"/>
+      </w:pPr>
+      <w:rPr>
+        <w:rFonts w:ascii="Courier New" w:hAnsi="Courier New" w:hint="default"/>
+        <w:sz w:val="20"/>
+      </w:rPr>
+    </w:lvl>
+    <w:lvl w:ilvl="2" w:tentative="1">
+      <w:start w:val="1"/>
+      <w:numFmt w:val="bullet"/>
+      <w:lvlText w:val=""/>
+      <w:lvlJc w:val="left"/>
+      <w:pPr>
+        <w:tabs>
+          <w:tab w:val="num" w:pos="2160"/>
+        </w:tabs>
+        <w:ind w:left="2160" w:hanging="360"/>
+      </w:pPr>
+      <w:rPr>
+        <w:rFonts w:ascii="Wingdings" w:hAnsi="Wingdings" w:hint="default"/>
+        <w:sz w:val="20"/>
+      </w:rPr>
+    </w:lvl>
+    <w:lvl w:ilvl="3" w:tentative="1">
+      <w:start w:val="1"/>
+      <w:numFmt w:val="bullet"/>
+      <w:lvlText w:val=""/>
+      <w:lvlJc w:val="left"/>
+      <w:pPr>
+        <w:tabs>
+          <w:tab w:val="num" w:pos="2880"/>
+        </w:tabs>
+        <w:ind w:left="2880" w:hanging="360"/>
+      </w:pPr>
+      <w:rPr>
+        <w:rFonts w:ascii="Wingdings" w:hAnsi="Wingdings" w:hint="default"/>
+        <w:sz w:val="20"/>
+      </w:rPr>
+    </w:lvl>
+    <w:lvl w:ilvl="4" w:tentative="1">
+      <w:start w:val="1"/>
+      <w:numFmt w:val="bullet"/>
+      <w:lvlText w:val=""/>
+      <w:lvlJc w:val="left"/>
+      <w:pPr>
+        <w:tabs>
+          <w:tab w:val="num" w:pos="3600"/>
+        </w:tabs>
+        <w:ind w:left="3600" w:hanging="360"/>
+      </w:pPr>
+      <w:rPr>
+        <w:rFonts w:ascii="Wingdings" w:hAnsi="Wingdings" w:hint="default"/>
+        <w:sz w:val="20"/>
+      </w:rPr>
+    </w:lvl>
+    <w:lvl w:ilvl="5" w:tentative="1">
+      <w:start w:val="1"/>
+      <w:numFmt w:val="bullet"/>
+      <w:lvlText w:val=""/>
+      <w:lvlJc w:val="left"/>
+      <w:pPr>
+        <w:tabs>
+          <w:tab w:val="num" w:pos="4320"/>
+        </w:tabs>
+        <w:ind w:left="4320" w:hanging="360"/>
+      </w:pPr>
+      <w:rPr>
+        <w:rFonts w:ascii="Wingdings" w:hAnsi="Wingdings" w:hint="default"/>
+        <w:sz w:val="20"/>
+      </w:rPr>
+    </w:lvl>
+    <w:lvl w:ilvl="6" w:tentative="1">
+      <w:start w:val="1"/>
+      <w:numFmt w:val="bullet"/>
+      <w:lvlText w:val=""/>
+      <w:lvlJc w:val="left"/>
+      <w:pPr>
+        <w:tabs>
+          <w:tab w:val="num" w:pos="5040"/>
+        </w:tabs>
+        <w:ind w:left="5040" w:hanging="360"/>
+      </w:pPr>
+      <w:rPr>
+        <w:rFonts w:ascii="Wingdings" w:hAnsi="Wingdings" w:hint="default"/>
+        <w:sz w:val="20"/>
+      </w:rPr>
+    </w:lvl>
+    <w:lvl w:ilvl="7" w:tentative="1">
+      <w:start w:val="1"/>
+      <w:numFmt w:val="bullet"/>
+      <w:lvlText w:val=""/>
+      <w:lvlJc w:val="left"/>
+      <w:pPr>
+        <w:tabs>
+          <w:tab w:val="num" w:pos="5760"/>
+        </w:tabs>
+        <w:ind w:left="5760" w:hanging="360"/>
+      </w:pPr>
+      <w:rPr>
+        <w:rFonts w:ascii="Wingdings" w:hAnsi="Wingdings" w:hint="default"/>
+        <w:sz w:val="20"/>
+      </w:rPr>
+    </w:lvl>
+    <w:lvl w:ilvl="8" w:tentative="1">
+      <w:start w:val="1"/>
+      <w:numFmt w:val="bullet"/>
+      <w:lvlText w:val=""/>
+      <w:lvlJc w:val="left"/>
+      <w:pPr>
+        <w:tabs>
+          <w:tab w:val="num" w:pos="6480"/>
+        </w:tabs>
+        <w:ind w:left="6480" w:hanging="360"/>
+      </w:pPr>
+      <w:rPr>
+        <w:rFonts w:ascii="Wingdings" w:hAnsi="Wingdings" w:hint="default"/>
+        <w:sz w:val="20"/>
+      </w:rPr>
+    </w:lvl>
+  </w:abstractNum>
+  <w:abstractNum w:abstractNumId="5" w15:restartNumberingAfterBreak="0">
+    <w:nsid w:val="3EAB6CF9"/>
+    <w:multiLevelType w:val="multilevel"/>
+    <w:tmpl w:val="A35480B6"/>
     <w:lvl w:ilvl="0">
       <w:start w:val="1"/>
       <w:numFmt w:val="bullet"/>
@@ -11222,10 +11755,10 @@
       </w:rPr>
     </w:lvl>
   </w:abstractNum>
-  <w:abstractNum w:abstractNumId="3" w15:restartNumberingAfterBreak="0">
-    <w:nsid w:val="36366C53"/>
+  <w:abstractNum w:abstractNumId="6" w15:restartNumberingAfterBreak="0">
+    <w:nsid w:val="42EF0224"/>
     <w:multiLevelType w:val="multilevel"/>
-    <w:tmpl w:val="DE7CBEFA"/>
+    <w:tmpl w:val="99225514"/>
     <w:lvl w:ilvl="0">
       <w:start w:val="1"/>
       <w:numFmt w:val="bullet"/>
@@ -11371,10 +11904,10 @@
       </w:rPr>
     </w:lvl>
   </w:abstractNum>
-  <w:abstractNum w:abstractNumId="4" w15:restartNumberingAfterBreak="0">
-    <w:nsid w:val="4B037168"/>
+  <w:abstractNum w:abstractNumId="7" w15:restartNumberingAfterBreak="0">
+    <w:nsid w:val="5FAC1966"/>
     <w:multiLevelType w:val="multilevel"/>
-    <w:tmpl w:val="FFCA9B26"/>
+    <w:tmpl w:val="195421EC"/>
     <w:lvl w:ilvl="0">
       <w:start w:val="1"/>
       <w:numFmt w:val="bullet"/>
@@ -11520,10 +12053,10 @@
       </w:rPr>
     </w:lvl>
   </w:abstractNum>
-  <w:abstractNum w:abstractNumId="5" w15:restartNumberingAfterBreak="0">
-    <w:nsid w:val="521C3418"/>
+  <w:abstractNum w:abstractNumId="8" w15:restartNumberingAfterBreak="0">
+    <w:nsid w:val="755641BA"/>
     <w:multiLevelType w:val="multilevel"/>
-    <w:tmpl w:val="5FB07E8E"/>
+    <w:tmpl w:val="6936A6FE"/>
     <w:lvl w:ilvl="0">
       <w:start w:val="1"/>
       <w:numFmt w:val="bullet"/>
@@ -11669,10 +12202,10 @@
       </w:rPr>
     </w:lvl>
   </w:abstractNum>
-  <w:abstractNum w:abstractNumId="6" w15:restartNumberingAfterBreak="0">
-    <w:nsid w:val="53DA198D"/>
+  <w:abstractNum w:abstractNumId="9" w15:restartNumberingAfterBreak="0">
+    <w:nsid w:val="777F209C"/>
     <w:multiLevelType w:val="multilevel"/>
-    <w:tmpl w:val="C156A424"/>
+    <w:tmpl w:val="6E60DFC2"/>
     <w:lvl w:ilvl="0">
       <w:start w:val="1"/>
       <w:numFmt w:val="bullet"/>
@@ -11818,482 +12351,35 @@
       </w:rPr>
     </w:lvl>
   </w:abstractNum>
-  <w:abstractNum w:abstractNumId="7" w15:restartNumberingAfterBreak="0">
-    <w:nsid w:val="5A1F2DBA"/>
-    <w:multiLevelType w:val="multilevel"/>
-    <w:tmpl w:val="09BE24B4"/>
-    <w:lvl w:ilvl="0">
-      <w:start w:val="1"/>
-      <w:numFmt w:val="bullet"/>
-      <w:lvlText w:val=""/>
-      <w:lvlJc w:val="left"/>
-      <w:pPr>
-        <w:tabs>
-          <w:tab w:val="num" w:pos="720"/>
-        </w:tabs>
-        <w:ind w:left="720" w:hanging="360"/>
-      </w:pPr>
-      <w:rPr>
-        <w:rFonts w:ascii="Symbol" w:hAnsi="Symbol" w:hint="default"/>
-        <w:sz w:val="20"/>
-      </w:rPr>
-    </w:lvl>
-    <w:lvl w:ilvl="1" w:tentative="1">
-      <w:start w:val="1"/>
-      <w:numFmt w:val="bullet"/>
-      <w:lvlText w:val="o"/>
-      <w:lvlJc w:val="left"/>
-      <w:pPr>
-        <w:tabs>
-          <w:tab w:val="num" w:pos="1440"/>
-        </w:tabs>
-        <w:ind w:left="1440" w:hanging="360"/>
-      </w:pPr>
-      <w:rPr>
-        <w:rFonts w:ascii="Courier New" w:hAnsi="Courier New" w:hint="default"/>
-        <w:sz w:val="20"/>
-      </w:rPr>
-    </w:lvl>
-    <w:lvl w:ilvl="2" w:tentative="1">
-      <w:start w:val="1"/>
-      <w:numFmt w:val="bullet"/>
-      <w:lvlText w:val=""/>
-      <w:lvlJc w:val="left"/>
-      <w:pPr>
-        <w:tabs>
-          <w:tab w:val="num" w:pos="2160"/>
-        </w:tabs>
-        <w:ind w:left="2160" w:hanging="360"/>
-      </w:pPr>
-      <w:rPr>
-        <w:rFonts w:ascii="Wingdings" w:hAnsi="Wingdings" w:hint="default"/>
-        <w:sz w:val="20"/>
-      </w:rPr>
-    </w:lvl>
-    <w:lvl w:ilvl="3" w:tentative="1">
-      <w:start w:val="1"/>
-      <w:numFmt w:val="bullet"/>
-      <w:lvlText w:val=""/>
-      <w:lvlJc w:val="left"/>
-      <w:pPr>
-        <w:tabs>
-          <w:tab w:val="num" w:pos="2880"/>
-        </w:tabs>
-        <w:ind w:left="2880" w:hanging="360"/>
-      </w:pPr>
-      <w:rPr>
-        <w:rFonts w:ascii="Wingdings" w:hAnsi="Wingdings" w:hint="default"/>
-        <w:sz w:val="20"/>
-      </w:rPr>
-    </w:lvl>
-    <w:lvl w:ilvl="4" w:tentative="1">
-      <w:start w:val="1"/>
-      <w:numFmt w:val="bullet"/>
-      <w:lvlText w:val=""/>
-      <w:lvlJc w:val="left"/>
-      <w:pPr>
-        <w:tabs>
-          <w:tab w:val="num" w:pos="3600"/>
-        </w:tabs>
-        <w:ind w:left="3600" w:hanging="360"/>
-      </w:pPr>
-      <w:rPr>
-        <w:rFonts w:ascii="Wingdings" w:hAnsi="Wingdings" w:hint="default"/>
-        <w:sz w:val="20"/>
-      </w:rPr>
-    </w:lvl>
-    <w:lvl w:ilvl="5" w:tentative="1">
-      <w:start w:val="1"/>
-      <w:numFmt w:val="bullet"/>
-      <w:lvlText w:val=""/>
-      <w:lvlJc w:val="left"/>
-      <w:pPr>
-        <w:tabs>
-          <w:tab w:val="num" w:pos="4320"/>
-        </w:tabs>
-        <w:ind w:left="4320" w:hanging="360"/>
-      </w:pPr>
-      <w:rPr>
-        <w:rFonts w:ascii="Wingdings" w:hAnsi="Wingdings" w:hint="default"/>
-        <w:sz w:val="20"/>
-      </w:rPr>
-    </w:lvl>
-    <w:lvl w:ilvl="6" w:tentative="1">
-      <w:start w:val="1"/>
-      <w:numFmt w:val="bullet"/>
-      <w:lvlText w:val=""/>
-      <w:lvlJc w:val="left"/>
-      <w:pPr>
-        <w:tabs>
-          <w:tab w:val="num" w:pos="5040"/>
-        </w:tabs>
-        <w:ind w:left="5040" w:hanging="360"/>
-      </w:pPr>
-      <w:rPr>
-        <w:rFonts w:ascii="Wingdings" w:hAnsi="Wingdings" w:hint="default"/>
-        <w:sz w:val="20"/>
-      </w:rPr>
-    </w:lvl>
-    <w:lvl w:ilvl="7" w:tentative="1">
-      <w:start w:val="1"/>
-      <w:numFmt w:val="bullet"/>
-      <w:lvlText w:val=""/>
-      <w:lvlJc w:val="left"/>
-      <w:pPr>
-        <w:tabs>
-          <w:tab w:val="num" w:pos="5760"/>
-        </w:tabs>
-        <w:ind w:left="5760" w:hanging="360"/>
-      </w:pPr>
-      <w:rPr>
-        <w:rFonts w:ascii="Wingdings" w:hAnsi="Wingdings" w:hint="default"/>
-        <w:sz w:val="20"/>
-      </w:rPr>
-    </w:lvl>
-    <w:lvl w:ilvl="8" w:tentative="1">
-      <w:start w:val="1"/>
-      <w:numFmt w:val="bullet"/>
-      <w:lvlText w:val=""/>
-      <w:lvlJc w:val="left"/>
-      <w:pPr>
-        <w:tabs>
-          <w:tab w:val="num" w:pos="6480"/>
-        </w:tabs>
-        <w:ind w:left="6480" w:hanging="360"/>
-      </w:pPr>
-      <w:rPr>
-        <w:rFonts w:ascii="Wingdings" w:hAnsi="Wingdings" w:hint="default"/>
-        <w:sz w:val="20"/>
-      </w:rPr>
-    </w:lvl>
-  </w:abstractNum>
-  <w:abstractNum w:abstractNumId="8" w15:restartNumberingAfterBreak="0">
-    <w:nsid w:val="6C123755"/>
-    <w:multiLevelType w:val="multilevel"/>
-    <w:tmpl w:val="F87074C4"/>
-    <w:lvl w:ilvl="0">
-      <w:start w:val="1"/>
-      <w:numFmt w:val="bullet"/>
-      <w:lvlText w:val=""/>
-      <w:lvlJc w:val="left"/>
-      <w:pPr>
-        <w:tabs>
-          <w:tab w:val="num" w:pos="720"/>
-        </w:tabs>
-        <w:ind w:left="720" w:hanging="360"/>
-      </w:pPr>
-      <w:rPr>
-        <w:rFonts w:ascii="Symbol" w:hAnsi="Symbol" w:hint="default"/>
-        <w:sz w:val="20"/>
-      </w:rPr>
-    </w:lvl>
-    <w:lvl w:ilvl="1" w:tentative="1">
-      <w:start w:val="1"/>
-      <w:numFmt w:val="bullet"/>
-      <w:lvlText w:val="o"/>
-      <w:lvlJc w:val="left"/>
-      <w:pPr>
-        <w:tabs>
-          <w:tab w:val="num" w:pos="1440"/>
-        </w:tabs>
-        <w:ind w:left="1440" w:hanging="360"/>
-      </w:pPr>
-      <w:rPr>
-        <w:rFonts w:ascii="Courier New" w:hAnsi="Courier New" w:hint="default"/>
-        <w:sz w:val="20"/>
-      </w:rPr>
-    </w:lvl>
-    <w:lvl w:ilvl="2" w:tentative="1">
-      <w:start w:val="1"/>
-      <w:numFmt w:val="bullet"/>
-      <w:lvlText w:val=""/>
-      <w:lvlJc w:val="left"/>
-      <w:pPr>
-        <w:tabs>
-          <w:tab w:val="num" w:pos="2160"/>
-        </w:tabs>
-        <w:ind w:left="2160" w:hanging="360"/>
-      </w:pPr>
-      <w:rPr>
-        <w:rFonts w:ascii="Wingdings" w:hAnsi="Wingdings" w:hint="default"/>
-        <w:sz w:val="20"/>
-      </w:rPr>
-    </w:lvl>
-    <w:lvl w:ilvl="3" w:tentative="1">
-      <w:start w:val="1"/>
-      <w:numFmt w:val="bullet"/>
-      <w:lvlText w:val=""/>
-      <w:lvlJc w:val="left"/>
-      <w:pPr>
-        <w:tabs>
-          <w:tab w:val="num" w:pos="2880"/>
-        </w:tabs>
-        <w:ind w:left="2880" w:hanging="360"/>
-      </w:pPr>
-      <w:rPr>
-        <w:rFonts w:ascii="Wingdings" w:hAnsi="Wingdings" w:hint="default"/>
-        <w:sz w:val="20"/>
-      </w:rPr>
-    </w:lvl>
-    <w:lvl w:ilvl="4" w:tentative="1">
-      <w:start w:val="1"/>
-      <w:numFmt w:val="bullet"/>
-      <w:lvlText w:val=""/>
-      <w:lvlJc w:val="left"/>
-      <w:pPr>
-        <w:tabs>
-          <w:tab w:val="num" w:pos="3600"/>
-        </w:tabs>
-        <w:ind w:left="3600" w:hanging="360"/>
-      </w:pPr>
-      <w:rPr>
-        <w:rFonts w:ascii="Wingdings" w:hAnsi="Wingdings" w:hint="default"/>
-        <w:sz w:val="20"/>
-      </w:rPr>
-    </w:lvl>
-    <w:lvl w:ilvl="5" w:tentative="1">
-      <w:start w:val="1"/>
-      <w:numFmt w:val="bullet"/>
-      <w:lvlText w:val=""/>
-      <w:lvlJc w:val="left"/>
-      <w:pPr>
-        <w:tabs>
-          <w:tab w:val="num" w:pos="4320"/>
-        </w:tabs>
-        <w:ind w:left="4320" w:hanging="360"/>
-      </w:pPr>
-      <w:rPr>
-        <w:rFonts w:ascii="Wingdings" w:hAnsi="Wingdings" w:hint="default"/>
-        <w:sz w:val="20"/>
-      </w:rPr>
-    </w:lvl>
-    <w:lvl w:ilvl="6" w:tentative="1">
-      <w:start w:val="1"/>
-      <w:numFmt w:val="bullet"/>
-      <w:lvlText w:val=""/>
-      <w:lvlJc w:val="left"/>
-      <w:pPr>
-        <w:tabs>
-          <w:tab w:val="num" w:pos="5040"/>
-        </w:tabs>
-        <w:ind w:left="5040" w:hanging="360"/>
-      </w:pPr>
-      <w:rPr>
-        <w:rFonts w:ascii="Wingdings" w:hAnsi="Wingdings" w:hint="default"/>
-        <w:sz w:val="20"/>
-      </w:rPr>
-    </w:lvl>
-    <w:lvl w:ilvl="7" w:tentative="1">
-      <w:start w:val="1"/>
-      <w:numFmt w:val="bullet"/>
-      <w:lvlText w:val=""/>
-      <w:lvlJc w:val="left"/>
-      <w:pPr>
-        <w:tabs>
-          <w:tab w:val="num" w:pos="5760"/>
-        </w:tabs>
-        <w:ind w:left="5760" w:hanging="360"/>
-      </w:pPr>
-      <w:rPr>
-        <w:rFonts w:ascii="Wingdings" w:hAnsi="Wingdings" w:hint="default"/>
-        <w:sz w:val="20"/>
-      </w:rPr>
-    </w:lvl>
-    <w:lvl w:ilvl="8" w:tentative="1">
-      <w:start w:val="1"/>
-      <w:numFmt w:val="bullet"/>
-      <w:lvlText w:val=""/>
-      <w:lvlJc w:val="left"/>
-      <w:pPr>
-        <w:tabs>
-          <w:tab w:val="num" w:pos="6480"/>
-        </w:tabs>
-        <w:ind w:left="6480" w:hanging="360"/>
-      </w:pPr>
-      <w:rPr>
-        <w:rFonts w:ascii="Wingdings" w:hAnsi="Wingdings" w:hint="default"/>
-        <w:sz w:val="20"/>
-      </w:rPr>
-    </w:lvl>
-  </w:abstractNum>
-  <w:abstractNum w:abstractNumId="9" w15:restartNumberingAfterBreak="0">
-    <w:nsid w:val="79353E37"/>
-    <w:multiLevelType w:val="multilevel"/>
-    <w:tmpl w:val="EF82186E"/>
-    <w:lvl w:ilvl="0">
-      <w:start w:val="1"/>
-      <w:numFmt w:val="bullet"/>
-      <w:lvlText w:val=""/>
-      <w:lvlJc w:val="left"/>
-      <w:pPr>
-        <w:tabs>
-          <w:tab w:val="num" w:pos="720"/>
-        </w:tabs>
-        <w:ind w:left="720" w:hanging="360"/>
-      </w:pPr>
-      <w:rPr>
-        <w:rFonts w:ascii="Symbol" w:hAnsi="Symbol" w:hint="default"/>
-        <w:sz w:val="20"/>
-      </w:rPr>
-    </w:lvl>
-    <w:lvl w:ilvl="1" w:tentative="1">
-      <w:start w:val="1"/>
-      <w:numFmt w:val="bullet"/>
-      <w:lvlText w:val="o"/>
-      <w:lvlJc w:val="left"/>
-      <w:pPr>
-        <w:tabs>
-          <w:tab w:val="num" w:pos="1440"/>
-        </w:tabs>
-        <w:ind w:left="1440" w:hanging="360"/>
-      </w:pPr>
-      <w:rPr>
-        <w:rFonts w:ascii="Courier New" w:hAnsi="Courier New" w:hint="default"/>
-        <w:sz w:val="20"/>
-      </w:rPr>
-    </w:lvl>
-    <w:lvl w:ilvl="2" w:tentative="1">
-      <w:start w:val="1"/>
-      <w:numFmt w:val="bullet"/>
-      <w:lvlText w:val=""/>
-      <w:lvlJc w:val="left"/>
-      <w:pPr>
-        <w:tabs>
-          <w:tab w:val="num" w:pos="2160"/>
-        </w:tabs>
-        <w:ind w:left="2160" w:hanging="360"/>
-      </w:pPr>
-      <w:rPr>
-        <w:rFonts w:ascii="Wingdings" w:hAnsi="Wingdings" w:hint="default"/>
-        <w:sz w:val="20"/>
-      </w:rPr>
-    </w:lvl>
-    <w:lvl w:ilvl="3" w:tentative="1">
-      <w:start w:val="1"/>
-      <w:numFmt w:val="bullet"/>
-      <w:lvlText w:val=""/>
-      <w:lvlJc w:val="left"/>
-      <w:pPr>
-        <w:tabs>
-          <w:tab w:val="num" w:pos="2880"/>
-        </w:tabs>
-        <w:ind w:left="2880" w:hanging="360"/>
-      </w:pPr>
-      <w:rPr>
-        <w:rFonts w:ascii="Wingdings" w:hAnsi="Wingdings" w:hint="default"/>
-        <w:sz w:val="20"/>
-      </w:rPr>
-    </w:lvl>
-    <w:lvl w:ilvl="4" w:tentative="1">
-      <w:start w:val="1"/>
-      <w:numFmt w:val="bullet"/>
-      <w:lvlText w:val=""/>
-      <w:lvlJc w:val="left"/>
-      <w:pPr>
-        <w:tabs>
-          <w:tab w:val="num" w:pos="3600"/>
-        </w:tabs>
-        <w:ind w:left="3600" w:hanging="360"/>
-      </w:pPr>
-      <w:rPr>
-        <w:rFonts w:ascii="Wingdings" w:hAnsi="Wingdings" w:hint="default"/>
-        <w:sz w:val="20"/>
-      </w:rPr>
-    </w:lvl>
-    <w:lvl w:ilvl="5" w:tentative="1">
-      <w:start w:val="1"/>
-      <w:numFmt w:val="bullet"/>
-      <w:lvlText w:val=""/>
-      <w:lvlJc w:val="left"/>
-      <w:pPr>
-        <w:tabs>
-          <w:tab w:val="num" w:pos="4320"/>
-        </w:tabs>
-        <w:ind w:left="4320" w:hanging="360"/>
-      </w:pPr>
-      <w:rPr>
-        <w:rFonts w:ascii="Wingdings" w:hAnsi="Wingdings" w:hint="default"/>
-        <w:sz w:val="20"/>
-      </w:rPr>
-    </w:lvl>
-    <w:lvl w:ilvl="6" w:tentative="1">
-      <w:start w:val="1"/>
-      <w:numFmt w:val="bullet"/>
-      <w:lvlText w:val=""/>
-      <w:lvlJc w:val="left"/>
-      <w:pPr>
-        <w:tabs>
-          <w:tab w:val="num" w:pos="5040"/>
-        </w:tabs>
-        <w:ind w:left="5040" w:hanging="360"/>
-      </w:pPr>
-      <w:rPr>
-        <w:rFonts w:ascii="Wingdings" w:hAnsi="Wingdings" w:hint="default"/>
-        <w:sz w:val="20"/>
-      </w:rPr>
-    </w:lvl>
-    <w:lvl w:ilvl="7" w:tentative="1">
-      <w:start w:val="1"/>
-      <w:numFmt w:val="bullet"/>
-      <w:lvlText w:val=""/>
-      <w:lvlJc w:val="left"/>
-      <w:pPr>
-        <w:tabs>
-          <w:tab w:val="num" w:pos="5760"/>
-        </w:tabs>
-        <w:ind w:left="5760" w:hanging="360"/>
-      </w:pPr>
-      <w:rPr>
-        <w:rFonts w:ascii="Wingdings" w:hAnsi="Wingdings" w:hint="default"/>
-        <w:sz w:val="20"/>
-      </w:rPr>
-    </w:lvl>
-    <w:lvl w:ilvl="8" w:tentative="1">
-      <w:start w:val="1"/>
-      <w:numFmt w:val="bullet"/>
-      <w:lvlText w:val=""/>
-      <w:lvlJc w:val="left"/>
-      <w:pPr>
-        <w:tabs>
-          <w:tab w:val="num" w:pos="6480"/>
-        </w:tabs>
-        <w:ind w:left="6480" w:hanging="360"/>
-      </w:pPr>
-      <w:rPr>
-        <w:rFonts w:ascii="Wingdings" w:hAnsi="Wingdings" w:hint="default"/>
-        <w:sz w:val="20"/>
-      </w:rPr>
-    </w:lvl>
-  </w:abstractNum>
-  <w:num w:numId="1" w16cid:durableId="331105483">
-    <w:abstractNumId w:val="0"/>
-  </w:num>
-  <w:num w:numId="2" w16cid:durableId="180365905">
+  <w:num w:numId="1" w16cid:durableId="756639190">
     <w:abstractNumId w:val="3"/>
   </w:num>
-  <w:num w:numId="3" w16cid:durableId="244464582">
+  <w:num w:numId="2" w16cid:durableId="1686443074">
+    <w:abstractNumId w:val="7"/>
+  </w:num>
+  <w:num w:numId="3" w16cid:durableId="600770646">
+    <w:abstractNumId w:val="5"/>
+  </w:num>
+  <w:num w:numId="4" w16cid:durableId="1485047719">
+    <w:abstractNumId w:val="9"/>
+  </w:num>
+  <w:num w:numId="5" w16cid:durableId="820775552">
+    <w:abstractNumId w:val="6"/>
+  </w:num>
+  <w:num w:numId="6" w16cid:durableId="1921403686">
+    <w:abstractNumId w:val="8"/>
+  </w:num>
+  <w:num w:numId="7" w16cid:durableId="701318515">
+    <w:abstractNumId w:val="4"/>
+  </w:num>
+  <w:num w:numId="8" w16cid:durableId="1669939010">
     <w:abstractNumId w:val="2"/>
   </w:num>
-  <w:num w:numId="4" w16cid:durableId="1120802265">
-    <w:abstractNumId w:val="4"/>
+  <w:num w:numId="9" w16cid:durableId="1314407988">
+    <w:abstractNumId w:val="1"/>
   </w:num>
-  <w:num w:numId="5" w16cid:durableId="1158885741">
-    <w:abstractNumId w:val="7"/>
-  </w:num>
-  <w:num w:numId="6" w16cid:durableId="2023117641">
-    <w:abstractNumId w:val="8"/>
-  </w:num>
-  <w:num w:numId="7" w16cid:durableId="1063334030">
-    <w:abstractNumId w:val="5"/>
-  </w:num>
-  <w:num w:numId="8" w16cid:durableId="1183739306">
-    <w:abstractNumId w:val="9"/>
-  </w:num>
-  <w:num w:numId="9" w16cid:durableId="1277634204">
-    <w:abstractNumId w:val="6"/>
-  </w:num>
-  <w:num w:numId="10" w16cid:durableId="1749762966">
-    <w:abstractNumId w:val="1"/>
+  <w:num w:numId="10" w16cid:durableId="541093473">
+    <w:abstractNumId w:val="0"/>
   </w:num>
 </w:numbering>
 </file>

</xml_diff>

<commit_message>
Tri-Stone is the only program: the office app becomes a library
Owner report: opening the office app on its own and signing in with a
Website Admin login showed "This login is for the Website Admin app".
The office app no longer builds its own program (OutputType Library, no
Program.cs, no Apps\Office App); Tri-Stone signs everyone in and opens
the right screens. 5/5 checks with the real TriStone.exe; notes,
Developer Guide and testing log updated.

Co-Authored-By: Claude Opus 5.5 <noreply@anthropic.com>
</commit_message>
<xml_diff>
--- a/docs/Developer Guide.docx
+++ b/docs/Developer Guide.docx
@@ -72,7 +72,7 @@
       <w:pPr>
         <w:pStyle w:val="NormalWeb"/>
         <w:shd w:val="clear" w:color="auto" w:fill="EEF2F8"/>
-        <w:divId w:val="572545262"/>
+        <w:divId w:val="1349404035"/>
         <w:rPr>
           <w:rFonts w:ascii="Calibri" w:hAnsi="Calibri" w:cs="Calibri"/>
           <w:color w:val="404040"/>
@@ -2368,7 +2368,7 @@
           <w:sz w:val="22"/>
           <w:szCs w:val="22"/>
         </w:rPr>
-        <w:t xml:space="preserve">Every build puts the finished programs in one easy folder at the top of the project. The one to open is </w:t>
+        <w:t xml:space="preserve">Every build puts the finished program in one easy folder at the top of the project: </w:t>
       </w:r>
       <w:r>
         <w:rPr>
@@ -2386,7 +2386,26 @@
           <w:sz w:val="22"/>
           <w:szCs w:val="22"/>
         </w:rPr>
-        <w:t xml:space="preserve">: it signs everyone in and opens the office app or the Website Admin app </w:t>
+        <w:t xml:space="preserve">, the </w:t>
+      </w:r>
+      <w:r>
+        <w:rPr>
+          <w:rStyle w:val="Strong"/>
+          <w:rFonts w:ascii="Calibri" w:hAnsi="Calibri" w:cs="Calibri"/>
+          <w:color w:val="1A1A1A"/>
+          <w:sz w:val="22"/>
+          <w:szCs w:val="22"/>
+        </w:rPr>
+        <w:t>only</w:t>
+      </w:r>
+      <w:r>
+        <w:rPr>
+          <w:rFonts w:ascii="Calibri" w:hAnsi="Calibri" w:cs="Calibri"/>
+          <w:color w:val="1A1A1A"/>
+          <w:sz w:val="22"/>
+          <w:szCs w:val="22"/>
+        </w:rPr>
+        <w:t xml:space="preserve"> program. It signs everyone in and opens the office screens or the </w:t>
       </w:r>
       <w:r>
         <w:rPr>
@@ -2396,32 +2415,7 @@
           <w:szCs w:val="22"/>
         </w:rPr>
         <w:lastRenderedPageBreak/>
-        <w:t>(chapter 10). Make a desktop shortcut to it. (</w:t>
-      </w:r>
-      <w:r>
-        <w:rPr>
-          <w:rStyle w:val="HTMLCode"/>
-          <w:color w:val="1A1A1A"/>
-        </w:rPr>
-        <w:t>Apps\Office App\Company.OfficeApp.exe</w:t>
-      </w:r>
-      <w:r>
-        <w:rPr>
-          <w:rFonts w:ascii="Calibri" w:hAnsi="Calibri" w:cs="Calibri"/>
-          <w:color w:val="1A1A1A"/>
-          <w:sz w:val="22"/>
-          <w:szCs w:val="22"/>
-        </w:rPr>
-        <w:t xml:space="preserve"> </w:t>
-      </w:r>
-      <w:r>
-        <w:rPr>
-          <w:rFonts w:ascii="Calibri" w:hAnsi="Calibri" w:cs="Calibri"/>
-          <w:color w:val="1A1A1A"/>
-          <w:sz w:val="22"/>
-          <w:szCs w:val="22"/>
-        </w:rPr>
-        <w:t>still runs the office app alone.) The folder is rebuilt every time and isn't saved in Git.</w:t>
+        <w:t>Website Admin screens (chapter 10). Make a desktop shortcut to it. The folder is rebuilt every time and isn't saved in Git.</w:t>
       </w:r>
     </w:p>
     <w:p>
@@ -2611,6 +2605,22 @@
           <w:sz w:val="22"/>
           <w:szCs w:val="22"/>
         </w:rPr>
+        <w:t xml:space="preserve"> runs the ones not run yet, each as all-or-nothing. A table called </w:t>
+      </w:r>
+      <w:r>
+        <w:rPr>
+          <w:rStyle w:val="HTMLCode"/>
+          <w:color w:val="1A1A1A"/>
+        </w:rPr>
+        <w:t>schema_versions</w:t>
+      </w:r>
+      <w:r>
+        <w:rPr>
+          <w:rFonts w:ascii="Calibri" w:hAnsi="Calibri" w:cs="Calibri"/>
+          <w:color w:val="1A1A1A"/>
+          <w:sz w:val="22"/>
+          <w:szCs w:val="22"/>
+        </w:rPr>
         <w:t xml:space="preserve"> </w:t>
       </w:r>
       <w:r>
@@ -2620,23 +2630,7 @@
           <w:sz w:val="22"/>
           <w:szCs w:val="22"/>
         </w:rPr>
-        <w:t xml:space="preserve">runs the ones not run yet, each as all-or-nothing. A table called </w:t>
-      </w:r>
-      <w:r>
-        <w:rPr>
-          <w:rStyle w:val="HTMLCode"/>
-          <w:color w:val="1A1A1A"/>
-        </w:rPr>
-        <w:t>schema_versions</w:t>
-      </w:r>
-      <w:r>
-        <w:rPr>
-          <w:rFonts w:ascii="Calibri" w:hAnsi="Calibri" w:cs="Calibri"/>
-          <w:color w:val="1A1A1A"/>
-          <w:sz w:val="22"/>
-          <w:szCs w:val="22"/>
-        </w:rPr>
-        <w:t xml:space="preserve"> remembers which have run. Any PC, and later the server, gets exactly the same database.</w:t>
+        <w:t>remembers which have run. Any PC, and later the server, gets exactly the same database.</w:t>
       </w:r>
     </w:p>
     <w:p>
@@ -4134,16 +4128,7 @@
           <w:sz w:val="22"/>
           <w:szCs w:val="22"/>
         </w:rPr>
-        <w:t xml:space="preserve"> if it can'</w:t>
-      </w:r>
-      <w:r>
-        <w:rPr>
-          <w:rFonts w:ascii="Calibri" w:hAnsi="Calibri" w:cs="Calibri"/>
-          <w:color w:val="1A1A1A"/>
-          <w:sz w:val="22"/>
-          <w:szCs w:val="22"/>
-        </w:rPr>
-        <w:t xml:space="preserve">t connect), then </w:t>
+        <w:t xml:space="preserve"> if it can't connect), then </w:t>
       </w:r>
       <w:r>
         <w:rPr>
@@ -4904,7 +4889,16 @@
           <w:sz w:val="22"/>
           <w:szCs w:val="22"/>
         </w:rPr>
-        <w:t>Pages only show data and call services. A service re-checks who is signed in before doing anything, so a rule can't be skipped by reaching the code another way.</w:t>
+        <w:t>Pages only show data and call services. A service re-checks who is signed in before doing anything, so a rule can'</w:t>
+      </w:r>
+      <w:r>
+        <w:rPr>
+          <w:rFonts w:ascii="Calibri" w:hAnsi="Calibri" w:cs="Calibri"/>
+          <w:color w:val="1A1A1A"/>
+          <w:sz w:val="22"/>
+          <w:szCs w:val="22"/>
+        </w:rPr>
+        <w:t>t be skipped by reaching the code another way.</w:t>
       </w:r>
     </w:p>
     <w:p>
@@ -6219,7 +6213,16 @@
                 <w:sz w:val="22"/>
                 <w:szCs w:val="22"/>
               </w:rPr>
-              <w:t xml:space="preserve"> place project revenue and expenses are added up. Projects, the project report and the Dashboard all use it, so they always agree.</w:t>
+              <w:t xml:space="preserve"> </w:t>
+            </w:r>
+            <w:r>
+              <w:rPr>
+                <w:rFonts w:ascii="Calibri" w:eastAsia="Times New Roman" w:hAnsi="Calibri" w:cs="Calibri"/>
+                <w:color w:val="1A1A1A"/>
+                <w:sz w:val="22"/>
+                <w:szCs w:val="22"/>
+              </w:rPr>
+              <w:t>place project revenue and expenses are added up. Projects, the project report and the Dashboard all use it, so they always agree.</w:t>
             </w:r>
           </w:p>
         </w:tc>
@@ -6562,7 +6565,16 @@
                 <w:sz w:val="22"/>
                 <w:szCs w:val="22"/>
               </w:rPr>
-              <w:t xml:space="preserve"> waits for the user to stop typing before searching; </w:t>
+              <w:t xml:space="preserve"> </w:t>
+            </w:r>
+            <w:r>
+              <w:rPr>
+                <w:rFonts w:ascii="Calibri" w:eastAsia="Times New Roman" w:hAnsi="Calibri" w:cs="Calibri"/>
+                <w:color w:val="1A1A1A"/>
+                <w:sz w:val="22"/>
+                <w:szCs w:val="22"/>
+              </w:rPr>
+              <w:t xml:space="preserve">waits for the user to stop typing before searching; </w:t>
             </w:r>
             <w:r>
               <w:rPr>
@@ -6865,16 +6877,7 @@
           <w:sz w:val="22"/>
           <w:szCs w:val="22"/>
         </w:rPr>
-        <w:t xml:space="preserve"> ignores the reload), then re-select only the record you mean. Otherwise the form silently edits the first row, and typing a "new" </w:t>
-      </w:r>
-      <w:r>
-        <w:rPr>
-          <w:rFonts w:ascii="Calibri" w:eastAsia="Times New Roman" w:hAnsi="Calibri" w:cs="Calibri"/>
-          <w:color w:val="1A1A1A"/>
-          <w:sz w:val="22"/>
-          <w:szCs w:val="22"/>
-        </w:rPr>
-        <w:t>record overwrites it (bug found on Employees, 2026-10-30).</w:t>
+        <w:t xml:space="preserve"> ignores the reload), then re-select only the record you mean. Otherwise the form silently edits the first row, and typing a "new" record overwrites it (bug found on Employees, 2026-10-30).</w:t>
       </w:r>
     </w:p>
     <w:p>
@@ -6908,7 +6911,16 @@
           <w:sz w:val="22"/>
           <w:szCs w:val="22"/>
         </w:rPr>
-        <w:t xml:space="preserve"> Every list page calls </w:t>
+        <w:t xml:space="preserve"> </w:t>
+      </w:r>
+      <w:r>
+        <w:rPr>
+          <w:rFonts w:ascii="Calibri" w:eastAsia="Times New Roman" w:hAnsi="Calibri" w:cs="Calibri"/>
+          <w:color w:val="1A1A1A"/>
+          <w:sz w:val="22"/>
+          <w:szCs w:val="22"/>
+        </w:rPr>
+        <w:t xml:space="preserve">Every list page calls </w:t>
       </w:r>
       <w:r>
         <w:rPr>
@@ -7040,7 +7052,16 @@
           <w:sz w:val="22"/>
           <w:szCs w:val="22"/>
         </w:rPr>
-        <w:t xml:space="preserve"> shows it until the page raises </w:t>
+        <w:t xml:space="preserve"> </w:t>
+      </w:r>
+      <w:r>
+        <w:rPr>
+          <w:rFonts w:ascii="Calibri" w:eastAsia="Times New Roman" w:hAnsi="Calibri" w:cs="Calibri"/>
+          <w:color w:val="1A1A1A"/>
+          <w:sz w:val="22"/>
+          <w:szCs w:val="22"/>
+        </w:rPr>
+        <w:t xml:space="preserve">shows it until the page raises </w:t>
       </w:r>
       <w:r>
         <w:rPr>
@@ -7532,16 +7553,7 @@
           <w:sz w:val="22"/>
           <w:szCs w:val="22"/>
         </w:rPr>
-        <w:t xml:space="preserve"> </w:t>
-      </w:r>
-      <w:r>
-        <w:rPr>
-          <w:rFonts w:ascii="Calibri" w:hAnsi="Calibri" w:cs="Calibri"/>
-          <w:color w:val="1A1A1A"/>
-          <w:sz w:val="22"/>
-          <w:szCs w:val="22"/>
-        </w:rPr>
-        <w:t xml:space="preserve">Usernames ignore capital letters. 5 wrong passwords lock the account until an Admin unlocks it. Every sign-in, sign-out, failure, lock and password change goes to </w:t>
+        <w:t xml:space="preserve"> Usernames ignore capital letters. 5 wrong passwords lock the account until an Admin unlocks it. Every sign-in, sign-out, failure, lock and password change goes to </w:t>
       </w:r>
       <w:r>
         <w:rPr>
@@ -7557,7 +7569,16 @@
           <w:sz w:val="22"/>
           <w:szCs w:val="22"/>
         </w:rPr>
-        <w:t xml:space="preserve"> with the PC name. After 5 minutes without activity a "Still there?" popup appears, and the app signs out by itself after 60 more seconds. In Debug builds, the </w:t>
+        <w:t xml:space="preserve"> with the PC name. After 5 minutes without activity a "</w:t>
+      </w:r>
+      <w:r>
+        <w:rPr>
+          <w:rFonts w:ascii="Calibri" w:hAnsi="Calibri" w:cs="Calibri"/>
+          <w:color w:val="1A1A1A"/>
+          <w:sz w:val="22"/>
+          <w:szCs w:val="22"/>
+        </w:rPr>
+        <w:t xml:space="preserve">Still there?" popup appears, and the app signs out by itself after 60 more seconds. In Debug builds, the </w:t>
       </w:r>
       <w:r>
         <w:rPr>
@@ -7603,16 +7624,7 @@
           <w:sz w:val="22"/>
           <w:szCs w:val="22"/>
         </w:rPr>
-        <w:t xml:space="preserve"> </w:t>
-      </w:r>
-      <w:r>
-        <w:rPr>
-          <w:rFonts w:ascii="Calibri" w:hAnsi="Calibri" w:cs="Calibri"/>
-          <w:color w:val="1A1A1A"/>
-          <w:sz w:val="22"/>
-          <w:szCs w:val="22"/>
-        </w:rPr>
-        <w:t xml:space="preserve">Only Admins create accounts and set passwords. Rules: 8+ characters with a letter and a number. </w:t>
+        <w:t xml:space="preserve"> Only Admins create accounts and set passwords. Rules: 8+ characters with a letter and a number. </w:t>
       </w:r>
       <w:r>
         <w:rPr>
@@ -7680,16 +7692,16 @@
           <w:sz w:val="22"/>
           <w:szCs w:val="22"/>
         </w:rPr>
-        <w:t xml:space="preserve"> (Admin only). Every login belongs to one Active office employee and takes its name and department from them. Administration staff only get Admin logins. You can'</w:t>
-      </w:r>
-      <w:r>
-        <w:rPr>
-          <w:rFonts w:ascii="Calibri" w:hAnsi="Calibri" w:cs="Calibri"/>
-          <w:color w:val="1A1A1A"/>
-          <w:sz w:val="22"/>
-          <w:szCs w:val="22"/>
-        </w:rPr>
-        <w:t>t disable yourself or remove your own Admin level, and the last active Admin is protected.</w:t>
+        <w:t xml:space="preserve"> </w:t>
+      </w:r>
+      <w:r>
+        <w:rPr>
+          <w:rFonts w:ascii="Calibri" w:hAnsi="Calibri" w:cs="Calibri"/>
+          <w:color w:val="1A1A1A"/>
+          <w:sz w:val="22"/>
+          <w:szCs w:val="22"/>
+        </w:rPr>
+        <w:t>(Admin only). Every login belongs to one Active office employee and takes its name and department from them. Administration staff only get Admin logins. You can't disable yourself or remove your own Admin level, and the last active Admin is protected.</w:t>
       </w:r>
     </w:p>
     <w:p>
@@ -7916,7 +7928,16 @@
           <w:sz w:val="22"/>
           <w:szCs w:val="22"/>
         </w:rPr>
-        <w:t xml:space="preserve">, and overhead counts by its own date. Supervisors only see their own department's expenses; revenue and net are hidden from them. The chart is ScottPlot (NuGet </w:t>
+        <w:t>, and overhead counts by its own date. Supervisors only see their own department'</w:t>
+      </w:r>
+      <w:r>
+        <w:rPr>
+          <w:rFonts w:ascii="Calibri" w:hAnsi="Calibri" w:cs="Calibri"/>
+          <w:color w:val="1A1A1A"/>
+          <w:sz w:val="22"/>
+          <w:szCs w:val="22"/>
+        </w:rPr>
+        <w:t xml:space="preserve">s expenses; revenue and net are hidden from them. The chart is ScottPlot (NuGet </w:t>
       </w:r>
       <w:r>
         <w:rPr>
@@ -7962,13 +7983,7 @@
         <w:rPr>
           <w:rFonts w:ascii="Calibri" w:eastAsia="Times New Roman" w:hAnsi="Calibri" w:cs="Calibri"/>
         </w:rPr>
-        <w:t xml:space="preserve">Chapter 6: HR </w:t>
-      </w:r>
-      <w:r>
-        <w:rPr>
-          <w:rFonts w:ascii="Calibri" w:eastAsia="Times New Roman" w:hAnsi="Calibri" w:cs="Calibri"/>
-        </w:rPr>
-        <w:t>&amp; Payroll (Part 2)</w:t>
+        <w:t>Chapter 6: HR &amp; Payroll (Part 2)</w:t>
       </w:r>
     </w:p>
     <w:p>
@@ -8044,16 +8059,7 @@
           <w:sz w:val="22"/>
           <w:szCs w:val="22"/>
         </w:rPr>
-        <w:t xml:space="preserve"> Attendance (waiting for the fingerprint scanner'</w:t>
-      </w:r>
-      <w:r>
-        <w:rPr>
-          <w:rFonts w:ascii="Calibri" w:hAnsi="Calibri" w:cs="Calibri"/>
-          <w:color w:val="1A1A1A"/>
-          <w:sz w:val="22"/>
-          <w:szCs w:val="22"/>
-        </w:rPr>
-        <w:t>s sample export file), Payroll, Cash Advances, Payslips.</w:t>
+        <w:t xml:space="preserve"> Attendance (waiting for the fingerprint scanner's sample export file), Payroll, Cash Advances, Payslips.</w:t>
       </w:r>
     </w:p>
     <w:p>
@@ -8135,7 +8141,16 @@
           <w:sz w:val="22"/>
           <w:szCs w:val="22"/>
         </w:rPr>
-        <w:t xml:space="preserve"> the Employee records, the Supervisor approves. Then the stock drops and the cost goes to the project.</w:t>
+        <w:t xml:space="preserve"> </w:t>
+      </w:r>
+      <w:r>
+        <w:rPr>
+          <w:rFonts w:ascii="Calibri" w:eastAsia="Times New Roman" w:hAnsi="Calibri" w:cs="Calibri"/>
+          <w:color w:val="1A1A1A"/>
+          <w:sz w:val="22"/>
+          <w:szCs w:val="22"/>
+        </w:rPr>
+        <w:t>the Employee records, the Supervisor approves. Then the stock drops and the cost goes to the project.</w:t>
       </w:r>
     </w:p>
     <w:p>
@@ -8203,16 +8218,7 @@
           <w:sz w:val="22"/>
           <w:szCs w:val="22"/>
         </w:rPr>
-        <w:t xml:space="preserve"> no approval needed. Each needs a scan, or "physical copy only" </w:t>
-      </w:r>
-      <w:r>
-        <w:rPr>
-          <w:rFonts w:ascii="Calibri" w:eastAsia="Times New Roman" w:hAnsi="Calibri" w:cs="Calibri"/>
-          <w:color w:val="1A1A1A"/>
-          <w:sz w:val="22"/>
-          <w:szCs w:val="22"/>
-        </w:rPr>
-        <w:t>with where the paper is filed. Receipts shows them as "Stock purchase" without copying them, so they are never counted twice.</w:t>
+        <w:t xml:space="preserve"> no approval needed. Each needs a scan, or "physical copy only" with where the paper is filed. Receipts shows them as "Stock purchase" without copying them, so they are never counted twice.</w:t>
       </w:r>
     </w:p>
     <w:p>
@@ -8371,16 +8377,7 @@
           <w:sz w:val="22"/>
           <w:szCs w:val="22"/>
         </w:rPr>
-        <w:t xml:space="preserve"> </w:t>
-      </w:r>
-      <w:r>
-        <w:rPr>
-          <w:rFonts w:ascii="Calibri" w:eastAsia="Times New Roman" w:hAnsi="Calibri" w:cs="Calibri"/>
-          <w:color w:val="1A1A1A"/>
-          <w:sz w:val="22"/>
-          <w:szCs w:val="22"/>
-        </w:rPr>
-        <w:t>the Employee marks a stage reached and prepares the voucher (SV-0001...), the Supervisor approves, then the payout is recorded. Once billing starts, the amount and stages are locked.</w:t>
+        <w:t xml:space="preserve"> the Employee marks a stage reached and prepares the voucher (SV-0001...), the Supervisor approves, then the payout is recorded. Once billing starts, the amount and stages are locked.</w:t>
       </w:r>
     </w:p>
     <w:p>
@@ -8414,7 +8411,16 @@
           <w:sz w:val="22"/>
           <w:szCs w:val="22"/>
         </w:rPr>
-        <w:t xml:space="preserve"> is released only when the job is 100% done and every stage is paid.</w:t>
+        <w:t xml:space="preserve"> </w:t>
+      </w:r>
+      <w:r>
+        <w:rPr>
+          <w:rFonts w:ascii="Calibri" w:eastAsia="Times New Roman" w:hAnsi="Calibri" w:cs="Calibri"/>
+          <w:color w:val="1A1A1A"/>
+          <w:sz w:val="22"/>
+          <w:szCs w:val="22"/>
+        </w:rPr>
+        <w:t>is released only when the job is 100% done and every stage is paid.</w:t>
       </w:r>
     </w:p>
     <w:p>
@@ -9265,7 +9271,16 @@
           <w:sz w:val="22"/>
           <w:szCs w:val="22"/>
         </w:rPr>
-        <w:t xml:space="preserve"> with the Website Admin screens. It references the office app, so it uses the same sign-in, session, database settings and screen helpers.</w:t>
+        <w:t xml:space="preserve"> </w:t>
+      </w:r>
+      <w:r>
+        <w:rPr>
+          <w:rFonts w:ascii="Calibri" w:hAnsi="Calibri" w:cs="Calibri"/>
+          <w:color w:val="1A1A1A"/>
+          <w:sz w:val="22"/>
+          <w:szCs w:val="22"/>
+        </w:rPr>
+        <w:t>with the Website Admin screens. It references the office app, so it uses the same sign-in, session, database settings and screen helpers.</w:t>
       </w:r>
     </w:p>
     <w:p>
@@ -9308,28 +9323,47 @@
       </w:pPr>
       <w:r>
         <w:rPr>
-          <w:rFonts w:ascii="Calibri" w:hAnsi="Calibri" w:cs="Calibri"/>
-          <w:color w:val="1A1A1A"/>
-          <w:sz w:val="22"/>
-          <w:szCs w:val="22"/>
-        </w:rPr>
-        <w:t>The office app on its own (</w:t>
-      </w:r>
-      <w:r>
-        <w:rPr>
           <w:rStyle w:val="HTMLCode"/>
           <w:color w:val="1A1A1A"/>
         </w:rPr>
-        <w:t>Apps\Office App\Company.OfficeApp.exe</w:t>
-      </w:r>
-      <w:r>
-        <w:rPr>
-          <w:rFonts w:ascii="Calibri" w:hAnsi="Calibri" w:cs="Calibri"/>
-          <w:color w:val="1A1A1A"/>
-          <w:sz w:val="22"/>
-          <w:szCs w:val="22"/>
-        </w:rPr>
-        <w:t>) refuses a Website Admin login and points to Tri-Stone.</w:t>
+        <w:t>src/Company.OfficeApp</w:t>
+      </w:r>
+      <w:r>
+        <w:rPr>
+          <w:rFonts w:ascii="Calibri" w:hAnsi="Calibri" w:cs="Calibri"/>
+          <w:color w:val="1A1A1A"/>
+          <w:sz w:val="22"/>
+          <w:szCs w:val="22"/>
+        </w:rPr>
+        <w:t xml:space="preserve"> </w:t>
+      </w:r>
+      <w:r>
+        <w:rPr>
+          <w:rFonts w:ascii="Calibri" w:hAnsi="Calibri" w:cs="Calibri"/>
+          <w:color w:val="1A1A1A"/>
+          <w:sz w:val="22"/>
+          <w:szCs w:val="22"/>
+        </w:rPr>
+        <w:t xml:space="preserve">is a library too (no Program.cs): Tri-Stone is the only program, so nobody can open one app alone and get the wrong Sign In (owner request, 30 Oct 2026). In Visual Studio, </w:t>
+      </w:r>
+      <w:r>
+        <w:rPr>
+          <w:rStyle w:val="Strong"/>
+          <w:rFonts w:ascii="Calibri" w:hAnsi="Calibri" w:cs="Calibri"/>
+          <w:color w:val="1A1A1A"/>
+          <w:sz w:val="22"/>
+          <w:szCs w:val="22"/>
+        </w:rPr>
+        <w:t>Company.Launcher</w:t>
+      </w:r>
+      <w:r>
+        <w:rPr>
+          <w:rFonts w:ascii="Calibri" w:hAnsi="Calibri" w:cs="Calibri"/>
+          <w:color w:val="1A1A1A"/>
+          <w:sz w:val="22"/>
+          <w:szCs w:val="22"/>
+        </w:rPr>
+        <w:t xml:space="preserve"> must be the startup project.</w:t>
       </w:r>
     </w:p>
     <w:p>
@@ -11336,9 +11370,9 @@
 <file path=word/numbering.xml><?xml version="1.0" encoding="utf-8"?>
 <w:numbering xmlns:wpc="http://schemas.microsoft.com/office/word/2010/wordprocessingCanvas" xmlns:cx="http://schemas.microsoft.com/office/drawing/2014/chartex" xmlns:cx1="http://schemas.microsoft.com/office/drawing/2015/9/8/chartex" xmlns:cx2="http://schemas.microsoft.com/office/drawing/2015/10/21/chartex" xmlns:cx3="http://schemas.microsoft.com/office/drawing/2016/5/9/chartex" xmlns:cx4="http://schemas.microsoft.com/office/drawing/2016/5/10/chartex" xmlns:cx5="http://schemas.microsoft.com/office/drawing/2016/5/11/chartex" xmlns:cx6="http://schemas.microsoft.com/office/drawing/2016/5/12/chartex" xmlns:cx7="http://schemas.microsoft.com/office/drawing/2016/5/13/chartex" xmlns:cx8="http://schemas.microsoft.com/office/drawing/2016/5/14/chartex" xmlns:mc="http://schemas.openxmlformats.org/markup-compatibility/2006" xmlns:aink="http://schemas.microsoft.com/office/drawing/2016/ink" xmlns:am3d="http://schemas.microsoft.com/office/drawing/2017/model3d" xmlns:o="urn:schemas-microsoft-com:office:office" xmlns:oel="http://schemas.microsoft.com/office/2019/extlst" xmlns:r="http://schemas.openxmlformats.org/officeDocument/2006/relationships" xmlns:m="http://schemas.openxmlformats.org/officeDocument/2006/math" xmlns:v="urn:schemas-microsoft-com:vml" xmlns:wp14="http://schemas.microsoft.com/office/word/2010/wordprocessingDrawing" xmlns:wp="http://schemas.openxmlformats.org/drawingml/2006/wordprocessingDrawing" xmlns:w10="urn:schemas-microsoft-com:office:word" xmlns:w="http://schemas.openxmlformats.org/wordprocessingml/2006/main" xmlns:w14="http://schemas.microsoft.com/office/word/2010/wordml" xmlns:w15="http://schemas.microsoft.com/office/word/2012/wordml" xmlns:w16cex="http://schemas.microsoft.com/office/word/2018/wordml/cex" xmlns:w16cid="http://schemas.microsoft.com/office/word/2016/wordml/cid" xmlns:w16="http://schemas.microsoft.com/office/word/2018/wordml" xmlns:w16du="http://schemas.microsoft.com/office/word/2023/wordml/word16du" xmlns:w16sdtdh="http://schemas.microsoft.com/office/word/2020/wordml/sdtdatahash" xmlns:w16sdtfl="http://schemas.microsoft.com/office/word/2024/wordml/sdtformatlock" xmlns:w16se="http://schemas.microsoft.com/office/word/2015/wordml/symex" xmlns:wpg="http://schemas.microsoft.com/office/word/2010/wordprocessingGroup" xmlns:wpi="http://schemas.microsoft.com/office/word/2010/wordprocessingInk" xmlns:wne="http://schemas.microsoft.com/office/word/2006/wordml" xmlns:wps="http://schemas.microsoft.com/office/word/2010/wordprocessingShape" mc:Ignorable="w14 w15 w16se w16cid w16 w16cex w16sdtdh w16sdtfl w16du wp14">
   <w:abstractNum w:abstractNumId="0" w15:restartNumberingAfterBreak="0">
-    <w:nsid w:val="003C2385"/>
+    <w:nsid w:val="001E2F1B"/>
     <w:multiLevelType w:val="multilevel"/>
-    <w:tmpl w:val="DC008CC6"/>
+    <w:tmpl w:val="BED48230"/>
     <w:lvl w:ilvl="0">
       <w:start w:val="1"/>
       <w:numFmt w:val="bullet"/>
@@ -11485,122 +11519,9 @@
     </w:lvl>
   </w:abstractNum>
   <w:abstractNum w:abstractNumId="1" w15:restartNumberingAfterBreak="0">
-    <w:nsid w:val="00DC15A2"/>
+    <w:nsid w:val="04433780"/>
     <w:multiLevelType w:val="multilevel"/>
-    <w:tmpl w:val="1D4EC078"/>
-    <w:lvl w:ilvl="0">
-      <w:start w:val="1"/>
-      <w:numFmt w:val="decimal"/>
-      <w:lvlText w:val="%1."/>
-      <w:lvlJc w:val="left"/>
-      <w:pPr>
-        <w:tabs>
-          <w:tab w:val="num" w:pos="720"/>
-        </w:tabs>
-        <w:ind w:left="720" w:hanging="360"/>
-      </w:pPr>
-    </w:lvl>
-    <w:lvl w:ilvl="1" w:tentative="1">
-      <w:start w:val="1"/>
-      <w:numFmt w:val="decimal"/>
-      <w:lvlText w:val="%2."/>
-      <w:lvlJc w:val="left"/>
-      <w:pPr>
-        <w:tabs>
-          <w:tab w:val="num" w:pos="1440"/>
-        </w:tabs>
-        <w:ind w:left="1440" w:hanging="360"/>
-      </w:pPr>
-    </w:lvl>
-    <w:lvl w:ilvl="2" w:tentative="1">
-      <w:start w:val="1"/>
-      <w:numFmt w:val="decimal"/>
-      <w:lvlText w:val="%3."/>
-      <w:lvlJc w:val="left"/>
-      <w:pPr>
-        <w:tabs>
-          <w:tab w:val="num" w:pos="2160"/>
-        </w:tabs>
-        <w:ind w:left="2160" w:hanging="360"/>
-      </w:pPr>
-    </w:lvl>
-    <w:lvl w:ilvl="3" w:tentative="1">
-      <w:start w:val="1"/>
-      <w:numFmt w:val="decimal"/>
-      <w:lvlText w:val="%4."/>
-      <w:lvlJc w:val="left"/>
-      <w:pPr>
-        <w:tabs>
-          <w:tab w:val="num" w:pos="2880"/>
-        </w:tabs>
-        <w:ind w:left="2880" w:hanging="360"/>
-      </w:pPr>
-    </w:lvl>
-    <w:lvl w:ilvl="4" w:tentative="1">
-      <w:start w:val="1"/>
-      <w:numFmt w:val="decimal"/>
-      <w:lvlText w:val="%5."/>
-      <w:lvlJc w:val="left"/>
-      <w:pPr>
-        <w:tabs>
-          <w:tab w:val="num" w:pos="3600"/>
-        </w:tabs>
-        <w:ind w:left="3600" w:hanging="360"/>
-      </w:pPr>
-    </w:lvl>
-    <w:lvl w:ilvl="5" w:tentative="1">
-      <w:start w:val="1"/>
-      <w:numFmt w:val="decimal"/>
-      <w:lvlText w:val="%6."/>
-      <w:lvlJc w:val="left"/>
-      <w:pPr>
-        <w:tabs>
-          <w:tab w:val="num" w:pos="4320"/>
-        </w:tabs>
-        <w:ind w:left="4320" w:hanging="360"/>
-      </w:pPr>
-    </w:lvl>
-    <w:lvl w:ilvl="6" w:tentative="1">
-      <w:start w:val="1"/>
-      <w:numFmt w:val="decimal"/>
-      <w:lvlText w:val="%7."/>
-      <w:lvlJc w:val="left"/>
-      <w:pPr>
-        <w:tabs>
-          <w:tab w:val="num" w:pos="5040"/>
-        </w:tabs>
-        <w:ind w:left="5040" w:hanging="360"/>
-      </w:pPr>
-    </w:lvl>
-    <w:lvl w:ilvl="7" w:tentative="1">
-      <w:start w:val="1"/>
-      <w:numFmt w:val="decimal"/>
-      <w:lvlText w:val="%8."/>
-      <w:lvlJc w:val="left"/>
-      <w:pPr>
-        <w:tabs>
-          <w:tab w:val="num" w:pos="5760"/>
-        </w:tabs>
-        <w:ind w:left="5760" w:hanging="360"/>
-      </w:pPr>
-    </w:lvl>
-    <w:lvl w:ilvl="8" w:tentative="1">
-      <w:start w:val="1"/>
-      <w:numFmt w:val="decimal"/>
-      <w:lvlText w:val="%9."/>
-      <w:lvlJc w:val="left"/>
-      <w:pPr>
-        <w:tabs>
-          <w:tab w:val="num" w:pos="6480"/>
-        </w:tabs>
-        <w:ind w:left="6480" w:hanging="360"/>
-      </w:pPr>
-    </w:lvl>
-  </w:abstractNum>
-  <w:abstractNum w:abstractNumId="2" w15:restartNumberingAfterBreak="0">
-    <w:nsid w:val="0426627E"/>
-    <w:multiLevelType w:val="multilevel"/>
-    <w:tmpl w:val="922E88F8"/>
+    <w:tmpl w:val="B3568EE0"/>
     <w:lvl w:ilvl="0">
       <w:start w:val="1"/>
       <w:numFmt w:val="bullet"/>
@@ -11746,10 +11667,10 @@
       </w:rPr>
     </w:lvl>
   </w:abstractNum>
-  <w:abstractNum w:abstractNumId="3" w15:restartNumberingAfterBreak="0">
-    <w:nsid w:val="04B552C0"/>
+  <w:abstractNum w:abstractNumId="2" w15:restartNumberingAfterBreak="0">
+    <w:nsid w:val="1CEF310D"/>
     <w:multiLevelType w:val="multilevel"/>
-    <w:tmpl w:val="90BACCC2"/>
+    <w:tmpl w:val="1D4E8B5A"/>
     <w:lvl w:ilvl="0">
       <w:start w:val="1"/>
       <w:numFmt w:val="bullet"/>
@@ -11895,10 +11816,10 @@
       </w:rPr>
     </w:lvl>
   </w:abstractNum>
-  <w:abstractNum w:abstractNumId="4" w15:restartNumberingAfterBreak="0">
-    <w:nsid w:val="21AF7BBA"/>
+  <w:abstractNum w:abstractNumId="3" w15:restartNumberingAfterBreak="0">
+    <w:nsid w:val="4FDA32D8"/>
     <w:multiLevelType w:val="multilevel"/>
-    <w:tmpl w:val="A95CB300"/>
+    <w:tmpl w:val="72800502"/>
     <w:lvl w:ilvl="0">
       <w:start w:val="1"/>
       <w:numFmt w:val="bullet"/>
@@ -12044,10 +11965,123 @@
       </w:rPr>
     </w:lvl>
   </w:abstractNum>
+  <w:abstractNum w:abstractNumId="4" w15:restartNumberingAfterBreak="0">
+    <w:nsid w:val="5A0A7467"/>
+    <w:multiLevelType w:val="multilevel"/>
+    <w:tmpl w:val="A7029EB6"/>
+    <w:lvl w:ilvl="0">
+      <w:start w:val="1"/>
+      <w:numFmt w:val="decimal"/>
+      <w:lvlText w:val="%1."/>
+      <w:lvlJc w:val="left"/>
+      <w:pPr>
+        <w:tabs>
+          <w:tab w:val="num" w:pos="720"/>
+        </w:tabs>
+        <w:ind w:left="720" w:hanging="360"/>
+      </w:pPr>
+    </w:lvl>
+    <w:lvl w:ilvl="1" w:tentative="1">
+      <w:start w:val="1"/>
+      <w:numFmt w:val="decimal"/>
+      <w:lvlText w:val="%2."/>
+      <w:lvlJc w:val="left"/>
+      <w:pPr>
+        <w:tabs>
+          <w:tab w:val="num" w:pos="1440"/>
+        </w:tabs>
+        <w:ind w:left="1440" w:hanging="360"/>
+      </w:pPr>
+    </w:lvl>
+    <w:lvl w:ilvl="2" w:tentative="1">
+      <w:start w:val="1"/>
+      <w:numFmt w:val="decimal"/>
+      <w:lvlText w:val="%3."/>
+      <w:lvlJc w:val="left"/>
+      <w:pPr>
+        <w:tabs>
+          <w:tab w:val="num" w:pos="2160"/>
+        </w:tabs>
+        <w:ind w:left="2160" w:hanging="360"/>
+      </w:pPr>
+    </w:lvl>
+    <w:lvl w:ilvl="3" w:tentative="1">
+      <w:start w:val="1"/>
+      <w:numFmt w:val="decimal"/>
+      <w:lvlText w:val="%4."/>
+      <w:lvlJc w:val="left"/>
+      <w:pPr>
+        <w:tabs>
+          <w:tab w:val="num" w:pos="2880"/>
+        </w:tabs>
+        <w:ind w:left="2880" w:hanging="360"/>
+      </w:pPr>
+    </w:lvl>
+    <w:lvl w:ilvl="4" w:tentative="1">
+      <w:start w:val="1"/>
+      <w:numFmt w:val="decimal"/>
+      <w:lvlText w:val="%5."/>
+      <w:lvlJc w:val="left"/>
+      <w:pPr>
+        <w:tabs>
+          <w:tab w:val="num" w:pos="3600"/>
+        </w:tabs>
+        <w:ind w:left="3600" w:hanging="360"/>
+      </w:pPr>
+    </w:lvl>
+    <w:lvl w:ilvl="5" w:tentative="1">
+      <w:start w:val="1"/>
+      <w:numFmt w:val="decimal"/>
+      <w:lvlText w:val="%6."/>
+      <w:lvlJc w:val="left"/>
+      <w:pPr>
+        <w:tabs>
+          <w:tab w:val="num" w:pos="4320"/>
+        </w:tabs>
+        <w:ind w:left="4320" w:hanging="360"/>
+      </w:pPr>
+    </w:lvl>
+    <w:lvl w:ilvl="6" w:tentative="1">
+      <w:start w:val="1"/>
+      <w:numFmt w:val="decimal"/>
+      <w:lvlText w:val="%7."/>
+      <w:lvlJc w:val="left"/>
+      <w:pPr>
+        <w:tabs>
+          <w:tab w:val="num" w:pos="5040"/>
+        </w:tabs>
+        <w:ind w:left="5040" w:hanging="360"/>
+      </w:pPr>
+    </w:lvl>
+    <w:lvl w:ilvl="7" w:tentative="1">
+      <w:start w:val="1"/>
+      <w:numFmt w:val="decimal"/>
+      <w:lvlText w:val="%8."/>
+      <w:lvlJc w:val="left"/>
+      <w:pPr>
+        <w:tabs>
+          <w:tab w:val="num" w:pos="5760"/>
+        </w:tabs>
+        <w:ind w:left="5760" w:hanging="360"/>
+      </w:pPr>
+    </w:lvl>
+    <w:lvl w:ilvl="8" w:tentative="1">
+      <w:start w:val="1"/>
+      <w:numFmt w:val="decimal"/>
+      <w:lvlText w:val="%9."/>
+      <w:lvlJc w:val="left"/>
+      <w:pPr>
+        <w:tabs>
+          <w:tab w:val="num" w:pos="6480"/>
+        </w:tabs>
+        <w:ind w:left="6480" w:hanging="360"/>
+      </w:pPr>
+    </w:lvl>
+  </w:abstractNum>
   <w:abstractNum w:abstractNumId="5" w15:restartNumberingAfterBreak="0">
-    <w:nsid w:val="26A07AAB"/>
+    <w:nsid w:val="5C2F51E6"/>
     <w:multiLevelType w:val="multilevel"/>
-    <w:tmpl w:val="710C54A0"/>
+    <w:tmpl w:val="5B38F1D2"/>
     <w:lvl w:ilvl="0">
       <w:start w:val="1"/>
       <w:numFmt w:val="bullet"/>
@@ -12194,9 +12228,158 @@
     </w:lvl>
   </w:abstractNum>
   <w:abstractNum w:abstractNumId="6" w15:restartNumberingAfterBreak="0">
-    <w:nsid w:val="3B723954"/>
+    <w:nsid w:val="641C548F"/>
     <w:multiLevelType w:val="multilevel"/>
-    <w:tmpl w:val="03842DF2"/>
+    <w:tmpl w:val="713C96D0"/>
+    <w:lvl w:ilvl="0">
+      <w:start w:val="1"/>
+      <w:numFmt w:val="bullet"/>
+      <w:lvlText w:val=""/>
+      <w:lvlJc w:val="left"/>
+      <w:pPr>
+        <w:tabs>
+          <w:tab w:val="num" w:pos="720"/>
+        </w:tabs>
+        <w:ind w:left="720" w:hanging="360"/>
+      </w:pPr>
+      <w:rPr>
+        <w:rFonts w:ascii="Symbol" w:hAnsi="Symbol" w:hint="default"/>
+        <w:sz w:val="20"/>
+      </w:rPr>
+    </w:lvl>
+    <w:lvl w:ilvl="1">
+      <w:start w:val="1"/>
+      <w:numFmt w:val="bullet"/>
+      <w:lvlText w:val="o"/>
+      <w:lvlJc w:val="left"/>
+      <w:pPr>
+        <w:tabs>
+          <w:tab w:val="num" w:pos="1440"/>
+        </w:tabs>
+        <w:ind w:left="1440" w:hanging="360"/>
+      </w:pPr>
+      <w:rPr>
+        <w:rFonts w:ascii="Courier New" w:hAnsi="Courier New" w:hint="default"/>
+        <w:sz w:val="20"/>
+      </w:rPr>
+    </w:lvl>
+    <w:lvl w:ilvl="2" w:tentative="1">
+      <w:start w:val="1"/>
+      <w:numFmt w:val="bullet"/>
+      <w:lvlText w:val=""/>
+      <w:lvlJc w:val="left"/>
+      <w:pPr>
+        <w:tabs>
+          <w:tab w:val="num" w:pos="2160"/>
+        </w:tabs>
+        <w:ind w:left="2160" w:hanging="360"/>
+      </w:pPr>
+      <w:rPr>
+        <w:rFonts w:ascii="Wingdings" w:hAnsi="Wingdings" w:hint="default"/>
+        <w:sz w:val="20"/>
+      </w:rPr>
+    </w:lvl>
+    <w:lvl w:ilvl="3" w:tentative="1">
+      <w:start w:val="1"/>
+      <w:numFmt w:val="bullet"/>
+      <w:lvlText w:val=""/>
+      <w:lvlJc w:val="left"/>
+      <w:pPr>
+        <w:tabs>
+          <w:tab w:val="num" w:pos="2880"/>
+        </w:tabs>
+        <w:ind w:left="2880" w:hanging="360"/>
+      </w:pPr>
+      <w:rPr>
+        <w:rFonts w:ascii="Wingdings" w:hAnsi="Wingdings" w:hint="default"/>
+        <w:sz w:val="20"/>
+      </w:rPr>
+    </w:lvl>
+    <w:lvl w:ilvl="4" w:tentative="1">
+      <w:start w:val="1"/>
+      <w:numFmt w:val="bullet"/>
+      <w:lvlText w:val=""/>
+      <w:lvlJc w:val="left"/>
+      <w:pPr>
+        <w:tabs>
+          <w:tab w:val="num" w:pos="3600"/>
+        </w:tabs>
+        <w:ind w:left="3600" w:hanging="360"/>
+      </w:pPr>
+      <w:rPr>
+        <w:rFonts w:ascii="Wingdings" w:hAnsi="Wingdings" w:hint="default"/>
+        <w:sz w:val="20"/>
+      </w:rPr>
+    </w:lvl>
+    <w:lvl w:ilvl="5" w:tentative="1">
+      <w:start w:val="1"/>
+      <w:numFmt w:val="bullet"/>
+      <w:lvlText w:val=""/>
+      <w:lvlJc w:val="left"/>
+      <w:pPr>
+        <w:tabs>
+          <w:tab w:val="num" w:pos="4320"/>
+        </w:tabs>
+        <w:ind w:left="4320" w:hanging="360"/>
+      </w:pPr>
+      <w:rPr>
+        <w:rFonts w:ascii="Wingdings" w:hAnsi="Wingdings" w:hint="default"/>
+        <w:sz w:val="20"/>
+      </w:rPr>
+    </w:lvl>
+    <w:lvl w:ilvl="6" w:tentative="1">
+      <w:start w:val="1"/>
+      <w:numFmt w:val="bullet"/>
+      <w:lvlText w:val=""/>
+      <w:lvlJc w:val="left"/>
+      <w:pPr>
+        <w:tabs>
+          <w:tab w:val="num" w:pos="5040"/>
+        </w:tabs>
+        <w:ind w:left="5040" w:hanging="360"/>
+      </w:pPr>
+      <w:rPr>
+        <w:rFonts w:ascii="Wingdings" w:hAnsi="Wingdings" w:hint="default"/>
+        <w:sz w:val="20"/>
+      </w:rPr>
+    </w:lvl>
+    <w:lvl w:ilvl="7" w:tentative="1">
+      <w:start w:val="1"/>
+      <w:numFmt w:val="bullet"/>
+      <w:lvlText w:val=""/>
+      <w:lvlJc w:val="left"/>
+      <w:pPr>
+        <w:tabs>
+          <w:tab w:val="num" w:pos="5760"/>
+        </w:tabs>
+        <w:ind w:left="5760" w:hanging="360"/>
+      </w:pPr>
+      <w:rPr>
+        <w:rFonts w:ascii="Wingdings" w:hAnsi="Wingdings" w:hint="default"/>
+        <w:sz w:val="20"/>
+      </w:rPr>
+    </w:lvl>
+    <w:lvl w:ilvl="8" w:tentative="1">
+      <w:start w:val="1"/>
+      <w:numFmt w:val="bullet"/>
+      <w:lvlText w:val=""/>
+      <w:lvlJc w:val="left"/>
+      <w:pPr>
+        <w:tabs>
+          <w:tab w:val="num" w:pos="6480"/>
+        </w:tabs>
+        <w:ind w:left="6480" w:hanging="360"/>
+      </w:pPr>
+      <w:rPr>
+        <w:rFonts w:ascii="Wingdings" w:hAnsi="Wingdings" w:hint="default"/>
+        <w:sz w:val="20"/>
+      </w:rPr>
+    </w:lvl>
+  </w:abstractNum>
+  <w:abstractNum w:abstractNumId="7" w15:restartNumberingAfterBreak="0">
+    <w:nsid w:val="6C973606"/>
+    <w:multiLevelType w:val="multilevel"/>
+    <w:tmpl w:val="60622198"/>
     <w:lvl w:ilvl="0">
       <w:start w:val="1"/>
       <w:numFmt w:val="bullet"/>
@@ -12342,10 +12525,10 @@
       </w:rPr>
     </w:lvl>
   </w:abstractNum>
-  <w:abstractNum w:abstractNumId="7" w15:restartNumberingAfterBreak="0">
-    <w:nsid w:val="3CC46239"/>
+  <w:abstractNum w:abstractNumId="8" w15:restartNumberingAfterBreak="0">
+    <w:nsid w:val="758D72BB"/>
     <w:multiLevelType w:val="multilevel"/>
-    <w:tmpl w:val="07164B5C"/>
+    <w:tmpl w:val="6FFEC6CA"/>
     <w:lvl w:ilvl="0">
       <w:start w:val="1"/>
       <w:numFmt w:val="bullet"/>
@@ -12491,181 +12674,32 @@
       </w:rPr>
     </w:lvl>
   </w:abstractNum>
-  <w:abstractNum w:abstractNumId="8" w15:restartNumberingAfterBreak="0">
-    <w:nsid w:val="6E0D27A9"/>
-    <w:multiLevelType w:val="multilevel"/>
-    <w:tmpl w:val="6FA231F8"/>
-    <w:lvl w:ilvl="0">
-      <w:start w:val="1"/>
-      <w:numFmt w:val="bullet"/>
-      <w:lvlText w:val=""/>
-      <w:lvlJc w:val="left"/>
-      <w:pPr>
-        <w:tabs>
-          <w:tab w:val="num" w:pos="720"/>
-        </w:tabs>
-        <w:ind w:left="720" w:hanging="360"/>
-      </w:pPr>
-      <w:rPr>
-        <w:rFonts w:ascii="Symbol" w:hAnsi="Symbol" w:hint="default"/>
-        <w:sz w:val="20"/>
-      </w:rPr>
-    </w:lvl>
-    <w:lvl w:ilvl="1">
-      <w:start w:val="1"/>
-      <w:numFmt w:val="bullet"/>
-      <w:lvlText w:val="o"/>
-      <w:lvlJc w:val="left"/>
-      <w:pPr>
-        <w:tabs>
-          <w:tab w:val="num" w:pos="1440"/>
-        </w:tabs>
-        <w:ind w:left="1440" w:hanging="360"/>
-      </w:pPr>
-      <w:rPr>
-        <w:rFonts w:ascii="Courier New" w:hAnsi="Courier New" w:hint="default"/>
-        <w:sz w:val="20"/>
-      </w:rPr>
-    </w:lvl>
-    <w:lvl w:ilvl="2" w:tentative="1">
-      <w:start w:val="1"/>
-      <w:numFmt w:val="bullet"/>
-      <w:lvlText w:val=""/>
-      <w:lvlJc w:val="left"/>
-      <w:pPr>
-        <w:tabs>
-          <w:tab w:val="num" w:pos="2160"/>
-        </w:tabs>
-        <w:ind w:left="2160" w:hanging="360"/>
-      </w:pPr>
-      <w:rPr>
-        <w:rFonts w:ascii="Wingdings" w:hAnsi="Wingdings" w:hint="default"/>
-        <w:sz w:val="20"/>
-      </w:rPr>
-    </w:lvl>
-    <w:lvl w:ilvl="3" w:tentative="1">
-      <w:start w:val="1"/>
-      <w:numFmt w:val="bullet"/>
-      <w:lvlText w:val=""/>
-      <w:lvlJc w:val="left"/>
-      <w:pPr>
-        <w:tabs>
-          <w:tab w:val="num" w:pos="2880"/>
-        </w:tabs>
-        <w:ind w:left="2880" w:hanging="360"/>
-      </w:pPr>
-      <w:rPr>
-        <w:rFonts w:ascii="Wingdings" w:hAnsi="Wingdings" w:hint="default"/>
-        <w:sz w:val="20"/>
-      </w:rPr>
-    </w:lvl>
-    <w:lvl w:ilvl="4" w:tentative="1">
-      <w:start w:val="1"/>
-      <w:numFmt w:val="bullet"/>
-      <w:lvlText w:val=""/>
-      <w:lvlJc w:val="left"/>
-      <w:pPr>
-        <w:tabs>
-          <w:tab w:val="num" w:pos="3600"/>
-        </w:tabs>
-        <w:ind w:left="3600" w:hanging="360"/>
-      </w:pPr>
-      <w:rPr>
-        <w:rFonts w:ascii="Wingdings" w:hAnsi="Wingdings" w:hint="default"/>
-        <w:sz w:val="20"/>
-      </w:rPr>
-    </w:lvl>
-    <w:lvl w:ilvl="5" w:tentative="1">
-      <w:start w:val="1"/>
-      <w:numFmt w:val="bullet"/>
-      <w:lvlText w:val=""/>
-      <w:lvlJc w:val="left"/>
-      <w:pPr>
-        <w:tabs>
-          <w:tab w:val="num" w:pos="4320"/>
-        </w:tabs>
-        <w:ind w:left="4320" w:hanging="360"/>
-      </w:pPr>
-      <w:rPr>
-        <w:rFonts w:ascii="Wingdings" w:hAnsi="Wingdings" w:hint="default"/>
-        <w:sz w:val="20"/>
-      </w:rPr>
-    </w:lvl>
-    <w:lvl w:ilvl="6" w:tentative="1">
-      <w:start w:val="1"/>
-      <w:numFmt w:val="bullet"/>
-      <w:lvlText w:val=""/>
-      <w:lvlJc w:val="left"/>
-      <w:pPr>
-        <w:tabs>
-          <w:tab w:val="num" w:pos="5040"/>
-        </w:tabs>
-        <w:ind w:left="5040" w:hanging="360"/>
-      </w:pPr>
-      <w:rPr>
-        <w:rFonts w:ascii="Wingdings" w:hAnsi="Wingdings" w:hint="default"/>
-        <w:sz w:val="20"/>
-      </w:rPr>
-    </w:lvl>
-    <w:lvl w:ilvl="7" w:tentative="1">
-      <w:start w:val="1"/>
-      <w:numFmt w:val="bullet"/>
-      <w:lvlText w:val=""/>
-      <w:lvlJc w:val="left"/>
-      <w:pPr>
-        <w:tabs>
-          <w:tab w:val="num" w:pos="5760"/>
-        </w:tabs>
-        <w:ind w:left="5760" w:hanging="360"/>
-      </w:pPr>
-      <w:rPr>
-        <w:rFonts w:ascii="Wingdings" w:hAnsi="Wingdings" w:hint="default"/>
-        <w:sz w:val="20"/>
-      </w:rPr>
-    </w:lvl>
-    <w:lvl w:ilvl="8" w:tentative="1">
-      <w:start w:val="1"/>
-      <w:numFmt w:val="bullet"/>
-      <w:lvlText w:val=""/>
-      <w:lvlJc w:val="left"/>
-      <w:pPr>
-        <w:tabs>
-          <w:tab w:val="num" w:pos="6480"/>
-        </w:tabs>
-        <w:ind w:left="6480" w:hanging="360"/>
-      </w:pPr>
-      <w:rPr>
-        <w:rFonts w:ascii="Wingdings" w:hAnsi="Wingdings" w:hint="default"/>
-        <w:sz w:val="20"/>
-      </w:rPr>
-    </w:lvl>
-  </w:abstractNum>
-  <w:num w:numId="1" w16cid:durableId="871655206">
+  <w:num w:numId="1" w16cid:durableId="553274335">
+    <w:abstractNumId w:val="4"/>
+  </w:num>
+  <w:num w:numId="2" w16cid:durableId="1138841928">
+    <w:abstractNumId w:val="3"/>
+  </w:num>
+  <w:num w:numId="3" w16cid:durableId="592011363">
+    <w:abstractNumId w:val="6"/>
+  </w:num>
+  <w:num w:numId="4" w16cid:durableId="1280069736">
     <w:abstractNumId w:val="1"/>
   </w:num>
-  <w:num w:numId="2" w16cid:durableId="133304713">
-    <w:abstractNumId w:val="0"/>
+  <w:num w:numId="5" w16cid:durableId="1503931320">
+    <w:abstractNumId w:val="5"/>
   </w:num>
-  <w:num w:numId="3" w16cid:durableId="1051155313">
+  <w:num w:numId="6" w16cid:durableId="1977180919">
     <w:abstractNumId w:val="8"/>
   </w:num>
-  <w:num w:numId="4" w16cid:durableId="856190589">
+  <w:num w:numId="7" w16cid:durableId="128713691">
     <w:abstractNumId w:val="7"/>
   </w:num>
-  <w:num w:numId="5" w16cid:durableId="418059036">
+  <w:num w:numId="8" w16cid:durableId="1248540407">
     <w:abstractNumId w:val="2"/>
   </w:num>
-  <w:num w:numId="6" w16cid:durableId="121045248">
-    <w:abstractNumId w:val="6"/>
-  </w:num>
-  <w:num w:numId="7" w16cid:durableId="1386952190">
-    <w:abstractNumId w:val="3"/>
-  </w:num>
-  <w:num w:numId="8" w16cid:durableId="1446538438">
-    <w:abstractNumId w:val="4"/>
-  </w:num>
-  <w:num w:numId="9" w16cid:durableId="1808625445">
-    <w:abstractNumId w:val="5"/>
+  <w:num w:numId="9" w16cid:durableId="122428542">
+    <w:abstractNumId w:val="0"/>
   </w:num>
 </w:numbering>
 </file>

</xml_diff>

<commit_message>
Rewrite the Feature Guide as a technical functional specification
Owner request: not basic. Each feature now states access, inputs and
validations, state changes, exact formulas with worked examples, and
what it writes: access model and approval states, audit trail, list-page
add/edit rules, sign-in table and account states, user accounts,
Dashboard formulas, projects, employees and rate history, attendance
import/calculation/fixes, pay calendar, payroll and government
deductions with the TRAIN table, cash advances, payslips, HR settings,
inventory, subcontractor billing, receipts and change orders, Website
Admin inquiries.

Co-Authored-By: Claude Opus 5.5 <noreply@anthropic.com>
</commit_message>
<xml_diff>
--- a/docs/Developer Guide.docx
+++ b/docs/Developer Guide.docx
@@ -75,7 +75,7 @@
       <w:pPr>
         <w:pStyle w:val="NormalWeb"/>
         <w:shd w:val="clear" w:color="auto" w:fill="EEF2F8"/>
-        <w:divId w:val="1923100333"/>
+        <w:divId w:val="1287277677"/>
         <w:rPr>
           <w:rFonts w:ascii="Calibri" w:hAnsi="Calibri" w:cs="Calibri"/>
           <w:color w:val="404040"/>
@@ -18217,9 +18217,9 @@
 <file path=word/numbering.xml><?xml version="1.0" encoding="utf-8"?>
 <w:numbering xmlns:wpc="http://schemas.microsoft.com/office/word/2010/wordprocessingCanvas" xmlns:cx="http://schemas.microsoft.com/office/drawing/2014/chartex" xmlns:cx1="http://schemas.microsoft.com/office/drawing/2015/9/8/chartex" xmlns:cx2="http://schemas.microsoft.com/office/drawing/2015/10/21/chartex" xmlns:cx3="http://schemas.microsoft.com/office/drawing/2016/5/9/chartex" xmlns:cx4="http://schemas.microsoft.com/office/drawing/2016/5/10/chartex" xmlns:cx5="http://schemas.microsoft.com/office/drawing/2016/5/11/chartex" xmlns:cx6="http://schemas.microsoft.com/office/drawing/2016/5/12/chartex" xmlns:cx7="http://schemas.microsoft.com/office/drawing/2016/5/13/chartex" xmlns:cx8="http://schemas.microsoft.com/office/drawing/2016/5/14/chartex" xmlns:mc="http://schemas.openxmlformats.org/markup-compatibility/2006" xmlns:aink="http://schemas.microsoft.com/office/drawing/2016/ink" xmlns:am3d="http://schemas.microsoft.com/office/drawing/2017/model3d" xmlns:o="urn:schemas-microsoft-com:office:office" xmlns:oel="http://schemas.microsoft.com/office/2019/extlst" xmlns:r="http://schemas.openxmlformats.org/officeDocument/2006/relationships" xmlns:m="http://schemas.openxmlformats.org/officeDocument/2006/math" xmlns:v="urn:schemas-microsoft-com:vml" xmlns:wp14="http://schemas.microsoft.com/office/word/2010/wordprocessingDrawing" xmlns:wp="http://schemas.openxmlformats.org/drawingml/2006/wordprocessingDrawing" xmlns:w10="urn:schemas-microsoft-com:office:word" xmlns:w="http://schemas.openxmlformats.org/wordprocessingml/2006/main" xmlns:w14="http://schemas.microsoft.com/office/word/2010/wordml" xmlns:w15="http://schemas.microsoft.com/office/word/2012/wordml" xmlns:w16cex="http://schemas.microsoft.com/office/word/2018/wordml/cex" xmlns:w16cid="http://schemas.microsoft.com/office/word/2016/wordml/cid" xmlns:w16="http://schemas.microsoft.com/office/word/2018/wordml" xmlns:w16du="http://schemas.microsoft.com/office/word/2023/wordml/word16du" xmlns:w16sdtdh="http://schemas.microsoft.com/office/word/2020/wordml/sdtdatahash" xmlns:w16sdtfl="http://schemas.microsoft.com/office/word/2024/wordml/sdtformatlock" xmlns:w16se="http://schemas.microsoft.com/office/word/2015/wordml/symex" xmlns:wpg="http://schemas.microsoft.com/office/word/2010/wordprocessingGroup" xmlns:wpi="http://schemas.microsoft.com/office/word/2010/wordprocessingInk" xmlns:wne="http://schemas.microsoft.com/office/word/2006/wordml" xmlns:wps="http://schemas.microsoft.com/office/word/2010/wordprocessingShape" mc:Ignorable="w14 w15 w16se w16cid w16 w16cex w16sdtdh w16sdtfl w16du wp14">
   <w:abstractNum w:abstractNumId="0" w15:restartNumberingAfterBreak="0">
-    <w:nsid w:val="08D21637"/>
+    <w:nsid w:val="00254A94"/>
     <w:multiLevelType w:val="multilevel"/>
-    <w:tmpl w:val="C8C266AE"/>
+    <w:tmpl w:val="CE6A33BC"/>
     <w:lvl w:ilvl="0">
       <w:start w:val="1"/>
       <w:numFmt w:val="bullet"/>
@@ -18366,9 +18366,1016 @@
     </w:lvl>
   </w:abstractNum>
   <w:abstractNum w:abstractNumId="1" w15:restartNumberingAfterBreak="0">
-    <w:nsid w:val="0DB802E6"/>
+    <w:nsid w:val="0B6B2E1B"/>
     <w:multiLevelType w:val="multilevel"/>
-    <w:tmpl w:val="CFEC37BC"/>
+    <w:tmpl w:val="0A26D8D6"/>
+    <w:lvl w:ilvl="0">
+      <w:start w:val="1"/>
+      <w:numFmt w:val="bullet"/>
+      <w:lvlText w:val=""/>
+      <w:lvlJc w:val="left"/>
+      <w:pPr>
+        <w:tabs>
+          <w:tab w:val="num" w:pos="720"/>
+        </w:tabs>
+        <w:ind w:left="720" w:hanging="360"/>
+      </w:pPr>
+      <w:rPr>
+        <w:rFonts w:ascii="Symbol" w:hAnsi="Symbol" w:hint="default"/>
+        <w:sz w:val="20"/>
+      </w:rPr>
+    </w:lvl>
+    <w:lvl w:ilvl="1" w:tentative="1">
+      <w:start w:val="1"/>
+      <w:numFmt w:val="bullet"/>
+      <w:lvlText w:val="o"/>
+      <w:lvlJc w:val="left"/>
+      <w:pPr>
+        <w:tabs>
+          <w:tab w:val="num" w:pos="1440"/>
+        </w:tabs>
+        <w:ind w:left="1440" w:hanging="360"/>
+      </w:pPr>
+      <w:rPr>
+        <w:rFonts w:ascii="Courier New" w:hAnsi="Courier New" w:hint="default"/>
+        <w:sz w:val="20"/>
+      </w:rPr>
+    </w:lvl>
+    <w:lvl w:ilvl="2" w:tentative="1">
+      <w:start w:val="1"/>
+      <w:numFmt w:val="bullet"/>
+      <w:lvlText w:val=""/>
+      <w:lvlJc w:val="left"/>
+      <w:pPr>
+        <w:tabs>
+          <w:tab w:val="num" w:pos="2160"/>
+        </w:tabs>
+        <w:ind w:left="2160" w:hanging="360"/>
+      </w:pPr>
+      <w:rPr>
+        <w:rFonts w:ascii="Wingdings" w:hAnsi="Wingdings" w:hint="default"/>
+        <w:sz w:val="20"/>
+      </w:rPr>
+    </w:lvl>
+    <w:lvl w:ilvl="3" w:tentative="1">
+      <w:start w:val="1"/>
+      <w:numFmt w:val="bullet"/>
+      <w:lvlText w:val=""/>
+      <w:lvlJc w:val="left"/>
+      <w:pPr>
+        <w:tabs>
+          <w:tab w:val="num" w:pos="2880"/>
+        </w:tabs>
+        <w:ind w:left="2880" w:hanging="360"/>
+      </w:pPr>
+      <w:rPr>
+        <w:rFonts w:ascii="Wingdings" w:hAnsi="Wingdings" w:hint="default"/>
+        <w:sz w:val="20"/>
+      </w:rPr>
+    </w:lvl>
+    <w:lvl w:ilvl="4" w:tentative="1">
+      <w:start w:val="1"/>
+      <w:numFmt w:val="bullet"/>
+      <w:lvlText w:val=""/>
+      <w:lvlJc w:val="left"/>
+      <w:pPr>
+        <w:tabs>
+          <w:tab w:val="num" w:pos="3600"/>
+        </w:tabs>
+        <w:ind w:left="3600" w:hanging="360"/>
+      </w:pPr>
+      <w:rPr>
+        <w:rFonts w:ascii="Wingdings" w:hAnsi="Wingdings" w:hint="default"/>
+        <w:sz w:val="20"/>
+      </w:rPr>
+    </w:lvl>
+    <w:lvl w:ilvl="5" w:tentative="1">
+      <w:start w:val="1"/>
+      <w:numFmt w:val="bullet"/>
+      <w:lvlText w:val=""/>
+      <w:lvlJc w:val="left"/>
+      <w:pPr>
+        <w:tabs>
+          <w:tab w:val="num" w:pos="4320"/>
+        </w:tabs>
+        <w:ind w:left="4320" w:hanging="360"/>
+      </w:pPr>
+      <w:rPr>
+        <w:rFonts w:ascii="Wingdings" w:hAnsi="Wingdings" w:hint="default"/>
+        <w:sz w:val="20"/>
+      </w:rPr>
+    </w:lvl>
+    <w:lvl w:ilvl="6" w:tentative="1">
+      <w:start w:val="1"/>
+      <w:numFmt w:val="bullet"/>
+      <w:lvlText w:val=""/>
+      <w:lvlJc w:val="left"/>
+      <w:pPr>
+        <w:tabs>
+          <w:tab w:val="num" w:pos="5040"/>
+        </w:tabs>
+        <w:ind w:left="5040" w:hanging="360"/>
+      </w:pPr>
+      <w:rPr>
+        <w:rFonts w:ascii="Wingdings" w:hAnsi="Wingdings" w:hint="default"/>
+        <w:sz w:val="20"/>
+      </w:rPr>
+    </w:lvl>
+    <w:lvl w:ilvl="7" w:tentative="1">
+      <w:start w:val="1"/>
+      <w:numFmt w:val="bullet"/>
+      <w:lvlText w:val=""/>
+      <w:lvlJc w:val="left"/>
+      <w:pPr>
+        <w:tabs>
+          <w:tab w:val="num" w:pos="5760"/>
+        </w:tabs>
+        <w:ind w:left="5760" w:hanging="360"/>
+      </w:pPr>
+      <w:rPr>
+        <w:rFonts w:ascii="Wingdings" w:hAnsi="Wingdings" w:hint="default"/>
+        <w:sz w:val="20"/>
+      </w:rPr>
+    </w:lvl>
+    <w:lvl w:ilvl="8" w:tentative="1">
+      <w:start w:val="1"/>
+      <w:numFmt w:val="bullet"/>
+      <w:lvlText w:val=""/>
+      <w:lvlJc w:val="left"/>
+      <w:pPr>
+        <w:tabs>
+          <w:tab w:val="num" w:pos="6480"/>
+        </w:tabs>
+        <w:ind w:left="6480" w:hanging="360"/>
+      </w:pPr>
+      <w:rPr>
+        <w:rFonts w:ascii="Wingdings" w:hAnsi="Wingdings" w:hint="default"/>
+        <w:sz w:val="20"/>
+      </w:rPr>
+    </w:lvl>
+  </w:abstractNum>
+  <w:abstractNum w:abstractNumId="2" w15:restartNumberingAfterBreak="0">
+    <w:nsid w:val="0BDE76B0"/>
+    <w:multiLevelType w:val="multilevel"/>
+    <w:tmpl w:val="017E90A2"/>
+    <w:lvl w:ilvl="0">
+      <w:start w:val="1"/>
+      <w:numFmt w:val="bullet"/>
+      <w:lvlText w:val=""/>
+      <w:lvlJc w:val="left"/>
+      <w:pPr>
+        <w:tabs>
+          <w:tab w:val="num" w:pos="720"/>
+        </w:tabs>
+        <w:ind w:left="720" w:hanging="360"/>
+      </w:pPr>
+      <w:rPr>
+        <w:rFonts w:ascii="Symbol" w:hAnsi="Symbol" w:hint="default"/>
+        <w:sz w:val="20"/>
+      </w:rPr>
+    </w:lvl>
+    <w:lvl w:ilvl="1" w:tentative="1">
+      <w:start w:val="1"/>
+      <w:numFmt w:val="bullet"/>
+      <w:lvlText w:val="o"/>
+      <w:lvlJc w:val="left"/>
+      <w:pPr>
+        <w:tabs>
+          <w:tab w:val="num" w:pos="1440"/>
+        </w:tabs>
+        <w:ind w:left="1440" w:hanging="360"/>
+      </w:pPr>
+      <w:rPr>
+        <w:rFonts w:ascii="Courier New" w:hAnsi="Courier New" w:hint="default"/>
+        <w:sz w:val="20"/>
+      </w:rPr>
+    </w:lvl>
+    <w:lvl w:ilvl="2" w:tentative="1">
+      <w:start w:val="1"/>
+      <w:numFmt w:val="bullet"/>
+      <w:lvlText w:val=""/>
+      <w:lvlJc w:val="left"/>
+      <w:pPr>
+        <w:tabs>
+          <w:tab w:val="num" w:pos="2160"/>
+        </w:tabs>
+        <w:ind w:left="2160" w:hanging="360"/>
+      </w:pPr>
+      <w:rPr>
+        <w:rFonts w:ascii="Wingdings" w:hAnsi="Wingdings" w:hint="default"/>
+        <w:sz w:val="20"/>
+      </w:rPr>
+    </w:lvl>
+    <w:lvl w:ilvl="3" w:tentative="1">
+      <w:start w:val="1"/>
+      <w:numFmt w:val="bullet"/>
+      <w:lvlText w:val=""/>
+      <w:lvlJc w:val="left"/>
+      <w:pPr>
+        <w:tabs>
+          <w:tab w:val="num" w:pos="2880"/>
+        </w:tabs>
+        <w:ind w:left="2880" w:hanging="360"/>
+      </w:pPr>
+      <w:rPr>
+        <w:rFonts w:ascii="Wingdings" w:hAnsi="Wingdings" w:hint="default"/>
+        <w:sz w:val="20"/>
+      </w:rPr>
+    </w:lvl>
+    <w:lvl w:ilvl="4" w:tentative="1">
+      <w:start w:val="1"/>
+      <w:numFmt w:val="bullet"/>
+      <w:lvlText w:val=""/>
+      <w:lvlJc w:val="left"/>
+      <w:pPr>
+        <w:tabs>
+          <w:tab w:val="num" w:pos="3600"/>
+        </w:tabs>
+        <w:ind w:left="3600" w:hanging="360"/>
+      </w:pPr>
+      <w:rPr>
+        <w:rFonts w:ascii="Wingdings" w:hAnsi="Wingdings" w:hint="default"/>
+        <w:sz w:val="20"/>
+      </w:rPr>
+    </w:lvl>
+    <w:lvl w:ilvl="5" w:tentative="1">
+      <w:start w:val="1"/>
+      <w:numFmt w:val="bullet"/>
+      <w:lvlText w:val=""/>
+      <w:lvlJc w:val="left"/>
+      <w:pPr>
+        <w:tabs>
+          <w:tab w:val="num" w:pos="4320"/>
+        </w:tabs>
+        <w:ind w:left="4320" w:hanging="360"/>
+      </w:pPr>
+      <w:rPr>
+        <w:rFonts w:ascii="Wingdings" w:hAnsi="Wingdings" w:hint="default"/>
+        <w:sz w:val="20"/>
+      </w:rPr>
+    </w:lvl>
+    <w:lvl w:ilvl="6" w:tentative="1">
+      <w:start w:val="1"/>
+      <w:numFmt w:val="bullet"/>
+      <w:lvlText w:val=""/>
+      <w:lvlJc w:val="left"/>
+      <w:pPr>
+        <w:tabs>
+          <w:tab w:val="num" w:pos="5040"/>
+        </w:tabs>
+        <w:ind w:left="5040" w:hanging="360"/>
+      </w:pPr>
+      <w:rPr>
+        <w:rFonts w:ascii="Wingdings" w:hAnsi="Wingdings" w:hint="default"/>
+        <w:sz w:val="20"/>
+      </w:rPr>
+    </w:lvl>
+    <w:lvl w:ilvl="7" w:tentative="1">
+      <w:start w:val="1"/>
+      <w:numFmt w:val="bullet"/>
+      <w:lvlText w:val=""/>
+      <w:lvlJc w:val="left"/>
+      <w:pPr>
+        <w:tabs>
+          <w:tab w:val="num" w:pos="5760"/>
+        </w:tabs>
+        <w:ind w:left="5760" w:hanging="360"/>
+      </w:pPr>
+      <w:rPr>
+        <w:rFonts w:ascii="Wingdings" w:hAnsi="Wingdings" w:hint="default"/>
+        <w:sz w:val="20"/>
+      </w:rPr>
+    </w:lvl>
+    <w:lvl w:ilvl="8" w:tentative="1">
+      <w:start w:val="1"/>
+      <w:numFmt w:val="bullet"/>
+      <w:lvlText w:val=""/>
+      <w:lvlJc w:val="left"/>
+      <w:pPr>
+        <w:tabs>
+          <w:tab w:val="num" w:pos="6480"/>
+        </w:tabs>
+        <w:ind w:left="6480" w:hanging="360"/>
+      </w:pPr>
+      <w:rPr>
+        <w:rFonts w:ascii="Wingdings" w:hAnsi="Wingdings" w:hint="default"/>
+        <w:sz w:val="20"/>
+      </w:rPr>
+    </w:lvl>
+  </w:abstractNum>
+  <w:abstractNum w:abstractNumId="3" w15:restartNumberingAfterBreak="0">
+    <w:nsid w:val="12306B8D"/>
+    <w:multiLevelType w:val="multilevel"/>
+    <w:tmpl w:val="B8E497F8"/>
+    <w:lvl w:ilvl="0">
+      <w:start w:val="1"/>
+      <w:numFmt w:val="bullet"/>
+      <w:lvlText w:val=""/>
+      <w:lvlJc w:val="left"/>
+      <w:pPr>
+        <w:tabs>
+          <w:tab w:val="num" w:pos="720"/>
+        </w:tabs>
+        <w:ind w:left="720" w:hanging="360"/>
+      </w:pPr>
+      <w:rPr>
+        <w:rFonts w:ascii="Symbol" w:hAnsi="Symbol" w:hint="default"/>
+        <w:sz w:val="20"/>
+      </w:rPr>
+    </w:lvl>
+    <w:lvl w:ilvl="1" w:tentative="1">
+      <w:start w:val="1"/>
+      <w:numFmt w:val="bullet"/>
+      <w:lvlText w:val="o"/>
+      <w:lvlJc w:val="left"/>
+      <w:pPr>
+        <w:tabs>
+          <w:tab w:val="num" w:pos="1440"/>
+        </w:tabs>
+        <w:ind w:left="1440" w:hanging="360"/>
+      </w:pPr>
+      <w:rPr>
+        <w:rFonts w:ascii="Courier New" w:hAnsi="Courier New" w:hint="default"/>
+        <w:sz w:val="20"/>
+      </w:rPr>
+    </w:lvl>
+    <w:lvl w:ilvl="2" w:tentative="1">
+      <w:start w:val="1"/>
+      <w:numFmt w:val="bullet"/>
+      <w:lvlText w:val=""/>
+      <w:lvlJc w:val="left"/>
+      <w:pPr>
+        <w:tabs>
+          <w:tab w:val="num" w:pos="2160"/>
+        </w:tabs>
+        <w:ind w:left="2160" w:hanging="360"/>
+      </w:pPr>
+      <w:rPr>
+        <w:rFonts w:ascii="Wingdings" w:hAnsi="Wingdings" w:hint="default"/>
+        <w:sz w:val="20"/>
+      </w:rPr>
+    </w:lvl>
+    <w:lvl w:ilvl="3" w:tentative="1">
+      <w:start w:val="1"/>
+      <w:numFmt w:val="bullet"/>
+      <w:lvlText w:val=""/>
+      <w:lvlJc w:val="left"/>
+      <w:pPr>
+        <w:tabs>
+          <w:tab w:val="num" w:pos="2880"/>
+        </w:tabs>
+        <w:ind w:left="2880" w:hanging="360"/>
+      </w:pPr>
+      <w:rPr>
+        <w:rFonts w:ascii="Wingdings" w:hAnsi="Wingdings" w:hint="default"/>
+        <w:sz w:val="20"/>
+      </w:rPr>
+    </w:lvl>
+    <w:lvl w:ilvl="4" w:tentative="1">
+      <w:start w:val="1"/>
+      <w:numFmt w:val="bullet"/>
+      <w:lvlText w:val=""/>
+      <w:lvlJc w:val="left"/>
+      <w:pPr>
+        <w:tabs>
+          <w:tab w:val="num" w:pos="3600"/>
+        </w:tabs>
+        <w:ind w:left="3600" w:hanging="360"/>
+      </w:pPr>
+      <w:rPr>
+        <w:rFonts w:ascii="Wingdings" w:hAnsi="Wingdings" w:hint="default"/>
+        <w:sz w:val="20"/>
+      </w:rPr>
+    </w:lvl>
+    <w:lvl w:ilvl="5" w:tentative="1">
+      <w:start w:val="1"/>
+      <w:numFmt w:val="bullet"/>
+      <w:lvlText w:val=""/>
+      <w:lvlJc w:val="left"/>
+      <w:pPr>
+        <w:tabs>
+          <w:tab w:val="num" w:pos="4320"/>
+        </w:tabs>
+        <w:ind w:left="4320" w:hanging="360"/>
+      </w:pPr>
+      <w:rPr>
+        <w:rFonts w:ascii="Wingdings" w:hAnsi="Wingdings" w:hint="default"/>
+        <w:sz w:val="20"/>
+      </w:rPr>
+    </w:lvl>
+    <w:lvl w:ilvl="6" w:tentative="1">
+      <w:start w:val="1"/>
+      <w:numFmt w:val="bullet"/>
+      <w:lvlText w:val=""/>
+      <w:lvlJc w:val="left"/>
+      <w:pPr>
+        <w:tabs>
+          <w:tab w:val="num" w:pos="5040"/>
+        </w:tabs>
+        <w:ind w:left="5040" w:hanging="360"/>
+      </w:pPr>
+      <w:rPr>
+        <w:rFonts w:ascii="Wingdings" w:hAnsi="Wingdings" w:hint="default"/>
+        <w:sz w:val="20"/>
+      </w:rPr>
+    </w:lvl>
+    <w:lvl w:ilvl="7" w:tentative="1">
+      <w:start w:val="1"/>
+      <w:numFmt w:val="bullet"/>
+      <w:lvlText w:val=""/>
+      <w:lvlJc w:val="left"/>
+      <w:pPr>
+        <w:tabs>
+          <w:tab w:val="num" w:pos="5760"/>
+        </w:tabs>
+        <w:ind w:left="5760" w:hanging="360"/>
+      </w:pPr>
+      <w:rPr>
+        <w:rFonts w:ascii="Wingdings" w:hAnsi="Wingdings" w:hint="default"/>
+        <w:sz w:val="20"/>
+      </w:rPr>
+    </w:lvl>
+    <w:lvl w:ilvl="8" w:tentative="1">
+      <w:start w:val="1"/>
+      <w:numFmt w:val="bullet"/>
+      <w:lvlText w:val=""/>
+      <w:lvlJc w:val="left"/>
+      <w:pPr>
+        <w:tabs>
+          <w:tab w:val="num" w:pos="6480"/>
+        </w:tabs>
+        <w:ind w:left="6480" w:hanging="360"/>
+      </w:pPr>
+      <w:rPr>
+        <w:rFonts w:ascii="Wingdings" w:hAnsi="Wingdings" w:hint="default"/>
+        <w:sz w:val="20"/>
+      </w:rPr>
+    </w:lvl>
+  </w:abstractNum>
+  <w:abstractNum w:abstractNumId="4" w15:restartNumberingAfterBreak="0">
+    <w:nsid w:val="1AEE4D24"/>
+    <w:multiLevelType w:val="multilevel"/>
+    <w:tmpl w:val="2FD2E90A"/>
+    <w:lvl w:ilvl="0">
+      <w:start w:val="1"/>
+      <w:numFmt w:val="bullet"/>
+      <w:lvlText w:val=""/>
+      <w:lvlJc w:val="left"/>
+      <w:pPr>
+        <w:tabs>
+          <w:tab w:val="num" w:pos="720"/>
+        </w:tabs>
+        <w:ind w:left="720" w:hanging="360"/>
+      </w:pPr>
+      <w:rPr>
+        <w:rFonts w:ascii="Symbol" w:hAnsi="Symbol" w:hint="default"/>
+        <w:sz w:val="20"/>
+      </w:rPr>
+    </w:lvl>
+    <w:lvl w:ilvl="1" w:tentative="1">
+      <w:start w:val="1"/>
+      <w:numFmt w:val="bullet"/>
+      <w:lvlText w:val="o"/>
+      <w:lvlJc w:val="left"/>
+      <w:pPr>
+        <w:tabs>
+          <w:tab w:val="num" w:pos="1440"/>
+        </w:tabs>
+        <w:ind w:left="1440" w:hanging="360"/>
+      </w:pPr>
+      <w:rPr>
+        <w:rFonts w:ascii="Courier New" w:hAnsi="Courier New" w:hint="default"/>
+        <w:sz w:val="20"/>
+      </w:rPr>
+    </w:lvl>
+    <w:lvl w:ilvl="2" w:tentative="1">
+      <w:start w:val="1"/>
+      <w:numFmt w:val="bullet"/>
+      <w:lvlText w:val=""/>
+      <w:lvlJc w:val="left"/>
+      <w:pPr>
+        <w:tabs>
+          <w:tab w:val="num" w:pos="2160"/>
+        </w:tabs>
+        <w:ind w:left="2160" w:hanging="360"/>
+      </w:pPr>
+      <w:rPr>
+        <w:rFonts w:ascii="Wingdings" w:hAnsi="Wingdings" w:hint="default"/>
+        <w:sz w:val="20"/>
+      </w:rPr>
+    </w:lvl>
+    <w:lvl w:ilvl="3" w:tentative="1">
+      <w:start w:val="1"/>
+      <w:numFmt w:val="bullet"/>
+      <w:lvlText w:val=""/>
+      <w:lvlJc w:val="left"/>
+      <w:pPr>
+        <w:tabs>
+          <w:tab w:val="num" w:pos="2880"/>
+        </w:tabs>
+        <w:ind w:left="2880" w:hanging="360"/>
+      </w:pPr>
+      <w:rPr>
+        <w:rFonts w:ascii="Wingdings" w:hAnsi="Wingdings" w:hint="default"/>
+        <w:sz w:val="20"/>
+      </w:rPr>
+    </w:lvl>
+    <w:lvl w:ilvl="4" w:tentative="1">
+      <w:start w:val="1"/>
+      <w:numFmt w:val="bullet"/>
+      <w:lvlText w:val=""/>
+      <w:lvlJc w:val="left"/>
+      <w:pPr>
+        <w:tabs>
+          <w:tab w:val="num" w:pos="3600"/>
+        </w:tabs>
+        <w:ind w:left="3600" w:hanging="360"/>
+      </w:pPr>
+      <w:rPr>
+        <w:rFonts w:ascii="Wingdings" w:hAnsi="Wingdings" w:hint="default"/>
+        <w:sz w:val="20"/>
+      </w:rPr>
+    </w:lvl>
+    <w:lvl w:ilvl="5" w:tentative="1">
+      <w:start w:val="1"/>
+      <w:numFmt w:val="bullet"/>
+      <w:lvlText w:val=""/>
+      <w:lvlJc w:val="left"/>
+      <w:pPr>
+        <w:tabs>
+          <w:tab w:val="num" w:pos="4320"/>
+        </w:tabs>
+        <w:ind w:left="4320" w:hanging="360"/>
+      </w:pPr>
+      <w:rPr>
+        <w:rFonts w:ascii="Wingdings" w:hAnsi="Wingdings" w:hint="default"/>
+        <w:sz w:val="20"/>
+      </w:rPr>
+    </w:lvl>
+    <w:lvl w:ilvl="6" w:tentative="1">
+      <w:start w:val="1"/>
+      <w:numFmt w:val="bullet"/>
+      <w:lvlText w:val=""/>
+      <w:lvlJc w:val="left"/>
+      <w:pPr>
+        <w:tabs>
+          <w:tab w:val="num" w:pos="5040"/>
+        </w:tabs>
+        <w:ind w:left="5040" w:hanging="360"/>
+      </w:pPr>
+      <w:rPr>
+        <w:rFonts w:ascii="Wingdings" w:hAnsi="Wingdings" w:hint="default"/>
+        <w:sz w:val="20"/>
+      </w:rPr>
+    </w:lvl>
+    <w:lvl w:ilvl="7" w:tentative="1">
+      <w:start w:val="1"/>
+      <w:numFmt w:val="bullet"/>
+      <w:lvlText w:val=""/>
+      <w:lvlJc w:val="left"/>
+      <w:pPr>
+        <w:tabs>
+          <w:tab w:val="num" w:pos="5760"/>
+        </w:tabs>
+        <w:ind w:left="5760" w:hanging="360"/>
+      </w:pPr>
+      <w:rPr>
+        <w:rFonts w:ascii="Wingdings" w:hAnsi="Wingdings" w:hint="default"/>
+        <w:sz w:val="20"/>
+      </w:rPr>
+    </w:lvl>
+    <w:lvl w:ilvl="8" w:tentative="1">
+      <w:start w:val="1"/>
+      <w:numFmt w:val="bullet"/>
+      <w:lvlText w:val=""/>
+      <w:lvlJc w:val="left"/>
+      <w:pPr>
+        <w:tabs>
+          <w:tab w:val="num" w:pos="6480"/>
+        </w:tabs>
+        <w:ind w:left="6480" w:hanging="360"/>
+      </w:pPr>
+      <w:rPr>
+        <w:rFonts w:ascii="Wingdings" w:hAnsi="Wingdings" w:hint="default"/>
+        <w:sz w:val="20"/>
+      </w:rPr>
+    </w:lvl>
+  </w:abstractNum>
+  <w:abstractNum w:abstractNumId="5" w15:restartNumberingAfterBreak="0">
+    <w:nsid w:val="1B246C53"/>
+    <w:multiLevelType w:val="multilevel"/>
+    <w:tmpl w:val="DA405142"/>
+    <w:lvl w:ilvl="0">
+      <w:start w:val="1"/>
+      <w:numFmt w:val="bullet"/>
+      <w:lvlText w:val=""/>
+      <w:lvlJc w:val="left"/>
+      <w:pPr>
+        <w:tabs>
+          <w:tab w:val="num" w:pos="720"/>
+        </w:tabs>
+        <w:ind w:left="720" w:hanging="360"/>
+      </w:pPr>
+      <w:rPr>
+        <w:rFonts w:ascii="Symbol" w:hAnsi="Symbol" w:hint="default"/>
+        <w:sz w:val="20"/>
+      </w:rPr>
+    </w:lvl>
+    <w:lvl w:ilvl="1" w:tentative="1">
+      <w:start w:val="1"/>
+      <w:numFmt w:val="bullet"/>
+      <w:lvlText w:val="o"/>
+      <w:lvlJc w:val="left"/>
+      <w:pPr>
+        <w:tabs>
+          <w:tab w:val="num" w:pos="1440"/>
+        </w:tabs>
+        <w:ind w:left="1440" w:hanging="360"/>
+      </w:pPr>
+      <w:rPr>
+        <w:rFonts w:ascii="Courier New" w:hAnsi="Courier New" w:hint="default"/>
+        <w:sz w:val="20"/>
+      </w:rPr>
+    </w:lvl>
+    <w:lvl w:ilvl="2" w:tentative="1">
+      <w:start w:val="1"/>
+      <w:numFmt w:val="bullet"/>
+      <w:lvlText w:val=""/>
+      <w:lvlJc w:val="left"/>
+      <w:pPr>
+        <w:tabs>
+          <w:tab w:val="num" w:pos="2160"/>
+        </w:tabs>
+        <w:ind w:left="2160" w:hanging="360"/>
+      </w:pPr>
+      <w:rPr>
+        <w:rFonts w:ascii="Wingdings" w:hAnsi="Wingdings" w:hint="default"/>
+        <w:sz w:val="20"/>
+      </w:rPr>
+    </w:lvl>
+    <w:lvl w:ilvl="3" w:tentative="1">
+      <w:start w:val="1"/>
+      <w:numFmt w:val="bullet"/>
+      <w:lvlText w:val=""/>
+      <w:lvlJc w:val="left"/>
+      <w:pPr>
+        <w:tabs>
+          <w:tab w:val="num" w:pos="2880"/>
+        </w:tabs>
+        <w:ind w:left="2880" w:hanging="360"/>
+      </w:pPr>
+      <w:rPr>
+        <w:rFonts w:ascii="Wingdings" w:hAnsi="Wingdings" w:hint="default"/>
+        <w:sz w:val="20"/>
+      </w:rPr>
+    </w:lvl>
+    <w:lvl w:ilvl="4" w:tentative="1">
+      <w:start w:val="1"/>
+      <w:numFmt w:val="bullet"/>
+      <w:lvlText w:val=""/>
+      <w:lvlJc w:val="left"/>
+      <w:pPr>
+        <w:tabs>
+          <w:tab w:val="num" w:pos="3600"/>
+        </w:tabs>
+        <w:ind w:left="3600" w:hanging="360"/>
+      </w:pPr>
+      <w:rPr>
+        <w:rFonts w:ascii="Wingdings" w:hAnsi="Wingdings" w:hint="default"/>
+        <w:sz w:val="20"/>
+      </w:rPr>
+    </w:lvl>
+    <w:lvl w:ilvl="5" w:tentative="1">
+      <w:start w:val="1"/>
+      <w:numFmt w:val="bullet"/>
+      <w:lvlText w:val=""/>
+      <w:lvlJc w:val="left"/>
+      <w:pPr>
+        <w:tabs>
+          <w:tab w:val="num" w:pos="4320"/>
+        </w:tabs>
+        <w:ind w:left="4320" w:hanging="360"/>
+      </w:pPr>
+      <w:rPr>
+        <w:rFonts w:ascii="Wingdings" w:hAnsi="Wingdings" w:hint="default"/>
+        <w:sz w:val="20"/>
+      </w:rPr>
+    </w:lvl>
+    <w:lvl w:ilvl="6" w:tentative="1">
+      <w:start w:val="1"/>
+      <w:numFmt w:val="bullet"/>
+      <w:lvlText w:val=""/>
+      <w:lvlJc w:val="left"/>
+      <w:pPr>
+        <w:tabs>
+          <w:tab w:val="num" w:pos="5040"/>
+        </w:tabs>
+        <w:ind w:left="5040" w:hanging="360"/>
+      </w:pPr>
+      <w:rPr>
+        <w:rFonts w:ascii="Wingdings" w:hAnsi="Wingdings" w:hint="default"/>
+        <w:sz w:val="20"/>
+      </w:rPr>
+    </w:lvl>
+    <w:lvl w:ilvl="7" w:tentative="1">
+      <w:start w:val="1"/>
+      <w:numFmt w:val="bullet"/>
+      <w:lvlText w:val=""/>
+      <w:lvlJc w:val="left"/>
+      <w:pPr>
+        <w:tabs>
+          <w:tab w:val="num" w:pos="5760"/>
+        </w:tabs>
+        <w:ind w:left="5760" w:hanging="360"/>
+      </w:pPr>
+      <w:rPr>
+        <w:rFonts w:ascii="Wingdings" w:hAnsi="Wingdings" w:hint="default"/>
+        <w:sz w:val="20"/>
+      </w:rPr>
+    </w:lvl>
+    <w:lvl w:ilvl="8" w:tentative="1">
+      <w:start w:val="1"/>
+      <w:numFmt w:val="bullet"/>
+      <w:lvlText w:val=""/>
+      <w:lvlJc w:val="left"/>
+      <w:pPr>
+        <w:tabs>
+          <w:tab w:val="num" w:pos="6480"/>
+        </w:tabs>
+        <w:ind w:left="6480" w:hanging="360"/>
+      </w:pPr>
+      <w:rPr>
+        <w:rFonts w:ascii="Wingdings" w:hAnsi="Wingdings" w:hint="default"/>
+        <w:sz w:val="20"/>
+      </w:rPr>
+    </w:lvl>
+  </w:abstractNum>
+  <w:abstractNum w:abstractNumId="6" w15:restartNumberingAfterBreak="0">
+    <w:nsid w:val="1CCE4C9F"/>
+    <w:multiLevelType w:val="multilevel"/>
+    <w:tmpl w:val="7E6A37AC"/>
+    <w:lvl w:ilvl="0">
+      <w:start w:val="1"/>
+      <w:numFmt w:val="bullet"/>
+      <w:lvlText w:val=""/>
+      <w:lvlJc w:val="left"/>
+      <w:pPr>
+        <w:tabs>
+          <w:tab w:val="num" w:pos="720"/>
+        </w:tabs>
+        <w:ind w:left="720" w:hanging="360"/>
+      </w:pPr>
+      <w:rPr>
+        <w:rFonts w:ascii="Symbol" w:hAnsi="Symbol" w:hint="default"/>
+        <w:sz w:val="20"/>
+      </w:rPr>
+    </w:lvl>
+    <w:lvl w:ilvl="1" w:tentative="1">
+      <w:start w:val="1"/>
+      <w:numFmt w:val="bullet"/>
+      <w:lvlText w:val="o"/>
+      <w:lvlJc w:val="left"/>
+      <w:pPr>
+        <w:tabs>
+          <w:tab w:val="num" w:pos="1440"/>
+        </w:tabs>
+        <w:ind w:left="1440" w:hanging="360"/>
+      </w:pPr>
+      <w:rPr>
+        <w:rFonts w:ascii="Courier New" w:hAnsi="Courier New" w:hint="default"/>
+        <w:sz w:val="20"/>
+      </w:rPr>
+    </w:lvl>
+    <w:lvl w:ilvl="2" w:tentative="1">
+      <w:start w:val="1"/>
+      <w:numFmt w:val="bullet"/>
+      <w:lvlText w:val=""/>
+      <w:lvlJc w:val="left"/>
+      <w:pPr>
+        <w:tabs>
+          <w:tab w:val="num" w:pos="2160"/>
+        </w:tabs>
+        <w:ind w:left="2160" w:hanging="360"/>
+      </w:pPr>
+      <w:rPr>
+        <w:rFonts w:ascii="Wingdings" w:hAnsi="Wingdings" w:hint="default"/>
+        <w:sz w:val="20"/>
+      </w:rPr>
+    </w:lvl>
+    <w:lvl w:ilvl="3" w:tentative="1">
+      <w:start w:val="1"/>
+      <w:numFmt w:val="bullet"/>
+      <w:lvlText w:val=""/>
+      <w:lvlJc w:val="left"/>
+      <w:pPr>
+        <w:tabs>
+          <w:tab w:val="num" w:pos="2880"/>
+        </w:tabs>
+        <w:ind w:left="2880" w:hanging="360"/>
+      </w:pPr>
+      <w:rPr>
+        <w:rFonts w:ascii="Wingdings" w:hAnsi="Wingdings" w:hint="default"/>
+        <w:sz w:val="20"/>
+      </w:rPr>
+    </w:lvl>
+    <w:lvl w:ilvl="4" w:tentative="1">
+      <w:start w:val="1"/>
+      <w:numFmt w:val="bullet"/>
+      <w:lvlText w:val=""/>
+      <w:lvlJc w:val="left"/>
+      <w:pPr>
+        <w:tabs>
+          <w:tab w:val="num" w:pos="3600"/>
+        </w:tabs>
+        <w:ind w:left="3600" w:hanging="360"/>
+      </w:pPr>
+      <w:rPr>
+        <w:rFonts w:ascii="Wingdings" w:hAnsi="Wingdings" w:hint="default"/>
+        <w:sz w:val="20"/>
+      </w:rPr>
+    </w:lvl>
+    <w:lvl w:ilvl="5" w:tentative="1">
+      <w:start w:val="1"/>
+      <w:numFmt w:val="bullet"/>
+      <w:lvlText w:val=""/>
+      <w:lvlJc w:val="left"/>
+      <w:pPr>
+        <w:tabs>
+          <w:tab w:val="num" w:pos="4320"/>
+        </w:tabs>
+        <w:ind w:left="4320" w:hanging="360"/>
+      </w:pPr>
+      <w:rPr>
+        <w:rFonts w:ascii="Wingdings" w:hAnsi="Wingdings" w:hint="default"/>
+        <w:sz w:val="20"/>
+      </w:rPr>
+    </w:lvl>
+    <w:lvl w:ilvl="6" w:tentative="1">
+      <w:start w:val="1"/>
+      <w:numFmt w:val="bullet"/>
+      <w:lvlText w:val=""/>
+      <w:lvlJc w:val="left"/>
+      <w:pPr>
+        <w:tabs>
+          <w:tab w:val="num" w:pos="5040"/>
+        </w:tabs>
+        <w:ind w:left="5040" w:hanging="360"/>
+      </w:pPr>
+      <w:rPr>
+        <w:rFonts w:ascii="Wingdings" w:hAnsi="Wingdings" w:hint="default"/>
+        <w:sz w:val="20"/>
+      </w:rPr>
+    </w:lvl>
+    <w:lvl w:ilvl="7" w:tentative="1">
+      <w:start w:val="1"/>
+      <w:numFmt w:val="bullet"/>
+      <w:lvlText w:val=""/>
+      <w:lvlJc w:val="left"/>
+      <w:pPr>
+        <w:tabs>
+          <w:tab w:val="num" w:pos="5760"/>
+        </w:tabs>
+        <w:ind w:left="5760" w:hanging="360"/>
+      </w:pPr>
+      <w:rPr>
+        <w:rFonts w:ascii="Wingdings" w:hAnsi="Wingdings" w:hint="default"/>
+        <w:sz w:val="20"/>
+      </w:rPr>
+    </w:lvl>
+    <w:lvl w:ilvl="8" w:tentative="1">
+      <w:start w:val="1"/>
+      <w:numFmt w:val="bullet"/>
+      <w:lvlText w:val=""/>
+      <w:lvlJc w:val="left"/>
+      <w:pPr>
+        <w:tabs>
+          <w:tab w:val="num" w:pos="6480"/>
+        </w:tabs>
+        <w:ind w:left="6480" w:hanging="360"/>
+      </w:pPr>
+      <w:rPr>
+        <w:rFonts w:ascii="Wingdings" w:hAnsi="Wingdings" w:hint="default"/>
+        <w:sz w:val="20"/>
+      </w:rPr>
+    </w:lvl>
+  </w:abstractNum>
+  <w:abstractNum w:abstractNumId="7" w15:restartNumberingAfterBreak="0">
+    <w:nsid w:val="2E9A76E5"/>
+    <w:multiLevelType w:val="multilevel"/>
+    <w:tmpl w:val="F592AB4C"/>
+    <w:lvl w:ilvl="0">
+      <w:start w:val="1"/>
+      <w:numFmt w:val="decimal"/>
+      <w:lvlText w:val="%1."/>
+      <w:lvlJc w:val="left"/>
+      <w:pPr>
+        <w:tabs>
+          <w:tab w:val="num" w:pos="720"/>
+        </w:tabs>
+        <w:ind w:left="720" w:hanging="360"/>
+      </w:pPr>
+    </w:lvl>
+    <w:lvl w:ilvl="1" w:tentative="1">
+      <w:start w:val="1"/>
+      <w:numFmt w:val="decimal"/>
+      <w:lvlText w:val="%2."/>
+      <w:lvlJc w:val="left"/>
+      <w:pPr>
+        <w:tabs>
+          <w:tab w:val="num" w:pos="1440"/>
+        </w:tabs>
+        <w:ind w:left="1440" w:hanging="360"/>
+      </w:pPr>
+    </w:lvl>
+    <w:lvl w:ilvl="2" w:tentative="1">
+      <w:start w:val="1"/>
+      <w:numFmt w:val="decimal"/>
+      <w:lvlText w:val="%3."/>
+      <w:lvlJc w:val="left"/>
+      <w:pPr>
+        <w:tabs>
+          <w:tab w:val="num" w:pos="2160"/>
+        </w:tabs>
+        <w:ind w:left="2160" w:hanging="360"/>
+      </w:pPr>
+    </w:lvl>
+    <w:lvl w:ilvl="3" w:tentative="1">
+      <w:start w:val="1"/>
+      <w:numFmt w:val="decimal"/>
+      <w:lvlText w:val="%4."/>
+      <w:lvlJc w:val="left"/>
+      <w:pPr>
+        <w:tabs>
+          <w:tab w:val="num" w:pos="2880"/>
+        </w:tabs>
+        <w:ind w:left="2880" w:hanging="360"/>
+      </w:pPr>
+    </w:lvl>
+    <w:lvl w:ilvl="4" w:tentative="1">
+      <w:start w:val="1"/>
+      <w:numFmt w:val="decimal"/>
+      <w:lvlText w:val="%5."/>
+      <w:lvlJc w:val="left"/>
+      <w:pPr>
+        <w:tabs>
+          <w:tab w:val="num" w:pos="3600"/>
+        </w:tabs>
+        <w:ind w:left="3600" w:hanging="360"/>
+      </w:pPr>
+    </w:lvl>
+    <w:lvl w:ilvl="5" w:tentative="1">
+      <w:start w:val="1"/>
+      <w:numFmt w:val="decimal"/>
+      <w:lvlText w:val="%6."/>
+      <w:lvlJc w:val="left"/>
+      <w:pPr>
+        <w:tabs>
+          <w:tab w:val="num" w:pos="4320"/>
+        </w:tabs>
+        <w:ind w:left="4320" w:hanging="360"/>
+      </w:pPr>
+    </w:lvl>
+    <w:lvl w:ilvl="6" w:tentative="1">
+      <w:start w:val="1"/>
+      <w:numFmt w:val="decimal"/>
+      <w:lvlText w:val="%7."/>
+      <w:lvlJc w:val="left"/>
+      <w:pPr>
+        <w:tabs>
+          <w:tab w:val="num" w:pos="5040"/>
+        </w:tabs>
+        <w:ind w:left="5040" w:hanging="360"/>
+      </w:pPr>
+    </w:lvl>
+    <w:lvl w:ilvl="7" w:tentative="1">
+      <w:start w:val="1"/>
+      <w:numFmt w:val="decimal"/>
+      <w:lvlText w:val="%8."/>
+      <w:lvlJc w:val="left"/>
+      <w:pPr>
+        <w:tabs>
+          <w:tab w:val="num" w:pos="5760"/>
+        </w:tabs>
+        <w:ind w:left="5760" w:hanging="360"/>
+      </w:pPr>
+    </w:lvl>
+    <w:lvl w:ilvl="8" w:tentative="1">
+      <w:start w:val="1"/>
+      <w:numFmt w:val="decimal"/>
+      <w:lvlText w:val="%9."/>
+      <w:lvlJc w:val="left"/>
+      <w:pPr>
+        <w:tabs>
+          <w:tab w:val="num" w:pos="6480"/>
+        </w:tabs>
+        <w:ind w:left="6480" w:hanging="360"/>
+      </w:pPr>
+    </w:lvl>
+  </w:abstractNum>
+  <w:abstractNum w:abstractNumId="8" w15:restartNumberingAfterBreak="0">
+    <w:nsid w:val="3DD0150C"/>
+    <w:multiLevelType w:val="multilevel"/>
+    <w:tmpl w:val="5A48FEC0"/>
     <w:lvl w:ilvl="0">
       <w:start w:val="1"/>
       <w:numFmt w:val="bullet"/>
@@ -18514,10 +19521,10 @@
       </w:rPr>
     </w:lvl>
   </w:abstractNum>
-  <w:abstractNum w:abstractNumId="2" w15:restartNumberingAfterBreak="0">
-    <w:nsid w:val="1099612B"/>
+  <w:abstractNum w:abstractNumId="9" w15:restartNumberingAfterBreak="0">
+    <w:nsid w:val="43846C97"/>
     <w:multiLevelType w:val="multilevel"/>
-    <w:tmpl w:val="D3F04FCC"/>
+    <w:tmpl w:val="3B8E447E"/>
     <w:lvl w:ilvl="0">
       <w:start w:val="1"/>
       <w:numFmt w:val="bullet"/>
@@ -18663,10 +19670,272 @@
       </w:rPr>
     </w:lvl>
   </w:abstractNum>
-  <w:abstractNum w:abstractNumId="3" w15:restartNumberingAfterBreak="0">
-    <w:nsid w:val="12B900DB"/>
+  <w:abstractNum w:abstractNumId="10" w15:restartNumberingAfterBreak="0">
+    <w:nsid w:val="61E141AE"/>
     <w:multiLevelType w:val="multilevel"/>
-    <w:tmpl w:val="F1EC70BE"/>
+    <w:tmpl w:val="E0F6C22E"/>
+    <w:lvl w:ilvl="0">
+      <w:start w:val="1"/>
+      <w:numFmt w:val="decimal"/>
+      <w:lvlText w:val="%1."/>
+      <w:lvlJc w:val="left"/>
+      <w:pPr>
+        <w:tabs>
+          <w:tab w:val="num" w:pos="720"/>
+        </w:tabs>
+        <w:ind w:left="720" w:hanging="360"/>
+      </w:pPr>
+    </w:lvl>
+    <w:lvl w:ilvl="1" w:tentative="1">
+      <w:start w:val="1"/>
+      <w:numFmt w:val="decimal"/>
+      <w:lvlText w:val="%2."/>
+      <w:lvlJc w:val="left"/>
+      <w:pPr>
+        <w:tabs>
+          <w:tab w:val="num" w:pos="1440"/>
+        </w:tabs>
+        <w:ind w:left="1440" w:hanging="360"/>
+      </w:pPr>
+    </w:lvl>
+    <w:lvl w:ilvl="2" w:tentative="1">
+      <w:start w:val="1"/>
+      <w:numFmt w:val="decimal"/>
+      <w:lvlText w:val="%3."/>
+      <w:lvlJc w:val="left"/>
+      <w:pPr>
+        <w:tabs>
+          <w:tab w:val="num" w:pos="2160"/>
+        </w:tabs>
+        <w:ind w:left="2160" w:hanging="360"/>
+      </w:pPr>
+    </w:lvl>
+    <w:lvl w:ilvl="3" w:tentative="1">
+      <w:start w:val="1"/>
+      <w:numFmt w:val="decimal"/>
+      <w:lvlText w:val="%4."/>
+      <w:lvlJc w:val="left"/>
+      <w:pPr>
+        <w:tabs>
+          <w:tab w:val="num" w:pos="2880"/>
+        </w:tabs>
+        <w:ind w:left="2880" w:hanging="360"/>
+      </w:pPr>
+    </w:lvl>
+    <w:lvl w:ilvl="4" w:tentative="1">
+      <w:start w:val="1"/>
+      <w:numFmt w:val="decimal"/>
+      <w:lvlText w:val="%5."/>
+      <w:lvlJc w:val="left"/>
+      <w:pPr>
+        <w:tabs>
+          <w:tab w:val="num" w:pos="3600"/>
+        </w:tabs>
+        <w:ind w:left="3600" w:hanging="360"/>
+      </w:pPr>
+    </w:lvl>
+    <w:lvl w:ilvl="5" w:tentative="1">
+      <w:start w:val="1"/>
+      <w:numFmt w:val="decimal"/>
+      <w:lvlText w:val="%6."/>
+      <w:lvlJc w:val="left"/>
+      <w:pPr>
+        <w:tabs>
+          <w:tab w:val="num" w:pos="4320"/>
+        </w:tabs>
+        <w:ind w:left="4320" w:hanging="360"/>
+      </w:pPr>
+    </w:lvl>
+    <w:lvl w:ilvl="6" w:tentative="1">
+      <w:start w:val="1"/>
+      <w:numFmt w:val="decimal"/>
+      <w:lvlText w:val="%7."/>
+      <w:lvlJc w:val="left"/>
+      <w:pPr>
+        <w:tabs>
+          <w:tab w:val="num" w:pos="5040"/>
+        </w:tabs>
+        <w:ind w:left="5040" w:hanging="360"/>
+      </w:pPr>
+    </w:lvl>
+    <w:lvl w:ilvl="7" w:tentative="1">
+      <w:start w:val="1"/>
+      <w:numFmt w:val="decimal"/>
+      <w:lvlText w:val="%8."/>
+      <w:lvlJc w:val="left"/>
+      <w:pPr>
+        <w:tabs>
+          <w:tab w:val="num" w:pos="5760"/>
+        </w:tabs>
+        <w:ind w:left="5760" w:hanging="360"/>
+      </w:pPr>
+    </w:lvl>
+    <w:lvl w:ilvl="8" w:tentative="1">
+      <w:start w:val="1"/>
+      <w:numFmt w:val="decimal"/>
+      <w:lvlText w:val="%9."/>
+      <w:lvlJc w:val="left"/>
+      <w:pPr>
+        <w:tabs>
+          <w:tab w:val="num" w:pos="6480"/>
+        </w:tabs>
+        <w:ind w:left="6480" w:hanging="360"/>
+      </w:pPr>
+    </w:lvl>
+  </w:abstractNum>
+  <w:abstractNum w:abstractNumId="11" w15:restartNumberingAfterBreak="0">
+    <w:nsid w:val="637A158D"/>
+    <w:multiLevelType w:val="multilevel"/>
+    <w:tmpl w:val="D69E037E"/>
+    <w:lvl w:ilvl="0">
+      <w:start w:val="1"/>
+      <w:numFmt w:val="bullet"/>
+      <w:lvlText w:val=""/>
+      <w:lvlJc w:val="left"/>
+      <w:pPr>
+        <w:tabs>
+          <w:tab w:val="num" w:pos="720"/>
+        </w:tabs>
+        <w:ind w:left="720" w:hanging="360"/>
+      </w:pPr>
+      <w:rPr>
+        <w:rFonts w:ascii="Symbol" w:hAnsi="Symbol" w:hint="default"/>
+        <w:sz w:val="20"/>
+      </w:rPr>
+    </w:lvl>
+    <w:lvl w:ilvl="1">
+      <w:start w:val="1"/>
+      <w:numFmt w:val="bullet"/>
+      <w:lvlText w:val="o"/>
+      <w:lvlJc w:val="left"/>
+      <w:pPr>
+        <w:tabs>
+          <w:tab w:val="num" w:pos="1440"/>
+        </w:tabs>
+        <w:ind w:left="1440" w:hanging="360"/>
+      </w:pPr>
+      <w:rPr>
+        <w:rFonts w:ascii="Courier New" w:hAnsi="Courier New" w:hint="default"/>
+        <w:sz w:val="20"/>
+      </w:rPr>
+    </w:lvl>
+    <w:lvl w:ilvl="2" w:tentative="1">
+      <w:start w:val="1"/>
+      <w:numFmt w:val="bullet"/>
+      <w:lvlText w:val=""/>
+      <w:lvlJc w:val="left"/>
+      <w:pPr>
+        <w:tabs>
+          <w:tab w:val="num" w:pos="2160"/>
+        </w:tabs>
+        <w:ind w:left="2160" w:hanging="360"/>
+      </w:pPr>
+      <w:rPr>
+        <w:rFonts w:ascii="Wingdings" w:hAnsi="Wingdings" w:hint="default"/>
+        <w:sz w:val="20"/>
+      </w:rPr>
+    </w:lvl>
+    <w:lvl w:ilvl="3" w:tentative="1">
+      <w:start w:val="1"/>
+      <w:numFmt w:val="bullet"/>
+      <w:lvlText w:val=""/>
+      <w:lvlJc w:val="left"/>
+      <w:pPr>
+        <w:tabs>
+          <w:tab w:val="num" w:pos="2880"/>
+        </w:tabs>
+        <w:ind w:left="2880" w:hanging="360"/>
+      </w:pPr>
+      <w:rPr>
+        <w:rFonts w:ascii="Wingdings" w:hAnsi="Wingdings" w:hint="default"/>
+        <w:sz w:val="20"/>
+      </w:rPr>
+    </w:lvl>
+    <w:lvl w:ilvl="4" w:tentative="1">
+      <w:start w:val="1"/>
+      <w:numFmt w:val="bullet"/>
+      <w:lvlText w:val=""/>
+      <w:lvlJc w:val="left"/>
+      <w:pPr>
+        <w:tabs>
+          <w:tab w:val="num" w:pos="3600"/>
+        </w:tabs>
+        <w:ind w:left="3600" w:hanging="360"/>
+      </w:pPr>
+      <w:rPr>
+        <w:rFonts w:ascii="Wingdings" w:hAnsi="Wingdings" w:hint="default"/>
+        <w:sz w:val="20"/>
+      </w:rPr>
+    </w:lvl>
+    <w:lvl w:ilvl="5" w:tentative="1">
+      <w:start w:val="1"/>
+      <w:numFmt w:val="bullet"/>
+      <w:lvlText w:val=""/>
+      <w:lvlJc w:val="left"/>
+      <w:pPr>
+        <w:tabs>
+          <w:tab w:val="num" w:pos="4320"/>
+        </w:tabs>
+        <w:ind w:left="4320" w:hanging="360"/>
+      </w:pPr>
+      <w:rPr>
+        <w:rFonts w:ascii="Wingdings" w:hAnsi="Wingdings" w:hint="default"/>
+        <w:sz w:val="20"/>
+      </w:rPr>
+    </w:lvl>
+    <w:lvl w:ilvl="6" w:tentative="1">
+      <w:start w:val="1"/>
+      <w:numFmt w:val="bullet"/>
+      <w:lvlText w:val=""/>
+      <w:lvlJc w:val="left"/>
+      <w:pPr>
+        <w:tabs>
+          <w:tab w:val="num" w:pos="5040"/>
+        </w:tabs>
+        <w:ind w:left="5040" w:hanging="360"/>
+      </w:pPr>
+      <w:rPr>
+        <w:rFonts w:ascii="Wingdings" w:hAnsi="Wingdings" w:hint="default"/>
+        <w:sz w:val="20"/>
+      </w:rPr>
+    </w:lvl>
+    <w:lvl w:ilvl="7" w:tentative="1">
+      <w:start w:val="1"/>
+      <w:numFmt w:val="bullet"/>
+      <w:lvlText w:val=""/>
+      <w:lvlJc w:val="left"/>
+      <w:pPr>
+        <w:tabs>
+          <w:tab w:val="num" w:pos="5760"/>
+        </w:tabs>
+        <w:ind w:left="5760" w:hanging="360"/>
+      </w:pPr>
+      <w:rPr>
+        <w:rFonts w:ascii="Wingdings" w:hAnsi="Wingdings" w:hint="default"/>
+        <w:sz w:val="20"/>
+      </w:rPr>
+    </w:lvl>
+    <w:lvl w:ilvl="8" w:tentative="1">
+      <w:start w:val="1"/>
+      <w:numFmt w:val="bullet"/>
+      <w:lvlText w:val=""/>
+      <w:lvlJc w:val="left"/>
+      <w:pPr>
+        <w:tabs>
+          <w:tab w:val="num" w:pos="6480"/>
+        </w:tabs>
+        <w:ind w:left="6480" w:hanging="360"/>
+      </w:pPr>
+      <w:rPr>
+        <w:rFonts w:ascii="Wingdings" w:hAnsi="Wingdings" w:hint="default"/>
+        <w:sz w:val="20"/>
+      </w:rPr>
+    </w:lvl>
+  </w:abstractNum>
+  <w:abstractNum w:abstractNumId="12" w15:restartNumberingAfterBreak="0">
+    <w:nsid w:val="67C65D96"/>
+    <w:multiLevelType w:val="multilevel"/>
+    <w:tmpl w:val="F9086C34"/>
     <w:lvl w:ilvl="0">
       <w:start w:val="1"/>
       <w:numFmt w:val="bullet"/>
@@ -18812,10 +20081,10 @@
       </w:rPr>
     </w:lvl>
   </w:abstractNum>
-  <w:abstractNum w:abstractNumId="4" w15:restartNumberingAfterBreak="0">
-    <w:nsid w:val="1F92558F"/>
+  <w:abstractNum w:abstractNumId="13" w15:restartNumberingAfterBreak="0">
+    <w:nsid w:val="7408223B"/>
     <w:multiLevelType w:val="multilevel"/>
-    <w:tmpl w:val="43A44164"/>
+    <w:tmpl w:val="C5D28C6A"/>
     <w:lvl w:ilvl="0">
       <w:start w:val="1"/>
       <w:numFmt w:val="bullet"/>
@@ -18961,1316 +20230,47 @@
       </w:rPr>
     </w:lvl>
   </w:abstractNum>
-  <w:abstractNum w:abstractNumId="5" w15:restartNumberingAfterBreak="0">
-    <w:nsid w:val="20C732B9"/>
-    <w:multiLevelType w:val="multilevel"/>
-    <w:tmpl w:val="674A0784"/>
-    <w:lvl w:ilvl="0">
-      <w:start w:val="1"/>
-      <w:numFmt w:val="decimal"/>
-      <w:lvlText w:val="%1."/>
-      <w:lvlJc w:val="left"/>
-      <w:pPr>
-        <w:tabs>
-          <w:tab w:val="num" w:pos="720"/>
-        </w:tabs>
-        <w:ind w:left="720" w:hanging="360"/>
-      </w:pPr>
-    </w:lvl>
-    <w:lvl w:ilvl="1" w:tentative="1">
-      <w:start w:val="1"/>
-      <w:numFmt w:val="decimal"/>
-      <w:lvlText w:val="%2."/>
-      <w:lvlJc w:val="left"/>
-      <w:pPr>
-        <w:tabs>
-          <w:tab w:val="num" w:pos="1440"/>
-        </w:tabs>
-        <w:ind w:left="1440" w:hanging="360"/>
-      </w:pPr>
-    </w:lvl>
-    <w:lvl w:ilvl="2" w:tentative="1">
-      <w:start w:val="1"/>
-      <w:numFmt w:val="decimal"/>
-      <w:lvlText w:val="%3."/>
-      <w:lvlJc w:val="left"/>
-      <w:pPr>
-        <w:tabs>
-          <w:tab w:val="num" w:pos="2160"/>
-        </w:tabs>
-        <w:ind w:left="2160" w:hanging="360"/>
-      </w:pPr>
-    </w:lvl>
-    <w:lvl w:ilvl="3" w:tentative="1">
-      <w:start w:val="1"/>
-      <w:numFmt w:val="decimal"/>
-      <w:lvlText w:val="%4."/>
-      <w:lvlJc w:val="left"/>
-      <w:pPr>
-        <w:tabs>
-          <w:tab w:val="num" w:pos="2880"/>
-        </w:tabs>
-        <w:ind w:left="2880" w:hanging="360"/>
-      </w:pPr>
-    </w:lvl>
-    <w:lvl w:ilvl="4" w:tentative="1">
-      <w:start w:val="1"/>
-      <w:numFmt w:val="decimal"/>
-      <w:lvlText w:val="%5."/>
-      <w:lvlJc w:val="left"/>
-      <w:pPr>
-        <w:tabs>
-          <w:tab w:val="num" w:pos="3600"/>
-        </w:tabs>
-        <w:ind w:left="3600" w:hanging="360"/>
-      </w:pPr>
-    </w:lvl>
-    <w:lvl w:ilvl="5" w:tentative="1">
-      <w:start w:val="1"/>
-      <w:numFmt w:val="decimal"/>
-      <w:lvlText w:val="%6."/>
-      <w:lvlJc w:val="left"/>
-      <w:pPr>
-        <w:tabs>
-          <w:tab w:val="num" w:pos="4320"/>
-        </w:tabs>
-        <w:ind w:left="4320" w:hanging="360"/>
-      </w:pPr>
-    </w:lvl>
-    <w:lvl w:ilvl="6" w:tentative="1">
-      <w:start w:val="1"/>
-      <w:numFmt w:val="decimal"/>
-      <w:lvlText w:val="%7."/>
-      <w:lvlJc w:val="left"/>
-      <w:pPr>
-        <w:tabs>
-          <w:tab w:val="num" w:pos="5040"/>
-        </w:tabs>
-        <w:ind w:left="5040" w:hanging="360"/>
-      </w:pPr>
-    </w:lvl>
-    <w:lvl w:ilvl="7" w:tentative="1">
-      <w:start w:val="1"/>
-      <w:numFmt w:val="decimal"/>
-      <w:lvlText w:val="%8."/>
-      <w:lvlJc w:val="left"/>
-      <w:pPr>
-        <w:tabs>
-          <w:tab w:val="num" w:pos="5760"/>
-        </w:tabs>
-        <w:ind w:left="5760" w:hanging="360"/>
-      </w:pPr>
-    </w:lvl>
-    <w:lvl w:ilvl="8" w:tentative="1">
-      <w:start w:val="1"/>
-      <w:numFmt w:val="decimal"/>
-      <w:lvlText w:val="%9."/>
-      <w:lvlJc w:val="left"/>
-      <w:pPr>
-        <w:tabs>
-          <w:tab w:val="num" w:pos="6480"/>
-        </w:tabs>
-        <w:ind w:left="6480" w:hanging="360"/>
-      </w:pPr>
-    </w:lvl>
-  </w:abstractNum>
-  <w:abstractNum w:abstractNumId="6" w15:restartNumberingAfterBreak="0">
-    <w:nsid w:val="224019BB"/>
-    <w:multiLevelType w:val="multilevel"/>
-    <w:tmpl w:val="A6C4486E"/>
-    <w:lvl w:ilvl="0">
-      <w:start w:val="1"/>
-      <w:numFmt w:val="bullet"/>
-      <w:lvlText w:val=""/>
-      <w:lvlJc w:val="left"/>
-      <w:pPr>
-        <w:tabs>
-          <w:tab w:val="num" w:pos="720"/>
-        </w:tabs>
-        <w:ind w:left="720" w:hanging="360"/>
-      </w:pPr>
-      <w:rPr>
-        <w:rFonts w:ascii="Symbol" w:hAnsi="Symbol" w:hint="default"/>
-        <w:sz w:val="20"/>
-      </w:rPr>
-    </w:lvl>
-    <w:lvl w:ilvl="1" w:tentative="1">
-      <w:start w:val="1"/>
-      <w:numFmt w:val="bullet"/>
-      <w:lvlText w:val="o"/>
-      <w:lvlJc w:val="left"/>
-      <w:pPr>
-        <w:tabs>
-          <w:tab w:val="num" w:pos="1440"/>
-        </w:tabs>
-        <w:ind w:left="1440" w:hanging="360"/>
-      </w:pPr>
-      <w:rPr>
-        <w:rFonts w:ascii="Courier New" w:hAnsi="Courier New" w:hint="default"/>
-        <w:sz w:val="20"/>
-      </w:rPr>
-    </w:lvl>
-    <w:lvl w:ilvl="2" w:tentative="1">
-      <w:start w:val="1"/>
-      <w:numFmt w:val="bullet"/>
-      <w:lvlText w:val=""/>
-      <w:lvlJc w:val="left"/>
-      <w:pPr>
-        <w:tabs>
-          <w:tab w:val="num" w:pos="2160"/>
-        </w:tabs>
-        <w:ind w:left="2160" w:hanging="360"/>
-      </w:pPr>
-      <w:rPr>
-        <w:rFonts w:ascii="Wingdings" w:hAnsi="Wingdings" w:hint="default"/>
-        <w:sz w:val="20"/>
-      </w:rPr>
-    </w:lvl>
-    <w:lvl w:ilvl="3" w:tentative="1">
-      <w:start w:val="1"/>
-      <w:numFmt w:val="bullet"/>
-      <w:lvlText w:val=""/>
-      <w:lvlJc w:val="left"/>
-      <w:pPr>
-        <w:tabs>
-          <w:tab w:val="num" w:pos="2880"/>
-        </w:tabs>
-        <w:ind w:left="2880" w:hanging="360"/>
-      </w:pPr>
-      <w:rPr>
-        <w:rFonts w:ascii="Wingdings" w:hAnsi="Wingdings" w:hint="default"/>
-        <w:sz w:val="20"/>
-      </w:rPr>
-    </w:lvl>
-    <w:lvl w:ilvl="4" w:tentative="1">
-      <w:start w:val="1"/>
-      <w:numFmt w:val="bullet"/>
-      <w:lvlText w:val=""/>
-      <w:lvlJc w:val="left"/>
-      <w:pPr>
-        <w:tabs>
-          <w:tab w:val="num" w:pos="3600"/>
-        </w:tabs>
-        <w:ind w:left="3600" w:hanging="360"/>
-      </w:pPr>
-      <w:rPr>
-        <w:rFonts w:ascii="Wingdings" w:hAnsi="Wingdings" w:hint="default"/>
-        <w:sz w:val="20"/>
-      </w:rPr>
-    </w:lvl>
-    <w:lvl w:ilvl="5" w:tentative="1">
-      <w:start w:val="1"/>
-      <w:numFmt w:val="bullet"/>
-      <w:lvlText w:val=""/>
-      <w:lvlJc w:val="left"/>
-      <w:pPr>
-        <w:tabs>
-          <w:tab w:val="num" w:pos="4320"/>
-        </w:tabs>
-        <w:ind w:left="4320" w:hanging="360"/>
-      </w:pPr>
-      <w:rPr>
-        <w:rFonts w:ascii="Wingdings" w:hAnsi="Wingdings" w:hint="default"/>
-        <w:sz w:val="20"/>
-      </w:rPr>
-    </w:lvl>
-    <w:lvl w:ilvl="6" w:tentative="1">
-      <w:start w:val="1"/>
-      <w:numFmt w:val="bullet"/>
-      <w:lvlText w:val=""/>
-      <w:lvlJc w:val="left"/>
-      <w:pPr>
-        <w:tabs>
-          <w:tab w:val="num" w:pos="5040"/>
-        </w:tabs>
-        <w:ind w:left="5040" w:hanging="360"/>
-      </w:pPr>
-      <w:rPr>
-        <w:rFonts w:ascii="Wingdings" w:hAnsi="Wingdings" w:hint="default"/>
-        <w:sz w:val="20"/>
-      </w:rPr>
-    </w:lvl>
-    <w:lvl w:ilvl="7" w:tentative="1">
-      <w:start w:val="1"/>
-      <w:numFmt w:val="bullet"/>
-      <w:lvlText w:val=""/>
-      <w:lvlJc w:val="left"/>
-      <w:pPr>
-        <w:tabs>
-          <w:tab w:val="num" w:pos="5760"/>
-        </w:tabs>
-        <w:ind w:left="5760" w:hanging="360"/>
-      </w:pPr>
-      <w:rPr>
-        <w:rFonts w:ascii="Wingdings" w:hAnsi="Wingdings" w:hint="default"/>
-        <w:sz w:val="20"/>
-      </w:rPr>
-    </w:lvl>
-    <w:lvl w:ilvl="8" w:tentative="1">
-      <w:start w:val="1"/>
-      <w:numFmt w:val="bullet"/>
-      <w:lvlText w:val=""/>
-      <w:lvlJc w:val="left"/>
-      <w:pPr>
-        <w:tabs>
-          <w:tab w:val="num" w:pos="6480"/>
-        </w:tabs>
-        <w:ind w:left="6480" w:hanging="360"/>
-      </w:pPr>
-      <w:rPr>
-        <w:rFonts w:ascii="Wingdings" w:hAnsi="Wingdings" w:hint="default"/>
-        <w:sz w:val="20"/>
-      </w:rPr>
-    </w:lvl>
-  </w:abstractNum>
-  <w:abstractNum w:abstractNumId="7" w15:restartNumberingAfterBreak="0">
-    <w:nsid w:val="304A4351"/>
-    <w:multiLevelType w:val="multilevel"/>
-    <w:tmpl w:val="607CFBE4"/>
-    <w:lvl w:ilvl="0">
-      <w:start w:val="1"/>
-      <w:numFmt w:val="bullet"/>
-      <w:lvlText w:val=""/>
-      <w:lvlJc w:val="left"/>
-      <w:pPr>
-        <w:tabs>
-          <w:tab w:val="num" w:pos="720"/>
-        </w:tabs>
-        <w:ind w:left="720" w:hanging="360"/>
-      </w:pPr>
-      <w:rPr>
-        <w:rFonts w:ascii="Symbol" w:hAnsi="Symbol" w:hint="default"/>
-        <w:sz w:val="20"/>
-      </w:rPr>
-    </w:lvl>
-    <w:lvl w:ilvl="1" w:tentative="1">
-      <w:start w:val="1"/>
-      <w:numFmt w:val="bullet"/>
-      <w:lvlText w:val="o"/>
-      <w:lvlJc w:val="left"/>
-      <w:pPr>
-        <w:tabs>
-          <w:tab w:val="num" w:pos="1440"/>
-        </w:tabs>
-        <w:ind w:left="1440" w:hanging="360"/>
-      </w:pPr>
-      <w:rPr>
-        <w:rFonts w:ascii="Courier New" w:hAnsi="Courier New" w:hint="default"/>
-        <w:sz w:val="20"/>
-      </w:rPr>
-    </w:lvl>
-    <w:lvl w:ilvl="2" w:tentative="1">
-      <w:start w:val="1"/>
-      <w:numFmt w:val="bullet"/>
-      <w:lvlText w:val=""/>
-      <w:lvlJc w:val="left"/>
-      <w:pPr>
-        <w:tabs>
-          <w:tab w:val="num" w:pos="2160"/>
-        </w:tabs>
-        <w:ind w:left="2160" w:hanging="360"/>
-      </w:pPr>
-      <w:rPr>
-        <w:rFonts w:ascii="Wingdings" w:hAnsi="Wingdings" w:hint="default"/>
-        <w:sz w:val="20"/>
-      </w:rPr>
-    </w:lvl>
-    <w:lvl w:ilvl="3" w:tentative="1">
-      <w:start w:val="1"/>
-      <w:numFmt w:val="bullet"/>
-      <w:lvlText w:val=""/>
-      <w:lvlJc w:val="left"/>
-      <w:pPr>
-        <w:tabs>
-          <w:tab w:val="num" w:pos="2880"/>
-        </w:tabs>
-        <w:ind w:left="2880" w:hanging="360"/>
-      </w:pPr>
-      <w:rPr>
-        <w:rFonts w:ascii="Wingdings" w:hAnsi="Wingdings" w:hint="default"/>
-        <w:sz w:val="20"/>
-      </w:rPr>
-    </w:lvl>
-    <w:lvl w:ilvl="4" w:tentative="1">
-      <w:start w:val="1"/>
-      <w:numFmt w:val="bullet"/>
-      <w:lvlText w:val=""/>
-      <w:lvlJc w:val="left"/>
-      <w:pPr>
-        <w:tabs>
-          <w:tab w:val="num" w:pos="3600"/>
-        </w:tabs>
-        <w:ind w:left="3600" w:hanging="360"/>
-      </w:pPr>
-      <w:rPr>
-        <w:rFonts w:ascii="Wingdings" w:hAnsi="Wingdings" w:hint="default"/>
-        <w:sz w:val="20"/>
-      </w:rPr>
-    </w:lvl>
-    <w:lvl w:ilvl="5" w:tentative="1">
-      <w:start w:val="1"/>
-      <w:numFmt w:val="bullet"/>
-      <w:lvlText w:val=""/>
-      <w:lvlJc w:val="left"/>
-      <w:pPr>
-        <w:tabs>
-          <w:tab w:val="num" w:pos="4320"/>
-        </w:tabs>
-        <w:ind w:left="4320" w:hanging="360"/>
-      </w:pPr>
-      <w:rPr>
-        <w:rFonts w:ascii="Wingdings" w:hAnsi="Wingdings" w:hint="default"/>
-        <w:sz w:val="20"/>
-      </w:rPr>
-    </w:lvl>
-    <w:lvl w:ilvl="6" w:tentative="1">
-      <w:start w:val="1"/>
-      <w:numFmt w:val="bullet"/>
-      <w:lvlText w:val=""/>
-      <w:lvlJc w:val="left"/>
-      <w:pPr>
-        <w:tabs>
-          <w:tab w:val="num" w:pos="5040"/>
-        </w:tabs>
-        <w:ind w:left="5040" w:hanging="360"/>
-      </w:pPr>
-      <w:rPr>
-        <w:rFonts w:ascii="Wingdings" w:hAnsi="Wingdings" w:hint="default"/>
-        <w:sz w:val="20"/>
-      </w:rPr>
-    </w:lvl>
-    <w:lvl w:ilvl="7" w:tentative="1">
-      <w:start w:val="1"/>
-      <w:numFmt w:val="bullet"/>
-      <w:lvlText w:val=""/>
-      <w:lvlJc w:val="left"/>
-      <w:pPr>
-        <w:tabs>
-          <w:tab w:val="num" w:pos="5760"/>
-        </w:tabs>
-        <w:ind w:left="5760" w:hanging="360"/>
-      </w:pPr>
-      <w:rPr>
-        <w:rFonts w:ascii="Wingdings" w:hAnsi="Wingdings" w:hint="default"/>
-        <w:sz w:val="20"/>
-      </w:rPr>
-    </w:lvl>
-    <w:lvl w:ilvl="8" w:tentative="1">
-      <w:start w:val="1"/>
-      <w:numFmt w:val="bullet"/>
-      <w:lvlText w:val=""/>
-      <w:lvlJc w:val="left"/>
-      <w:pPr>
-        <w:tabs>
-          <w:tab w:val="num" w:pos="6480"/>
-        </w:tabs>
-        <w:ind w:left="6480" w:hanging="360"/>
-      </w:pPr>
-      <w:rPr>
-        <w:rFonts w:ascii="Wingdings" w:hAnsi="Wingdings" w:hint="default"/>
-        <w:sz w:val="20"/>
-      </w:rPr>
-    </w:lvl>
-  </w:abstractNum>
-  <w:abstractNum w:abstractNumId="8" w15:restartNumberingAfterBreak="0">
-    <w:nsid w:val="3D163ADE"/>
-    <w:multiLevelType w:val="multilevel"/>
-    <w:tmpl w:val="4ADA0C18"/>
-    <w:lvl w:ilvl="0">
-      <w:start w:val="1"/>
-      <w:numFmt w:val="bullet"/>
-      <w:lvlText w:val=""/>
-      <w:lvlJc w:val="left"/>
-      <w:pPr>
-        <w:tabs>
-          <w:tab w:val="num" w:pos="720"/>
-        </w:tabs>
-        <w:ind w:left="720" w:hanging="360"/>
-      </w:pPr>
-      <w:rPr>
-        <w:rFonts w:ascii="Symbol" w:hAnsi="Symbol" w:hint="default"/>
-        <w:sz w:val="20"/>
-      </w:rPr>
-    </w:lvl>
-    <w:lvl w:ilvl="1" w:tentative="1">
-      <w:start w:val="1"/>
-      <w:numFmt w:val="bullet"/>
-      <w:lvlText w:val="o"/>
-      <w:lvlJc w:val="left"/>
-      <w:pPr>
-        <w:tabs>
-          <w:tab w:val="num" w:pos="1440"/>
-        </w:tabs>
-        <w:ind w:left="1440" w:hanging="360"/>
-      </w:pPr>
-      <w:rPr>
-        <w:rFonts w:ascii="Courier New" w:hAnsi="Courier New" w:hint="default"/>
-        <w:sz w:val="20"/>
-      </w:rPr>
-    </w:lvl>
-    <w:lvl w:ilvl="2" w:tentative="1">
-      <w:start w:val="1"/>
-      <w:numFmt w:val="bullet"/>
-      <w:lvlText w:val=""/>
-      <w:lvlJc w:val="left"/>
-      <w:pPr>
-        <w:tabs>
-          <w:tab w:val="num" w:pos="2160"/>
-        </w:tabs>
-        <w:ind w:left="2160" w:hanging="360"/>
-      </w:pPr>
-      <w:rPr>
-        <w:rFonts w:ascii="Wingdings" w:hAnsi="Wingdings" w:hint="default"/>
-        <w:sz w:val="20"/>
-      </w:rPr>
-    </w:lvl>
-    <w:lvl w:ilvl="3" w:tentative="1">
-      <w:start w:val="1"/>
-      <w:numFmt w:val="bullet"/>
-      <w:lvlText w:val=""/>
-      <w:lvlJc w:val="left"/>
-      <w:pPr>
-        <w:tabs>
-          <w:tab w:val="num" w:pos="2880"/>
-        </w:tabs>
-        <w:ind w:left="2880" w:hanging="360"/>
-      </w:pPr>
-      <w:rPr>
-        <w:rFonts w:ascii="Wingdings" w:hAnsi="Wingdings" w:hint="default"/>
-        <w:sz w:val="20"/>
-      </w:rPr>
-    </w:lvl>
-    <w:lvl w:ilvl="4" w:tentative="1">
-      <w:start w:val="1"/>
-      <w:numFmt w:val="bullet"/>
-      <w:lvlText w:val=""/>
-      <w:lvlJc w:val="left"/>
-      <w:pPr>
-        <w:tabs>
-          <w:tab w:val="num" w:pos="3600"/>
-        </w:tabs>
-        <w:ind w:left="3600" w:hanging="360"/>
-      </w:pPr>
-      <w:rPr>
-        <w:rFonts w:ascii="Wingdings" w:hAnsi="Wingdings" w:hint="default"/>
-        <w:sz w:val="20"/>
-      </w:rPr>
-    </w:lvl>
-    <w:lvl w:ilvl="5" w:tentative="1">
-      <w:start w:val="1"/>
-      <w:numFmt w:val="bullet"/>
-      <w:lvlText w:val=""/>
-      <w:lvlJc w:val="left"/>
-      <w:pPr>
-        <w:tabs>
-          <w:tab w:val="num" w:pos="4320"/>
-        </w:tabs>
-        <w:ind w:left="4320" w:hanging="360"/>
-      </w:pPr>
-      <w:rPr>
-        <w:rFonts w:ascii="Wingdings" w:hAnsi="Wingdings" w:hint="default"/>
-        <w:sz w:val="20"/>
-      </w:rPr>
-    </w:lvl>
-    <w:lvl w:ilvl="6" w:tentative="1">
-      <w:start w:val="1"/>
-      <w:numFmt w:val="bullet"/>
-      <w:lvlText w:val=""/>
-      <w:lvlJc w:val="left"/>
-      <w:pPr>
-        <w:tabs>
-          <w:tab w:val="num" w:pos="5040"/>
-        </w:tabs>
-        <w:ind w:left="5040" w:hanging="360"/>
-      </w:pPr>
-      <w:rPr>
-        <w:rFonts w:ascii="Wingdings" w:hAnsi="Wingdings" w:hint="default"/>
-        <w:sz w:val="20"/>
-      </w:rPr>
-    </w:lvl>
-    <w:lvl w:ilvl="7" w:tentative="1">
-      <w:start w:val="1"/>
-      <w:numFmt w:val="bullet"/>
-      <w:lvlText w:val=""/>
-      <w:lvlJc w:val="left"/>
-      <w:pPr>
-        <w:tabs>
-          <w:tab w:val="num" w:pos="5760"/>
-        </w:tabs>
-        <w:ind w:left="5760" w:hanging="360"/>
-      </w:pPr>
-      <w:rPr>
-        <w:rFonts w:ascii="Wingdings" w:hAnsi="Wingdings" w:hint="default"/>
-        <w:sz w:val="20"/>
-      </w:rPr>
-    </w:lvl>
-    <w:lvl w:ilvl="8" w:tentative="1">
-      <w:start w:val="1"/>
-      <w:numFmt w:val="bullet"/>
-      <w:lvlText w:val=""/>
-      <w:lvlJc w:val="left"/>
-      <w:pPr>
-        <w:tabs>
-          <w:tab w:val="num" w:pos="6480"/>
-        </w:tabs>
-        <w:ind w:left="6480" w:hanging="360"/>
-      </w:pPr>
-      <w:rPr>
-        <w:rFonts w:ascii="Wingdings" w:hAnsi="Wingdings" w:hint="default"/>
-        <w:sz w:val="20"/>
-      </w:rPr>
-    </w:lvl>
-  </w:abstractNum>
-  <w:abstractNum w:abstractNumId="9" w15:restartNumberingAfterBreak="0">
-    <w:nsid w:val="44B35327"/>
-    <w:multiLevelType w:val="multilevel"/>
-    <w:tmpl w:val="7F0C4FA8"/>
-    <w:lvl w:ilvl="0">
-      <w:start w:val="1"/>
-      <w:numFmt w:val="bullet"/>
-      <w:lvlText w:val=""/>
-      <w:lvlJc w:val="left"/>
-      <w:pPr>
-        <w:tabs>
-          <w:tab w:val="num" w:pos="720"/>
-        </w:tabs>
-        <w:ind w:left="720" w:hanging="360"/>
-      </w:pPr>
-      <w:rPr>
-        <w:rFonts w:ascii="Symbol" w:hAnsi="Symbol" w:hint="default"/>
-        <w:sz w:val="20"/>
-      </w:rPr>
-    </w:lvl>
-    <w:lvl w:ilvl="1" w:tentative="1">
-      <w:start w:val="1"/>
-      <w:numFmt w:val="bullet"/>
-      <w:lvlText w:val="o"/>
-      <w:lvlJc w:val="left"/>
-      <w:pPr>
-        <w:tabs>
-          <w:tab w:val="num" w:pos="1440"/>
-        </w:tabs>
-        <w:ind w:left="1440" w:hanging="360"/>
-      </w:pPr>
-      <w:rPr>
-        <w:rFonts w:ascii="Courier New" w:hAnsi="Courier New" w:hint="default"/>
-        <w:sz w:val="20"/>
-      </w:rPr>
-    </w:lvl>
-    <w:lvl w:ilvl="2" w:tentative="1">
-      <w:start w:val="1"/>
-      <w:numFmt w:val="bullet"/>
-      <w:lvlText w:val=""/>
-      <w:lvlJc w:val="left"/>
-      <w:pPr>
-        <w:tabs>
-          <w:tab w:val="num" w:pos="2160"/>
-        </w:tabs>
-        <w:ind w:left="2160" w:hanging="360"/>
-      </w:pPr>
-      <w:rPr>
-        <w:rFonts w:ascii="Wingdings" w:hAnsi="Wingdings" w:hint="default"/>
-        <w:sz w:val="20"/>
-      </w:rPr>
-    </w:lvl>
-    <w:lvl w:ilvl="3" w:tentative="1">
-      <w:start w:val="1"/>
-      <w:numFmt w:val="bullet"/>
-      <w:lvlText w:val=""/>
-      <w:lvlJc w:val="left"/>
-      <w:pPr>
-        <w:tabs>
-          <w:tab w:val="num" w:pos="2880"/>
-        </w:tabs>
-        <w:ind w:left="2880" w:hanging="360"/>
-      </w:pPr>
-      <w:rPr>
-        <w:rFonts w:ascii="Wingdings" w:hAnsi="Wingdings" w:hint="default"/>
-        <w:sz w:val="20"/>
-      </w:rPr>
-    </w:lvl>
-    <w:lvl w:ilvl="4" w:tentative="1">
-      <w:start w:val="1"/>
-      <w:numFmt w:val="bullet"/>
-      <w:lvlText w:val=""/>
-      <w:lvlJc w:val="left"/>
-      <w:pPr>
-        <w:tabs>
-          <w:tab w:val="num" w:pos="3600"/>
-        </w:tabs>
-        <w:ind w:left="3600" w:hanging="360"/>
-      </w:pPr>
-      <w:rPr>
-        <w:rFonts w:ascii="Wingdings" w:hAnsi="Wingdings" w:hint="default"/>
-        <w:sz w:val="20"/>
-      </w:rPr>
-    </w:lvl>
-    <w:lvl w:ilvl="5" w:tentative="1">
-      <w:start w:val="1"/>
-      <w:numFmt w:val="bullet"/>
-      <w:lvlText w:val=""/>
-      <w:lvlJc w:val="left"/>
-      <w:pPr>
-        <w:tabs>
-          <w:tab w:val="num" w:pos="4320"/>
-        </w:tabs>
-        <w:ind w:left="4320" w:hanging="360"/>
-      </w:pPr>
-      <w:rPr>
-        <w:rFonts w:ascii="Wingdings" w:hAnsi="Wingdings" w:hint="default"/>
-        <w:sz w:val="20"/>
-      </w:rPr>
-    </w:lvl>
-    <w:lvl w:ilvl="6" w:tentative="1">
-      <w:start w:val="1"/>
-      <w:numFmt w:val="bullet"/>
-      <w:lvlText w:val=""/>
-      <w:lvlJc w:val="left"/>
-      <w:pPr>
-        <w:tabs>
-          <w:tab w:val="num" w:pos="5040"/>
-        </w:tabs>
-        <w:ind w:left="5040" w:hanging="360"/>
-      </w:pPr>
-      <w:rPr>
-        <w:rFonts w:ascii="Wingdings" w:hAnsi="Wingdings" w:hint="default"/>
-        <w:sz w:val="20"/>
-      </w:rPr>
-    </w:lvl>
-    <w:lvl w:ilvl="7" w:tentative="1">
-      <w:start w:val="1"/>
-      <w:numFmt w:val="bullet"/>
-      <w:lvlText w:val=""/>
-      <w:lvlJc w:val="left"/>
-      <w:pPr>
-        <w:tabs>
-          <w:tab w:val="num" w:pos="5760"/>
-        </w:tabs>
-        <w:ind w:left="5760" w:hanging="360"/>
-      </w:pPr>
-      <w:rPr>
-        <w:rFonts w:ascii="Wingdings" w:hAnsi="Wingdings" w:hint="default"/>
-        <w:sz w:val="20"/>
-      </w:rPr>
-    </w:lvl>
-    <w:lvl w:ilvl="8" w:tentative="1">
-      <w:start w:val="1"/>
-      <w:numFmt w:val="bullet"/>
-      <w:lvlText w:val=""/>
-      <w:lvlJc w:val="left"/>
-      <w:pPr>
-        <w:tabs>
-          <w:tab w:val="num" w:pos="6480"/>
-        </w:tabs>
-        <w:ind w:left="6480" w:hanging="360"/>
-      </w:pPr>
-      <w:rPr>
-        <w:rFonts w:ascii="Wingdings" w:hAnsi="Wingdings" w:hint="default"/>
-        <w:sz w:val="20"/>
-      </w:rPr>
-    </w:lvl>
-  </w:abstractNum>
-  <w:abstractNum w:abstractNumId="10" w15:restartNumberingAfterBreak="0">
-    <w:nsid w:val="45B333A3"/>
-    <w:multiLevelType w:val="multilevel"/>
-    <w:tmpl w:val="69D22BC8"/>
-    <w:lvl w:ilvl="0">
-      <w:start w:val="1"/>
-      <w:numFmt w:val="bullet"/>
-      <w:lvlText w:val=""/>
-      <w:lvlJc w:val="left"/>
-      <w:pPr>
-        <w:tabs>
-          <w:tab w:val="num" w:pos="720"/>
-        </w:tabs>
-        <w:ind w:left="720" w:hanging="360"/>
-      </w:pPr>
-      <w:rPr>
-        <w:rFonts w:ascii="Symbol" w:hAnsi="Symbol" w:hint="default"/>
-        <w:sz w:val="20"/>
-      </w:rPr>
-    </w:lvl>
-    <w:lvl w:ilvl="1">
-      <w:start w:val="1"/>
-      <w:numFmt w:val="bullet"/>
-      <w:lvlText w:val="o"/>
-      <w:lvlJc w:val="left"/>
-      <w:pPr>
-        <w:tabs>
-          <w:tab w:val="num" w:pos="1440"/>
-        </w:tabs>
-        <w:ind w:left="1440" w:hanging="360"/>
-      </w:pPr>
-      <w:rPr>
-        <w:rFonts w:ascii="Courier New" w:hAnsi="Courier New" w:hint="default"/>
-        <w:sz w:val="20"/>
-      </w:rPr>
-    </w:lvl>
-    <w:lvl w:ilvl="2" w:tentative="1">
-      <w:start w:val="1"/>
-      <w:numFmt w:val="bullet"/>
-      <w:lvlText w:val=""/>
-      <w:lvlJc w:val="left"/>
-      <w:pPr>
-        <w:tabs>
-          <w:tab w:val="num" w:pos="2160"/>
-        </w:tabs>
-        <w:ind w:left="2160" w:hanging="360"/>
-      </w:pPr>
-      <w:rPr>
-        <w:rFonts w:ascii="Wingdings" w:hAnsi="Wingdings" w:hint="default"/>
-        <w:sz w:val="20"/>
-      </w:rPr>
-    </w:lvl>
-    <w:lvl w:ilvl="3" w:tentative="1">
-      <w:start w:val="1"/>
-      <w:numFmt w:val="bullet"/>
-      <w:lvlText w:val=""/>
-      <w:lvlJc w:val="left"/>
-      <w:pPr>
-        <w:tabs>
-          <w:tab w:val="num" w:pos="2880"/>
-        </w:tabs>
-        <w:ind w:left="2880" w:hanging="360"/>
-      </w:pPr>
-      <w:rPr>
-        <w:rFonts w:ascii="Wingdings" w:hAnsi="Wingdings" w:hint="default"/>
-        <w:sz w:val="20"/>
-      </w:rPr>
-    </w:lvl>
-    <w:lvl w:ilvl="4" w:tentative="1">
-      <w:start w:val="1"/>
-      <w:numFmt w:val="bullet"/>
-      <w:lvlText w:val=""/>
-      <w:lvlJc w:val="left"/>
-      <w:pPr>
-        <w:tabs>
-          <w:tab w:val="num" w:pos="3600"/>
-        </w:tabs>
-        <w:ind w:left="3600" w:hanging="360"/>
-      </w:pPr>
-      <w:rPr>
-        <w:rFonts w:ascii="Wingdings" w:hAnsi="Wingdings" w:hint="default"/>
-        <w:sz w:val="20"/>
-      </w:rPr>
-    </w:lvl>
-    <w:lvl w:ilvl="5" w:tentative="1">
-      <w:start w:val="1"/>
-      <w:numFmt w:val="bullet"/>
-      <w:lvlText w:val=""/>
-      <w:lvlJc w:val="left"/>
-      <w:pPr>
-        <w:tabs>
-          <w:tab w:val="num" w:pos="4320"/>
-        </w:tabs>
-        <w:ind w:left="4320" w:hanging="360"/>
-      </w:pPr>
-      <w:rPr>
-        <w:rFonts w:ascii="Wingdings" w:hAnsi="Wingdings" w:hint="default"/>
-        <w:sz w:val="20"/>
-      </w:rPr>
-    </w:lvl>
-    <w:lvl w:ilvl="6" w:tentative="1">
-      <w:start w:val="1"/>
-      <w:numFmt w:val="bullet"/>
-      <w:lvlText w:val=""/>
-      <w:lvlJc w:val="left"/>
-      <w:pPr>
-        <w:tabs>
-          <w:tab w:val="num" w:pos="5040"/>
-        </w:tabs>
-        <w:ind w:left="5040" w:hanging="360"/>
-      </w:pPr>
-      <w:rPr>
-        <w:rFonts w:ascii="Wingdings" w:hAnsi="Wingdings" w:hint="default"/>
-        <w:sz w:val="20"/>
-      </w:rPr>
-    </w:lvl>
-    <w:lvl w:ilvl="7" w:tentative="1">
-      <w:start w:val="1"/>
-      <w:numFmt w:val="bullet"/>
-      <w:lvlText w:val=""/>
-      <w:lvlJc w:val="left"/>
-      <w:pPr>
-        <w:tabs>
-          <w:tab w:val="num" w:pos="5760"/>
-        </w:tabs>
-        <w:ind w:left="5760" w:hanging="360"/>
-      </w:pPr>
-      <w:rPr>
-        <w:rFonts w:ascii="Wingdings" w:hAnsi="Wingdings" w:hint="default"/>
-        <w:sz w:val="20"/>
-      </w:rPr>
-    </w:lvl>
-    <w:lvl w:ilvl="8" w:tentative="1">
-      <w:start w:val="1"/>
-      <w:numFmt w:val="bullet"/>
-      <w:lvlText w:val=""/>
-      <w:lvlJc w:val="left"/>
-      <w:pPr>
-        <w:tabs>
-          <w:tab w:val="num" w:pos="6480"/>
-        </w:tabs>
-        <w:ind w:left="6480" w:hanging="360"/>
-      </w:pPr>
-      <w:rPr>
-        <w:rFonts w:ascii="Wingdings" w:hAnsi="Wingdings" w:hint="default"/>
-        <w:sz w:val="20"/>
-      </w:rPr>
-    </w:lvl>
-  </w:abstractNum>
-  <w:abstractNum w:abstractNumId="11" w15:restartNumberingAfterBreak="0">
-    <w:nsid w:val="6F501EA5"/>
-    <w:multiLevelType w:val="multilevel"/>
-    <w:tmpl w:val="A5A08EA0"/>
-    <w:lvl w:ilvl="0">
-      <w:start w:val="1"/>
-      <w:numFmt w:val="decimal"/>
-      <w:lvlText w:val="%1."/>
-      <w:lvlJc w:val="left"/>
-      <w:pPr>
-        <w:tabs>
-          <w:tab w:val="num" w:pos="720"/>
-        </w:tabs>
-        <w:ind w:left="720" w:hanging="360"/>
-      </w:pPr>
-    </w:lvl>
-    <w:lvl w:ilvl="1" w:tentative="1">
-      <w:start w:val="1"/>
-      <w:numFmt w:val="decimal"/>
-      <w:lvlText w:val="%2."/>
-      <w:lvlJc w:val="left"/>
-      <w:pPr>
-        <w:tabs>
-          <w:tab w:val="num" w:pos="1440"/>
-        </w:tabs>
-        <w:ind w:left="1440" w:hanging="360"/>
-      </w:pPr>
-    </w:lvl>
-    <w:lvl w:ilvl="2" w:tentative="1">
-      <w:start w:val="1"/>
-      <w:numFmt w:val="decimal"/>
-      <w:lvlText w:val="%3."/>
-      <w:lvlJc w:val="left"/>
-      <w:pPr>
-        <w:tabs>
-          <w:tab w:val="num" w:pos="2160"/>
-        </w:tabs>
-        <w:ind w:left="2160" w:hanging="360"/>
-      </w:pPr>
-    </w:lvl>
-    <w:lvl w:ilvl="3" w:tentative="1">
-      <w:start w:val="1"/>
-      <w:numFmt w:val="decimal"/>
-      <w:lvlText w:val="%4."/>
-      <w:lvlJc w:val="left"/>
-      <w:pPr>
-        <w:tabs>
-          <w:tab w:val="num" w:pos="2880"/>
-        </w:tabs>
-        <w:ind w:left="2880" w:hanging="360"/>
-      </w:pPr>
-    </w:lvl>
-    <w:lvl w:ilvl="4" w:tentative="1">
-      <w:start w:val="1"/>
-      <w:numFmt w:val="decimal"/>
-      <w:lvlText w:val="%5."/>
-      <w:lvlJc w:val="left"/>
-      <w:pPr>
-        <w:tabs>
-          <w:tab w:val="num" w:pos="3600"/>
-        </w:tabs>
-        <w:ind w:left="3600" w:hanging="360"/>
-      </w:pPr>
-    </w:lvl>
-    <w:lvl w:ilvl="5" w:tentative="1">
-      <w:start w:val="1"/>
-      <w:numFmt w:val="decimal"/>
-      <w:lvlText w:val="%6."/>
-      <w:lvlJc w:val="left"/>
-      <w:pPr>
-        <w:tabs>
-          <w:tab w:val="num" w:pos="4320"/>
-        </w:tabs>
-        <w:ind w:left="4320" w:hanging="360"/>
-      </w:pPr>
-    </w:lvl>
-    <w:lvl w:ilvl="6" w:tentative="1">
-      <w:start w:val="1"/>
-      <w:numFmt w:val="decimal"/>
-      <w:lvlText w:val="%7."/>
-      <w:lvlJc w:val="left"/>
-      <w:pPr>
-        <w:tabs>
-          <w:tab w:val="num" w:pos="5040"/>
-        </w:tabs>
-        <w:ind w:left="5040" w:hanging="360"/>
-      </w:pPr>
-    </w:lvl>
-    <w:lvl w:ilvl="7" w:tentative="1">
-      <w:start w:val="1"/>
-      <w:numFmt w:val="decimal"/>
-      <w:lvlText w:val="%8."/>
-      <w:lvlJc w:val="left"/>
-      <w:pPr>
-        <w:tabs>
-          <w:tab w:val="num" w:pos="5760"/>
-        </w:tabs>
-        <w:ind w:left="5760" w:hanging="360"/>
-      </w:pPr>
-    </w:lvl>
-    <w:lvl w:ilvl="8" w:tentative="1">
-      <w:start w:val="1"/>
-      <w:numFmt w:val="decimal"/>
-      <w:lvlText w:val="%9."/>
-      <w:lvlJc w:val="left"/>
-      <w:pPr>
-        <w:tabs>
-          <w:tab w:val="num" w:pos="6480"/>
-        </w:tabs>
-        <w:ind w:left="6480" w:hanging="360"/>
-      </w:pPr>
-    </w:lvl>
-  </w:abstractNum>
-  <w:abstractNum w:abstractNumId="12" w15:restartNumberingAfterBreak="0">
-    <w:nsid w:val="788F66A9"/>
-    <w:multiLevelType w:val="multilevel"/>
-    <w:tmpl w:val="7ACA1B78"/>
-    <w:lvl w:ilvl="0">
-      <w:start w:val="1"/>
-      <w:numFmt w:val="bullet"/>
-      <w:lvlText w:val=""/>
-      <w:lvlJc w:val="left"/>
-      <w:pPr>
-        <w:tabs>
-          <w:tab w:val="num" w:pos="720"/>
-        </w:tabs>
-        <w:ind w:left="720" w:hanging="360"/>
-      </w:pPr>
-      <w:rPr>
-        <w:rFonts w:ascii="Symbol" w:hAnsi="Symbol" w:hint="default"/>
-        <w:sz w:val="20"/>
-      </w:rPr>
-    </w:lvl>
-    <w:lvl w:ilvl="1" w:tentative="1">
-      <w:start w:val="1"/>
-      <w:numFmt w:val="bullet"/>
-      <w:lvlText w:val="o"/>
-      <w:lvlJc w:val="left"/>
-      <w:pPr>
-        <w:tabs>
-          <w:tab w:val="num" w:pos="1440"/>
-        </w:tabs>
-        <w:ind w:left="1440" w:hanging="360"/>
-      </w:pPr>
-      <w:rPr>
-        <w:rFonts w:ascii="Courier New" w:hAnsi="Courier New" w:hint="default"/>
-        <w:sz w:val="20"/>
-      </w:rPr>
-    </w:lvl>
-    <w:lvl w:ilvl="2" w:tentative="1">
-      <w:start w:val="1"/>
-      <w:numFmt w:val="bullet"/>
-      <w:lvlText w:val=""/>
-      <w:lvlJc w:val="left"/>
-      <w:pPr>
-        <w:tabs>
-          <w:tab w:val="num" w:pos="2160"/>
-        </w:tabs>
-        <w:ind w:left="2160" w:hanging="360"/>
-      </w:pPr>
-      <w:rPr>
-        <w:rFonts w:ascii="Wingdings" w:hAnsi="Wingdings" w:hint="default"/>
-        <w:sz w:val="20"/>
-      </w:rPr>
-    </w:lvl>
-    <w:lvl w:ilvl="3" w:tentative="1">
-      <w:start w:val="1"/>
-      <w:numFmt w:val="bullet"/>
-      <w:lvlText w:val=""/>
-      <w:lvlJc w:val="left"/>
-      <w:pPr>
-        <w:tabs>
-          <w:tab w:val="num" w:pos="2880"/>
-        </w:tabs>
-        <w:ind w:left="2880" w:hanging="360"/>
-      </w:pPr>
-      <w:rPr>
-        <w:rFonts w:ascii="Wingdings" w:hAnsi="Wingdings" w:hint="default"/>
-        <w:sz w:val="20"/>
-      </w:rPr>
-    </w:lvl>
-    <w:lvl w:ilvl="4" w:tentative="1">
-      <w:start w:val="1"/>
-      <w:numFmt w:val="bullet"/>
-      <w:lvlText w:val=""/>
-      <w:lvlJc w:val="left"/>
-      <w:pPr>
-        <w:tabs>
-          <w:tab w:val="num" w:pos="3600"/>
-        </w:tabs>
-        <w:ind w:left="3600" w:hanging="360"/>
-      </w:pPr>
-      <w:rPr>
-        <w:rFonts w:ascii="Wingdings" w:hAnsi="Wingdings" w:hint="default"/>
-        <w:sz w:val="20"/>
-      </w:rPr>
-    </w:lvl>
-    <w:lvl w:ilvl="5" w:tentative="1">
-      <w:start w:val="1"/>
-      <w:numFmt w:val="bullet"/>
-      <w:lvlText w:val=""/>
-      <w:lvlJc w:val="left"/>
-      <w:pPr>
-        <w:tabs>
-          <w:tab w:val="num" w:pos="4320"/>
-        </w:tabs>
-        <w:ind w:left="4320" w:hanging="360"/>
-      </w:pPr>
-      <w:rPr>
-        <w:rFonts w:ascii="Wingdings" w:hAnsi="Wingdings" w:hint="default"/>
-        <w:sz w:val="20"/>
-      </w:rPr>
-    </w:lvl>
-    <w:lvl w:ilvl="6" w:tentative="1">
-      <w:start w:val="1"/>
-      <w:numFmt w:val="bullet"/>
-      <w:lvlText w:val=""/>
-      <w:lvlJc w:val="left"/>
-      <w:pPr>
-        <w:tabs>
-          <w:tab w:val="num" w:pos="5040"/>
-        </w:tabs>
-        <w:ind w:left="5040" w:hanging="360"/>
-      </w:pPr>
-      <w:rPr>
-        <w:rFonts w:ascii="Wingdings" w:hAnsi="Wingdings" w:hint="default"/>
-        <w:sz w:val="20"/>
-      </w:rPr>
-    </w:lvl>
-    <w:lvl w:ilvl="7" w:tentative="1">
-      <w:start w:val="1"/>
-      <w:numFmt w:val="bullet"/>
-      <w:lvlText w:val=""/>
-      <w:lvlJc w:val="left"/>
-      <w:pPr>
-        <w:tabs>
-          <w:tab w:val="num" w:pos="5760"/>
-        </w:tabs>
-        <w:ind w:left="5760" w:hanging="360"/>
-      </w:pPr>
-      <w:rPr>
-        <w:rFonts w:ascii="Wingdings" w:hAnsi="Wingdings" w:hint="default"/>
-        <w:sz w:val="20"/>
-      </w:rPr>
-    </w:lvl>
-    <w:lvl w:ilvl="8" w:tentative="1">
-      <w:start w:val="1"/>
-      <w:numFmt w:val="bullet"/>
-      <w:lvlText w:val=""/>
-      <w:lvlJc w:val="left"/>
-      <w:pPr>
-        <w:tabs>
-          <w:tab w:val="num" w:pos="6480"/>
-        </w:tabs>
-        <w:ind w:left="6480" w:hanging="360"/>
-      </w:pPr>
-      <w:rPr>
-        <w:rFonts w:ascii="Wingdings" w:hAnsi="Wingdings" w:hint="default"/>
-        <w:sz w:val="20"/>
-      </w:rPr>
-    </w:lvl>
-  </w:abstractNum>
-  <w:abstractNum w:abstractNumId="13" w15:restartNumberingAfterBreak="0">
-    <w:nsid w:val="7B9712B7"/>
-    <w:multiLevelType w:val="multilevel"/>
-    <w:tmpl w:val="37FAD9C2"/>
-    <w:lvl w:ilvl="0">
-      <w:start w:val="1"/>
-      <w:numFmt w:val="bullet"/>
-      <w:lvlText w:val=""/>
-      <w:lvlJc w:val="left"/>
-      <w:pPr>
-        <w:tabs>
-          <w:tab w:val="num" w:pos="720"/>
-        </w:tabs>
-        <w:ind w:left="720" w:hanging="360"/>
-      </w:pPr>
-      <w:rPr>
-        <w:rFonts w:ascii="Symbol" w:hAnsi="Symbol" w:hint="default"/>
-        <w:sz w:val="20"/>
-      </w:rPr>
-    </w:lvl>
-    <w:lvl w:ilvl="1" w:tentative="1">
-      <w:start w:val="1"/>
-      <w:numFmt w:val="bullet"/>
-      <w:lvlText w:val="o"/>
-      <w:lvlJc w:val="left"/>
-      <w:pPr>
-        <w:tabs>
-          <w:tab w:val="num" w:pos="1440"/>
-        </w:tabs>
-        <w:ind w:left="1440" w:hanging="360"/>
-      </w:pPr>
-      <w:rPr>
-        <w:rFonts w:ascii="Courier New" w:hAnsi="Courier New" w:hint="default"/>
-        <w:sz w:val="20"/>
-      </w:rPr>
-    </w:lvl>
-    <w:lvl w:ilvl="2" w:tentative="1">
-      <w:start w:val="1"/>
-      <w:numFmt w:val="bullet"/>
-      <w:lvlText w:val=""/>
-      <w:lvlJc w:val="left"/>
-      <w:pPr>
-        <w:tabs>
-          <w:tab w:val="num" w:pos="2160"/>
-        </w:tabs>
-        <w:ind w:left="2160" w:hanging="360"/>
-      </w:pPr>
-      <w:rPr>
-        <w:rFonts w:ascii="Wingdings" w:hAnsi="Wingdings" w:hint="default"/>
-        <w:sz w:val="20"/>
-      </w:rPr>
-    </w:lvl>
-    <w:lvl w:ilvl="3" w:tentative="1">
-      <w:start w:val="1"/>
-      <w:numFmt w:val="bullet"/>
-      <w:lvlText w:val=""/>
-      <w:lvlJc w:val="left"/>
-      <w:pPr>
-        <w:tabs>
-          <w:tab w:val="num" w:pos="2880"/>
-        </w:tabs>
-        <w:ind w:left="2880" w:hanging="360"/>
-      </w:pPr>
-      <w:rPr>
-        <w:rFonts w:ascii="Wingdings" w:hAnsi="Wingdings" w:hint="default"/>
-        <w:sz w:val="20"/>
-      </w:rPr>
-    </w:lvl>
-    <w:lvl w:ilvl="4" w:tentative="1">
-      <w:start w:val="1"/>
-      <w:numFmt w:val="bullet"/>
-      <w:lvlText w:val=""/>
-      <w:lvlJc w:val="left"/>
-      <w:pPr>
-        <w:tabs>
-          <w:tab w:val="num" w:pos="3600"/>
-        </w:tabs>
-        <w:ind w:left="3600" w:hanging="360"/>
-      </w:pPr>
-      <w:rPr>
-        <w:rFonts w:ascii="Wingdings" w:hAnsi="Wingdings" w:hint="default"/>
-        <w:sz w:val="20"/>
-      </w:rPr>
-    </w:lvl>
-    <w:lvl w:ilvl="5" w:tentative="1">
-      <w:start w:val="1"/>
-      <w:numFmt w:val="bullet"/>
-      <w:lvlText w:val=""/>
-      <w:lvlJc w:val="left"/>
-      <w:pPr>
-        <w:tabs>
-          <w:tab w:val="num" w:pos="4320"/>
-        </w:tabs>
-        <w:ind w:left="4320" w:hanging="360"/>
-      </w:pPr>
-      <w:rPr>
-        <w:rFonts w:ascii="Wingdings" w:hAnsi="Wingdings" w:hint="default"/>
-        <w:sz w:val="20"/>
-      </w:rPr>
-    </w:lvl>
-    <w:lvl w:ilvl="6" w:tentative="1">
-      <w:start w:val="1"/>
-      <w:numFmt w:val="bullet"/>
-      <w:lvlText w:val=""/>
-      <w:lvlJc w:val="left"/>
-      <w:pPr>
-        <w:tabs>
-          <w:tab w:val="num" w:pos="5040"/>
-        </w:tabs>
-        <w:ind w:left="5040" w:hanging="360"/>
-      </w:pPr>
-      <w:rPr>
-        <w:rFonts w:ascii="Wingdings" w:hAnsi="Wingdings" w:hint="default"/>
-        <w:sz w:val="20"/>
-      </w:rPr>
-    </w:lvl>
-    <w:lvl w:ilvl="7" w:tentative="1">
-      <w:start w:val="1"/>
-      <w:numFmt w:val="bullet"/>
-      <w:lvlText w:val=""/>
-      <w:lvlJc w:val="left"/>
-      <w:pPr>
-        <w:tabs>
-          <w:tab w:val="num" w:pos="5760"/>
-        </w:tabs>
-        <w:ind w:left="5760" w:hanging="360"/>
-      </w:pPr>
-      <w:rPr>
-        <w:rFonts w:ascii="Wingdings" w:hAnsi="Wingdings" w:hint="default"/>
-        <w:sz w:val="20"/>
-      </w:rPr>
-    </w:lvl>
-    <w:lvl w:ilvl="8" w:tentative="1">
-      <w:start w:val="1"/>
-      <w:numFmt w:val="bullet"/>
-      <w:lvlText w:val=""/>
-      <w:lvlJc w:val="left"/>
-      <w:pPr>
-        <w:tabs>
-          <w:tab w:val="num" w:pos="6480"/>
-        </w:tabs>
-        <w:ind w:left="6480" w:hanging="360"/>
-      </w:pPr>
-      <w:rPr>
-        <w:rFonts w:ascii="Wingdings" w:hAnsi="Wingdings" w:hint="default"/>
-        <w:sz w:val="20"/>
-      </w:rPr>
-    </w:lvl>
-  </w:abstractNum>
-  <w:num w:numId="1" w16cid:durableId="1565219455">
+  <w:num w:numId="1" w16cid:durableId="35396854">
+    <w:abstractNumId w:val="7"/>
+  </w:num>
+  <w:num w:numId="2" w16cid:durableId="279190179">
+    <w:abstractNumId w:val="9"/>
+  </w:num>
+  <w:num w:numId="3" w16cid:durableId="494422066">
+    <w:abstractNumId w:val="11"/>
+  </w:num>
+  <w:num w:numId="4" w16cid:durableId="184443544">
+    <w:abstractNumId w:val="10"/>
+  </w:num>
+  <w:num w:numId="5" w16cid:durableId="1486895093">
+    <w:abstractNumId w:val="4"/>
+  </w:num>
+  <w:num w:numId="6" w16cid:durableId="349180562">
+    <w:abstractNumId w:val="13"/>
+  </w:num>
+  <w:num w:numId="7" w16cid:durableId="92015343">
+    <w:abstractNumId w:val="2"/>
+  </w:num>
+  <w:num w:numId="8" w16cid:durableId="466239682">
+    <w:abstractNumId w:val="6"/>
+  </w:num>
+  <w:num w:numId="9" w16cid:durableId="1281188187">
+    <w:abstractNumId w:val="3"/>
+  </w:num>
+  <w:num w:numId="10" w16cid:durableId="1345939012">
+    <w:abstractNumId w:val="8"/>
+  </w:num>
+  <w:num w:numId="11" w16cid:durableId="1572498896">
     <w:abstractNumId w:val="5"/>
   </w:num>
-  <w:num w:numId="2" w16cid:durableId="1202278583">
+  <w:num w:numId="12" w16cid:durableId="163592445">
+    <w:abstractNumId w:val="1"/>
+  </w:num>
+  <w:num w:numId="13" w16cid:durableId="197472660">
     <w:abstractNumId w:val="0"/>
   </w:num>
-  <w:num w:numId="3" w16cid:durableId="978387756">
-    <w:abstractNumId w:val="1"/>
-  </w:num>
-  <w:num w:numId="4" w16cid:durableId="18896849">
-    <w:abstractNumId w:val="11"/>
-  </w:num>
-  <w:num w:numId="5" w16cid:durableId="822700396">
-    <w:abstractNumId w:val="8"/>
-  </w:num>
-  <w:num w:numId="6" w16cid:durableId="283585599">
-    <w:abstractNumId w:val="7"/>
-  </w:num>
-  <w:num w:numId="7" w16cid:durableId="1919514235">
-    <w:abstractNumId w:val="4"/>
-  </w:num>
-  <w:num w:numId="8" w16cid:durableId="1471249602">
-    <w:abstractNumId w:val="2"/>
-  </w:num>
-  <w:num w:numId="9" w16cid:durableId="156728022">
+  <w:num w:numId="14" w16cid:durableId="1059938296">
     <w:abstractNumId w:val="12"/>
-  </w:num>
-  <w:num w:numId="10" w16cid:durableId="1940020674">
-    <w:abstractNumId w:val="10"/>
-  </w:num>
-  <w:num w:numId="11" w16cid:durableId="1099182019">
-    <w:abstractNumId w:val="3"/>
-  </w:num>
-  <w:num w:numId="12" w16cid:durableId="893085843">
-    <w:abstractNumId w:val="13"/>
-  </w:num>
-  <w:num w:numId="13" w16cid:durableId="403920842">
-    <w:abstractNumId w:val="6"/>
-  </w:num>
-  <w:num w:numId="14" w16cid:durableId="931086401">
-    <w:abstractNumId w:val="9"/>
   </w:num>
 </w:numbering>
 </file>

</xml_diff>